<commit_message>
Record the YouTube selling-path chapters and the handover other agents should follow.
Co-authored-by: Cursor <cursoragent@cursor.com>
</commit_message>
<xml_diff>
--- a/Your First YouTube Channel That Sells/Your First YouTube Channel That Sells.docx
+++ b/Your First YouTube Channel That Sells/Your First YouTube Channel That Sells.docx
@@ -17,7 +17,7 @@
         <w:pStyle w:val="Subtitle"/>
       </w:pPr>
       <w:r>
-        <w:t>How to Make Videos Cheaply, Win the Click, and Build a Channel That Can Pay</w:t>
+        <w:t>How to Choose One Offer, Make the Videos That Sell It, and Get Paid</w:t>
       </w:r>
     </w:p>
     <w:p>
@@ -62,7 +62,7 @@
             <w:color w:val="1F4E79"/>
             <w:u w:val="single"/>
           </w:rPr>
-          <w:t>1 The Click Is the Whole Business</w:t>
+          <w:t>1 Sell One Thing</w:t>
         </w:r>
       </w:hyperlink>
     </w:p>
@@ -76,7 +76,7 @@
             <w:color w:val="1F4E79"/>
             <w:u w:val="single"/>
           </w:rPr>
-          <w:t>2 Nobody Can Tell What It Cost</w:t>
+          <w:t>2 The Click Is the Whole Business</w:t>
         </w:r>
       </w:hyperlink>
     </w:p>
@@ -90,13 +90,97 @@
             <w:color w:val="1F4E79"/>
             <w:u w:val="single"/>
           </w:rPr>
-          <w:t>3 Where the Money Actually Comes From</w:t>
+          <w:t>3 Nobody Can Tell What It Cost</w:t>
         </w:r>
       </w:hyperlink>
     </w:p>
     <w:p>
       <w:pPr/>
       <w:hyperlink w:anchor="ch4">
+        <w:r>
+          <w:rPr>
+            <w:rFonts w:ascii="Calibri" w:hAnsi="Calibri"/>
+            <w:sz w:val="22"/>
+            <w:color w:val="1F4E79"/>
+            <w:u w:val="single"/>
+          </w:rPr>
+          <w:t>4 The Videos That Do the Selling</w:t>
+        </w:r>
+      </w:hyperlink>
+    </w:p>
+    <w:p>
+      <w:pPr/>
+      <w:hyperlink w:anchor="ch5">
+        <w:r>
+          <w:rPr>
+            <w:rFonts w:ascii="Calibri" w:hAnsi="Calibri"/>
+            <w:sz w:val="22"/>
+            <w:color w:val="1F4E79"/>
+            <w:u w:val="single"/>
+          </w:rPr>
+          <w:t>5 Where the Money Actually Comes From</w:t>
+        </w:r>
+      </w:hyperlink>
+    </w:p>
+    <w:p>
+      <w:pPr/>
+      <w:hyperlink w:anchor="ch6">
+        <w:r>
+          <w:rPr>
+            <w:rFonts w:ascii="Calibri" w:hAnsi="Calibri"/>
+            <w:sz w:val="22"/>
+            <w:color w:val="1F4E79"/>
+            <w:u w:val="single"/>
+          </w:rPr>
+          <w:t>6 Six Weeks to a Live Offer</w:t>
+        </w:r>
+      </w:hyperlink>
+    </w:p>
+    <w:p>
+      <w:pPr/>
+      <w:hyperlink w:anchor="ch7">
+        <w:r>
+          <w:rPr>
+            <w:rFonts w:ascii="Calibri" w:hAnsi="Calibri"/>
+            <w:sz w:val="22"/>
+            <w:color w:val="1F4E79"/>
+            <w:u w:val="single"/>
+          </w:rPr>
+          <w:t>7 Say This</w:t>
+        </w:r>
+      </w:hyperlink>
+    </w:p>
+    <w:p>
+      <w:pPr/>
+      <w:hyperlink w:anchor="ch8">
+        <w:r>
+          <w:rPr>
+            <w:rFonts w:ascii="Calibri" w:hAnsi="Calibri"/>
+            <w:sz w:val="22"/>
+            <w:color w:val="1F4E79"/>
+            <w:u w:val="single"/>
+          </w:rPr>
+          <w:t>8 The Channel Workbook</w:t>
+        </w:r>
+      </w:hyperlink>
+    </w:p>
+    <w:p>
+      <w:pPr/>
+      <w:hyperlink w:anchor="ch9">
+        <w:r>
+          <w:rPr>
+            <w:rFonts w:ascii="Calibri" w:hAnsi="Calibri"/>
+            <w:sz w:val="22"/>
+            <w:color w:val="1F4E79"/>
+            <w:u w:val="single"/>
+          </w:rPr>
+          <w:t>9 When Nothing Sells</w:t>
+        </w:r>
+      </w:hyperlink>
+    </w:p>
+    <w:p>
+      <w:pPr/>
+      <w:hyperlink w:anchor="ch10">
         <w:r>
           <w:rPr>
             <w:rFonts w:ascii="Calibri" w:hAnsi="Calibri"/>
@@ -123,55 +207,71 @@
         <w:rPr>
           <w:rFonts w:ascii="Calibri" w:hAnsi="Calibri"/>
         </w:rPr>
-        <w:t>A channel starts when a stranger can find a video, tell what it offers, and decide it is worth their time. This guide is the process for doing that on a small budget: make the video cheaply, win the click honestly, and know which numbers a platform requires before it pays you.</w:t>
-      </w:r>
-    </w:p>
-    <w:p>
-      <w:r>
-        <w:rPr>
-          <w:rFonts w:ascii="Calibri" w:hAnsi="Calibri"/>
-        </w:rPr>
-        <w:t>Read the chapters in order if you are starting. If you already post, open the chapter that matches the problem you can see.</w:t>
-      </w:r>
-    </w:p>
-    <w:p>
-      <w:r>
-        <w:rPr>
-          <w:rFonts w:ascii="Calibri" w:hAnsi="Calibri"/>
-        </w:rPr>
-        <w:t>Chapter 1 is the click. A thumbnail and a title win or lose the viewer before a second of the video plays. The chapter covers the title, description, and tag limits you can count in the upload form, the words that can suppress reach, captions, retention as creator consensus rather than a published formula, and a short-form to long-form posting rhythm.</w:t>
-      </w:r>
-    </w:p>
-    <w:p>
-      <w:r>
-        <w:rPr>
-          <w:rFonts w:ascii="Calibri" w:hAnsi="Calibri"/>
-        </w:rPr>
-        <w:t>Chapter 2 is production. Footage, music, a voice, and an export each have a free or near-free tool. None of those tools tell you what you are allowed to publish. The license check is yours.</w:t>
-      </w:r>
-    </w:p>
-    <w:p>
-      <w:r>
-        <w:rPr>
-          <w:rFonts w:ascii="Calibri" w:hAnsi="Calibri"/>
-        </w:rPr>
-        <w:t>Chapter 3 is the money. A subscriber count is not a monetized channel. YouTube’s Partner Program has two gates, a second channel starts back at zero, other platforms pay on different terms that change quickly, and an affiliate link does not depend on any one of those programs surviving.</w:t>
-      </w:r>
-    </w:p>
-    <w:p>
-      <w:r>
-        <w:rPr>
-          <w:rFonts w:ascii="Calibri" w:hAnsi="Calibri"/>
-        </w:rPr>
-        <w:t>Character limits, export settings, and eligibility rules are stated as facts because they are checkable in the product. Ranking behavior and retention percentages are labeled as inference or creator consensus. Tool prices and platform thresholds move. Recheck the upload form and the linked help pages before you build a plan on a specific number.</w:t>
-      </w:r>
-    </w:p>
-    <w:p>
-      <w:r>
-        <w:rPr>
-          <w:rFonts w:ascii="Calibri" w:hAnsi="Calibri"/>
-        </w:rPr>
-        <w:t>This is a companion to a Kindle publishing guide, not a chapter of it. It does not tell you what your videos should be about, and it is not legal, tax, or official platform advice.</w:t>
+        <w:t>A channel that sells has one thing a stranger can buy. Views, subscribers, and a monetization badge are not that thing. This book is the path from no offer to a small set of videos that point at one price.</w:t>
+      </w:r>
+    </w:p>
+    <w:p>
+      <w:r>
+        <w:rPr>
+          <w:rFonts w:ascii="Calibri" w:hAnsi="Calibri"/>
+        </w:rPr>
+        <w:t>Read it in order if you are starting. If you already post, use the last chapter to find the earliest break, then go to the chapter that fixes that break.</w:t>
+      </w:r>
+    </w:p>
+    <w:p>
+      <w:r>
+        <w:rPr>
+          <w:rFonts w:ascii="Calibri" w:hAnsi="Calibri"/>
+        </w:rPr>
+        <w:t>Chapter 1 names the buyer and the single offer, and puts a price on a page before you film.</w:t>
+      </w:r>
+    </w:p>
+    <w:p>
+      <w:r>
+        <w:rPr>
+          <w:rFonts w:ascii="Calibri" w:hAnsi="Calibri"/>
+        </w:rPr>
+        <w:t>Chapter 2 wins the click: titles, descriptions, tags, captions, and a posting rhythm you can keep. Ranking claims are labeled as creator consensus, not platform formulas.</w:t>
+      </w:r>
+    </w:p>
+    <w:p>
+      <w:r>
+        <w:rPr>
+          <w:rFonts w:ascii="Calibri" w:hAnsi="Calibri"/>
+        </w:rPr>
+        <w:t>Chapter 3 makes the videos cheaply enough that you can continue, and tells you which licenses you still have to read.</w:t>
+      </w:r>
+    </w:p>
+    <w:p>
+      <w:r>
+        <w:rPr>
+          <w:rFonts w:ascii="Calibri" w:hAnsi="Calibri"/>
+        </w:rPr>
+        <w:t>Chapter 4 is the first eight videos, each with one job, including the video that states the offer.</w:t>
+      </w:r>
+    </w:p>
+    <w:p>
+      <w:r>
+        <w:rPr>
+          <w:rFonts w:ascii="Calibri" w:hAnsi="Calibri"/>
+        </w:rPr>
+        <w:t>Chapter 5 is how money actually arrives: platform programs, their thresholds, and affiliate links. Ad revenue is extra. It is not the offer.</w:t>
+      </w:r>
+    </w:p>
+    <w:p>
+      <w:r>
+        <w:rPr>
+          <w:rFonts w:ascii="Calibri" w:hAnsi="Calibri"/>
+        </w:rPr>
+        <w:t>Chapter 6 is six weeks to get that offer in front of strangers. Chapter 7 is wording you can paste and then make true. Chapter 8 is the notebook. Chapter 9 is what to fix when nothing sells.</w:t>
+      </w:r>
+    </w:p>
+    <w:p>
+      <w:r>
+        <w:rPr>
+          <w:rFonts w:ascii="Calibri" w:hAnsi="Calibri"/>
+        </w:rPr>
+        <w:t>Character limits, export settings, and eligibility rules are facts you can check in the product. They move. The planning numbers in this book are arithmetic, not promises of income. This is not legal, tax, or official platform advice.</w:t>
       </w:r>
     </w:p>
     <w:p>
@@ -180,9 +280,362 @@
         <w:pStyle w:val="Heading1"/>
       </w:pPr>
       <w:r>
-        <w:t>1 The Click Is the Whole Business</w:t>
+        <w:t>1 Sell One Thing</w:t>
       </w:r>
       <w:bookmarkEnd w:id="2"/>
+    </w:p>
+    <w:p>
+      <w:r>
+        <w:rPr>
+          <w:rFonts w:ascii="Calibri" w:hAnsi="Calibri"/>
+          <w:i/>
+        </w:rPr>
+        <w:t>A channel that sells has one thing a stranger can buy. Views are not that thing.</w:t>
+      </w:r>
+    </w:p>
+    <w:p>
+      <w:r>
+        <w:rPr>
+          <w:rFonts w:ascii="Calibri" w:hAnsi="Calibri"/>
+        </w:rPr>
+        <w:t>The title of this book is a job description. A channel that sells does not mean a channel with a lot of views, a round subscriber number, or a monetization badge you hope will arrive later. It means a stranger can watch a video, understand one offer, and pay for it. Everything else in this book — the click, the cheap production, the platform thresholds — exists to make that sale more likely and less expensive to attempt.</w:t>
+      </w:r>
+    </w:p>
+    <w:p>
+      <w:r>
+        <w:rPr>
+          <w:rFonts w:ascii="Calibri" w:hAnsi="Calibri"/>
+        </w:rPr>
+        <w:t>If you cannot name the offer in one sentence, you do not have a channel that sells yet. You have a place to post. Posting is allowed. It is not the goal.</w:t>
+      </w:r>
+    </w:p>
+    <w:p>
+      <w:pPr>
+        <w:pStyle w:val="Heading2"/>
+      </w:pPr>
+      <w:r>
+        <w:t>I. Name the buyer before the topic</w:t>
+      </w:r>
+    </w:p>
+    <w:p>
+      <w:r>
+        <w:rPr>
+          <w:rFonts w:ascii="Calibri" w:hAnsi="Calibri"/>
+        </w:rPr>
+        <w:t>A topic is not a buyer. “Fitness,” “personal finance,” and “home repair” describe shelves. A buyer is a person with a situation and a reason to spend money on it.</w:t>
+      </w:r>
+    </w:p>
+    <w:p>
+      <w:r>
+        <w:rPr>
+          <w:rFonts w:ascii="Calibri" w:hAnsi="Calibri"/>
+        </w:rPr>
+        <w:t>Finish this sentence before you design a banner: “This channel helps [specific person] who wants [specific result] and is willing to pay for [specific offer].” If the last bracket is “my videos,” rewrite it. The video is how they find the offer. It is not the offer, unless you are selling a course and the video is the sample of that course.</w:t>
+      </w:r>
+    </w:p>
+    <w:p>
+      <w:r>
+        <w:rPr>
+          <w:rFonts w:ascii="Calibri" w:hAnsi="Calibri"/>
+        </w:rPr>
+        <w:t>Write a second sentence: “This channel is a poor fit for people who want [different result].” A retirement-planning channel that also tries to serve day traders will teach neither of them well enough to earn the trust a purchase requires. Narrowing is not a branding exercise. It is how you stop making videos for people who will never buy.</w:t>
+      </w:r>
+    </w:p>
+    <w:p>
+      <w:pPr>
+        <w:pStyle w:val="Heading2"/>
+      </w:pPr>
+      <w:r>
+        <w:t>II. One offer, on purpose</w:t>
+      </w:r>
+    </w:p>
+    <w:p>
+      <w:r>
+        <w:rPr>
+          <w:rFonts w:ascii="Calibri" w:hAnsi="Calibri"/>
+        </w:rPr>
+        <w:t>Pick one of these for the first ninety days. You may add a second later. You may not start with all three and call it a business.</w:t>
+      </w:r>
+    </w:p>
+    <w:p>
+      <w:pPr>
+        <w:pStyle w:val="ListBullet"/>
+      </w:pPr>
+      <w:r>
+        <w:rPr>
+          <w:rFonts w:ascii="Calibri" w:hAnsi="Calibri"/>
+          <w:b/>
+        </w:rPr>
+        <w:t>A thing you made.</w:t>
+      </w:r>
+      <w:r>
+        <w:rPr>
+          <w:rFonts w:ascii="Calibri" w:hAnsi="Calibri"/>
+        </w:rPr>
+        <w:t xml:space="preserve"> A short paid guide, a template pack, a recorded class, a physical product you can ship. You keep most of the money. You also own the support.</w:t>
+      </w:r>
+    </w:p>
+    <w:p>
+      <w:pPr>
+        <w:pStyle w:val="ListBullet"/>
+      </w:pPr>
+      <w:r>
+        <w:rPr>
+          <w:rFonts w:ascii="Calibri" w:hAnsi="Calibri"/>
+          <w:b/>
+        </w:rPr>
+        <w:t>A service you do.</w:t>
+      </w:r>
+      <w:r>
+        <w:rPr>
+          <w:rFonts w:ascii="Calibri" w:hAnsi="Calibri"/>
+        </w:rPr>
+        <w:t xml:space="preserve"> An audit, a setup, a consult, a done-for-you job with a written scope. One clear price or a small menu of two. “Message me for rates” is not an offer.</w:t>
+      </w:r>
+    </w:p>
+    <w:p>
+      <w:pPr>
+        <w:pStyle w:val="ListBullet"/>
+      </w:pPr>
+      <w:r>
+        <w:rPr>
+          <w:rFonts w:ascii="Calibri" w:hAnsi="Calibri"/>
+          <w:b/>
+        </w:rPr>
+        <w:t>Someone else’s product, with a disclosed affiliate link.</w:t>
+      </w:r>
+      <w:r>
+        <w:rPr>
+          <w:rFonts w:ascii="Calibri" w:hAnsi="Calibri"/>
+        </w:rPr>
+        <w:t xml:space="preserve"> You recommend a tool or book you would use anyway, and you are paid if the viewer buys. The link has to be allowed on the platform, and the disclosure has to sit next to the link, not in a footnote. The money chapter covers placement. This chapter only requires that you choose the product before you film the recommendation.</w:t>
+      </w:r>
+    </w:p>
+    <w:p>
+      <w:r>
+        <w:rPr>
+          <w:rFonts w:ascii="Calibri" w:hAnsi="Calibri"/>
+        </w:rPr>
+        <w:t>Ad revenue from a platform partner program is not this offer. It can become extra income after the thresholds in the money chapter. It is a slow, uncertain side effect of attention. Do not build the channel as if the badge is the product. A channel with no offer can be popular and still sell nothing you control.</w:t>
+      </w:r>
+    </w:p>
+    <w:p>
+      <w:pPr>
+        <w:pStyle w:val="Heading2"/>
+      </w:pPr>
+      <w:r>
+        <w:t>III. The promise the video has to keep</w:t>
+      </w:r>
+    </w:p>
+    <w:p>
+      <w:r>
+        <w:rPr>
+          <w:rFonts w:ascii="Calibri" w:hAnsi="Calibri"/>
+        </w:rPr>
+        <w:t>Write the offer the way you would say it out loud at the end of a video, in under twenty seconds:</w:t>
+      </w:r>
+    </w:p>
+    <w:p>
+      <w:r>
+        <w:rPr>
+          <w:rFonts w:ascii="Calibri" w:hAnsi="Calibri"/>
+        </w:rPr>
+        <w:t>“If you want [result], I made [offer]. It costs [price]. Here is the link. You do not have to buy it to use what this video already taught you.”</w:t>
+      </w:r>
+    </w:p>
+    <w:p>
+      <w:r>
+        <w:rPr>
+          <w:rFonts w:ascii="Calibri" w:hAnsi="Calibri"/>
+        </w:rPr>
+        <w:t>That last sentence matters. A useful video that withholds the actual steps until checkout trains people to distrust you. Give the teaching away. Sell the faster path, the template, the personal help, or the tool that saves the work. The scam version is a video that promises a method and delivers only a pitch. Do not make that video.</w:t>
+      </w:r>
+    </w:p>
+    <w:p>
+      <w:r>
+        <w:rPr>
+          <w:rFonts w:ascii="Calibri" w:hAnsi="Calibri"/>
+        </w:rPr>
+        <w:t>Check the promise against the product. If the guide says it includes a checklist, the file includes a checklist. If the service says “one revision,” the page says what a revision is. Disappointment after payment is more expensive than a slow start, because the same viewers tell other people.</w:t>
+      </w:r>
+    </w:p>
+    <w:p>
+      <w:pPr>
+        <w:pStyle w:val="Heading2"/>
+      </w:pPr>
+      <w:r>
+        <w:t>IV. A price you can explain</w:t>
+      </w:r>
+    </w:p>
+    <w:p>
+      <w:r>
+        <w:rPr>
+          <w:rFonts w:ascii="Calibri" w:hAnsi="Calibri"/>
+        </w:rPr>
+        <w:t>You do not need a perfect price. You need a price you can say without flinching, and a reason you would change it.</w:t>
+      </w:r>
+    </w:p>
+    <w:p>
+      <w:r>
+        <w:rPr>
+          <w:rFonts w:ascii="Calibri" w:hAnsi="Calibri"/>
+        </w:rPr>
+        <w:t>Use arithmetic, not a feeling. These figures are hypothetical planning numbers, not typical results.</w:t>
+      </w:r>
+    </w:p>
+    <w:p>
+      <w:r>
+        <w:rPr>
+          <w:rFonts w:ascii="Calibri" w:hAnsi="Calibri"/>
+        </w:rPr>
+        <w:t>Suppose the offer earns you $30 after fees on each sale. Suppose, as a planning guess you will replace with your own count, that 2 of every 100 people who watch the video where you make the offer go on to buy. You need about 50 views of that video for one sale, and about $30 of earnings. If those 50 views cost you more than $30 in ads or in time you cannot spare, the offer is not carrying the channel yet. Change the offer, the video, or the price. Do not answer that result by posting more videos with no offer in them.</w:t>
+      </w:r>
+    </w:p>
+    <w:p>
+      <w:r>
+        <w:rPr>
+          <w:rFonts w:ascii="Calibri" w:hAnsi="Calibri"/>
+        </w:rPr>
+        <w:t>A service priced at $150 with the same 2-in-100 guess needs only the same 50 views to earn $150. Fewer buyers can be a better business than many buyers of a $9 file, if you can deliver the service without drowning. Write down which one you can actually fulfill this month.</w:t>
+      </w:r>
+    </w:p>
+    <w:p>
+      <w:pPr>
+        <w:pStyle w:val="Heading2"/>
+      </w:pPr>
+      <w:r>
+        <w:t>V. Put the sale where a stranger can reach it</w:t>
+      </w:r>
+    </w:p>
+    <w:p>
+      <w:r>
+        <w:rPr>
+          <w:rFonts w:ascii="Calibri" w:hAnsi="Calibri"/>
+        </w:rPr>
+        <w:t>The sale does not happen inside the player unless the platform gives you a product shelf and you are eligible to use it. For almost every new channel, the sale happens at a link: a simple page with the name of the offer, the price, what is included, and a way to pay or book.</w:t>
+      </w:r>
+    </w:p>
+    <w:p>
+      <w:r>
+        <w:rPr>
+          <w:rFonts w:ascii="Calibri" w:hAnsi="Calibri"/>
+        </w:rPr>
+        <w:t>Before the first video, that page exists. The channel description links to it. The video where you explain the offer links to it in the first two lines of the description and in the pinned comment. One primary link. A row of six competing links is a menu, and menus are where undecided people go to leave.</w:t>
+      </w:r>
+    </w:p>
+    <w:p>
+      <w:r>
+        <w:rPr>
+          <w:rFonts w:ascii="Calibri" w:hAnsi="Calibri"/>
+        </w:rPr>
+        <w:t>If you are not ready to take money, you are not ready to call the channel a channel that sells. A waitlist with no offer is a delay. A free email list is allowed as a step only if you say what they will be offered and when. “Join my community” is not a sale.</w:t>
+      </w:r>
+    </w:p>
+    <w:p>
+      <w:pPr>
+        <w:pStyle w:val="Heading2"/>
+      </w:pPr>
+      <w:r>
+        <w:t>VI. Do this before you film</w:t>
+      </w:r>
+    </w:p>
+    <w:p>
+      <w:r>
+        <w:rPr>
+          <w:rFonts w:ascii="Calibri" w:hAnsi="Calibri"/>
+        </w:rPr>
+        <w:t>Write the buyer sentence, the unfit-viewer sentence, and the twenty-second offer. Create the page with the price on it. Put that single link in the channel description. If you cannot do those four things, the next chapters will help you get watched and will not help you get paid.</w:t>
+      </w:r>
+    </w:p>
+    <w:p>
+      <w:pPr>
+        <w:pStyle w:val="Heading2"/>
+      </w:pPr>
+      <w:r>
+        <w:t>VII. Claims that do not survive a checkout page</w:t>
+      </w:r>
+    </w:p>
+    <w:p>
+      <w:pPr>
+        <w:pStyle w:val="ListBullet"/>
+      </w:pPr>
+      <w:r>
+        <w:rPr>
+          <w:rFonts w:ascii="Calibri" w:hAnsi="Calibri"/>
+        </w:rPr>
+        <w:t>That a channel sells once it has subscribers. Subscribers are people who might see the next video. They are not customers until they pay.</w:t>
+      </w:r>
+    </w:p>
+    <w:p>
+      <w:pPr>
+        <w:pStyle w:val="ListBullet"/>
+      </w:pPr>
+      <w:r>
+        <w:rPr>
+          <w:rFonts w:ascii="Calibri" w:hAnsi="Calibri"/>
+        </w:rPr>
+        <w:t>That you should wait for a partner program before you sell anything. The program pays the platform’s advertisers. Your offer pays you on a sale you can see.</w:t>
+      </w:r>
+    </w:p>
+    <w:p>
+      <w:pPr>
+        <w:pStyle w:val="ListBullet"/>
+      </w:pPr>
+      <w:r>
+        <w:rPr>
+          <w:rFonts w:ascii="Calibri" w:hAnsi="Calibri"/>
+        </w:rPr>
+        <w:t>That more offers convert better than one. One clear offer gives a new viewer a decision. Five offers give them an excuse to make none.</w:t>
+      </w:r>
+    </w:p>
+    <w:p>
+      <w:pPr>
+        <w:pStyle w:val="ListBullet"/>
+      </w:pPr>
+      <w:r>
+        <w:rPr>
+          <w:rFonts w:ascii="Calibri" w:hAnsi="Calibri"/>
+        </w:rPr>
+        <w:t>That the best videos never mention the product. A teaching video can stand alone and still end with one honest next step. Hiding the offer is not integrity. It is a missing price tag.</w:t>
+      </w:r>
+    </w:p>
+    <w:p>
+      <w:pPr>
+        <w:pStyle w:val="ListBullet"/>
+      </w:pPr>
+      <w:r>
+        <w:rPr>
+          <w:rFonts w:ascii="Calibri" w:hAnsi="Calibri"/>
+        </w:rPr>
+        <w:t>That a specific conversion rate is normal. The 2-in-100 figure above is a planning placeholder. Replace it with your own count after the offer video has real views. Until then it is arithmetic, not a promise.</w:t>
+      </w:r>
+    </w:p>
+    <w:p>
+      <w:r>
+        <w:rPr>
+          <w:rFonts w:ascii="Calibri" w:hAnsi="Calibri"/>
+        </w:rPr>
+        <w:t>A last limit. This chapter will not choose your niche for you, and it will not make a weak product sell. It will refuse the version of a channel that posts for months and still has nothing a stranger can buy.</w:t>
+      </w:r>
+    </w:p>
+    <w:p>
+      <w:r>
+        <w:rPr>
+          <w:rFonts w:ascii="Calibri" w:hAnsi="Calibri"/>
+          <w:i/>
+        </w:rPr>
+        <w:t>Sources: The distinction between an offer and platform ad revenue follows from how those programs pay, as described in the money chapter of this book. The conversion arithmetic is a hypothetical planning example, not a measured rate. Disclosure expectations for affiliate recommendations are the same practical rule stated in that money chapter: say that the link pays you, next to the link. Not legal, tax, or platform-policy advice.</w:t>
+      </w:r>
+    </w:p>
+    <w:p>
+      <w:bookmarkStart w:id="3" w:name="ch2"/>
+      <w:pPr>
+        <w:pStyle w:val="Heading1"/>
+      </w:pPr>
+      <w:r>
+        <w:t>2 The Click Is the Whole Business</w:t>
+      </w:r>
+      <w:bookmarkEnd w:id="3"/>
     </w:p>
     <w:p>
       <w:r>
@@ -981,14 +1434,14 @@
       </w:r>
     </w:p>
     <w:p>
-      <w:bookmarkStart w:id="3" w:name="ch2"/>
+      <w:bookmarkStart w:id="4" w:name="ch3"/>
       <w:pPr>
         <w:pStyle w:val="Heading1"/>
       </w:pPr>
       <w:r>
-        <w:t>2 Nobody Can Tell What It Cost</w:t>
-      </w:r>
-      <w:bookmarkEnd w:id="3"/>
+        <w:t>3 Nobody Can Tell What It Cost</w:t>
+      </w:r>
+      <w:bookmarkEnd w:id="4"/>
     </w:p>
     <w:p>
       <w:r>
@@ -2591,7 +3044,7 @@
         <w:rPr>
           <w:rFonts w:ascii="Calibri" w:hAnsi="Calibri"/>
         </w:rPr>
-        <w:t xml:space="preserve"> does the reverse job — turning a recorded voice into text — which is worth knowing about specifically because that transcript can go straight into the caption workflow this book’s first chapter covers, rather than requiring a second, separate transcription pass.</w:t>
+        <w:t xml:space="preserve"> does the reverse job — turning a recorded voice into text — which is worth knowing about specifically because that transcript can go straight into the caption workflow in The Click Is the Whole Business, rather than requiring a second, separate transcription pass.</w:t>
       </w:r>
     </w:p>
     <w:p>
@@ -2825,7 +3278,7 @@
         <w:rPr>
           <w:rFonts w:ascii="Calibri" w:hAnsi="Calibri"/>
         </w:rPr>
-        <w:t>That auto-transcribed narration is caption-ready the moment it is generated. It still needs the same review pass this book’s first chapter describes for automatic captions — a transcription tool mishears the same way a captioning one does.</w:t>
+        <w:t>That auto-transcribed narration is caption-ready the moment it is generated. It still needs the same review pass the click chapter describes for automatic captions — a transcription tool mishears the same way a captioning one does.</w:t>
       </w:r>
     </w:p>
     <w:p>
@@ -2898,14 +3351,393 @@
       </w:r>
     </w:p>
     <w:p>
-      <w:bookmarkStart w:id="4" w:name="ch3"/>
+      <w:bookmarkStart w:id="5" w:name="ch4"/>
       <w:pPr>
         <w:pStyle w:val="Heading1"/>
       </w:pPr>
       <w:r>
-        <w:t>3 Where the Money Actually Comes From</w:t>
-      </w:r>
-      <w:bookmarkEnd w:id="4"/>
+        <w:t>4 The Videos That Do the Selling</w:t>
+      </w:r>
+      <w:bookmarkEnd w:id="5"/>
+    </w:p>
+    <w:p>
+      <w:r>
+        <w:rPr>
+          <w:rFonts w:ascii="Calibri" w:hAnsi="Calibri"/>
+          <w:i/>
+        </w:rPr>
+        <w:t>Eight videos, each with one job. A channel that sells is a small set of videos that point at one offer, not a pile of posts.</w:t>
+      </w:r>
+    </w:p>
+    <w:p>
+      <w:r>
+        <w:rPr>
+          <w:rFonts w:ascii="Calibri" w:hAnsi="Calibri"/>
+        </w:rPr>
+        <w:t>Once the offer exists, the channel needs videos that do work. “Content” is not work. A video either helps a specific buyer decide, or it fills a calendar. Calendars feel productive. Buyers pay.</w:t>
+      </w:r>
+    </w:p>
+    <w:p>
+      <w:r>
+        <w:rPr>
+          <w:rFonts w:ascii="Calibri" w:hAnsi="Calibri"/>
+        </w:rPr>
+        <w:t>You do not need thirty videos to find out whether the offer can sell. You need a short set you can finish, each aimed at one question the buyer already has. Make them in the cheap way the production chapter describes. Package them the way the click chapter describes. Point them at the single link from the offer chapter.</w:t>
+      </w:r>
+    </w:p>
+    <w:p>
+      <w:pPr>
+        <w:pStyle w:val="Heading2"/>
+      </w:pPr>
+      <w:r>
+        <w:t>I. Give every video one job</w:t>
+      </w:r>
+    </w:p>
+    <w:p>
+      <w:r>
+        <w:rPr>
+          <w:rFonts w:ascii="Calibri" w:hAnsi="Calibri"/>
+        </w:rPr>
+        <w:t>Before you write a title, write the job in a single line: “After this video, the viewer can [do one thing] or can decide whether [the offer] is for them.” If the line needs “and,” split the video.</w:t>
+      </w:r>
+    </w:p>
+    <w:p>
+      <w:r>
+        <w:rPr>
+          <w:rFonts w:ascii="Calibri" w:hAnsi="Calibri"/>
+        </w:rPr>
+        <w:t>Jobs that sell, used in this order:</w:t>
+      </w:r>
+    </w:p>
+    <w:p>
+      <w:pPr>
+        <w:pStyle w:val="ListNumber"/>
+      </w:pPr>
+      <w:r>
+        <w:rPr>
+          <w:rFonts w:ascii="Calibri" w:hAnsi="Calibri"/>
+          <w:b/>
+        </w:rPr>
+        <w:t>Who it is for.</w:t>
+      </w:r>
+      <w:r>
+        <w:rPr>
+          <w:rFonts w:ascii="Calibri" w:hAnsi="Calibri"/>
+        </w:rPr>
+        <w:t xml:space="preserve"> The buyer recognizes themselves in the first ten seconds. People who are not the buyer can leave without feeling tricked.</w:t>
+      </w:r>
+    </w:p>
+    <w:p>
+      <w:pPr>
+        <w:pStyle w:val="ListNumber"/>
+      </w:pPr>
+      <w:r>
+        <w:rPr>
+          <w:rFonts w:ascii="Calibri" w:hAnsi="Calibri"/>
+          <w:b/>
+        </w:rPr>
+        <w:t>The problem, in their words.</w:t>
+      </w:r>
+      <w:r>
+        <w:rPr>
+          <w:rFonts w:ascii="Calibri" w:hAnsi="Calibri"/>
+        </w:rPr>
+        <w:t xml:space="preserve"> Use the phrase they would type, not the clever name you prefer. The click chapter’s rule still applies: describe the situation, not a crisis word that can suppress the video.</w:t>
+      </w:r>
+    </w:p>
+    <w:p>
+      <w:pPr>
+        <w:pStyle w:val="ListNumber"/>
+      </w:pPr>
+      <w:r>
+        <w:rPr>
+          <w:rFonts w:ascii="Calibri" w:hAnsi="Calibri"/>
+          <w:b/>
+        </w:rPr>
+        <w:t>The method, given away.</w:t>
+      </w:r>
+      <w:r>
+        <w:rPr>
+          <w:rFonts w:ascii="Calibri" w:hAnsi="Calibri"/>
+        </w:rPr>
+        <w:t xml:space="preserve"> Show the real steps. A withheld step is a leak in trust. The offer, later, is the shortcut, the template, or the help, not the half you hid.</w:t>
+      </w:r>
+    </w:p>
+    <w:p>
+      <w:pPr>
+        <w:pStyle w:val="ListNumber"/>
+      </w:pPr>
+      <w:r>
+        <w:rPr>
+          <w:rFonts w:ascii="Calibri" w:hAnsi="Calibri"/>
+          <w:b/>
+        </w:rPr>
+        <w:t>Proof it can be done.</w:t>
+      </w:r>
+      <w:r>
+        <w:rPr>
+          <w:rFonts w:ascii="Calibri" w:hAnsi="Calibri"/>
+        </w:rPr>
+        <w:t xml:space="preserve"> A before and after, a worked example, a walk-through with numbers you actually have. Invented results are a lie, and lies do not survive a refund.</w:t>
+      </w:r>
+    </w:p>
+    <w:p>
+      <w:pPr>
+        <w:pStyle w:val="ListNumber"/>
+      </w:pPr>
+      <w:r>
+        <w:rPr>
+          <w:rFonts w:ascii="Calibri" w:hAnsi="Calibri"/>
+          <w:b/>
+        </w:rPr>
+        <w:t>The comparison.</w:t>
+      </w:r>
+      <w:r>
+        <w:rPr>
+          <w:rFonts w:ascii="Calibri" w:hAnsi="Calibri"/>
+        </w:rPr>
+        <w:t xml:space="preserve"> What you recommend versus the common alternative, including “do it by hand.” Say who should not buy.</w:t>
+      </w:r>
+    </w:p>
+    <w:p>
+      <w:pPr>
+        <w:pStyle w:val="ListNumber"/>
+      </w:pPr>
+      <w:r>
+        <w:rPr>
+          <w:rFonts w:ascii="Calibri" w:hAnsi="Calibri"/>
+          <w:b/>
+        </w:rPr>
+        <w:t>The objection.</w:t>
+      </w:r>
+      <w:r>
+        <w:rPr>
+          <w:rFonts w:ascii="Calibri" w:hAnsi="Calibri"/>
+        </w:rPr>
+        <w:t xml:space="preserve"> Price, time, skill, “I tried this before.” Answer one objection per video. Do not stack them into a speech.</w:t>
+      </w:r>
+    </w:p>
+    <w:p>
+      <w:pPr>
+        <w:pStyle w:val="ListNumber"/>
+      </w:pPr>
+      <w:r>
+        <w:rPr>
+          <w:rFonts w:ascii="Calibri" w:hAnsi="Calibri"/>
+          <w:b/>
+        </w:rPr>
+        <w:t>The offer.</w:t>
+      </w:r>
+      <w:r>
+        <w:rPr>
+          <w:rFonts w:ascii="Calibri" w:hAnsi="Calibri"/>
+        </w:rPr>
+        <w:t xml:space="preserve"> The twenty-second version from the offer chapter, filmed as its own short video and also spoken once at the end of the others.</w:t>
+      </w:r>
+    </w:p>
+    <w:p>
+      <w:pPr>
+        <w:pStyle w:val="ListNumber"/>
+      </w:pPr>
+      <w:r>
+        <w:rPr>
+          <w:rFonts w:ascii="Calibri" w:hAnsi="Calibri"/>
+          <w:b/>
+        </w:rPr>
+        <w:t>The next video.</w:t>
+      </w:r>
+      <w:r>
+        <w:rPr>
+          <w:rFonts w:ascii="Calibri" w:hAnsi="Calibri"/>
+        </w:rPr>
+        <w:t xml:space="preserve"> Tell them which of the seven to watch next, by name. A channel that sells is a path, not a feed.</w:t>
+      </w:r>
+    </w:p>
+    <w:p>
+      <w:r>
+        <w:rPr>
+          <w:rFonts w:ascii="Calibri" w:hAnsi="Calibri"/>
+        </w:rPr>
+        <w:t>That is the first eight. You may post shorts that point at these. You do not need a ninth idea until these eight exist and the offer link has been clicked by someone who is not you.</w:t>
+      </w:r>
+    </w:p>
+    <w:p>
+      <w:pPr>
+        <w:pStyle w:val="Heading2"/>
+      </w:pPr>
+      <w:r>
+        <w:t>II. The offer video is not a commercial with nothing in it</w:t>
+      </w:r>
+    </w:p>
+    <w:p>
+      <w:r>
+        <w:rPr>
+          <w:rFonts w:ascii="Calibri" w:hAnsi="Calibri"/>
+        </w:rPr>
+        <w:t>The offer video still teaches. Open with the result, show one piece of the method so the viewer sees you know it, then say what the paid version adds and what it costs. Put the link in the first two lines of the description and in the pinned comment. Say that an affiliate link pays you, if it does.</w:t>
+      </w:r>
+    </w:p>
+    <w:p>
+      <w:r>
+        <w:rPr>
+          <w:rFonts w:ascii="Calibri" w:hAnsi="Calibri"/>
+        </w:rPr>
+        <w:t>Keep it short enough that you can remake it when the price or the scope changes. A twelve-minute commercial about your feelings is not an offer video. A four-minute video that shows the checklist and then sells the filled-in version is.</w:t>
+      </w:r>
+    </w:p>
+    <w:p>
+      <w:pPr>
+        <w:pStyle w:val="Heading2"/>
+      </w:pPr>
+      <w:r>
+        <w:t>III. Titles that sell name the buyer’s job</w:t>
+      </w:r>
+    </w:p>
+    <w:p>
+      <w:r>
+        <w:rPr>
+          <w:rFonts w:ascii="Calibri" w:hAnsi="Calibri"/>
+        </w:rPr>
+        <w:t>Use the click chapter’s formula — keyword, benefit, hook — and add one constraint: the keyword is the buyer’s problem, not your brand. “How I grew my channel” is about you. “How to price a bathroom repair so the quote matches the work” is about a buyer, if that is your offer. The second one can sell. The first one can only flatter you.</w:t>
+      </w:r>
+    </w:p>
+    <w:p>
+      <w:r>
+        <w:rPr>
+          <w:rFonts w:ascii="Calibri" w:hAnsi="Calibri"/>
+        </w:rPr>
+        <w:t>Write the title before you film, and write the one action you will ask for at the end in the same sitting. If you cannot say the action, you do not know the job yet.</w:t>
+      </w:r>
+    </w:p>
+    <w:p>
+      <w:pPr>
+        <w:pStyle w:val="Heading2"/>
+      </w:pPr>
+      <w:r>
+        <w:t>IV. Stop when the set is done</w:t>
+      </w:r>
+    </w:p>
+    <w:p>
+      <w:r>
+        <w:rPr>
+          <w:rFonts w:ascii="Calibri" w:hAnsi="Calibri"/>
+        </w:rPr>
+        <w:t>Eight finished videos aimed at one offer beat forty videos aimed at “the algorithm.” The posting rhythm in the click chapter is a floor for staying visible, not an order to invent topics. If you can publish one of the eight a week, publish one of the eight a week. If a week is too fast to keep the teaching accurate, slow down. A wrong video that contradicts the offer does more damage than a quiet week.</w:t>
+      </w:r>
+    </w:p>
+    <w:p>
+      <w:r>
+        <w:rPr>
+          <w:rFonts w:ascii="Calibri" w:hAnsi="Calibri"/>
+        </w:rPr>
+        <w:t>When the eight are live, look at one number before you invent video nine: did anyone reach the offer page from a video? Not views. Not likes. The page. If the page was never visited, the next video is not a new topic. It is a clearer path from a video you already have — a better title, a link in the first lines, a pinned comment, an end that says the name of the offer.</w:t>
+      </w:r>
+    </w:p>
+    <w:p>
+      <w:pPr>
+        <w:pStyle w:val="Heading2"/>
+      </w:pPr>
+      <w:r>
+        <w:t>V. Do this before you batch-film</w:t>
+      </w:r>
+    </w:p>
+    <w:p>
+      <w:r>
+        <w:rPr>
+          <w:rFonts w:ascii="Calibri" w:hAnsi="Calibri"/>
+        </w:rPr>
+        <w:t>List the eight jobs with a working title under each. Mark the offer video. Confirm each title would make sense to the buyer in section I of the offer chapter, and that none of them require a tool or a claim you cannot show. Film the “who it is for” video and the offer video first. Those two, with the link live, are enough to test whether a stranger understands what you sell.</w:t>
+      </w:r>
+    </w:p>
+    <w:p>
+      <w:pPr>
+        <w:pStyle w:val="Heading2"/>
+      </w:pPr>
+      <w:r>
+        <w:t>VI. Claims that do not survive the offer page</w:t>
+      </w:r>
+    </w:p>
+    <w:p>
+      <w:pPr>
+        <w:pStyle w:val="ListBullet"/>
+      </w:pPr>
+      <w:r>
+        <w:rPr>
+          <w:rFonts w:ascii="Calibri" w:hAnsi="Calibri"/>
+        </w:rPr>
+        <w:t>That you should post for months before you mention a product. Mention it when the video’s job is to help the buyer decide. Mention it briefly when the job is to teach. Silence is not a strategy.</w:t>
+      </w:r>
+    </w:p>
+    <w:p>
+      <w:pPr>
+        <w:pStyle w:val="ListBullet"/>
+      </w:pPr>
+      <w:r>
+        <w:rPr>
+          <w:rFonts w:ascii="Calibri" w:hAnsi="Calibri"/>
+        </w:rPr>
+        <w:t>That viral videos sell the offer by themselves. A video can be widely watched by people who are not the buyer. Wide and unpaid is a hobby with an audience.</w:t>
+      </w:r>
+    </w:p>
+    <w:p>
+      <w:pPr>
+        <w:pStyle w:val="ListBullet"/>
+      </w:pPr>
+      <w:r>
+        <w:rPr>
+          <w:rFonts w:ascii="Calibri" w:hAnsi="Calibri"/>
+        </w:rPr>
+        <w:t>That you need daily uploads to deserve a sale. You need a path from the video to one link. Frequency does not replace that path.</w:t>
+      </w:r>
+    </w:p>
+    <w:p>
+      <w:pPr>
+        <w:pStyle w:val="ListBullet"/>
+      </w:pPr>
+      <w:r>
+        <w:rPr>
+          <w:rFonts w:ascii="Calibri" w:hAnsi="Calibri"/>
+        </w:rPr>
+        <w:t>That proof can be a screenshot you found. Proof is a result you can explain. If you do not have one yet, show the method on a small real example and do not invent a larger one.</w:t>
+      </w:r>
+    </w:p>
+    <w:p>
+      <w:pPr>
+        <w:pStyle w:val="ListBullet"/>
+      </w:pPr>
+      <w:r>
+        <w:rPr>
+          <w:rFonts w:ascii="Calibri" w:hAnsi="Calibri"/>
+        </w:rPr>
+        <w:t>That the next video should chase whatever got the most views. Chase the video that sent people to the offer, or fix the one that should have and did not.</w:t>
+      </w:r>
+    </w:p>
+    <w:p>
+      <w:r>
+        <w:rPr>
+          <w:rFonts w:ascii="Calibri" w:hAnsi="Calibri"/>
+        </w:rPr>
+        <w:t>A last limit. This chapter will not hand you a niche or a script for your life. It will refuse a content calendar that has no offer video on it.</w:t>
+      </w:r>
+    </w:p>
+    <w:p>
+      <w:r>
+        <w:rPr>
+          <w:rFonts w:ascii="Calibri" w:hAnsi="Calibri"/>
+          <w:i/>
+        </w:rPr>
+        <w:t>Sources: Title structure refers to the click chapter of this book. Production cost refers to the production chapter. No platform ranking formula is claimed here. The instruction to watch the offer page rather than views is editorial guidance for a channel whose goal is a sale. Not platform-policy advice.</w:t>
+      </w:r>
+    </w:p>
+    <w:p>
+      <w:bookmarkStart w:id="6" w:name="ch5"/>
+      <w:pPr>
+        <w:pStyle w:val="Heading1"/>
+      </w:pPr>
+      <w:r>
+        <w:t>5 Where the Money Actually Comes From</w:t>
+      </w:r>
+      <w:bookmarkEnd w:id="6"/>
     </w:p>
     <w:p>
       <w:r>
@@ -4392,21 +5224,1508 @@
       </w:r>
     </w:p>
     <w:p>
-      <w:bookmarkStart w:id="5" w:name="ch4"/>
+      <w:bookmarkStart w:id="7" w:name="ch6"/>
       <w:pPr>
         <w:pStyle w:val="Heading1"/>
       </w:pPr>
       <w:r>
+        <w:t>6 Six Weeks to a Live Offer</w:t>
+      </w:r>
+      <w:bookmarkEnd w:id="7"/>
+    </w:p>
+    <w:p>
+      <w:r>
+        <w:rPr>
+          <w:rFonts w:ascii="Calibri" w:hAnsi="Calibri"/>
+          <w:i/>
+        </w:rPr>
+        <w:t>A calendar for getting one offer in front of strangers. Move the dates. Do not skip the offer.</w:t>
+      </w:r>
+    </w:p>
+    <w:p>
+      <w:r>
+        <w:rPr>
+          <w:rFonts w:ascii="Calibri" w:hAnsi="Calibri"/>
+        </w:rPr>
+        <w:t>Use this as a frame, the way you would use a launch calendar for a book. If a step is not true yet — the page does not take payment, the example in the video is fake, the license on the footage is unread — move the date. A channel that goes live with nothing to buy has followed a posting schedule and missed the title of this book.</w:t>
+      </w:r>
+    </w:p>
+    <w:p>
+      <w:r>
+        <w:rPr>
+          <w:rFonts w:ascii="Calibri" w:hAnsi="Calibri"/>
+        </w:rPr>
+        <w:t>Hours below are a modest pace for one person using the free tools in the production chapter. If you have less time, stretch a week into two. Do not delete the offer to save an evening.</w:t>
+      </w:r>
+    </w:p>
+    <w:p>
+      <w:pPr>
+        <w:pStyle w:val="Heading2"/>
+      </w:pPr>
+      <w:r>
+        <w:t>I. Week one: the offer on a page</w:t>
+      </w:r>
+    </w:p>
+    <w:p>
+      <w:r>
+        <w:rPr>
+          <w:rFonts w:ascii="Calibri" w:hAnsi="Calibri"/>
+        </w:rPr>
+        <w:t>Write the buyer sentence, the unfit-viewer sentence, and the twenty-second offer. Choose one of the three offer types. Put a price on the page, or a booking link with the scope written in plain language. Read it aloud. If you stumble, the viewer will leave.</w:t>
+      </w:r>
+    </w:p>
+    <w:p>
+      <w:r>
+        <w:rPr>
+          <w:rFonts w:ascii="Calibri" w:hAnsi="Calibri"/>
+        </w:rPr>
+        <w:t>Set up the channel only as far as the offer needs: a name a buyer understands, a description whose first lines say who it helps and contain the link, and a banner you can read on a phone. Skip the logo exploration. The page is the product. The banner is a sign.</w:t>
+      </w:r>
+    </w:p>
+    <w:p>
+      <w:pPr>
+        <w:pStyle w:val="Heading2"/>
+      </w:pPr>
+      <w:r>
+        <w:t>II. Week two: two videos, not eight</w:t>
+      </w:r>
+    </w:p>
+    <w:p>
+      <w:r>
+        <w:rPr>
+          <w:rFonts w:ascii="Calibri" w:hAnsi="Calibri"/>
+        </w:rPr>
+        <w:t>Film “who it is for” and the offer video. Package them with the click chapter’s limits: keyword first in the title, benefit in the first lines of the description, one link, pinned comment with the same link. Review the captions before you publish. A misheard price in the automatic captions is a broken offer.</w:t>
+      </w:r>
+    </w:p>
+    <w:p>
+      <w:r>
+        <w:rPr>
+          <w:rFonts w:ascii="Calibri" w:hAnsi="Calibri"/>
+        </w:rPr>
+        <w:t>Publish both in the same week if they are ready. Tell three people who match the buyer sentence, not three people who like you, and ask them to try to find the price without your help. If they cannot, fix the description before you make video three.</w:t>
+      </w:r>
+    </w:p>
+    <w:p>
+      <w:pPr>
+        <w:pStyle w:val="Heading2"/>
+      </w:pPr>
+      <w:r>
+        <w:t>III. Week three: the method, given away</w:t>
+      </w:r>
+    </w:p>
+    <w:p>
+      <w:r>
+        <w:rPr>
+          <w:rFonts w:ascii="Calibri" w:hAnsi="Calibri"/>
+        </w:rPr>
+        <w:t>Film the method video. Show the steps you would be embarrassed to hide. Export it with the settings in the production chapter. Publish it with the same single link, and say once, near the end, what the paid version adds.</w:t>
+      </w:r>
+    </w:p>
+    <w:p>
+      <w:r>
+        <w:rPr>
+          <w:rFonts w:ascii="Calibri" w:hAnsi="Calibri"/>
+        </w:rPr>
+        <w:t>This is the week most people skip, because giving the method away feels like losing the sale. It is the opposite. The viewer who can finish a small version alone is the viewer who believes you can help with the larger one.</w:t>
+      </w:r>
+    </w:p>
+    <w:p>
+      <w:pPr>
+        <w:pStyle w:val="Heading2"/>
+      </w:pPr>
+      <w:r>
+        <w:t>IV. Week four: proof and one objection</w:t>
+      </w:r>
+    </w:p>
+    <w:p>
+      <w:r>
+        <w:rPr>
+          <w:rFonts w:ascii="Calibri" w:hAnsi="Calibri"/>
+        </w:rPr>
+        <w:t>Film proof you actually have. If the proof is small, say it is small. Film one objection video: the reason a sensible buyer hesitates, answered without insulting them.</w:t>
+      </w:r>
+    </w:p>
+    <w:p>
+      <w:r>
+        <w:rPr>
+          <w:rFonts w:ascii="Calibri" w:hAnsi="Calibri"/>
+        </w:rPr>
+        <w:t>Check the offer page again. Does it match what these videos now promise? Update the page before you update the thumbnails. A sharper thumbnail sending people to a stale page is a faster way to disappoint them.</w:t>
+      </w:r>
+    </w:p>
+    <w:p>
+      <w:pPr>
+        <w:pStyle w:val="Heading2"/>
+      </w:pPr>
+      <w:r>
+        <w:t>V. Week five: comparison, then quiet measurement</w:t>
+      </w:r>
+    </w:p>
+    <w:p>
+      <w:r>
+        <w:rPr>
+          <w:rFonts w:ascii="Calibri" w:hAnsi="Calibri"/>
+        </w:rPr>
+        <w:t>Film the comparison: your offer versus the usual alternative, including doing nothing. Publish it. Then stop making new videos for several days and read only these counts, written down with the date:</w:t>
+      </w:r>
+    </w:p>
+    <w:p>
+      <w:pPr>
+        <w:pStyle w:val="ListBullet"/>
+      </w:pPr>
+      <w:r>
+        <w:rPr>
+          <w:rFonts w:ascii="Calibri" w:hAnsi="Calibri"/>
+        </w:rPr>
+        <w:t>Views on the offer video.</w:t>
+      </w:r>
+    </w:p>
+    <w:p>
+      <w:pPr>
+        <w:pStyle w:val="ListBullet"/>
+      </w:pPr>
+      <w:r>
+        <w:rPr>
+          <w:rFonts w:ascii="Calibri" w:hAnsi="Calibri"/>
+        </w:rPr>
+        <w:t>Clicks from your videos to the offer page, if your page or the platform shows them. If you cannot see clicks, count visits to the page another honest way, or ask the three buyers from week two what they clicked.</w:t>
+      </w:r>
+    </w:p>
+    <w:p>
+      <w:pPr>
+        <w:pStyle w:val="ListBullet"/>
+      </w:pPr>
+      <w:r>
+        <w:rPr>
+          <w:rFonts w:ascii="Calibri" w:hAnsi="Calibri"/>
+        </w:rPr>
+        <w:t>Payments, including zero.</w:t>
+      </w:r>
+    </w:p>
+    <w:p>
+      <w:pPr>
+        <w:pStyle w:val="ListBullet"/>
+      </w:pPr>
+      <w:r>
+        <w:rPr>
+          <w:rFonts w:ascii="Calibri" w:hAnsi="Calibri"/>
+        </w:rPr>
+        <w:t>The question people actually asked, in their words.</w:t>
+      </w:r>
+    </w:p>
+    <w:p>
+      <w:r>
+        <w:rPr>
+          <w:rFonts w:ascii="Calibri" w:hAnsi="Calibri"/>
+        </w:rPr>
+        <w:t>Do not change the price, the title, and the offer in the same week. You would not know which change mattered.</w:t>
+      </w:r>
+    </w:p>
+    <w:p>
+      <w:pPr>
+        <w:pStyle w:val="Heading2"/>
+      </w:pPr>
+      <w:r>
+        <w:t>VI. Week six: one decision</w:t>
+      </w:r>
+    </w:p>
+    <w:p>
+      <w:r>
+        <w:rPr>
+          <w:rFonts w:ascii="Calibri" w:hAnsi="Calibri"/>
+        </w:rPr>
+        <w:t>Choose one of these, and write the reason in a sentence:</w:t>
+      </w:r>
+    </w:p>
+    <w:p>
+      <w:pPr>
+        <w:pStyle w:val="ListBullet"/>
+      </w:pPr>
+      <w:r>
+        <w:rPr>
+          <w:rFonts w:ascii="Calibri" w:hAnsi="Calibri"/>
+          <w:b/>
+        </w:rPr>
+        <w:t>Keep the offer and make the remaining videos</w:t>
+      </w:r>
+      <w:r>
+        <w:rPr>
+          <w:rFonts w:ascii="Calibri" w:hAnsi="Calibri"/>
+        </w:rPr>
+        <w:t xml:space="preserve"> from the eight-video set, because someone who is not a friend reached the page or paid.</w:t>
+      </w:r>
+    </w:p>
+    <w:p>
+      <w:pPr>
+        <w:pStyle w:val="ListBullet"/>
+      </w:pPr>
+      <w:r>
+        <w:rPr>
+          <w:rFonts w:ascii="Calibri" w:hAnsi="Calibri"/>
+          <w:b/>
+        </w:rPr>
+        <w:t>Rewrite the offer video and the first lines of the description,</w:t>
+      </w:r>
+      <w:r>
+        <w:rPr>
+          <w:rFonts w:ascii="Calibri" w:hAnsi="Calibri"/>
+        </w:rPr>
+        <w:t xml:space="preserve"> because people watched and did not reach the page.</w:t>
+      </w:r>
+    </w:p>
+    <w:p>
+      <w:pPr>
+        <w:pStyle w:val="ListBullet"/>
+      </w:pPr>
+      <w:r>
+        <w:rPr>
+          <w:rFonts w:ascii="Calibri" w:hAnsi="Calibri"/>
+          <w:b/>
+        </w:rPr>
+        <w:t>Change the offer,</w:t>
+      </w:r>
+      <w:r>
+        <w:rPr>
+          <w:rFonts w:ascii="Calibri" w:hAnsi="Calibri"/>
+        </w:rPr>
+        <w:t xml:space="preserve"> because people reached the page and the same objection showed up twice. Change the price, the scope, or the buyer. Do not change all three.</w:t>
+      </w:r>
+    </w:p>
+    <w:p>
+      <w:pPr>
+        <w:pStyle w:val="ListBullet"/>
+      </w:pPr>
+      <w:r>
+        <w:rPr>
+          <w:rFonts w:ascii="Calibri" w:hAnsi="Calibri"/>
+          <w:b/>
+        </w:rPr>
+        <w:t>Stop spending money to push it,</w:t>
+      </w:r>
+      <w:r>
+        <w:rPr>
+          <w:rFonts w:ascii="Calibri" w:hAnsi="Calibri"/>
+        </w:rPr>
+        <w:t xml:space="preserve"> if you bought ads or a boost and the page still got no visits from strangers. Fix the path before you buy more attention.</w:t>
+      </w:r>
+    </w:p>
+    <w:p>
+      <w:r>
+        <w:rPr>
+          <w:rFonts w:ascii="Calibri" w:hAnsi="Calibri"/>
+        </w:rPr>
+        <w:t>Then schedule the next four weeks as production of the videos you still lack, not as a new niche. A second niche in week six is how a channel that might have sold becomes two hobbies.</w:t>
+      </w:r>
+    </w:p>
+    <w:p>
+      <w:pPr>
+        <w:pStyle w:val="Heading2"/>
+      </w:pPr>
+      <w:r>
+        <w:t>VII. Do this on paper first</w:t>
+      </w:r>
+    </w:p>
+    <w:p>
+      <w:r>
+        <w:rPr>
+          <w:rFonts w:ascii="Calibri" w:hAnsi="Calibri"/>
+        </w:rPr>
+        <w:t>Copy the six weeks onto one page with your real dates. Put the offer-page link at the top. If a week has no task that touches the offer, that week is optional. The filming is not optional forever. The offer is not optional at all.</w:t>
+      </w:r>
+    </w:p>
+    <w:p>
+      <w:pPr>
+        <w:pStyle w:val="Heading2"/>
+      </w:pPr>
+      <w:r>
+        <w:t>VIII. Claims that do not survive week six</w:t>
+      </w:r>
+    </w:p>
+    <w:p>
+      <w:pPr>
+        <w:pStyle w:val="ListBullet"/>
+      </w:pPr>
+      <w:r>
+        <w:rPr>
+          <w:rFonts w:ascii="Calibri" w:hAnsi="Calibri"/>
+        </w:rPr>
+        <w:t>That six weeks is a guarantee of income. It is a deadline for learning whether a stranger can find the price. Income is the later count.</w:t>
+      </w:r>
+    </w:p>
+    <w:p>
+      <w:pPr>
+        <w:pStyle w:val="ListBullet"/>
+      </w:pPr>
+      <w:r>
+        <w:rPr>
+          <w:rFonts w:ascii="Calibri" w:hAnsi="Calibri"/>
+        </w:rPr>
+        <w:t>That you should wait to publish until all eight videos are perfect. Two honest videos and a live price teach you more than eight private drafts.</w:t>
+      </w:r>
+    </w:p>
+    <w:p>
+      <w:pPr>
+        <w:pStyle w:val="ListBullet"/>
+      </w:pPr>
+      <w:r>
+        <w:rPr>
+          <w:rFonts w:ascii="Calibri" w:hAnsi="Calibri"/>
+        </w:rPr>
+        <w:t>That a quiet week means the topic is dead. Quiet means you do not have evidence yet. Evidence is page visits and payments, not a feeling about the niche.</w:t>
+      </w:r>
+    </w:p>
+    <w:p>
+      <w:pPr>
+        <w:pStyle w:val="ListBullet"/>
+      </w:pPr>
+      <w:r>
+        <w:rPr>
+          <w:rFonts w:ascii="Calibri" w:hAnsi="Calibri"/>
+        </w:rPr>
+        <w:t>That ads can replace weeks two through five. Ads send strangers to whatever you already published. If the path is missing, you paid to show them a gap.</w:t>
+      </w:r>
+    </w:p>
+    <w:p>
+      <w:pPr>
+        <w:pStyle w:val="ListBullet"/>
+      </w:pPr>
+      <w:r>
+        <w:rPr>
+          <w:rFonts w:ascii="Calibri" w:hAnsi="Calibri"/>
+        </w:rPr>
+        <w:t>That changing everything in week six is decisive. One change, then another quiet measurement, is decisive. A new banner, a new niche, and a new price is a new project.</w:t>
+      </w:r>
+    </w:p>
+    <w:p>
+      <w:r>
+        <w:rPr>
+          <w:rFonts w:ascii="Calibri" w:hAnsi="Calibri"/>
+        </w:rPr>
+        <w:t>A last limit. This calendar will not negotiate with a missing price. If the page cannot take money or a booking by the end of week one, week two does not start.</w:t>
+      </w:r>
+    </w:p>
+    <w:p>
+      <w:r>
+        <w:rPr>
+          <w:rFonts w:ascii="Calibri" w:hAnsi="Calibri"/>
+          <w:i/>
+        </w:rPr>
+        <w:t>Sources: Packaging limits and caption review refer to the click chapter. Export settings refer to the production chapter. The six-week frame is editorial planning, not a platform requirement and not a forecast of sales. Not legal or tax advice.</w:t>
+      </w:r>
+    </w:p>
+    <w:p>
+      <w:bookmarkStart w:id="8" w:name="ch7"/>
+      <w:pPr>
+        <w:pStyle w:val="Heading1"/>
+      </w:pPr>
+      <w:r>
+        <w:t>7 Say This</w:t>
+      </w:r>
+      <w:bookmarkEnd w:id="8"/>
+    </w:p>
+    <w:p>
+      <w:r>
+        <w:rPr>
+          <w:rFonts w:ascii="Calibri" w:hAnsi="Calibri"/>
+          <w:i/>
+        </w:rPr>
+        <w:t>Words you can paste and then make true. Replace every bracket. Delete any sentence that is not yet real.</w:t>
+      </w:r>
+    </w:p>
+    <w:p>
+      <w:r>
+        <w:rPr>
+          <w:rFonts w:ascii="Calibri" w:hAnsi="Calibri"/>
+        </w:rPr>
+        <w:t>These are your words, not a script for a viewer’s comment and not a fake testimonial. If a sentence overclaims, cut it. A channel that sells says a smaller true thing.</w:t>
+      </w:r>
+    </w:p>
+    <w:p>
+      <w:pPr>
+        <w:pStyle w:val="Heading2"/>
+      </w:pPr>
+      <w:r>
+        <w:t>I. Channel description</w:t>
+      </w:r>
+    </w:p>
+    <w:p>
+      <w:r>
+        <w:rPr>
+          <w:rFonts w:ascii="Calibri" w:hAnsi="Calibri"/>
+        </w:rPr>
+        <w:t>I help [specific person] who wants [specific result].</w:t>
+      </w:r>
+    </w:p>
+    <w:p>
+      <w:r>
+        <w:rPr>
+          <w:rFonts w:ascii="Calibri" w:hAnsi="Calibri"/>
+        </w:rPr>
+        <w:t>The offer is [name of offer] — [what it includes] for [price].</w:t>
+      </w:r>
+    </w:p>
+    <w:p>
+      <w:r>
+        <w:rPr>
+          <w:rFonts w:ascii="Calibri" w:hAnsi="Calibri"/>
+        </w:rPr>
+        <w:t>Start here: [one link]</w:t>
+      </w:r>
+    </w:p>
+    <w:p>
+      <w:r>
+        <w:rPr>
+          <w:rFonts w:ascii="Calibri" w:hAnsi="Calibri"/>
+        </w:rPr>
+        <w:t>New videos walk through [the method] so you can do a small version yourself. The paid version is for when you want [the shortcut, template, or help].</w:t>
+      </w:r>
+    </w:p>
+    <w:p>
+      <w:pPr>
+        <w:pStyle w:val="Heading2"/>
+      </w:pPr>
+      <w:r>
+        <w:t>II. Description of a teaching video</w:t>
+      </w:r>
+    </w:p>
+    <w:p>
+      <w:r>
+        <w:rPr>
+          <w:rFonts w:ascii="Calibri" w:hAnsi="Calibri"/>
+        </w:rPr>
+        <w:t>[Buyer’s problem, in their words]. This video shows [the one job of this video].</w:t>
+      </w:r>
+    </w:p>
+    <w:p>
+      <w:r>
+        <w:rPr>
+          <w:rFonts w:ascii="Calibri" w:hAnsi="Calibri"/>
+        </w:rPr>
+        <w:t>I cover [three concrete steps, named].</w:t>
+      </w:r>
+    </w:p>
+    <w:p>
+      <w:r>
+        <w:rPr>
+          <w:rFonts w:ascii="Calibri" w:hAnsi="Calibri"/>
+        </w:rPr>
+        <w:t>If you want the [offer] instead of doing it from scratch, it is here: [one link]. [If affiliate: This is an affiliate link. I earn a commission if you buy, at no extra cost to you.]</w:t>
+      </w:r>
+    </w:p>
+    <w:p>
+      <w:r>
+        <w:rPr>
+          <w:rFonts w:ascii="Calibri" w:hAnsi="Calibri"/>
+        </w:rPr>
+        <w:t>Chapters: 0:00 [who it is for] [timestamp] [step] [timestamp] [what the offer adds]</w:t>
+      </w:r>
+    </w:p>
+    <w:p>
+      <w:pPr>
+        <w:pStyle w:val="Heading2"/>
+      </w:pPr>
+      <w:r>
+        <w:t>III. Description of the offer video</w:t>
+      </w:r>
+    </w:p>
+    <w:p>
+      <w:r>
+        <w:rPr>
+          <w:rFonts w:ascii="Calibri" w:hAnsi="Calibri"/>
+        </w:rPr>
+        <w:t>[Offer name] is for [specific person] who wants [result].</w:t>
+      </w:r>
+    </w:p>
+    <w:p>
+      <w:r>
+        <w:rPr>
+          <w:rFonts w:ascii="Calibri" w:hAnsi="Calibri"/>
+        </w:rPr>
+        <w:t>It includes [list]. It costs [price]. It does not include [the thing buyers often assume].</w:t>
+      </w:r>
+    </w:p>
+    <w:p>
+      <w:r>
+        <w:rPr>
+          <w:rFonts w:ascii="Calibri" w:hAnsi="Calibri"/>
+        </w:rPr>
+        <w:t>Get it here: [one link]</w:t>
+      </w:r>
+    </w:p>
+    <w:p>
+      <w:r>
+        <w:rPr>
+          <w:rFonts w:ascii="Calibri" w:hAnsi="Calibri"/>
+        </w:rPr>
+        <w:t>You can do the basic version with the free steps in this video. The link is the faster path, not a locked door.</w:t>
+      </w:r>
+    </w:p>
+    <w:p>
+      <w:pPr>
+        <w:pStyle w:val="Heading2"/>
+      </w:pPr>
+      <w:r>
+        <w:t>IV. Pinned comment</w:t>
+      </w:r>
+    </w:p>
+    <w:p>
+      <w:r>
+        <w:rPr>
+          <w:rFonts w:ascii="Calibri" w:hAnsi="Calibri"/>
+        </w:rPr>
+        <w:t>The link for [offer name] is [one link]. [Price]. [One sentence on what is included.] [Affiliate disclosure in the same comment, if it applies.]</w:t>
+      </w:r>
+    </w:p>
+    <w:p>
+      <w:pPr>
+        <w:pStyle w:val="Heading2"/>
+      </w:pPr>
+      <w:r>
+        <w:t>V. The twenty seconds at the end of a video</w:t>
+      </w:r>
+    </w:p>
+    <w:p>
+      <w:r>
+        <w:rPr>
+          <w:rFonts w:ascii="Calibri" w:hAnsi="Calibri"/>
+        </w:rPr>
+        <w:t>If you want [result] without building [the tedious part] yourself, I made [offer name]. It is [price] and it includes [the single most useful part]. The link is in the first line of the description and in the pinned comment. If you would rather do it yourself, the steps in this video are enough.</w:t>
+      </w:r>
+    </w:p>
+    <w:p>
+      <w:pPr>
+        <w:pStyle w:val="Heading2"/>
+      </w:pPr>
+      <w:r>
+        <w:t>VI. The reply when someone asks the price in a comment</w:t>
+      </w:r>
+    </w:p>
+    <w:p>
+      <w:r>
+        <w:rPr>
+          <w:rFonts w:ascii="Calibri" w:hAnsi="Calibri"/>
+        </w:rPr>
+        <w:t>[Offer name] is [price]. Here is what is included: [one sentence]. Link: [one link]. Happy to answer a question about fit. I do not change the price in the comments.</w:t>
+      </w:r>
+    </w:p>
+    <w:p>
+      <w:pPr>
+        <w:pStyle w:val="Heading2"/>
+      </w:pPr>
+      <w:r>
+        <w:t>VII. What you do not say</w:t>
+      </w:r>
+    </w:p>
+    <w:p>
+      <w:r>
+        <w:rPr>
+          <w:rFonts w:ascii="Calibri" w:hAnsi="Calibri"/>
+        </w:rPr>
+        <w:t>Do not say the video will change their life, guarantee income, or “blow up” their own channel. Do not tell a viewer to comment a keyword so you can pretend the comment count is demand. Do not ask for a subscription in the same breath as the price. One ask. The ask that matches a channel that sells is the offer, not the bell.</w:t>
+      </w:r>
+    </w:p>
+    <w:p>
+      <w:r>
+        <w:rPr>
+          <w:rFonts w:ascii="Calibri" w:hAnsi="Calibri"/>
+        </w:rPr>
+        <w:t>Do not paste a review you wrote yourself. If a buyer tells you a result, ask before you quote them, and do not enlarge the result.</w:t>
+      </w:r>
+    </w:p>
+    <w:p>
+      <w:pPr>
+        <w:pStyle w:val="Heading2"/>
+      </w:pPr>
+      <w:r>
+        <w:t>VIII. Claims that do not survive being read aloud</w:t>
+      </w:r>
+    </w:p>
+    <w:p>
+      <w:pPr>
+        <w:pStyle w:val="ListBullet"/>
+      </w:pPr>
+      <w:r>
+        <w:rPr>
+          <w:rFonts w:ascii="Calibri" w:hAnsi="Calibri"/>
+        </w:rPr>
+        <w:t>That clever copy outperforms a clear price. The buyer has to find the number. Cleverness that hides it is a lost sale.</w:t>
+      </w:r>
+    </w:p>
+    <w:p>
+      <w:pPr>
+        <w:pStyle w:val="ListBullet"/>
+      </w:pPr>
+      <w:r>
+        <w:rPr>
+          <w:rFonts w:ascii="Calibri" w:hAnsi="Calibri"/>
+        </w:rPr>
+        <w:t>That you need a different link in every video. One primary link. Different videos may explain different parts. They send people to the same offer until that offer has earned a second one.</w:t>
+      </w:r>
+    </w:p>
+    <w:p>
+      <w:pPr>
+        <w:pStyle w:val="ListBullet"/>
+      </w:pPr>
+      <w:r>
+        <w:rPr>
+          <w:rFonts w:ascii="Calibri" w:hAnsi="Calibri"/>
+        </w:rPr>
+        <w:t>That disclosure ruins affiliate sales. Hiding an affiliate relationship ruins trust, and on many platforms it breaks the rule. Say it next to the link.</w:t>
+      </w:r>
+    </w:p>
+    <w:p>
+      <w:pPr>
+        <w:pStyle w:val="ListBullet"/>
+      </w:pPr>
+      <w:r>
+        <w:rPr>
+          <w:rFonts w:ascii="Calibri" w:hAnsi="Calibri"/>
+        </w:rPr>
+        <w:t>That the description can wait until you are “bigger.” The description is the shelf. A video with no shelf can be watched and still sell nothing.</w:t>
+      </w:r>
+    </w:p>
+    <w:p>
+      <w:r>
+        <w:rPr>
+          <w:rFonts w:ascii="Calibri" w:hAnsi="Calibri"/>
+        </w:rPr>
+        <w:t>A last limit. If you would be ashamed to say the filled-in version to a careful person, do not publish it. Rewrite the offer until the sentences are dull and true.</w:t>
+      </w:r>
+    </w:p>
+    <w:p>
+      <w:r>
+        <w:rPr>
+          <w:rFonts w:ascii="Calibri" w:hAnsi="Calibri"/>
+          <w:i/>
+        </w:rPr>
+        <w:t>Sources: These are author templates, not platform-required wording. Affiliate disclosure is editorial guidance consistent with the money chapter; confirm the current rule on the platform where you post and, for U.S. advertising claims, the FTC’s endorsement guidance. Not legal advice.</w:t>
+      </w:r>
+    </w:p>
+    <w:p>
+      <w:bookmarkStart w:id="9" w:name="ch8"/>
+      <w:pPr>
+        <w:pStyle w:val="Heading1"/>
+      </w:pPr>
+      <w:r>
+        <w:t>8 The Channel Workbook</w:t>
+      </w:r>
+      <w:bookmarkEnd w:id="9"/>
+    </w:p>
+    <w:p>
+      <w:r>
+        <w:rPr>
+          <w:rFonts w:ascii="Calibri" w:hAnsi="Calibri"/>
+          <w:i/>
+        </w:rPr>
+        <w:t>Copy these into a notebook. Keep the first answers so you can see what you changed.</w:t>
+      </w:r>
+    </w:p>
+    <w:p>
+      <w:r>
+        <w:rPr>
+          <w:rFonts w:ascii="Calibri" w:hAnsi="Calibri"/>
+        </w:rPr>
+        <w:t>A channel that sells leaves a trail: who it was for, what it cost, what you asked people to buy, and what they did. Memory is a poor record. The point of these sheets is to stop you from “improving” three things at once and then guessing which one mattered.</w:t>
+      </w:r>
+    </w:p>
+    <w:p>
+      <w:pPr>
+        <w:pStyle w:val="Heading2"/>
+      </w:pPr>
+      <w:r>
+        <w:t>I. Buyer sheet</w:t>
+      </w:r>
+    </w:p>
+    <w:p>
+      <w:r>
+        <w:rPr>
+          <w:rFonts w:ascii="Calibri" w:hAnsi="Calibri"/>
+        </w:rPr>
+        <w:t>Who the channel is for:</w:t>
+      </w:r>
+    </w:p>
+    <w:p>
+      <w:r>
+        <w:rPr>
+          <w:rFonts w:ascii="Calibri" w:hAnsi="Calibri"/>
+        </w:rPr>
+        <w:t>The result they want:</w:t>
+      </w:r>
+    </w:p>
+    <w:p>
+      <w:r>
+        <w:rPr>
+          <w:rFonts w:ascii="Calibri" w:hAnsi="Calibri"/>
+        </w:rPr>
+        <w:t>Who it is not for:</w:t>
+      </w:r>
+    </w:p>
+    <w:p>
+      <w:r>
+        <w:rPr>
+          <w:rFonts w:ascii="Calibri" w:hAnsi="Calibri"/>
+        </w:rPr>
+        <w:t>The phrase they would type into search:</w:t>
+      </w:r>
+    </w:p>
+    <w:p>
+      <w:r>
+        <w:rPr>
+          <w:rFonts w:ascii="Calibri" w:hAnsi="Calibri"/>
+        </w:rPr>
+        <w:t>The promise in one sentence:</w:t>
+      </w:r>
+    </w:p>
+    <w:p>
+      <w:r>
+        <w:rPr>
+          <w:rFonts w:ascii="Calibri" w:hAnsi="Calibri"/>
+        </w:rPr>
+        <w:t>One proof you actually have:</w:t>
+      </w:r>
+    </w:p>
+    <w:p>
+      <w:pPr>
+        <w:pStyle w:val="Heading2"/>
+      </w:pPr>
+      <w:r>
+        <w:t>II. Offer sheet</w:t>
+      </w:r>
+    </w:p>
+    <w:p>
+      <w:r>
+        <w:rPr>
+          <w:rFonts w:ascii="Calibri" w:hAnsi="Calibri"/>
+        </w:rPr>
+        <w:t>Offer type: thing you made / service / affiliate</w:t>
+      </w:r>
+    </w:p>
+    <w:p>
+      <w:r>
+        <w:rPr>
+          <w:rFonts w:ascii="Calibri" w:hAnsi="Calibri"/>
+        </w:rPr>
+        <w:t>Name:</w:t>
+      </w:r>
+    </w:p>
+    <w:p>
+      <w:r>
+        <w:rPr>
+          <w:rFonts w:ascii="Calibri" w:hAnsi="Calibri"/>
+        </w:rPr>
+        <w:t>Price after fees:</w:t>
+      </w:r>
+    </w:p>
+    <w:p>
+      <w:r>
+        <w:rPr>
+          <w:rFonts w:ascii="Calibri" w:hAnsi="Calibri"/>
+        </w:rPr>
+        <w:t>What is included:</w:t>
+      </w:r>
+    </w:p>
+    <w:p>
+      <w:r>
+        <w:rPr>
+          <w:rFonts w:ascii="Calibri" w:hAnsi="Calibri"/>
+        </w:rPr>
+        <w:t>What is not included:</w:t>
+      </w:r>
+    </w:p>
+    <w:p>
+      <w:r>
+        <w:rPr>
+          <w:rFonts w:ascii="Calibri" w:hAnsi="Calibri"/>
+        </w:rPr>
+        <w:t>The page link:</w:t>
+      </w:r>
+    </w:p>
+    <w:p>
+      <w:r>
+        <w:rPr>
+          <w:rFonts w:ascii="Calibri" w:hAnsi="Calibri"/>
+        </w:rPr>
+        <w:t>The twenty-second spoken version:</w:t>
+      </w:r>
+    </w:p>
+    <w:p>
+      <w:r>
+        <w:rPr>
+          <w:rFonts w:ascii="Calibri" w:hAnsi="Calibri"/>
+        </w:rPr>
+        <w:t>What would make you change the price:</w:t>
+      </w:r>
+    </w:p>
+    <w:p>
+      <w:r>
+        <w:rPr>
+          <w:rFonts w:ascii="Calibri" w:hAnsi="Calibri"/>
+        </w:rPr>
+        <w:t>Can you deliver ten sales this month without breaking the promise: yes / no</w:t>
+      </w:r>
+    </w:p>
+    <w:p>
+      <w:pPr>
+        <w:pStyle w:val="Heading2"/>
+      </w:pPr>
+      <w:r>
+        <w:t>III. The eight videos</w:t>
+      </w:r>
+    </w:p>
+    <w:p>
+      <w:r>
+        <w:rPr>
+          <w:rFonts w:ascii="Calibri" w:hAnsi="Calibri"/>
+        </w:rPr>
+        <w:t>For each, write the job, the working title, and the one action at the end.</w:t>
+      </w:r>
+    </w:p>
+    <w:p>
+      <w:pPr>
+        <w:pStyle w:val="ListNumber"/>
+      </w:pPr>
+      <w:r>
+        <w:rPr>
+          <w:rFonts w:ascii="Calibri" w:hAnsi="Calibri"/>
+        </w:rPr>
+        <w:t>Who it is for —</w:t>
+      </w:r>
+    </w:p>
+    <w:p>
+      <w:pPr>
+        <w:pStyle w:val="ListNumber"/>
+      </w:pPr>
+      <w:r>
+        <w:rPr>
+          <w:rFonts w:ascii="Calibri" w:hAnsi="Calibri"/>
+        </w:rPr>
+        <w:t>The problem in their words —</w:t>
+      </w:r>
+    </w:p>
+    <w:p>
+      <w:pPr>
+        <w:pStyle w:val="ListNumber"/>
+      </w:pPr>
+      <w:r>
+        <w:rPr>
+          <w:rFonts w:ascii="Calibri" w:hAnsi="Calibri"/>
+        </w:rPr>
+        <w:t>The method, given away —</w:t>
+      </w:r>
+    </w:p>
+    <w:p>
+      <w:pPr>
+        <w:pStyle w:val="ListNumber"/>
+      </w:pPr>
+      <w:r>
+        <w:rPr>
+          <w:rFonts w:ascii="Calibri" w:hAnsi="Calibri"/>
+        </w:rPr>
+        <w:t>Proof —</w:t>
+      </w:r>
+    </w:p>
+    <w:p>
+      <w:pPr>
+        <w:pStyle w:val="ListNumber"/>
+      </w:pPr>
+      <w:r>
+        <w:rPr>
+          <w:rFonts w:ascii="Calibri" w:hAnsi="Calibri"/>
+        </w:rPr>
+        <w:t>Comparison —</w:t>
+      </w:r>
+    </w:p>
+    <w:p>
+      <w:pPr>
+        <w:pStyle w:val="ListNumber"/>
+      </w:pPr>
+      <w:r>
+        <w:rPr>
+          <w:rFonts w:ascii="Calibri" w:hAnsi="Calibri"/>
+        </w:rPr>
+        <w:t>One objection —</w:t>
+      </w:r>
+    </w:p>
+    <w:p>
+      <w:pPr>
+        <w:pStyle w:val="ListNumber"/>
+      </w:pPr>
+      <w:r>
+        <w:rPr>
+          <w:rFonts w:ascii="Calibri" w:hAnsi="Calibri"/>
+        </w:rPr>
+        <w:t>The offer —</w:t>
+      </w:r>
+    </w:p>
+    <w:p>
+      <w:pPr>
+        <w:pStyle w:val="ListNumber"/>
+      </w:pPr>
+      <w:r>
+        <w:rPr>
+          <w:rFonts w:ascii="Calibri" w:hAnsi="Calibri"/>
+        </w:rPr>
+        <w:t>Which video to watch next —</w:t>
+      </w:r>
+    </w:p>
+    <w:p>
+      <w:r>
+        <w:rPr>
+          <w:rFonts w:ascii="Calibri" w:hAnsi="Calibri"/>
+        </w:rPr>
+        <w:t>Offer video published on:</w:t>
+      </w:r>
+    </w:p>
+    <w:p>
+      <w:r>
+        <w:rPr>
+          <w:rFonts w:ascii="Calibri" w:hAnsi="Calibri"/>
+        </w:rPr>
+        <w:t>Link in the first two description lines: yes / no</w:t>
+      </w:r>
+    </w:p>
+    <w:p>
+      <w:r>
+        <w:rPr>
+          <w:rFonts w:ascii="Calibri" w:hAnsi="Calibri"/>
+        </w:rPr>
+        <w:t>Pinned comment matches that link: yes / no</w:t>
+      </w:r>
+    </w:p>
+    <w:p>
+      <w:pPr>
+        <w:pStyle w:val="Heading2"/>
+      </w:pPr>
+      <w:r>
+        <w:t>IV. Week sheet</w:t>
+      </w:r>
+    </w:p>
+    <w:p>
+      <w:r>
+        <w:rPr>
+          <w:rFonts w:ascii="Calibri" w:hAnsi="Calibri"/>
+        </w:rPr>
+        <w:t>Week of:</w:t>
+      </w:r>
+    </w:p>
+    <w:p>
+      <w:r>
+        <w:rPr>
+          <w:rFonts w:ascii="Calibri" w:hAnsi="Calibri"/>
+        </w:rPr>
+        <w:t>What you published:</w:t>
+      </w:r>
+    </w:p>
+    <w:p>
+      <w:r>
+        <w:rPr>
+          <w:rFonts w:ascii="Calibri" w:hAnsi="Calibri"/>
+        </w:rPr>
+        <w:t>Views on the offer video:</w:t>
+      </w:r>
+    </w:p>
+    <w:p>
+      <w:r>
+        <w:rPr>
+          <w:rFonts w:ascii="Calibri" w:hAnsi="Calibri"/>
+        </w:rPr>
+        <w:t>Visits or clicks to the offer page:</w:t>
+      </w:r>
+    </w:p>
+    <w:p>
+      <w:r>
+        <w:rPr>
+          <w:rFonts w:ascii="Calibri" w:hAnsi="Calibri"/>
+        </w:rPr>
+        <w:t>Payments:</w:t>
+      </w:r>
+    </w:p>
+    <w:p>
+      <w:r>
+        <w:rPr>
+          <w:rFonts w:ascii="Calibri" w:hAnsi="Calibri"/>
+        </w:rPr>
+        <w:t>The question people asked, in their words:</w:t>
+      </w:r>
+    </w:p>
+    <w:p>
+      <w:r>
+        <w:rPr>
+          <w:rFonts w:ascii="Calibri" w:hAnsi="Calibri"/>
+        </w:rPr>
+        <w:t>The one thing you will change next, and the date you will look again:</w:t>
+      </w:r>
+    </w:p>
+    <w:p>
+      <w:r>
+        <w:rPr>
+          <w:rFonts w:ascii="Calibri" w:hAnsi="Calibri"/>
+        </w:rPr>
+        <w:t>What you will not change this week:</w:t>
+      </w:r>
+    </w:p>
+    <w:p>
+      <w:pPr>
+        <w:pStyle w:val="Heading2"/>
+      </w:pPr>
+      <w:r>
+        <w:t>V. Money sheet</w:t>
+      </w:r>
+    </w:p>
+    <w:p>
+      <w:r>
+        <w:rPr>
+          <w:rFonts w:ascii="Calibri" w:hAnsi="Calibri"/>
+        </w:rPr>
+        <w:t>Cost to make this week’s video, in money and in hours:</w:t>
+      </w:r>
+    </w:p>
+    <w:p>
+      <w:r>
+        <w:rPr>
+          <w:rFonts w:ascii="Calibri" w:hAnsi="Calibri"/>
+        </w:rPr>
+        <w:t>Money spent to promote it:</w:t>
+      </w:r>
+    </w:p>
+    <w:p>
+      <w:r>
+        <w:rPr>
+          <w:rFonts w:ascii="Calibri" w:hAnsi="Calibri"/>
+        </w:rPr>
+        <w:t>Earnings from the offer:</w:t>
+      </w:r>
+    </w:p>
+    <w:p>
+      <w:r>
+        <w:rPr>
+          <w:rFonts w:ascii="Calibri" w:hAnsi="Calibri"/>
+        </w:rPr>
+        <w:t>Earnings from any platform program, kept separate:</w:t>
+      </w:r>
+    </w:p>
+    <w:p>
+      <w:r>
+        <w:rPr>
+          <w:rFonts w:ascii="Calibri" w:hAnsi="Calibri"/>
+        </w:rPr>
+        <w:t>Net this week: earnings minus promotion minus money spent making it</w:t>
+      </w:r>
+    </w:p>
+    <w:p>
+      <w:r>
+        <w:rPr>
+          <w:rFonts w:ascii="Calibri" w:hAnsi="Calibri"/>
+        </w:rPr>
+        <w:t>Hours are not nothing. If the video took ten hours and earned $20, write that down. You do not have to quit. You do have to see it. A channel that sells is allowed to be small. It is not allowed to pretend hours were free if you needed those hours for rent.</w:t>
+      </w:r>
+    </w:p>
+    <w:p>
+      <w:r>
+        <w:rPr>
+          <w:rFonts w:ascii="Calibri" w:hAnsi="Calibri"/>
+        </w:rPr>
+        <w:t>Platform ad money does not get mixed into offer money. They answer different questions. The money chapter is where the platform thresholds live. This sheet is where your offer either paid you or did not.</w:t>
+      </w:r>
+    </w:p>
+    <w:p>
+      <w:pPr>
+        <w:pStyle w:val="Heading2"/>
+      </w:pPr>
+      <w:r>
+        <w:t>VI. Decision log</w:t>
+      </w:r>
+    </w:p>
+    <w:p>
+      <w:r>
+        <w:rPr>
+          <w:rFonts w:ascii="Calibri" w:hAnsi="Calibri"/>
+        </w:rPr>
+        <w:t>Date:</w:t>
+      </w:r>
+    </w:p>
+    <w:p>
+      <w:r>
+        <w:rPr>
+          <w:rFonts w:ascii="Calibri" w:hAnsi="Calibri"/>
+        </w:rPr>
+        <w:t>What you changed:</w:t>
+      </w:r>
+    </w:p>
+    <w:p>
+      <w:r>
+        <w:rPr>
+          <w:rFonts w:ascii="Calibri" w:hAnsi="Calibri"/>
+        </w:rPr>
+        <w:t>What you left alone:</w:t>
+      </w:r>
+    </w:p>
+    <w:p>
+      <w:r>
+        <w:rPr>
+          <w:rFonts w:ascii="Calibri" w:hAnsi="Calibri"/>
+        </w:rPr>
+        <w:t>What you expected:</w:t>
+      </w:r>
+    </w:p>
+    <w:p>
+      <w:r>
+        <w:rPr>
+          <w:rFonts w:ascii="Calibri" w:hAnsi="Calibri"/>
+        </w:rPr>
+        <w:t>What you counted, and over how many days:</w:t>
+      </w:r>
+    </w:p>
+    <w:p>
+      <w:r>
+        <w:rPr>
+          <w:rFonts w:ascii="Calibri" w:hAnsi="Calibri"/>
+        </w:rPr>
+        <w:t>What you will do next:</w:t>
+      </w:r>
+    </w:p>
+    <w:p>
+      <w:r>
+        <w:rPr>
+          <w:rFonts w:ascii="Calibri" w:hAnsi="Calibri"/>
+        </w:rPr>
+        <w:t>A useful line sounds like this: “Changed only the first two lines of the offer-video description. Same title, same price. Seven days. Page visits went from none to four. No payment yet. Hold the price. Look again in seven days.” That is more useful than “descriptions don’t work.”</w:t>
+      </w:r>
+    </w:p>
+    <w:p>
+      <w:pPr>
+        <w:pStyle w:val="Heading2"/>
+      </w:pPr>
+      <w:r>
+        <w:t>VII. Claims that do not survive the sheet</w:t>
+      </w:r>
+    </w:p>
+    <w:p>
+      <w:pPr>
+        <w:pStyle w:val="ListBullet"/>
+      </w:pPr>
+      <w:r>
+        <w:rPr>
+          <w:rFonts w:ascii="Calibri" w:hAnsi="Calibri"/>
+        </w:rPr>
+        <w:t>That you will remember the price you tested. You will not. Write it.</w:t>
+      </w:r>
+    </w:p>
+    <w:p>
+      <w:pPr>
+        <w:pStyle w:val="ListBullet"/>
+      </w:pPr>
+      <w:r>
+        <w:rPr>
+          <w:rFonts w:ascii="Calibri" w:hAnsi="Calibri"/>
+        </w:rPr>
+        <w:t>That likes are a substitute for the payment line. Likes are polite. The payment line is the title of this book.</w:t>
+      </w:r>
+    </w:p>
+    <w:p>
+      <w:pPr>
+        <w:pStyle w:val="ListBullet"/>
+      </w:pPr>
+      <w:r>
+        <w:rPr>
+          <w:rFonts w:ascii="Calibri" w:hAnsi="Calibri"/>
+        </w:rPr>
+        <w:t>That a blank “can you deliver ten sales” box can stay blank. If the answer is no, shrink the offer until the answer is yes. Do not advertise a service you will resent on sale three.</w:t>
+      </w:r>
+    </w:p>
+    <w:p>
+      <w:r>
+        <w:rPr>
+          <w:rFonts w:ascii="Calibri" w:hAnsi="Calibri"/>
+        </w:rPr>
+        <w:t>A last limit. Blank sheets do not make a channel sell. Filled sheets make the next decision obvious, including the decision to stop.</w:t>
+      </w:r>
+    </w:p>
+    <w:p>
+      <w:r>
+        <w:rPr>
+          <w:rFonts w:ascii="Calibri" w:hAnsi="Calibri"/>
+          <w:i/>
+        </w:rPr>
+        <w:t>Sources: This workbook is editorial structure for the rest of this book. It states no platform rule. Not accounting or tax advice; keep whatever records your own situation requires.</w:t>
+      </w:r>
+    </w:p>
+    <w:p>
+      <w:bookmarkStart w:id="10" w:name="ch9"/>
+      <w:pPr>
+        <w:pStyle w:val="Heading1"/>
+      </w:pPr>
+      <w:r>
+        <w:t>9 When Nothing Sells</w:t>
+      </w:r>
+      <w:bookmarkEnd w:id="10"/>
+    </w:p>
+    <w:p>
+      <w:r>
+        <w:rPr>
+          <w:rFonts w:ascii="Calibri" w:hAnsi="Calibri"/>
+          <w:i/>
+        </w:rPr>
+        <w:t>Find the earliest break in the path. A new video is not a diagnosis.</w:t>
+      </w:r>
+    </w:p>
+    <w:p>
+      <w:r>
+        <w:rPr>
+          <w:rFonts w:ascii="Calibri" w:hAnsi="Calibri"/>
+        </w:rPr>
+        <w:t>When a channel does not sell, the tempting explanation is “the algorithm” or “the niche.” Sometimes the videos are simply hard to find. More often the path from a stranger to a payment is broken in a specific place, and another video will not repair a missing price. Start at the top of this list. Fix the first item that is true. Do not fix item six while item two is still true.</w:t>
+      </w:r>
+    </w:p>
+    <w:p>
+      <w:pPr>
+        <w:pStyle w:val="Heading2"/>
+      </w:pPr>
+      <w:r>
+        <w:t>I. You cannot say what you sell</w:t>
+      </w:r>
+    </w:p>
+    <w:p>
+      <w:r>
+        <w:rPr>
+          <w:rFonts w:ascii="Calibri" w:hAnsi="Calibri"/>
+        </w:rPr>
+        <w:t>If the twenty-second offer is still unfinished, stop. The offer chapter is the whole diagnosis. No title, thumbnail, or posting schedule sells an unnamed thing. Write the sentence. Put a price on a page. Then come back.</w:t>
+      </w:r>
+    </w:p>
+    <w:p>
+      <w:pPr>
+        <w:pStyle w:val="Heading2"/>
+      </w:pPr>
+      <w:r>
+        <w:t>II. People cannot find the price</w:t>
+      </w:r>
+    </w:p>
+    <w:p>
+      <w:r>
+        <w:rPr>
+          <w:rFonts w:ascii="Calibri" w:hAnsi="Calibri"/>
+        </w:rPr>
+        <w:t>The videos exist. The page exists. Viewers still do not arrive there. Look at the first two lines of the description, the pinned comment, and the words you say at the end. If the link is under a paragraph about your story, move it up. If you never say the name of the offer, say it. If three test viewers cannot find the price without you pointing, the packaging failed and the niche did not.</w:t>
+      </w:r>
+    </w:p>
+    <w:p>
+      <w:r>
+        <w:rPr>
+          <w:rFonts w:ascii="Calibri" w:hAnsi="Calibri"/>
+        </w:rPr>
+        <w:t>This is the same shelf as the click chapter, applied to money instead of curiosity. A title can win the click and still lose the sale if the click leads nowhere.</w:t>
+      </w:r>
+    </w:p>
+    <w:p>
+      <w:pPr>
+        <w:pStyle w:val="Heading2"/>
+      </w:pPr>
+      <w:r>
+        <w:t>III. The wrong people are watching</w:t>
+      </w:r>
+    </w:p>
+    <w:p>
+      <w:r>
+        <w:rPr>
+          <w:rFonts w:ascii="Calibri" w:hAnsi="Calibri"/>
+        </w:rPr>
+        <w:t>The offer video has views, and the viewers are not the buyer you named. Read the comments and the search phrases if the platform shows them. If they came for a different promise — entertainment, a face, a controversy — your teaching will not convert them, and it should not. Change the title and the first ten seconds so the unfit viewer leaves early. Do not rewrite the offer to chase whoever happened to arrive.</w:t>
+      </w:r>
+    </w:p>
+    <w:p>
+      <w:pPr>
+        <w:pStyle w:val="Heading2"/>
+      </w:pPr>
+      <w:r>
+        <w:t>IV. The right people watch and do not believe you</w:t>
+      </w:r>
+    </w:p>
+    <w:p>
+      <w:r>
+        <w:rPr>
+          <w:rFonts w:ascii="Calibri" w:hAnsi="Calibri"/>
+        </w:rPr>
+        <w:t>They reach the page and do not pay. Ask what is missing, of the page and of the proof video. Common true answers: the scope is vague, the price has no reason, the method video hid the hard step, the proof is a claim without a walk-through. Fix one of those. A discount is not the first fix. A discount on a vague offer teaches people to wait for a lower price on something they still do not understand.</w:t>
+      </w:r>
+    </w:p>
+    <w:p>
+      <w:pPr>
+        <w:pStyle w:val="Heading2"/>
+      </w:pPr>
+      <w:r>
+        <w:t>V. They believe you and the checkout fails</w:t>
+      </w:r>
+    </w:p>
+    <w:p>
+      <w:r>
+        <w:rPr>
+          <w:rFonts w:ascii="Calibri" w:hAnsi="Calibri"/>
+        </w:rPr>
+        <w:t>They mean to pay, and the page breaks, the booking tool confuses them, or you take three days to reply. That is not a content problem. Buy the thing yourself, on a phone, as a stranger would. Fix the step where you stalled. If you cannot deliver, stop taking orders until you can, and say so on the page.</w:t>
+      </w:r>
+    </w:p>
+    <w:p>
+      <w:pPr>
+        <w:pStyle w:val="Heading2"/>
+      </w:pPr>
+      <w:r>
+        <w:t>VI. You are spending to hide the break</w:t>
+      </w:r>
+    </w:p>
+    <w:p>
+      <w:r>
+        <w:rPr>
+          <w:rFonts w:ascii="Calibri" w:hAnsi="Calibri"/>
+        </w:rPr>
+        <w:t>Ads, boosts, and “growth” services send more people into the same path. If the path loses them, you bought a faster loss. Turn the spend off until a handful of unpaid viewers can reach the page. Then, if you spend at all, cap it the way you would cap any test: a number written down before you start, and a date when you stop even if you are curious.</w:t>
+      </w:r>
+    </w:p>
+    <w:p>
+      <w:r>
+        <w:rPr>
+          <w:rFonts w:ascii="Calibri" w:hAnsi="Calibri"/>
+        </w:rPr>
+        <w:t>Platform ad revenue, if you ever qualify, does not repair a broken offer. It can sit beside a working one. It cannot substitute for one.</w:t>
+      </w:r>
+    </w:p>
+    <w:p>
+      <w:pPr>
+        <w:pStyle w:val="Heading2"/>
+      </w:pPr>
+      <w:r>
+        <w:t>VII. The honest stop</w:t>
+      </w:r>
+    </w:p>
+    <w:p>
+      <w:r>
+        <w:rPr>
+          <w:rFonts w:ascii="Calibri" w:hAnsi="Calibri"/>
+        </w:rPr>
+        <w:t>Some offers should not continue. If, after the path is clear, the right people have seen a true demonstration and still will not pay a price that covers your time, the channel is not failing to sell. The offer is being refused. Change the buyer, the promise, or the price once. If you change all three, you started a different business, and the old sheets should be labeled as closed so you do not mix the counts.</w:t>
+      </w:r>
+    </w:p>
+    <w:p>
+      <w:r>
+        <w:rPr>
+          <w:rFonts w:ascii="Calibri" w:hAnsi="Calibri"/>
+        </w:rPr>
+        <w:t>Quitting a refused offer is more useful than another month of videos that protect you from hearing no.</w:t>
+      </w:r>
+    </w:p>
+    <w:p>
+      <w:pPr>
+        <w:pStyle w:val="Heading2"/>
+      </w:pPr>
+      <w:r>
+        <w:t>VIII. Do this once</w:t>
+      </w:r>
+    </w:p>
+    <w:p>
+      <w:r>
+        <w:rPr>
+          <w:rFonts w:ascii="Calibri" w:hAnsi="Calibri"/>
+        </w:rPr>
+        <w:t>Write which of the seven breaks is true today. Do the single fix that break requires. Set a date to count page visits and payments again. Leave every other variable alone until that date.</w:t>
+      </w:r>
+    </w:p>
+    <w:p>
+      <w:pPr>
+        <w:pStyle w:val="Heading2"/>
+      </w:pPr>
+      <w:r>
+        <w:t>IX. Claims that do not survive the path</w:t>
+      </w:r>
+    </w:p>
+    <w:p>
+      <w:pPr>
+        <w:pStyle w:val="ListBullet"/>
+      </w:pPr>
+      <w:r>
+        <w:rPr>
+          <w:rFonts w:ascii="Calibri" w:hAnsi="Calibri"/>
+        </w:rPr>
+        <w:t>That low views and no sales are the same problem. No views means people are not arriving. Views with no page visits means the shelf is hidden. Page visits with no payment means the offer, the proof, or the checkout. Treat them as different jobs.</w:t>
+      </w:r>
+    </w:p>
+    <w:p>
+      <w:pPr>
+        <w:pStyle w:val="ListBullet"/>
+      </w:pPr>
+      <w:r>
+        <w:rPr>
+          <w:rFonts w:ascii="Calibri" w:hAnsi="Calibri"/>
+        </w:rPr>
+        <w:t>That a new niche is the fix for a hidden link. Moving the link up is the fix for a hidden link.</w:t>
+      </w:r>
+    </w:p>
+    <w:p>
+      <w:pPr>
+        <w:pStyle w:val="ListBullet"/>
+      </w:pPr>
+      <w:r>
+        <w:rPr>
+          <w:rFonts w:ascii="Calibri" w:hAnsi="Calibri"/>
+        </w:rPr>
+        <w:t>That you need more subscribers before anyone will buy. You need one buyer who can find the price. Subscribers can wait.</w:t>
+      </w:r>
+    </w:p>
+    <w:p>
+      <w:pPr>
+        <w:pStyle w:val="ListBullet"/>
+      </w:pPr>
+      <w:r>
+        <w:rPr>
+          <w:rFonts w:ascii="Calibri" w:hAnsi="Calibri"/>
+        </w:rPr>
+        <w:t>That harsh comments are the diagnosis. A comment that names a missing step is useful. A comment that dislikes your face is not a business plan.</w:t>
+      </w:r>
+    </w:p>
+    <w:p>
+      <w:pPr>
+        <w:pStyle w:val="ListBullet"/>
+      </w:pPr>
+      <w:r>
+        <w:rPr>
+          <w:rFonts w:ascii="Calibri" w:hAnsi="Calibri"/>
+        </w:rPr>
+        <w:t>That persistence means never changing the offer. Persistence means keeping the count. Refusal is data. Ignoring refusal is how a hobby becomes expensive.</w:t>
+      </w:r>
+    </w:p>
+    <w:p>
+      <w:r>
+        <w:rPr>
+          <w:rFonts w:ascii="Calibri" w:hAnsi="Calibri"/>
+        </w:rPr>
+        <w:t>A last limit. This chapter will not promise that every clear offer eventually sells. It will make the reason it does not sell visible, which is the only way the next month is more useful than the last one.</w:t>
+      </w:r>
+    </w:p>
+    <w:p>
+      <w:r>
+        <w:rPr>
+          <w:rFonts w:ascii="Calibri" w:hAnsi="Calibri"/>
+          <w:i/>
+        </w:rPr>
+        <w:t>Sources: This chapter is a diagnostic order for the rest of the book. It states no ranking formula and no expected conversion rate. Platform advertising products change; any spend cap is your own limit, not a platform setting. Not legal, tax, or financial advice.</w:t>
+      </w:r>
+    </w:p>
+    <w:p>
+      <w:bookmarkStart w:id="11" w:name="ch10"/>
+      <w:pPr>
+        <w:pStyle w:val="Heading1"/>
+      </w:pPr>
+      <w:r>
         <w:t>Official sources and updates</w:t>
       </w:r>
-      <w:bookmarkEnd w:id="5"/>
-    </w:p>
-    <w:p>
-      <w:r>
-        <w:rPr>
-          <w:rFonts w:ascii="Calibri" w:hAnsi="Calibri"/>
-        </w:rPr>
-        <w:t>These notes support the claims in the chapters. Planning methods and creator-consensus tactics are editorial guidance, not platform requirements. Accessed September 2026.</w:t>
+      <w:bookmarkEnd w:id="11"/>
+    </w:p>
+    <w:p>
+      <w:r>
+        <w:rPr>
+          <w:rFonts w:ascii="Calibri" w:hAnsi="Calibri"/>
+        </w:rPr>
+        <w:t>These notes support the claims in the chapters. Planning methods, worksheets, and creator-consensus tactics are editorial guidance, not platform requirements. The sample conversion figures are arithmetic placeholders, not measured rates. Accessed September 2026.</w:t>
       </w:r>
     </w:p>
     <w:p>
@@ -4415,7 +6734,7 @@
           <w:rFonts w:ascii="Calibri" w:hAnsi="Calibri"/>
           <w:i/>
         </w:rPr>
-        <w:t>Chapter 1. YouTube Studio’s own upload interface (title, description, and tag character limits, and the captions workflow). YouTube’s advertiser-friendly content guidelines, for the existence of a sensitive-content category. Retention benchmarks and posting-cadence figures are creator consensus, not published platform figures.</w:t>
+        <w:t>Chapters 1, 4, and 6 through 9 are a selling path: one offer, eight videos, a six-week calendar, wording, a workbook, and a diagnosis when nothing sells. They state no ranking formula.</w:t>
       </w:r>
     </w:p>
     <w:p>
@@ -4424,7 +6743,7 @@
           <w:rFonts w:ascii="Calibri" w:hAnsi="Calibri"/>
           <w:i/>
         </w:rPr>
-        <w:t>Chapter 2. Tool names and URLs come from working bookmark lists of video, footage, music, and voice tools. A few transferable techniques — reference-image consistency, mixing ratios, export settings, and the fully original workflow — were taken from saved research and rewritten. Specific personal projects were not used. Pricing, licenses, and features change.</w:t>
+        <w:t>Chapter 2. YouTube Studio’s upload interface for title, description, and tag limits, and the captions workflow. YouTube’s advertiser-friendly content guidelines, for the existence of a sensitive-content category. Retention benchmarks and posting cadence are creator consensus, not published platform figures.</w:t>
       </w:r>
     </w:p>
     <w:p>
@@ -4433,7 +6752,16 @@
           <w:rFonts w:ascii="Calibri" w:hAnsi="Calibri"/>
           <w:i/>
         </w:rPr>
-        <w:t>Chapter 3. YouTube Partner Program requirements were checked against YouTube’s own monetization guidance. Other platforms were checked against their own creator or help pages. Dailymotion’s requirements could not be confirmed to the same standard and are flagged in the chapter. Subscriber-conversion tactics and affiliate-link placement are creator consensus, not published policy.</w:t>
+        <w:t>Chapter 3. Tool names and URLs come from working bookmark lists. Pricing, licenses, and features change. Specific personal projects were not used.</w:t>
+      </w:r>
+    </w:p>
+    <w:p>
+      <w:r>
+        <w:rPr>
+          <w:rFonts w:ascii="Calibri" w:hAnsi="Calibri"/>
+          <w:i/>
+        </w:rPr>
+        <w:t>Chapter 5. YouTube Partner Program requirements were checked against YouTube’s own monetization guidance. Other platforms were checked against their own creator or help pages. Dailymotion’s requirements could not be confirmed to the same standard and are flagged in the chapter. Affiliate-link placement is creator consensus plus a disclosure habit, not a promise of income.</w:t>
       </w:r>
     </w:p>
     <w:p>

</xml_diff>

<commit_message>
Give the channel one video load and one link.
The eight jobs replace a second posting quota, the profile keeps a single URL, and the interviews split into the path this book declines and the early sale it keeps.

Co-authored-by: Cursor <cursoragent@cursor.com>
</commit_message>
<xml_diff>
--- a/Your First YouTube Channel That Sells/Your First YouTube Channel That Sells.docx
+++ b/Your First YouTube Channel That Sells/Your First YouTube Channel That Sells.docx
@@ -520,7 +520,7 @@
             <w:color w:val="1F4E79"/>
             <w:u w:val="single"/>
           </w:rPr>
-          <w:t>V. Four people, and the move you can copy</w:t>
+          <w:t>V. Four people, and which move is yours</w:t>
         </w:r>
       </w:hyperlink>
     </w:p>
@@ -1377,6 +1377,19 @@
       </w:r>
     </w:p>
     <w:p>
+      <w:pPr>
+        <w:sectPr>
+          <w:headerReference w:type="default" r:id="rId9"/>
+          <w:footerReference w:type="default" r:id="rId10"/>
+          <w:pgSz w:w="10080" w:h="14400"/>
+          <w:pgMar w:top="1008" w:right="1008" w:bottom="1008" w:left="1008" w:header="504" w:footer="504" w:gutter="0"/>
+          <w:cols w:space="720"/>
+          <w:titlePg/>
+          <w:docGrid w:linePitch="360"/>
+        </w:sectPr>
+      </w:pPr>
+    </w:p>
+    <w:p>
       <w:bookmarkStart w:id="2" w:name="toc1"/>
       <w:pPr>
         <w:pStyle w:val="Heading1"/>
@@ -1674,6 +1687,158 @@
         <w:rPr>
           <w:rFonts w:ascii="Calibri" w:hAnsi="Calibri"/>
         </w:rPr>
+        <w:t>Week one of the calendar builds the page for the shape you picked, and you say that shape’s sentence. One page. One sentence. One shape for ninety days.</w:t>
+      </w:r>
+    </w:p>
+    <w:p>
+      <w:pPr>
+        <w:pStyle w:val="ListBullet"/>
+      </w:pPr>
+      <w:r>
+        <w:rPr>
+          <w:rFonts w:ascii="Calibri" w:hAnsi="Calibri"/>
+          <w:b/>
+        </w:rPr>
+        <w:t>File.</w:t>
+      </w:r>
+      <w:r>
+        <w:rPr>
+          <w:rFonts w:ascii="Calibri" w:hAnsi="Calibri"/>
+        </w:rPr>
+        <w:t xml:space="preserve"> The page names the file, the price, and what is in it. Say: “I made [name]. It costs [price]. Here is the link.”</w:t>
+      </w:r>
+    </w:p>
+    <w:p>
+      <w:pPr>
+        <w:pStyle w:val="ListBullet"/>
+      </w:pPr>
+      <w:r>
+        <w:rPr>
+          <w:rFonts w:ascii="Calibri" w:hAnsi="Calibri"/>
+          <w:b/>
+        </w:rPr>
+        <w:t>Ticket.</w:t>
+      </w:r>
+      <w:r>
+        <w:rPr>
+          <w:rFonts w:ascii="Calibri" w:hAnsi="Calibri"/>
+        </w:rPr>
+        <w:t xml:space="preserve"> The page names the date, the length, and the price. Say: “On [date] I teach [result]. It costs [price]. Here is the link.” After that date, sell the recording as the file, or stop. Do not leave both on the page.</w:t>
+      </w:r>
+    </w:p>
+    <w:p>
+      <w:pPr>
+        <w:pStyle w:val="ListBullet"/>
+      </w:pPr>
+      <w:r>
+        <w:rPr>
+          <w:rFonts w:ascii="Calibri" w:hAnsi="Calibri"/>
+          <w:b/>
+        </w:rPr>
+        <w:t>A thing you ship.</w:t>
+      </w:r>
+      <w:r>
+        <w:rPr>
+          <w:rFonts w:ascii="Calibri" w:hAnsi="Calibri"/>
+        </w:rPr>
+        <w:t xml:space="preserve"> The page names what arrives, how long it takes, and the price, including whether shipping is inside the number. Say: “I will send you [thing]. It costs [price]. Here is the link.”</w:t>
+      </w:r>
+    </w:p>
+    <w:p>
+      <w:pPr>
+        <w:pStyle w:val="ListBullet"/>
+      </w:pPr>
+      <w:r>
+        <w:rPr>
+          <w:rFonts w:ascii="Calibri" w:hAnsi="Calibri"/>
+          <w:b/>
+        </w:rPr>
+        <w:t>License.</w:t>
+      </w:r>
+      <w:r>
+        <w:rPr>
+          <w:rFonts w:ascii="Calibri" w:hAnsi="Calibri"/>
+        </w:rPr>
+        <w:t xml:space="preserve"> The page says what the buyer may do with the clip or the template, and what they may not. Say: “You can use [thing] for [the use you wrote down]. It costs [price]. Here is the link.”</w:t>
+      </w:r>
+    </w:p>
+    <w:p>
+      <w:pPr>
+        <w:pStyle w:val="ListBullet"/>
+      </w:pPr>
+      <w:r>
+        <w:rPr>
+          <w:rFonts w:ascii="Calibri" w:hAnsi="Calibri"/>
+          <w:b/>
+        </w:rPr>
+        <w:t>Call.</w:t>
+      </w:r>
+      <w:r>
+        <w:rPr>
+          <w:rFonts w:ascii="Calibri" w:hAnsi="Calibri"/>
+        </w:rPr>
+        <w:t xml:space="preserve"> The page names the length, the result, and the price. Say: “I will [result] with you for [length]. It costs [price]. Here is the link.”</w:t>
+      </w:r>
+    </w:p>
+    <w:p>
+      <w:pPr>
+        <w:pStyle w:val="ListBullet"/>
+      </w:pPr>
+      <w:r>
+        <w:rPr>
+          <w:rFonts w:ascii="Calibri" w:hAnsi="Calibri"/>
+          <w:b/>
+        </w:rPr>
+        <w:t>One affiliate product.</w:t>
+      </w:r>
+      <w:r>
+        <w:rPr>
+          <w:rFonts w:ascii="Calibri" w:hAnsi="Calibri"/>
+        </w:rPr>
+        <w:t xml:space="preserve"> The page the stranger pays on is the merchant’s. Your sentence carries the disclosure. Say: “I use [product]. This is an affiliate link. The price on their page is [price].”</w:t>
+      </w:r>
+    </w:p>
+    <w:p>
+      <w:pPr>
+        <w:pStyle w:val="ListBullet"/>
+      </w:pPr>
+      <w:r>
+        <w:rPr>
+          <w:rFonts w:ascii="Calibri" w:hAnsi="Calibri"/>
+          <w:b/>
+        </w:rPr>
+        <w:t>Monthly pass.</w:t>
+      </w:r>
+      <w:r>
+        <w:rPr>
+          <w:rFonts w:ascii="Calibri" w:hAnsi="Calibri"/>
+        </w:rPr>
+        <w:t xml:space="preserve"> The page says what arrives each month and when the next charge happens. Say: “Each month you get [thing]. It costs [price] a month. Here is the link. You can cancel before the next charge.”</w:t>
+      </w:r>
+    </w:p>
+    <w:p>
+      <w:pPr>
+        <w:pStyle w:val="ListBullet"/>
+      </w:pPr>
+      <w:r>
+        <w:rPr>
+          <w:rFonts w:ascii="Calibri" w:hAnsi="Calibri"/>
+          <w:b/>
+        </w:rPr>
+        <w:t>One sponsor.</w:t>
+      </w:r>
+      <w:r>
+        <w:rPr>
+          <w:rFonts w:ascii="Calibri" w:hAnsi="Calibri"/>
+        </w:rPr>
+        <w:t xml:space="preserve"> If the sponsor pays you directly, the sentence is the disclosure. Say: “[Sponsor] paid for this video. The link is theirs.” Do not also name your file.</w:t>
+      </w:r>
+    </w:p>
+    <w:p>
+      <w:r>
+        <w:rPr>
+          <w:rFonts w:ascii="Calibri" w:hAnsi="Calibri"/>
+        </w:rPr>
         <w:t>Ad revenue from a platform partner program is not this offer. It can become extra income after the thresholds in the money chapter. It is a slow, uncertain side effect of attention. Do not build the channel as if the badge is the product. A channel with no offer can be popular and still sell nothing you control.</w:t>
       </w:r>
     </w:p>
@@ -1762,6 +1927,14 @@
       </w:r>
     </w:p>
     <w:p>
+      <w:r>
+        <w:rPr>
+          <w:rFonts w:ascii="Calibri" w:hAnsi="Calibri"/>
+        </w:rPr>
+        <w:t>Price the hours as well. Suppose the offer video takes eight hours, and you need those hours to be worth $25 each. The video costs $200 of your time before a sale. At $30 a sale you need seven sales, about 350 views of that video at the 2-in-100 guess, before the time is covered. The $150 call covers those same hours on the second sale. Write your own hours and your own rate on the money sheet. If the file cannot cover the hours, sell the call, or make a shorter video. The 2-in-100 figure stays a placeholder until your own count replaces it.</w:t>
+      </w:r>
+    </w:p>
+    <w:p>
       <w:bookmarkStart w:id="7" w:name="toc6"/>
       <w:pPr>
         <w:pStyle w:val="Heading2"/>
@@ -1808,7 +1981,15 @@
         <w:rPr>
           <w:rFonts w:ascii="Calibri" w:hAnsi="Calibri"/>
         </w:rPr>
-        <w:t>Then buy it yourself. On your phone, open the link the way a stranger will, from the description, not from a bookmark you already trust. Finish the payment or the booking. If the tool allows a refund of that test, refund it. The step where you stalled is the step a buyer will abandon. Do this before the first video.</w:t>
+        <w:t>Then buy it yourself. On your phone, open the link the way a stranger will, from the description, not from a bookmark you already trust.</w:t>
+      </w:r>
+    </w:p>
+    <w:p>
+      <w:r>
+        <w:rPr>
+          <w:rFonts w:ascii="Calibri" w:hAnsi="Calibri"/>
+        </w:rPr>
+        <w:t>Here is the test when it fails. The page says “request a quote.” Or the pay button loads and the form will not take the card. You stop. That stall is the buyer’s stall. Fix the page before you film. If a payment did go through and the tool allows a refund, refund it. The step where you stalled is the step a buyer will abandon. Do this before the first video.</w:t>
       </w:r>
     </w:p>
     <w:p>
@@ -1826,7 +2007,7 @@
         </w:rPr>
         <w:t xml:space="preserve">YouTube also lets a channel publish posts. </w:t>
       </w:r>
-      <w:hyperlink r:id="rId9">
+      <w:hyperlink r:id="rId13">
         <w:r>
           <w:rPr>
             <w:rStyle w:val="Hyperlink"/>
@@ -2023,6 +2204,19 @@
       </w:r>
     </w:p>
     <w:p>
+      <w:pPr>
+        <w:sectPr>
+          <w:headerReference w:type="default" r:id="rId11"/>
+          <w:footerReference w:type="default" r:id="rId12"/>
+          <w:pgSz w:w="10080" w:h="14400"/>
+          <w:pgMar w:top="1008" w:right="1008" w:bottom="1008" w:left="1008" w:header="504" w:footer="504" w:gutter="0"/>
+          <w:cols w:space="720"/>
+          <w:titlePg/>
+          <w:docGrid w:linePitch="360"/>
+        </w:sectPr>
+      </w:pPr>
+    </w:p>
+    <w:p>
       <w:bookmarkStart w:id="10" w:name="toc9"/>
       <w:pPr>
         <w:pStyle w:val="Heading1"/>
@@ -2172,7 +2366,7 @@
         </w:rPr>
         <w:t xml:space="preserve">A title that leads with the hook and buries the keyword reads well and ranks poorly; search does not give credit for personality it cannot parse. Put the keyword first when the two goals conflict. </w:t>
       </w:r>
-      <w:hyperlink r:id="rId10">
+      <w:hyperlink r:id="rId16">
         <w:r>
           <w:rPr>
             <w:rStyle w:val="Hyperlink"/>
@@ -2204,7 +2398,7 @@
         </w:rPr>
         <w:t xml:space="preserve">The thumbnail does not repeat the title. The title carries the keyword. The picture shows the result or the problem. Neither may promise a result the video does not deliver. Where Studio offers a title-and-thumbnail test, </w:t>
       </w:r>
-      <w:hyperlink r:id="rId11">
+      <w:hyperlink r:id="rId17">
         <w:r>
           <w:rPr>
             <w:rStyle w:val="Hyperlink"/>
@@ -2568,7 +2762,7 @@
       </w:r>
     </w:p>
     <w:p>
-      <w:hyperlink r:id="rId12">
+      <w:hyperlink r:id="rId18">
         <w:r>
           <w:rPr>
             <w:rStyle w:val="Hyperlink"/>
@@ -2594,7 +2788,7 @@
       </w:r>
     </w:p>
     <w:p>
-      <w:hyperlink r:id="rId13">
+      <w:hyperlink r:id="rId19">
         <w:r>
           <w:rPr>
             <w:rStyle w:val="Hyperlink"/>
@@ -2820,7 +3014,7 @@
         </w:rPr>
         <w:t xml:space="preserve">YouTube does publish one retention measurement, and it is not a ranking formula. In Studio, open that video’s Analytics and the audience-retention report. The report usually takes one to two days to appear. The intro line is the percentage of viewers still watching after the first 30 seconds. </w:t>
       </w:r>
-      <w:hyperlink r:id="rId14">
+      <w:hyperlink r:id="rId20">
         <w:r>
           <w:rPr>
             <w:rStyle w:val="Hyperlink"/>
@@ -2838,7 +3032,7 @@
       </w:r>
     </w:p>
     <w:p>
-      <w:hyperlink r:id="rId13">
+      <w:hyperlink r:id="rId19">
         <w:r>
           <w:rPr>
             <w:rStyle w:val="Hyperlink"/>
@@ -2856,7 +3050,7 @@
       </w:r>
     </w:p>
     <w:p>
-      <w:hyperlink r:id="rId15">
+      <w:hyperlink r:id="rId21">
         <w:r>
           <w:rPr>
             <w:rStyle w:val="Hyperlink"/>
@@ -2904,7 +3098,7 @@
         <w:rPr>
           <w:rFonts w:ascii="Calibri" w:hAnsi="Calibri"/>
         </w:rPr>
-        <w:t>Connect them in three places. Name the long video as the Short’s related video. Say the destination out loud inside the Short, and show it. A pinned comment on the Short is not a buy link. YouTube’s sharing-links page says a Short’s comments are not clickable. The spoken pointer still matters. Do all three. One of them does not replace the others.</w:t>
+        <w:t>Connect them in three places. Name the long video as the Short’s related video. Say the destination out loud inside the Short, and show it. A pinned comment on the Short is not a buy link. The money chapter has the rule, from YouTube’s own page: a Short’s description and comments are not clickable. The spoken pointer still matters.</w:t>
       </w:r>
     </w:p>
     <w:p>
@@ -2914,7 +3108,7 @@
         </w:rPr>
         <w:t xml:space="preserve">A Short is ranked for a person, not for a format. </w:t>
       </w:r>
-      <w:hyperlink r:id="rId16">
+      <w:hyperlink r:id="rId22">
         <w:r>
           <w:rPr>
             <w:rStyle w:val="Hyperlink"/>
@@ -2938,7 +3132,7 @@
         </w:rPr>
         <w:t xml:space="preserve">In Analytics, open the Content tab and the Shorts chip. </w:t>
       </w:r>
-      <w:hyperlink r:id="rId17">
+      <w:hyperlink r:id="rId23">
         <w:r>
           <w:rPr>
             <w:rStyle w:val="Hyperlink"/>
@@ -2962,7 +3156,7 @@
         </w:rPr>
         <w:t xml:space="preserve">If several videos answer the same buyer’s next question, mark them as a </w:t>
       </w:r>
-      <w:hyperlink r:id="rId18">
+      <w:hyperlink r:id="rId24">
         <w:r>
           <w:rPr>
             <w:rStyle w:val="Hyperlink"/>
@@ -2984,7 +3178,15 @@
         <w:rPr>
           <w:rFonts w:ascii="Calibri" w:hAnsi="Calibri"/>
         </w:rPr>
-        <w:t>Four long videos and six shorts in a month is a load a person can finish. YouTube does not publish it as a quota. One of the four is the offer video. The other three are that buyer’s next questions, not a new subject every Sunday. Posting every week for six months beats a daily plan you drop in week three.</w:t>
+        <w:t>The load you can finish is the eight jobs in the videos chapter. The six-week calendar films those eight. YouTube does not publish that set as a quota. There is not a second month of four long videos and six Shorts sitting on top of them.</w:t>
+      </w:r>
+    </w:p>
+    <w:p>
+      <w:r>
+        <w:rPr>
+          <w:rFonts w:ascii="Calibri" w:hAnsi="Calibri"/>
+        </w:rPr>
+        <w:t>Four of the eight have to be long videos, because a Short cannot carry the link: who it is for, the problem in their words, the method, and the offer. Proof, the comparison, the objection, and the video that names which one to watch next can be long videos too. If the month is short, those four can be Shorts that point at the long video which already did that job. The offer itself is never only a Short. It has to be long enough for a clickable description. Posting a week you can finish beats a daily plan you drop in week three.</w:t>
       </w:r>
     </w:p>
     <w:tbl>
@@ -3156,7 +3358,7 @@
           <w:rFonts w:ascii="Calibri" w:hAnsi="Calibri"/>
           <w:i/>
         </w:rPr>
-        <w:t>Sources: YouTube Studio’s own upload interface (title, description, and tag character limits, and the captions workflow). YouTube’s thumbnail and title tips, its description tips, its title-and-thumbnail test, its audience-retention report, its pages on recommendation signals and on the recommendation system, its Shorts discovery page, its Shorts analytics tips, and its series-playlist settings, each cited in the section where it is used. YouTube’s advertiser-friendly content guidelines for the existence of a sensitive-content category. The “four long videos and six shorts” month is a production load, not a figure YouTube publishes. Confirm the live help pages before you rely on a number.</w:t>
+        <w:t>Sources: YouTube Studio’s own upload interface (title, description, and tag character limits, and the captions workflow). YouTube’s thumbnail and title tips, its description tips, its title-and-thumbnail test, its audience-retention report, its pages on recommendation signals and on the recommendation system, its Shorts discovery page, its Shorts analytics tips, and its series-playlist settings, each cited in the section where it is used. YouTube’s advertiser-friendly content guidelines for the existence of a sensitive-content category. The eight jobs are the production load, spelled out again in the videos chapter and on the six-week calendar. YouTube does not publish that set as a quota. Confirm the live help pages before you rely on a number.</w:t>
       </w:r>
     </w:p>
     <w:p>
@@ -3169,6 +3371,19 @@
       </w:r>
     </w:p>
     <w:p>
+      <w:pPr>
+        <w:sectPr>
+          <w:headerReference w:type="default" r:id="rId14"/>
+          <w:footerReference w:type="default" r:id="rId15"/>
+          <w:pgSz w:w="10080" w:h="14400"/>
+          <w:pgMar w:top="1008" w:right="1008" w:bottom="1008" w:left="1008" w:header="504" w:footer="504" w:gutter="0"/>
+          <w:cols w:space="720"/>
+          <w:titlePg/>
+          <w:docGrid w:linePitch="360"/>
+        </w:sectPr>
+      </w:pPr>
+    </w:p>
+    <w:p>
       <w:bookmarkStart w:id="18" w:name="toc17"/>
       <w:pPr>
         <w:pStyle w:val="Heading1"/>
@@ -3216,7 +3431,31 @@
         <w:rPr>
           <w:rFonts w:ascii="Calibri" w:hAnsi="Calibri"/>
         </w:rPr>
-        <w:t>You are here because the videos in the next chapter have to be cheap enough to finish. The tools are how you make those videos. They are not a second hobby of collecting apps. Make the one video in front of you, with the free tool that does that one job, and read its license before you publish.</w:t>
+        <w:t>You are here because the videos in the next chapter have to be cheap enough to finish. Make the one video in front of you. The tools are how. They are not a second hobby of collecting apps.</w:t>
+      </w:r>
+    </w:p>
+    <w:p>
+      <w:r>
+        <w:rPr>
+          <w:rFonts w:ascii="Calibri" w:hAnsi="Calibri"/>
+        </w:rPr>
+        <w:t xml:space="preserve">The default stack is four things. Your voice, or a text-to-speech voice that is not a clone of someone else. One track from YouTube’s Audio Library. One editor that will export the whole video: </w:t>
+      </w:r>
+      <w:hyperlink r:id="rId27">
+        <w:r>
+          <w:rPr>
+            <w:rStyle w:val="Hyperlink"/>
+            <w:sz w:val="22"/>
+            <w:rFonts w:ascii="Calibri" w:hAnsi="Calibri"/>
+          </w:rPr>
+          <w:t xml:space="preserve">CapCut</w:t>
+        </w:r>
+      </w:hyperlink>
+      <w:r>
+        <w:rPr>
+          <w:rFonts w:ascii="Calibri" w:hAnsi="Calibri"/>
+        </w:rPr>
+        <w:t xml:space="preserve"> is enough. Footage you filmed, drew, or photographed, or one stock clip after you have read that clip’s license. Finish with that stack. The rest of this chapter is what to open when the stack cannot make the shot. Read the license before you publish.</w:t>
       </w:r>
     </w:p>
     <w:p>
@@ -3239,7 +3478,7 @@
                     <pic:cNvPicPr/>
                   </pic:nvPicPr>
                   <pic:blipFill>
-                    <a:blip r:embed="rId19"/>
+                    <a:blip r:embed="rId28"/>
                     <a:stretch>
                       <a:fillRect/>
                     </a:stretch>
@@ -3282,14 +3521,14 @@
         <w:rPr>
           <w:rFonts w:ascii="Calibri" w:hAnsi="Calibri"/>
         </w:rPr>
-        <w:t>Describe a shot. A text-to-video tool gives you a few seconds that did not exist an hour ago. Use one tool for the shot in front of you.</w:t>
+        <w:t>Describe a shot. A text-to-video tool gives you a few seconds that did not exist an hour ago. Use one tool for the shot the default stack cannot film, then stop.</w:t>
       </w:r>
     </w:p>
     <w:p>
       <w:pPr>
         <w:pStyle w:val="ListBullet"/>
       </w:pPr>
-      <w:hyperlink r:id="rId20">
+      <w:hyperlink r:id="rId29">
         <w:r>
           <w:rPr>
             <w:rStyle w:val="Hyperlink"/>
@@ -3310,29 +3549,76 @@
       <w:pPr>
         <w:pStyle w:val="ListBullet"/>
       </w:pPr>
-      <w:r>
-        <w:rPr>
-          <w:rFonts w:ascii="Calibri" w:hAnsi="Calibri"/>
-        </w:rPr>
-        <w:t>InVideo, Media.io, VEED, and Magic Hour do that job in a browser. Magic Hour also offers face swap, a talking head from one photo, lip sync, and restyling. A face you did not film is someone else’s face. Section VI is the check.</w:t>
+      <w:hyperlink r:id="rId30">
+        <w:r>
+          <w:rPr>
+            <w:rStyle w:val="Hyperlink"/>
+            <w:sz w:val="22"/>
+            <w:rFonts w:ascii="Calibri" w:hAnsi="Calibri"/>
+          </w:rPr>
+          <w:t xml:space="preserve">InVideo</w:t>
+        </w:r>
+      </w:hyperlink>
+      <w:r>
+        <w:rPr>
+          <w:rFonts w:ascii="Calibri" w:hAnsi="Calibri"/>
+        </w:rPr>
+        <w:t xml:space="preserve">, </w:t>
+      </w:r>
+      <w:hyperlink r:id="rId31">
+        <w:r>
+          <w:rPr>
+            <w:rStyle w:val="Hyperlink"/>
+            <w:sz w:val="22"/>
+            <w:rFonts w:ascii="Calibri" w:hAnsi="Calibri"/>
+          </w:rPr>
+          <w:t xml:space="preserve">Media.io</w:t>
+        </w:r>
+      </w:hyperlink>
+      <w:r>
+        <w:rPr>
+          <w:rFonts w:ascii="Calibri" w:hAnsi="Calibri"/>
+        </w:rPr>
+        <w:t xml:space="preserve">, </w:t>
+      </w:r>
+      <w:hyperlink r:id="rId32">
+        <w:r>
+          <w:rPr>
+            <w:rStyle w:val="Hyperlink"/>
+            <w:sz w:val="22"/>
+            <w:rFonts w:ascii="Calibri" w:hAnsi="Calibri"/>
+          </w:rPr>
+          <w:t xml:space="preserve">VEED</w:t>
+        </w:r>
+      </w:hyperlink>
+      <w:r>
+        <w:rPr>
+          <w:rFonts w:ascii="Calibri" w:hAnsi="Calibri"/>
+        </w:rPr>
+        <w:t xml:space="preserve">, and </w:t>
+      </w:r>
+      <w:hyperlink r:id="rId33">
+        <w:r>
+          <w:rPr>
+            <w:rStyle w:val="Hyperlink"/>
+            <w:sz w:val="22"/>
+            <w:rFonts w:ascii="Calibri" w:hAnsi="Calibri"/>
+          </w:rPr>
+          <w:t xml:space="preserve">Magic Hour</w:t>
+        </w:r>
+      </w:hyperlink>
+      <w:r>
+        <w:rPr>
+          <w:rFonts w:ascii="Calibri" w:hAnsi="Calibri"/>
+        </w:rPr>
+        <w:t xml:space="preserve"> do that job in a browser.</w:t>
       </w:r>
     </w:p>
     <w:p>
       <w:pPr>
         <w:pStyle w:val="ListBullet"/>
       </w:pPr>
-      <w:r>
-        <w:rPr>
-          <w:rFonts w:ascii="Calibri" w:hAnsi="Calibri"/>
-        </w:rPr>
-        <w:t>Remaker and Deepswap are built around face swap. Same check.</w:t>
-      </w:r>
-    </w:p>
-    <w:p>
-      <w:pPr>
-        <w:pStyle w:val="ListBullet"/>
-      </w:pPr>
-      <w:hyperlink r:id="rId21">
+      <w:hyperlink r:id="rId34">
         <w:r>
           <w:rPr>
             <w:rStyle w:val="Hyperlink"/>
@@ -3346,7 +3632,23 @@
         <w:rPr>
           <w:rFonts w:ascii="Calibri" w:hAnsi="Calibri"/>
         </w:rPr>
-        <w:t xml:space="preserve"> and Synthesys put a generated presenter on screen from a script. Use one when the video needs a person at a desk and you are not filming yourself.</w:t>
+        <w:t xml:space="preserve"> and </w:t>
+      </w:r>
+      <w:hyperlink r:id="rId35">
+        <w:r>
+          <w:rPr>
+            <w:rStyle w:val="Hyperlink"/>
+            <w:sz w:val="22"/>
+            <w:rFonts w:ascii="Calibri" w:hAnsi="Calibri"/>
+          </w:rPr>
+          <w:t xml:space="preserve">Synthesys</w:t>
+        </w:r>
+      </w:hyperlink>
+      <w:r>
+        <w:rPr>
+          <w:rFonts w:ascii="Calibri" w:hAnsi="Calibri"/>
+        </w:rPr>
+        <w:t xml:space="preserve"> put a generated presenter on screen from a script, when the video needs a person at a desk and you are not filming yourself.</w:t>
       </w:r>
     </w:p>
     <w:p>
@@ -3511,7 +3813,7 @@
                 <w:sz w:val="21"/>
               </w:rPr>
             </w:r>
-            <w:hyperlink r:id="rId22">
+            <w:hyperlink r:id="rId36">
               <w:r>
                 <w:rPr>
                   <w:rStyle w:val="Hyperlink"/>
@@ -3588,7 +3890,7 @@
                 <w:sz w:val="21"/>
               </w:rPr>
             </w:r>
-            <w:hyperlink r:id="rId23">
+            <w:hyperlink r:id="rId37">
               <w:r>
                 <w:rPr>
                   <w:rStyle w:val="Hyperlink"/>
@@ -3665,7 +3967,7 @@
                 <w:sz w:val="21"/>
               </w:rPr>
             </w:r>
-            <w:hyperlink r:id="rId24">
+            <w:hyperlink r:id="rId38">
               <w:r>
                 <w:rPr>
                   <w:rStyle w:val="Hyperlink"/>
@@ -3742,7 +4044,7 @@
                 <w:sz w:val="21"/>
               </w:rPr>
             </w:r>
-            <w:hyperlink r:id="rId25">
+            <w:hyperlink r:id="rId39">
               <w:r>
                 <w:rPr>
                   <w:rStyle w:val="Hyperlink"/>
@@ -3819,7 +4121,7 @@
                 <w:sz w:val="21"/>
               </w:rPr>
             </w:r>
-            <w:hyperlink r:id="rId26">
+            <w:hyperlink r:id="rId40">
               <w:r>
                 <w:rPr>
                   <w:rStyle w:val="Hyperlink"/>
@@ -3896,7 +4198,7 @@
                 <w:sz w:val="21"/>
               </w:rPr>
             </w:r>
-            <w:hyperlink r:id="rId27">
+            <w:hyperlink r:id="rId41">
               <w:r>
                 <w:rPr>
                   <w:rStyle w:val="Hyperlink"/>
@@ -3973,7 +4275,7 @@
                 <w:sz w:val="21"/>
               </w:rPr>
             </w:r>
-            <w:hyperlink r:id="rId28">
+            <w:hyperlink r:id="rId42">
               <w:r>
                 <w:rPr>
                   <w:rStyle w:val="Hyperlink"/>
@@ -4050,7 +4352,7 @@
                 <w:sz w:val="21"/>
               </w:rPr>
             </w:r>
-            <w:hyperlink r:id="rId29">
+            <w:hyperlink r:id="rId43">
               <w:r>
                 <w:rPr>
                   <w:rStyle w:val="Hyperlink"/>
@@ -4127,7 +4429,7 @@
                 <w:sz w:val="21"/>
               </w:rPr>
             </w:r>
-            <w:hyperlink r:id="rId30">
+            <w:hyperlink r:id="rId44">
               <w:r>
                 <w:rPr>
                   <w:rStyle w:val="Hyperlink"/>
@@ -4204,7 +4506,7 @@
                 <w:sz w:val="21"/>
               </w:rPr>
             </w:r>
-            <w:hyperlink r:id="rId31">
+            <w:hyperlink r:id="rId45">
               <w:r>
                 <w:rPr>
                   <w:rStyle w:val="Hyperlink"/>
@@ -4281,7 +4583,7 @@
                 <w:sz w:val="21"/>
               </w:rPr>
             </w:r>
-            <w:hyperlink r:id="rId32">
+            <w:hyperlink r:id="rId46">
               <w:r>
                 <w:rPr>
                   <w:rStyle w:val="Hyperlink"/>
@@ -4298,7 +4600,7 @@
               </w:rPr>
               <w:t xml:space="preserve"> / </w:t>
             </w:r>
-            <w:hyperlink r:id="rId33">
+            <w:hyperlink r:id="rId47">
               <w:r>
                 <w:rPr>
                   <w:rStyle w:val="Hyperlink"/>
@@ -4362,7 +4664,7 @@
     </w:tbl>
     <w:p/>
     <w:p>
-      <w:hyperlink r:id="rId34">
+      <w:hyperlink r:id="rId48">
         <w:r>
           <w:rPr>
             <w:rStyle w:val="Hyperlink"/>
@@ -4417,7 +4719,7 @@
         </w:rPr>
         <w:t xml:space="preserve">. </w:t>
       </w:r>
-      <w:hyperlink r:id="rId35">
+      <w:hyperlink r:id="rId49">
         <w:r>
           <w:rPr>
             <w:rStyle w:val="Hyperlink"/>
@@ -4433,7 +4735,7 @@
         </w:rPr>
         <w:t xml:space="preserve"> says it lives in YouTube Studio, on the left menu as Audio library, and also at </w:t>
       </w:r>
-      <w:hyperlink r:id="rId36">
+      <w:hyperlink r:id="rId50">
         <w:r>
           <w:rPr>
             <w:rStyle w:val="Hyperlink"/>
@@ -4457,7 +4759,7 @@
         </w:rPr>
         <w:t xml:space="preserve">Beyond it: </w:t>
       </w:r>
-      <w:hyperlink r:id="rId37">
+      <w:hyperlink r:id="rId51">
         <w:r>
           <w:rPr>
             <w:rStyle w:val="Hyperlink"/>
@@ -4473,7 +4775,7 @@
         </w:rPr>
         <w:t xml:space="preserve"> and </w:t>
       </w:r>
-      <w:hyperlink r:id="rId38">
+      <w:hyperlink r:id="rId52">
         <w:r>
           <w:rPr>
             <w:rStyle w:val="Hyperlink"/>
@@ -4489,7 +4791,7 @@
         </w:rPr>
         <w:t xml:space="preserve"> are free with no attribution required, the latter because its tracks are public domain outright. Sites built around a specific composer’s catalog, like Incompetech, or a named creator’s free tier, like Bensound, commonly require crediting that person by name in the video description even when the track itself costs nothing — read the attribution wording on the specific track, not just its price. For a sound effect that is not in that tab, </w:t>
       </w:r>
-      <w:hyperlink r:id="rId39">
+      <w:hyperlink r:id="rId53">
         <w:r>
           <w:rPr>
             <w:rStyle w:val="Hyperlink"/>
@@ -4505,7 +4807,7 @@
         </w:rPr>
         <w:t xml:space="preserve"> is one library of effects; read its license the same way you read a stock clip’s. </w:t>
       </w:r>
-      <w:hyperlink r:id="rId40">
+      <w:hyperlink r:id="rId54">
         <w:r>
           <w:rPr>
             <w:rStyle w:val="Hyperlink"/>
@@ -4523,7 +4825,7 @@
       </w:r>
     </w:p>
     <w:p>
-      <w:hyperlink r:id="rId41">
+      <w:hyperlink r:id="rId55">
         <w:r>
           <w:rPr>
             <w:rStyle w:val="Hyperlink"/>
@@ -4539,7 +4841,7 @@
         </w:rPr>
         <w:t xml:space="preserve"> clears its free tracks for monetized use if you keep a one-line credit, unless you pay to drop the credit. </w:t>
       </w:r>
-      <w:hyperlink r:id="rId42">
+      <w:hyperlink r:id="rId56">
         <w:r>
           <w:rPr>
             <w:rStyle w:val="Hyperlink"/>
@@ -4555,7 +4857,7 @@
         </w:rPr>
         <w:t xml:space="preserve"> hosts independent artists. Filter for the Creative Commons tracks. The rest of that library is not yours to use. </w:t>
       </w:r>
-      <w:hyperlink r:id="rId43">
+      <w:hyperlink r:id="rId57">
         <w:r>
           <w:rPr>
             <w:rStyle w:val="Hyperlink"/>
@@ -4587,7 +4889,7 @@
         </w:rPr>
         <w:t xml:space="preserve">A full song with vocals is a different job. </w:t>
       </w:r>
-      <w:hyperlink r:id="rId44">
+      <w:hyperlink r:id="rId58">
         <w:r>
           <w:rPr>
             <w:rStyle w:val="Hyperlink"/>
@@ -4603,7 +4905,7 @@
         </w:rPr>
         <w:t xml:space="preserve"> and </w:t>
       </w:r>
-      <w:hyperlink r:id="rId45">
+      <w:hyperlink r:id="rId59">
         <w:r>
           <w:rPr>
             <w:rStyle w:val="Hyperlink"/>
@@ -4647,7 +4949,7 @@
       <w:bookmarkEnd w:id="22"/>
     </w:p>
     <w:p>
-      <w:hyperlink r:id="rId46">
+      <w:hyperlink r:id="rId60">
         <w:r>
           <w:rPr>
             <w:rStyle w:val="Hyperlink"/>
@@ -4663,7 +4965,7 @@
         </w:rPr>
         <w:t xml:space="preserve"> and </w:t>
       </w:r>
-      <w:hyperlink r:id="rId47">
+      <w:hyperlink r:id="rId61">
         <w:r>
           <w:rPr>
             <w:rStyle w:val="Hyperlink"/>
@@ -4685,7 +4987,55 @@
         <w:rPr>
           <w:rFonts w:ascii="Calibri" w:hAnsi="Calibri"/>
         </w:rPr>
-        <w:t>ElevenLabs is the name creators most often call the most natural, as of this writing. Its free tier covers several short scripts a month. That reputation is creator talk. Listen to a sample on its own page before you pick it. NaturalReader and Speechify do the same job more simply. The voice sounds less natural. If your editor already speaks a script from the timeline, try that first. It skips a second export.</w:t>
+        <w:t xml:space="preserve">ElevenLabs is the name creators most often call the most natural, as of this writing. Its free tier covers several short scripts a month. That reputation is creator talk. Listen to a sample on </w:t>
+      </w:r>
+      <w:hyperlink r:id="rId62">
+        <w:r>
+          <w:rPr>
+            <w:rStyle w:val="Hyperlink"/>
+            <w:sz w:val="22"/>
+            <w:rFonts w:ascii="Calibri" w:hAnsi="Calibri"/>
+          </w:rPr>
+          <w:t xml:space="preserve">its own page</w:t>
+        </w:r>
+      </w:hyperlink>
+      <w:r>
+        <w:rPr>
+          <w:rFonts w:ascii="Calibri" w:hAnsi="Calibri"/>
+        </w:rPr>
+        <w:t xml:space="preserve"> before you pick it. </w:t>
+      </w:r>
+      <w:hyperlink r:id="rId63">
+        <w:r>
+          <w:rPr>
+            <w:rStyle w:val="Hyperlink"/>
+            <w:sz w:val="22"/>
+            <w:rFonts w:ascii="Calibri" w:hAnsi="Calibri"/>
+          </w:rPr>
+          <w:t xml:space="preserve">NaturalReader</w:t>
+        </w:r>
+      </w:hyperlink>
+      <w:r>
+        <w:rPr>
+          <w:rFonts w:ascii="Calibri" w:hAnsi="Calibri"/>
+        </w:rPr>
+        <w:t xml:space="preserve"> and </w:t>
+      </w:r>
+      <w:hyperlink r:id="rId64">
+        <w:r>
+          <w:rPr>
+            <w:rStyle w:val="Hyperlink"/>
+            <w:sz w:val="22"/>
+            <w:rFonts w:ascii="Calibri" w:hAnsi="Calibri"/>
+          </w:rPr>
+          <w:t xml:space="preserve">Speechify</w:t>
+        </w:r>
+      </w:hyperlink>
+      <w:r>
+        <w:rPr>
+          <w:rFonts w:ascii="Calibri" w:hAnsi="Calibri"/>
+        </w:rPr>
+        <w:t xml:space="preserve"> do the same job more simply. The voice sounds less natural. If your editor already speaks a script from the timeline, try that first. It skips a second export.</w:t>
       </w:r>
     </w:p>
     <w:p>
@@ -4727,9 +5077,9 @@
         <w:rPr>
           <w:rFonts w:ascii="Calibri" w:hAnsi="Calibri"/>
         </w:rPr>
-        <w:t xml:space="preserve">Trimming, a vertical frame, a join, a burned-in caption, and a format YouTube will take: a browser editor can do those at no cost. 123apps, EZGIF, Clideo, and </w:t>
-      </w:r>
-      <w:hyperlink r:id="rId48">
+        <w:t xml:space="preserve">Trimming, a vertical frame, a join, a burned-in caption, and a format YouTube will take: one browser editor can do those at no cost. </w:t>
+      </w:r>
+      <w:hyperlink r:id="rId27">
         <w:r>
           <w:rPr>
             <w:rStyle w:val="Hyperlink"/>
@@ -4743,9 +5093,57 @@
         <w:rPr>
           <w:rFonts w:ascii="Calibri" w:hAnsi="Calibri"/>
         </w:rPr>
-        <w:t xml:space="preserve"> each bundle most of them. </w:t>
-      </w:r>
-      <w:hyperlink r:id="rId49">
+        <w:t xml:space="preserve"> is the default. </w:t>
+      </w:r>
+      <w:hyperlink r:id="rId65">
+        <w:r>
+          <w:rPr>
+            <w:rStyle w:val="Hyperlink"/>
+            <w:sz w:val="22"/>
+            <w:rFonts w:ascii="Calibri" w:hAnsi="Calibri"/>
+          </w:rPr>
+          <w:t xml:space="preserve">123apps</w:t>
+        </w:r>
+      </w:hyperlink>
+      <w:r>
+        <w:rPr>
+          <w:rFonts w:ascii="Calibri" w:hAnsi="Calibri"/>
+        </w:rPr>
+        <w:t xml:space="preserve">, </w:t>
+      </w:r>
+      <w:hyperlink r:id="rId66">
+        <w:r>
+          <w:rPr>
+            <w:rStyle w:val="Hyperlink"/>
+            <w:sz w:val="22"/>
+            <w:rFonts w:ascii="Calibri" w:hAnsi="Calibri"/>
+          </w:rPr>
+          <w:t xml:space="preserve">EZGIF</w:t>
+        </w:r>
+      </w:hyperlink>
+      <w:r>
+        <w:rPr>
+          <w:rFonts w:ascii="Calibri" w:hAnsi="Calibri"/>
+        </w:rPr>
+        <w:t xml:space="preserve">, and </w:t>
+      </w:r>
+      <w:hyperlink r:id="rId67">
+        <w:r>
+          <w:rPr>
+            <w:rStyle w:val="Hyperlink"/>
+            <w:sz w:val="22"/>
+            <w:rFonts w:ascii="Calibri" w:hAnsi="Calibri"/>
+          </w:rPr>
+          <w:t xml:space="preserve">Clideo</w:t>
+        </w:r>
+      </w:hyperlink>
+      <w:r>
+        <w:rPr>
+          <w:rFonts w:ascii="Calibri" w:hAnsi="Calibri"/>
+        </w:rPr>
+        <w:t xml:space="preserve"> cover a single job when CapCut will not. </w:t>
+      </w:r>
+      <w:hyperlink r:id="rId68">
         <w:r>
           <w:rPr>
             <w:rStyle w:val="Hyperlink"/>
@@ -4759,7 +5157,23 @@
         <w:rPr>
           <w:rFonts w:ascii="Calibri" w:hAnsi="Calibri"/>
         </w:rPr>
-        <w:t xml:space="preserve"> is enough when all you need is a trim. cloudconvert.com turns one file format into another when the editor’s export list does not include the one you need.</w:t>
+        <w:t xml:space="preserve"> is enough when all you need is a trim. </w:t>
+      </w:r>
+      <w:hyperlink r:id="rId69">
+        <w:r>
+          <w:rPr>
+            <w:rStyle w:val="Hyperlink"/>
+            <w:sz w:val="22"/>
+            <w:rFonts w:ascii="Calibri" w:hAnsi="Calibri"/>
+          </w:rPr>
+          <w:t xml:space="preserve">CloudConvert</w:t>
+        </w:r>
+      </w:hyperlink>
+      <w:r>
+        <w:rPr>
+          <w:rFonts w:ascii="Calibri" w:hAnsi="Calibri"/>
+        </w:rPr>
+        <w:t xml:space="preserve"> turns one file format into another when the editor’s export list does not include the one you need.</w:t>
       </w:r>
     </w:p>
     <w:p>
@@ -4777,7 +5191,7 @@
         </w:rPr>
         <w:t xml:space="preserve">Underneath nearly all of these, doing the actual video processing, is </w:t>
       </w:r>
-      <w:hyperlink r:id="rId50">
+      <w:hyperlink r:id="rId70">
         <w:r>
           <w:rPr>
             <w:rStyle w:val="Hyperlink"/>
@@ -4814,7 +5228,7 @@
         </w:rPr>
         <w:t xml:space="preserve">Whatever tool does the final export, match </w:t>
       </w:r>
-      <w:hyperlink r:id="rId51">
+      <w:hyperlink r:id="rId71">
         <w:r>
           <w:rPr>
             <w:rStyle w:val="Hyperlink"/>
@@ -4871,6 +5285,14 @@
           <w:rFonts w:ascii="Calibri" w:hAnsi="Calibri"/>
         </w:rPr>
         <w:t>Before you post the same file on another site, read the license for that site. A grant that names YouTube does not automatically name every other logo. If the license is silent, do not post the file there.</w:t>
+      </w:r>
+    </w:p>
+    <w:p>
+      <w:r>
+        <w:rPr>
+          <w:rFonts w:ascii="Calibri" w:hAnsi="Calibri"/>
+        </w:rPr>
+        <w:t>A face swap, or a voice cloned from someone else, fails this check unless that person has agreed in writing. The tool’s terms do not supply that agreement. Do not build the video around either one.</w:t>
       </w:r>
     </w:p>
     <w:tbl>
@@ -5033,6 +5455,19 @@
       </w:r>
     </w:p>
     <w:p>
+      <w:pPr>
+        <w:sectPr>
+          <w:headerReference w:type="default" r:id="rId25"/>
+          <w:footerReference w:type="default" r:id="rId26"/>
+          <w:pgSz w:w="10080" w:h="14400"/>
+          <w:pgMar w:top="1008" w:right="1008" w:bottom="1008" w:left="1008" w:header="504" w:footer="504" w:gutter="0"/>
+          <w:cols w:space="720"/>
+          <w:titlePg/>
+          <w:docGrid w:linePitch="360"/>
+        </w:sectPr>
+      </w:pPr>
+    </w:p>
+    <w:p>
       <w:bookmarkStart w:id="26" w:name="toc25"/>
       <w:pPr>
         <w:pStyle w:val="Heading1"/>
@@ -5090,7 +5525,15 @@
         <w:rPr>
           <w:rFonts w:ascii="Calibri" w:hAnsi="Calibri"/>
         </w:rPr>
-        <w:t>Jobs that sell, used in this order:</w:t>
+        <w:t>The order is the buyer’s order. They have to recognize themselves before a method is worth hearing. They have to see the method before proof means anything. They have to see proof before a comparison is a choice. They have to hear the comparison and the one objection before the price is a decision. The last video names the path, so the set is not a feed.</w:t>
+      </w:r>
+    </w:p>
+    <w:p>
+      <w:r>
+        <w:rPr>
+          <w:rFonts w:ascii="Calibri" w:hAnsi="Calibri"/>
+        </w:rPr>
+        <w:t>Jobs that sell, in that order:</w:t>
       </w:r>
     </w:p>
     <w:p>
@@ -5244,7 +5687,7 @@
         <w:rPr>
           <w:rFonts w:ascii="Calibri" w:hAnsi="Calibri"/>
         </w:rPr>
-        <w:t xml:space="preserve"> The twenty-second version from the offer chapter, filmed as its own short video and also spoken once at the end of the others.</w:t>
+        <w:t xml:space="preserve"> The twenty-second version from the offer chapter, filmed as a brief video, long enough for a clickable description, and also spoken once at the end of the others. A YouTube Short cannot be this video. Its description is not a checkout.</w:t>
       </w:r>
     </w:p>
     <w:p>
@@ -5274,7 +5717,7 @@
         <w:rPr>
           <w:rFonts w:ascii="Calibri" w:hAnsi="Calibri"/>
         </w:rPr>
-        <w:t>That is the first eight. You may post shorts that point at these. You do not need a ninth idea until these eight exist and the offer link has been clicked by someone who is not you.</w:t>
+        <w:t>That is the first eight, and it is the only production load in this book. The click chapter uses the same eight. So does the six-week calendar. A Short may point at one of them. It does not add a second quota. You do not need a ninth idea until these eight exist and the offer link has been clicked by someone who is not you.</w:t>
       </w:r>
     </w:p>
     <w:p>
@@ -5344,7 +5787,7 @@
         <w:rPr>
           <w:rFonts w:ascii="Calibri" w:hAnsi="Calibri"/>
         </w:rPr>
-        <w:t>Eight finished videos aimed at one offer beat forty videos aimed at “the algorithm.” The posting rhythm in the click chapter is a floor for staying visible, not an order to invent topics. If you can publish one of the eight a week, publish one of the eight a week. If a week is too fast to keep the teaching accurate, slow down. A wrong video that contradicts the offer does more damage than a quiet week.</w:t>
+        <w:t>Eight finished videos aimed at one offer beat forty videos aimed at a posting streak. If you can publish one of the eight a week, do that. If a week is too fast to keep the teaching accurate, slow down. A wrong video that contradicts the offer does more damage than a quiet week.</w:t>
       </w:r>
     </w:p>
     <w:p>
@@ -5361,7 +5804,7 @@
         <w:pStyle w:val="Heading2"/>
       </w:pPr>
       <w:r>
-        <w:t>V. Four people, and the move you can copy</w:t>
+        <w:t>V. Four people, and which move is yours</w:t>
       </w:r>
       <w:bookmarkEnd w:id="31"/>
     </w:p>
@@ -5370,47 +5813,23 @@
         <w:rPr>
           <w:rFonts w:ascii="Calibri" w:hAnsi="Calibri"/>
         </w:rPr>
-        <w:t>These are not income promises. They are the early repeat, in the person’s own interviews. Copy the repeat. The later studio is not the lesson.</w:t>
-      </w:r>
-    </w:p>
-    <w:p>
-      <w:r>
-        <w:rPr>
-          <w:rFonts w:ascii="Calibri" w:hAnsi="Calibri"/>
-        </w:rPr>
-        <w:t>Marques Brownlee told The Verge he bought a laptop after watching reviews, found details those reviews had skipped, and turned on a webcam so the next buyer would not miss them. The video he counts as the start was about one accessory that came in the box. On Recode he described posting about Safari for Windows the day it was available, and waking up to on the order of 6,000 views when his other videos were not doing that. In the same interview he told people who ask which camera to buy to start with the gear they already have. A better camera did not make the first video. A buyer’s missing detail did.</w:t>
-      </w:r>
-    </w:p>
-    <w:p>
-      <w:r>
-        <w:rPr>
-          <w:rFonts w:ascii="Calibri" w:hAnsi="Calibri"/>
-        </w:rPr>
-        <w:t>Andrew Rea told Mashed the first Binging with Babish video was a one-off: a burger from a Parks and Recreation episode, filmed because he wanted to know what it tasted like. He had not planned a series. He kept going because he wanted to edit the next one the same night. He later added Basics with Babish, which taught ordinary technique instead of only the stunt recipe, and he published a cookbook of food from the videos. The free videos were the method. The book was the thing a stranger could buy.</w:t>
-      </w:r>
-    </w:p>
-    <w:p>
-      <w:r>
-        <w:rPr>
-          <w:rFonts w:ascii="Calibri" w:hAnsi="Calibri"/>
-        </w:rPr>
-        <w:t>Ali Abdaal told Mixergy he made a short course on editing, on someone else’s platform, in about a day, and it kept selling after he stopped promoting it. He then made his own course, because leaving the income on a platform he did not control felt fragile. The YouTube video stayed the piece he wanted to make. The other posts were cut from it.</w:t>
-      </w:r>
-    </w:p>
-    <w:p>
-      <w:r>
-        <w:rPr>
-          <w:rFonts w:ascii="Calibri" w:hAnsi="Calibri"/>
-        </w:rPr>
-        <w:t>Hannah Hart told The Verge the first year of her channel was a webcam, with the laptop on a stack of books. She recorded in Photo Booth and cut the video in iMovie. She said the first episode reached about 80,000 views, and that she was still filming without a crew years later. The Verge’s introduction notes that she later published a cookbook and, by that interview, a memoir. The early move is one video with the gear already on the desk. The books are the thing a stranger could buy. The later audience is not the lesson.</w:t>
-      </w:r>
-    </w:p>
-    <w:p>
-      <w:r>
-        <w:rPr>
-          <w:rFonts w:ascii="Calibri" w:hAnsi="Calibri"/>
-        </w:rPr>
-        <w:t>What you can copy is the early move, and only that. Brownlee filmed one missing detail a buyer would have wanted, on a webcam. Rea filmed one recipe he wanted to taste, and a cookbook came later. Abdaal sold a short course, then moved that sale onto something he controlled. Hart’s first year was a laptop on a stack of books, and the books a stranger could buy came after. None of that is this chapter’s eight-video set. The set is the method here. Their later studios, audiences, and income are not evidence the set works, and they are not a reason to wait for a studio before the offer exists.</w:t>
+        <w:t>These interviews are not income promises. They are not proof that the eight jobs work. Three of them are the path this book declines.</w:t>
+      </w:r>
+    </w:p>
+    <w:p>
+      <w:r>
+        <w:rPr>
+          <w:rFonts w:ascii="Calibri" w:hAnsi="Calibri"/>
+        </w:rPr>
+        <w:t>Marques Brownlee told The Verge he turned on a webcam so the next laptop buyer would not miss a detail the reviews had skipped. On Recode he told people who ask which camera to buy to start with the gear they already have, and he recalled a Safari-for-Windows video reaching on the order of 6,000 views. Andrew Rea told Mashed the first video was one burger he wanted to taste. A cookbook of the recipes came later. Hannah Hart told The Verge the first year was a webcam, the laptop on a stack of books, recorded in Photo Booth and cut in iMovie. She said the first episode reached about 80,000 views, and that she was still filming without a crew years later. The Verge’s introduction notes a cookbook and, by that interview, a memoir. Those products came after the audience. Film first, price later, is the order this book refuses. The page and the price come before the second video.</w:t>
+      </w:r>
+    </w:p>
+    <w:p>
+      <w:r>
+        <w:rPr>
+          <w:rFonts w:ascii="Calibri" w:hAnsi="Calibri"/>
+        </w:rPr>
+        <w:t>Ali Abdaal told Mixergy he made a short editing course, on someone else’s platform, in about a day, and it kept selling after he stopped promoting it. He then moved that sale onto a course he controlled, because leaving the income on a platform he did not own felt fragile. That is the move this book keeps: a price, on a page you control, while the videos are still small. His later audience is not the lesson. The eight jobs are the method. A studio is not a reason to wait for one.</w:t>
       </w:r>
     </w:p>
     <w:p>
@@ -5550,7 +5969,7 @@
         <w:rPr>
           <w:rFonts w:ascii="Calibri" w:hAnsi="Calibri"/>
         </w:rPr>
-        <w:t>That you need the studio those channels have now. Brownlee started on a webcam. Hart’s first year was a laptop on a stack of books. Rea started with one recipe he wanted to taste. The gear came after the repeat.</w:t>
+        <w:t>That you need the studio those channels have now. Brownlee, Rea, and Hart filmed with what was on the desk, and the product came after the audience. This book keeps Abdaal’s move instead: a price on a page you control, before the second video. The gear can be the gear you have. The missing price cannot.</w:t>
       </w:r>
     </w:p>
     <w:p>
@@ -5571,6 +5990,19 @@
       </w:r>
     </w:p>
     <w:p>
+      <w:pPr>
+        <w:sectPr>
+          <w:headerReference w:type="default" r:id="rId72"/>
+          <w:footerReference w:type="default" r:id="rId73"/>
+          <w:pgSz w:w="10080" w:h="14400"/>
+          <w:pgMar w:top="1008" w:right="1008" w:bottom="1008" w:left="1008" w:header="504" w:footer="504" w:gutter="0"/>
+          <w:cols w:space="720"/>
+          <w:titlePg/>
+          <w:docGrid w:linePitch="360"/>
+        </w:sectPr>
+      </w:pPr>
+    </w:p>
+    <w:p>
       <w:bookmarkStart w:id="34" w:name="toc33"/>
       <w:pPr>
         <w:pStyle w:val="Heading1"/>
@@ -5622,7 +6054,7 @@
         </w:rPr>
         <w:t xml:space="preserve">YouTube pays through two gates, and neither one is the first money. The offer in chapter 1 can pay on a sale before either gate opens. YouTube’s own ads on your videos, before you are accepted, are not your revenue. </w:t>
       </w:r>
-      <w:hyperlink r:id="rId52">
+      <w:hyperlink r:id="rId76">
         <w:r>
           <w:rPr>
             <w:rStyle w:val="Hyperlink"/>
@@ -5646,7 +6078,7 @@
         </w:rPr>
         <w:t xml:space="preserve">In countries where YouTube has opened the expanded program, the first gate is fan funding and Shopping: channel memberships, Super Chat, Super Stickers, Super Thanks, and product tags. </w:t>
       </w:r>
-      <w:hyperlink r:id="rId53">
+      <w:hyperlink r:id="rId77">
         <w:r>
           <w:rPr>
             <w:rStyle w:val="Hyperlink"/>
@@ -5845,7 +6277,7 @@
                     <pic:cNvPicPr/>
                   </pic:nvPicPr>
                   <pic:blipFill>
-                    <a:blip r:embed="rId54"/>
+                    <a:blip r:embed="rId78"/>
                     <a:stretch>
                       <a:fillRect/>
                     </a:stretch>
@@ -5870,1158 +6302,136 @@
           <w:rFonts w:ascii="Calibri" w:hAnsi="Calibri"/>
           <w:i/>
         </w:rPr>
-        <w:t>The highlighted YouTube bar is 1,000 subscribers, the ad-share gate from §I. The fan-funding gate is 500 subscribers and is deliberately not a second bar: this chart compares main ad programs, and a follower count alone still does not make a channel eligible. Figures as of the time of writing. The table below is the fuller picture.</w:t>
-      </w:r>
-    </w:p>
-    <w:tbl>
-      <w:tblPr>
-        <w:tblStyle w:val="TableGrid"/>
-        <w:tblW w:type="auto" w:w="0"/>
-        <w:tblLayout w:type="fixed"/>
-        <w:tblLook w:firstColumn="1" w:firstRow="1" w:lastColumn="0" w:lastRow="0" w:noHBand="0" w:noVBand="1" w:val="04A0"/>
-        <w:tblW w:w="8063" w:type="dxa"/>
-      </w:tblPr>
-      <w:tblGrid>
-        <w:gridCol w:w="2016"/>
-        <w:gridCol w:w="2016"/>
-        <w:gridCol w:w="2016"/>
-        <w:gridCol w:w="2016"/>
-      </w:tblGrid>
-      <w:tr>
-        <w:tc>
-          <w:tcPr>
-            <w:tcW w:type="dxa" w:w="2016"/>
-            <w:tcW w:w="1512" w:type="dxa"/>
-            <w:shd w:val="clear" w:color="auto" w:fill="F3F1EA"/>
-          </w:tcPr>
-          <w:p>
-            <w:pPr>
-              <w:spacing w:after="40" w:before="40"/>
-            </w:pPr>
-            <w:r>
-              <w:rPr>
-                <w:rFonts w:ascii="Calibri" w:hAnsi="Calibri"/>
-                <w:b/>
-                <w:sz w:val="21"/>
-              </w:rPr>
-            </w:r>
-            <w:r>
-              <w:rPr>
-                <w:rFonts w:ascii="Calibri" w:hAnsi="Calibri"/>
-                <w:b/>
-                <w:sz w:val="21"/>
-              </w:rPr>
-              <w:t>Platform</w:t>
-            </w:r>
-          </w:p>
-        </w:tc>
-        <w:tc>
-          <w:tcPr>
-            <w:tcW w:type="dxa" w:w="2016"/>
-            <w:tcW w:w="1728" w:type="dxa"/>
-            <w:shd w:val="clear" w:color="auto" w:fill="F3F1EA"/>
-          </w:tcPr>
-          <w:p>
-            <w:pPr>
-              <w:spacing w:after="40" w:before="40"/>
-            </w:pPr>
-            <w:r>
-              <w:rPr>
-                <w:rFonts w:ascii="Calibri" w:hAnsi="Calibri"/>
-                <w:b/>
-                <w:sz w:val="21"/>
-              </w:rPr>
-            </w:r>
-            <w:r>
-              <w:rPr>
-                <w:rFonts w:ascii="Calibri" w:hAnsi="Calibri"/>
-                <w:b/>
-                <w:sz w:val="21"/>
-              </w:rPr>
-              <w:t>Program</w:t>
-            </w:r>
-          </w:p>
-        </w:tc>
-        <w:tc>
-          <w:tcPr>
-            <w:tcW w:type="dxa" w:w="2016"/>
-            <w:tcW w:w="3168" w:type="dxa"/>
-            <w:shd w:val="clear" w:color="auto" w:fill="F3F1EA"/>
-          </w:tcPr>
-          <w:p>
-            <w:pPr>
-              <w:spacing w:after="40" w:before="40"/>
-            </w:pPr>
-            <w:r>
-              <w:rPr>
-                <w:rFonts w:ascii="Calibri" w:hAnsi="Calibri"/>
-                <w:b/>
-                <w:sz w:val="21"/>
-              </w:rPr>
-            </w:r>
-            <w:r>
-              <w:rPr>
-                <w:rFonts w:ascii="Calibri" w:hAnsi="Calibri"/>
-                <w:b/>
-                <w:sz w:val="21"/>
-              </w:rPr>
-              <w:t>Threshold (at time of writing)</w:t>
-            </w:r>
-          </w:p>
-        </w:tc>
-        <w:tc>
-          <w:tcPr>
-            <w:tcW w:type="dxa" w:w="2016"/>
-            <w:tcW w:w="1655" w:type="dxa"/>
-            <w:shd w:val="clear" w:color="auto" w:fill="F3F1EA"/>
-          </w:tcPr>
-          <w:p>
-            <w:pPr>
-              <w:spacing w:after="40" w:before="40"/>
-            </w:pPr>
-            <w:r>
-              <w:rPr>
-                <w:rFonts w:ascii="Calibri" w:hAnsi="Calibri"/>
-                <w:b/>
-                <w:sz w:val="21"/>
-              </w:rPr>
-            </w:r>
-            <w:r>
-              <w:rPr>
-                <w:rFonts w:ascii="Calibri" w:hAnsi="Calibri"/>
-                <w:b/>
-                <w:sz w:val="21"/>
-              </w:rPr>
-              <w:t>Model</w:t>
-            </w:r>
-          </w:p>
-        </w:tc>
-      </w:tr>
-      <w:tr>
-        <w:tc>
-          <w:tcPr>
-            <w:tcW w:type="dxa" w:w="2016"/>
-            <w:tcW w:w="1512" w:type="dxa"/>
-          </w:tcPr>
-          <w:p>
-            <w:pPr>
-              <w:spacing w:after="40" w:before="40"/>
-            </w:pPr>
-            <w:r>
-              <w:rPr>
-                <w:rFonts w:ascii="Calibri" w:hAnsi="Calibri"/>
-                <w:sz w:val="21"/>
-              </w:rPr>
-            </w:r>
-            <w:r>
-              <w:rPr>
-                <w:rFonts w:ascii="Calibri" w:hAnsi="Calibri"/>
-                <w:sz w:val="21"/>
-              </w:rPr>
-              <w:t>YouTube</w:t>
-            </w:r>
-          </w:p>
-        </w:tc>
-        <w:tc>
-          <w:tcPr>
-            <w:tcW w:type="dxa" w:w="2016"/>
-            <w:tcW w:w="1728" w:type="dxa"/>
-          </w:tcPr>
-          <w:p>
-            <w:pPr>
-              <w:spacing w:after="40" w:before="40"/>
-            </w:pPr>
-            <w:r>
-              <w:rPr>
-                <w:rFonts w:ascii="Calibri" w:hAnsi="Calibri"/>
-                <w:sz w:val="21"/>
-              </w:rPr>
-            </w:r>
-            <w:r>
-              <w:rPr>
-                <w:rFonts w:ascii="Calibri" w:hAnsi="Calibri"/>
-                <w:sz w:val="21"/>
-              </w:rPr>
-              <w:t>Partner Program</w:t>
-            </w:r>
-          </w:p>
-        </w:tc>
-        <w:tc>
-          <w:tcPr>
-            <w:tcW w:type="dxa" w:w="2016"/>
-            <w:tcW w:w="3168" w:type="dxa"/>
-          </w:tcPr>
-          <w:p>
-            <w:pPr>
-              <w:spacing w:after="40" w:before="40"/>
-            </w:pPr>
-            <w:r>
-              <w:rPr>
-                <w:rFonts w:ascii="Calibri" w:hAnsi="Calibri"/>
-                <w:sz w:val="21"/>
-              </w:rPr>
-            </w:r>
-            <w:r>
-              <w:rPr>
-                <w:rFonts w:ascii="Calibri" w:hAnsi="Calibri"/>
-                <w:sz w:val="21"/>
-              </w:rPr>
-              <w:t>1,000 subscribers + 4,000 watch hours/12 months, or 10M Shorts views/90 days</w:t>
-            </w:r>
-          </w:p>
-        </w:tc>
-        <w:tc>
-          <w:tcPr>
-            <w:tcW w:type="dxa" w:w="2016"/>
-            <w:tcW w:w="1655" w:type="dxa"/>
-          </w:tcPr>
-          <w:p>
-            <w:pPr>
-              <w:spacing w:after="40" w:before="40"/>
-            </w:pPr>
-            <w:r>
-              <w:rPr>
-                <w:rFonts w:ascii="Calibri" w:hAnsi="Calibri"/>
-                <w:sz w:val="21"/>
-              </w:rPr>
-            </w:r>
-            <w:r>
-              <w:rPr>
-                <w:rFonts w:ascii="Calibri" w:hAnsi="Calibri"/>
-                <w:sz w:val="21"/>
-              </w:rPr>
-              <w:t>Ad revenue share</w:t>
-            </w:r>
-          </w:p>
-        </w:tc>
-      </w:tr>
-      <w:tr>
-        <w:tc>
-          <w:tcPr>
-            <w:tcW w:type="dxa" w:w="2016"/>
-            <w:tcW w:w="1512" w:type="dxa"/>
-          </w:tcPr>
-          <w:p>
-            <w:pPr>
-              <w:spacing w:after="40" w:before="40"/>
-            </w:pPr>
-            <w:r>
-              <w:rPr>
-                <w:rFonts w:ascii="Calibri" w:hAnsi="Calibri"/>
-                <w:sz w:val="21"/>
-              </w:rPr>
-            </w:r>
-            <w:hyperlink r:id="rId55">
-              <w:r>
-                <w:rPr>
-                  <w:rStyle w:val="Hyperlink"/>
-                  <w:sz w:val="22"/>
-                  <w:rFonts w:ascii="Calibri" w:hAnsi="Calibri"/>
-                </w:rPr>
-                <w:t xml:space="preserve">TikTok</w:t>
-              </w:r>
-            </w:hyperlink>
-          </w:p>
-        </w:tc>
-        <w:tc>
-          <w:tcPr>
-            <w:tcW w:type="dxa" w:w="2016"/>
-            <w:tcW w:w="1728" w:type="dxa"/>
-          </w:tcPr>
-          <w:p>
-            <w:pPr>
-              <w:spacing w:after="40" w:before="40"/>
-            </w:pPr>
-            <w:r>
-              <w:rPr>
-                <w:rFonts w:ascii="Calibri" w:hAnsi="Calibri"/>
-                <w:sz w:val="21"/>
-              </w:rPr>
-            </w:r>
-            <w:r>
-              <w:rPr>
-                <w:rFonts w:ascii="Calibri" w:hAnsi="Calibri"/>
-                <w:sz w:val="21"/>
-              </w:rPr>
-              <w:t>Creator Rewards</w:t>
-            </w:r>
-          </w:p>
-        </w:tc>
-        <w:tc>
-          <w:tcPr>
-            <w:tcW w:type="dxa" w:w="2016"/>
-            <w:tcW w:w="3168" w:type="dxa"/>
-          </w:tcPr>
-          <w:p>
-            <w:pPr>
-              <w:spacing w:after="40" w:before="40"/>
-            </w:pPr>
-            <w:r>
-              <w:rPr>
-                <w:rFonts w:ascii="Calibri" w:hAnsi="Calibri"/>
-                <w:sz w:val="21"/>
-              </w:rPr>
-            </w:r>
-            <w:r>
-              <w:rPr>
-                <w:rFonts w:ascii="Calibri" w:hAnsi="Calibri"/>
-                <w:sz w:val="21"/>
-              </w:rPr>
-              <w:t>10,000 followers + 100,000 views/30 days; 18+; videos 60s or longer; limited countries</w:t>
-            </w:r>
-          </w:p>
-        </w:tc>
-        <w:tc>
-          <w:tcPr>
-            <w:tcW w:type="dxa" w:w="2016"/>
-            <w:tcW w:w="1655" w:type="dxa"/>
-          </w:tcPr>
-          <w:p>
-            <w:pPr>
-              <w:spacing w:after="40" w:before="40"/>
-            </w:pPr>
-            <w:r>
-              <w:rPr>
-                <w:rFonts w:ascii="Calibri" w:hAnsi="Calibri"/>
-                <w:sz w:val="21"/>
-              </w:rPr>
-            </w:r>
-            <w:r>
-              <w:rPr>
-                <w:rFonts w:ascii="Calibri" w:hAnsi="Calibri"/>
-                <w:sz w:val="21"/>
-              </w:rPr>
-              <w:t>Pay per qualified view</w:t>
-            </w:r>
-          </w:p>
-        </w:tc>
-      </w:tr>
-      <w:tr>
-        <w:tc>
-          <w:tcPr>
-            <w:tcW w:type="dxa" w:w="2016"/>
-            <w:tcW w:w="1512" w:type="dxa"/>
-          </w:tcPr>
-          <w:p>
-            <w:pPr>
-              <w:spacing w:after="40" w:before="40"/>
-            </w:pPr>
-            <w:r>
-              <w:rPr>
-                <w:rFonts w:ascii="Calibri" w:hAnsi="Calibri"/>
-                <w:sz w:val="21"/>
-              </w:rPr>
-            </w:r>
-            <w:hyperlink r:id="rId56">
-              <w:r>
-                <w:rPr>
-                  <w:rStyle w:val="Hyperlink"/>
-                  <w:sz w:val="22"/>
-                  <w:rFonts w:ascii="Calibri" w:hAnsi="Calibri"/>
-                </w:rPr>
-                <w:t xml:space="preserve">Facebook</w:t>
-              </w:r>
-            </w:hyperlink>
-          </w:p>
-        </w:tc>
-        <w:tc>
-          <w:tcPr>
-            <w:tcW w:type="dxa" w:w="2016"/>
-            <w:tcW w:w="1728" w:type="dxa"/>
-          </w:tcPr>
-          <w:p>
-            <w:pPr>
-              <w:spacing w:after="40" w:before="40"/>
-            </w:pPr>
-            <w:r>
-              <w:rPr>
-                <w:rFonts w:ascii="Calibri" w:hAnsi="Calibri"/>
-                <w:sz w:val="21"/>
-              </w:rPr>
-            </w:r>
-            <w:r>
-              <w:rPr>
-                <w:rFonts w:ascii="Calibri" w:hAnsi="Calibri"/>
-                <w:sz w:val="21"/>
-              </w:rPr>
-              <w:t>Content Monetization</w:t>
-            </w:r>
-          </w:p>
-        </w:tc>
-        <w:tc>
-          <w:tcPr>
-            <w:tcW w:type="dxa" w:w="2016"/>
-            <w:tcW w:w="3168" w:type="dxa"/>
-          </w:tcPr>
-          <w:p>
-            <w:pPr>
-              <w:spacing w:after="40" w:before="40"/>
-            </w:pPr>
-            <w:r>
-              <w:rPr>
-                <w:rFonts w:ascii="Calibri" w:hAnsi="Calibri"/>
-                <w:sz w:val="21"/>
-              </w:rPr>
-            </w:r>
-            <w:r>
-              <w:rPr>
-                <w:rFonts w:ascii="Calibri" w:hAnsi="Calibri"/>
-                <w:sz w:val="21"/>
-              </w:rPr>
-              <w:t>10,000 followers + 600,000 minutes watched/60 days + 5 videos on the Page</w:t>
-            </w:r>
-          </w:p>
-        </w:tc>
-        <w:tc>
-          <w:tcPr>
-            <w:tcW w:type="dxa" w:w="2016"/>
-            <w:tcW w:w="1655" w:type="dxa"/>
-          </w:tcPr>
-          <w:p>
-            <w:pPr>
-              <w:spacing w:after="40" w:before="40"/>
-            </w:pPr>
-            <w:r>
-              <w:rPr>
-                <w:rFonts w:ascii="Calibri" w:hAnsi="Calibri"/>
-                <w:sz w:val="21"/>
-              </w:rPr>
-            </w:r>
-            <w:r>
-              <w:rPr>
-                <w:rFonts w:ascii="Calibri" w:hAnsi="Calibri"/>
-                <w:sz w:val="21"/>
-              </w:rPr>
-              <w:t>Ad revenue share</w:t>
-            </w:r>
-          </w:p>
-        </w:tc>
-      </w:tr>
-      <w:tr>
-        <w:tc>
-          <w:tcPr>
-            <w:tcW w:type="dxa" w:w="2016"/>
-            <w:tcW w:w="1512" w:type="dxa"/>
-          </w:tcPr>
-          <w:p>
-            <w:pPr>
-              <w:spacing w:after="40" w:before="40"/>
-            </w:pPr>
-            <w:r>
-              <w:rPr>
-                <w:rFonts w:ascii="Calibri" w:hAnsi="Calibri"/>
-                <w:sz w:val="21"/>
-              </w:rPr>
-            </w:r>
-            <w:hyperlink r:id="rId57">
-              <w:r>
-                <w:rPr>
-                  <w:rStyle w:val="Hyperlink"/>
-                  <w:sz w:val="22"/>
-                  <w:rFonts w:ascii="Calibri" w:hAnsi="Calibri"/>
-                </w:rPr>
-                <w:t xml:space="preserve">Snapchat</w:t>
-              </w:r>
-            </w:hyperlink>
-          </w:p>
-        </w:tc>
-        <w:tc>
-          <w:tcPr>
-            <w:tcW w:type="dxa" w:w="2016"/>
-            <w:tcW w:w="1728" w:type="dxa"/>
-          </w:tcPr>
-          <w:p>
-            <w:pPr>
-              <w:spacing w:after="40" w:before="40"/>
-            </w:pPr>
-            <w:r>
-              <w:rPr>
-                <w:rFonts w:ascii="Calibri" w:hAnsi="Calibri"/>
-                <w:sz w:val="21"/>
-              </w:rPr>
-            </w:r>
-            <w:r>
-              <w:rPr>
-                <w:rFonts w:ascii="Calibri" w:hAnsi="Calibri"/>
-                <w:sz w:val="21"/>
-              </w:rPr>
-              <w:t>Spotlight monetization</w:t>
-            </w:r>
-          </w:p>
-        </w:tc>
-        <w:tc>
-          <w:tcPr>
-            <w:tcW w:type="dxa" w:w="2016"/>
-            <w:tcW w:w="3168" w:type="dxa"/>
-          </w:tcPr>
-          <w:p>
-            <w:pPr>
-              <w:spacing w:after="40" w:before="40"/>
-            </w:pPr>
-            <w:r>
-              <w:rPr>
-                <w:rFonts w:ascii="Calibri" w:hAnsi="Calibri"/>
-                <w:sz w:val="21"/>
-              </w:rPr>
-            </w:r>
-            <w:r>
-              <w:rPr>
-                <w:rFonts w:ascii="Calibri" w:hAnsi="Calibri"/>
-                <w:sz w:val="21"/>
-              </w:rPr>
-              <w:t>50,000 followers + 25 posts/month + 100 hours of Spotlight view time/28 days</w:t>
-            </w:r>
-          </w:p>
-        </w:tc>
-        <w:tc>
-          <w:tcPr>
-            <w:tcW w:type="dxa" w:w="2016"/>
-            <w:tcW w:w="1655" w:type="dxa"/>
-          </w:tcPr>
-          <w:p>
-            <w:pPr>
-              <w:spacing w:after="40" w:before="40"/>
-            </w:pPr>
-            <w:r>
-              <w:rPr>
-                <w:rFonts w:ascii="Calibri" w:hAnsi="Calibri"/>
-                <w:sz w:val="21"/>
-              </w:rPr>
-            </w:r>
-            <w:r>
-              <w:rPr>
-                <w:rFonts w:ascii="Calibri" w:hAnsi="Calibri"/>
-                <w:sz w:val="21"/>
-              </w:rPr>
-              <w:t>Ad revenue share</w:t>
-            </w:r>
-          </w:p>
-        </w:tc>
-      </w:tr>
-      <w:tr>
-        <w:tc>
-          <w:tcPr>
-            <w:tcW w:type="dxa" w:w="2016"/>
-            <w:tcW w:w="1512" w:type="dxa"/>
-          </w:tcPr>
-          <w:p>
-            <w:pPr>
-              <w:spacing w:after="40" w:before="40"/>
-            </w:pPr>
-            <w:r>
-              <w:rPr>
-                <w:rFonts w:ascii="Calibri" w:hAnsi="Calibri"/>
-                <w:sz w:val="21"/>
-              </w:rPr>
-            </w:r>
-            <w:hyperlink r:id="rId58">
-              <w:r>
-                <w:rPr>
-                  <w:rStyle w:val="Hyperlink"/>
-                  <w:sz w:val="22"/>
-                  <w:rFonts w:ascii="Calibri" w:hAnsi="Calibri"/>
-                </w:rPr>
-                <w:t xml:space="preserve">X</w:t>
-              </w:r>
-            </w:hyperlink>
-          </w:p>
-        </w:tc>
-        <w:tc>
-          <w:tcPr>
-            <w:tcW w:type="dxa" w:w="2016"/>
-            <w:tcW w:w="1728" w:type="dxa"/>
-          </w:tcPr>
-          <w:p>
-            <w:pPr>
-              <w:spacing w:after="40" w:before="40"/>
-            </w:pPr>
-            <w:r>
-              <w:rPr>
-                <w:rFonts w:ascii="Calibri" w:hAnsi="Calibri"/>
-                <w:sz w:val="21"/>
-              </w:rPr>
-            </w:r>
-            <w:r>
-              <w:rPr>
-                <w:rFonts w:ascii="Calibri" w:hAnsi="Calibri"/>
-                <w:sz w:val="21"/>
-              </w:rPr>
-              <w:t>Original Content Rewards</w:t>
-            </w:r>
-          </w:p>
-        </w:tc>
-        <w:tc>
-          <w:tcPr>
-            <w:tcW w:type="dxa" w:w="2016"/>
-            <w:tcW w:w="3168" w:type="dxa"/>
-          </w:tcPr>
-          <w:p>
-            <w:pPr>
-              <w:spacing w:after="40" w:before="40"/>
-            </w:pPr>
-            <w:r>
-              <w:rPr>
-                <w:rFonts w:ascii="Calibri" w:hAnsi="Calibri"/>
-                <w:sz w:val="21"/>
-              </w:rPr>
-            </w:r>
-            <w:r>
-              <w:rPr>
-                <w:rFonts w:ascii="Calibri" w:hAnsi="Calibri"/>
-                <w:sz w:val="21"/>
-              </w:rPr>
-              <w:t>Active Premium subscription + 500 verified followers + 500,000 impressions/90 days</w:t>
-            </w:r>
-          </w:p>
-        </w:tc>
-        <w:tc>
-          <w:tcPr>
-            <w:tcW w:type="dxa" w:w="2016"/>
-            <w:tcW w:w="1655" w:type="dxa"/>
-          </w:tcPr>
-          <w:p>
-            <w:pPr>
-              <w:spacing w:after="40" w:before="40"/>
-            </w:pPr>
-            <w:r>
-              <w:rPr>
-                <w:rFonts w:ascii="Calibri" w:hAnsi="Calibri"/>
-                <w:sz w:val="21"/>
-              </w:rPr>
-            </w:r>
-            <w:r>
-              <w:rPr>
-                <w:rFonts w:ascii="Calibri" w:hAnsi="Calibri"/>
-                <w:sz w:val="21"/>
-              </w:rPr>
-              <w:t>Pay per qualified impression</w:t>
-            </w:r>
-          </w:p>
-        </w:tc>
-      </w:tr>
-      <w:tr>
-        <w:tc>
-          <w:tcPr>
-            <w:tcW w:type="dxa" w:w="2016"/>
-            <w:tcW w:w="1512" w:type="dxa"/>
-          </w:tcPr>
-          <w:p>
-            <w:pPr>
-              <w:spacing w:after="40" w:before="40"/>
-            </w:pPr>
-            <w:r>
-              <w:rPr>
-                <w:rFonts w:ascii="Calibri" w:hAnsi="Calibri"/>
-                <w:sz w:val="21"/>
-              </w:rPr>
-            </w:r>
-            <w:hyperlink r:id="rId59">
-              <w:r>
-                <w:rPr>
-                  <w:rStyle w:val="Hyperlink"/>
-                  <w:sz w:val="22"/>
-                  <w:rFonts w:ascii="Calibri" w:hAnsi="Calibri"/>
-                </w:rPr>
-                <w:t xml:space="preserve">Rumble</w:t>
-              </w:r>
-            </w:hyperlink>
-          </w:p>
-        </w:tc>
-        <w:tc>
-          <w:tcPr>
-            <w:tcW w:type="dxa" w:w="2016"/>
-            <w:tcW w:w="1728" w:type="dxa"/>
-          </w:tcPr>
-          <w:p>
-            <w:pPr>
-              <w:spacing w:after="40" w:before="40"/>
-            </w:pPr>
-            <w:r>
-              <w:rPr>
-                <w:rFonts w:ascii="Calibri" w:hAnsi="Calibri"/>
-                <w:sz w:val="21"/>
-              </w:rPr>
-            </w:r>
-            <w:r>
-              <w:rPr>
-                <w:rFonts w:ascii="Calibri" w:hAnsi="Calibri"/>
-                <w:sz w:val="21"/>
-              </w:rPr>
-              <w:t>Partner Program</w:t>
-            </w:r>
-          </w:p>
-        </w:tc>
-        <w:tc>
-          <w:tcPr>
-            <w:tcW w:type="dxa" w:w="2016"/>
-            <w:tcW w:w="3168" w:type="dxa"/>
-          </w:tcPr>
-          <w:p>
-            <w:pPr>
-              <w:spacing w:after="40" w:before="40"/>
-            </w:pPr>
-            <w:r>
-              <w:rPr>
-                <w:rFonts w:ascii="Calibri" w:hAnsi="Calibri"/>
-                <w:sz w:val="21"/>
-              </w:rPr>
-            </w:r>
-            <w:r>
-              <w:rPr>
-                <w:rFonts w:ascii="Calibri" w:hAnsi="Calibri"/>
-                <w:sz w:val="21"/>
-              </w:rPr>
-              <w:t>No follower minimum; 30-day-old account in good standing, one original upload</w:t>
-            </w:r>
-          </w:p>
-        </w:tc>
-        <w:tc>
-          <w:tcPr>
-            <w:tcW w:type="dxa" w:w="2016"/>
-            <w:tcW w:w="1655" w:type="dxa"/>
-          </w:tcPr>
-          <w:p>
-            <w:pPr>
-              <w:spacing w:after="40" w:before="40"/>
-            </w:pPr>
-            <w:r>
-              <w:rPr>
-                <w:rFonts w:ascii="Calibri" w:hAnsi="Calibri"/>
-                <w:sz w:val="21"/>
-              </w:rPr>
-            </w:r>
-            <w:r>
-              <w:rPr>
-                <w:rFonts w:ascii="Calibri" w:hAnsi="Calibri"/>
-                <w:sz w:val="21"/>
-              </w:rPr>
-              <w:t>Ad revenue share</w:t>
-            </w:r>
-          </w:p>
-        </w:tc>
-      </w:tr>
-      <w:tr>
-        <w:tc>
-          <w:tcPr>
-            <w:tcW w:type="dxa" w:w="2016"/>
-            <w:tcW w:w="1512" w:type="dxa"/>
-          </w:tcPr>
-          <w:p>
-            <w:pPr>
-              <w:spacing w:after="40" w:before="40"/>
-            </w:pPr>
-            <w:r>
-              <w:rPr>
-                <w:rFonts w:ascii="Calibri" w:hAnsi="Calibri"/>
-                <w:sz w:val="21"/>
-              </w:rPr>
-            </w:r>
-            <w:hyperlink r:id="rId60">
-              <w:r>
-                <w:rPr>
-                  <w:rStyle w:val="Hyperlink"/>
-                  <w:sz w:val="22"/>
-                  <w:rFonts w:ascii="Calibri" w:hAnsi="Calibri"/>
-                </w:rPr>
-                <w:t xml:space="preserve">Dailymotion</w:t>
-              </w:r>
-            </w:hyperlink>
-          </w:p>
-        </w:tc>
-        <w:tc>
-          <w:tcPr>
-            <w:tcW w:type="dxa" w:w="2016"/>
-            <w:tcW w:w="1728" w:type="dxa"/>
-          </w:tcPr>
-          <w:p>
-            <w:pPr>
-              <w:spacing w:after="40" w:before="40"/>
-            </w:pPr>
-            <w:r>
-              <w:rPr>
-                <w:rFonts w:ascii="Calibri" w:hAnsi="Calibri"/>
-                <w:sz w:val="21"/>
-              </w:rPr>
-            </w:r>
-            <w:r>
-              <w:rPr>
-                <w:rFonts w:ascii="Calibri" w:hAnsi="Calibri"/>
-                <w:sz w:val="21"/>
-              </w:rPr>
-              <w:t>Partner Program</w:t>
-            </w:r>
-          </w:p>
-        </w:tc>
-        <w:tc>
-          <w:tcPr>
-            <w:tcW w:type="dxa" w:w="2016"/>
-            <w:tcW w:w="3168" w:type="dxa"/>
-          </w:tcPr>
-          <w:p>
-            <w:pPr>
-              <w:spacing w:after="40" w:before="40"/>
-            </w:pPr>
-            <w:r>
-              <w:rPr>
-                <w:rFonts w:ascii="Calibri" w:hAnsi="Calibri"/>
-                <w:sz w:val="21"/>
-              </w:rPr>
-            </w:r>
-            <w:r>
-              <w:rPr>
-                <w:rFonts w:ascii="Calibri" w:hAnsi="Calibri"/>
-                <w:sz w:val="21"/>
-              </w:rPr>
-              <w:t>Sources disagree — confirm directly with Dailymotion</w:t>
-            </w:r>
-          </w:p>
-        </w:tc>
-        <w:tc>
-          <w:tcPr>
-            <w:tcW w:type="dxa" w:w="2016"/>
-            <w:tcW w:w="1655" w:type="dxa"/>
-          </w:tcPr>
-          <w:p>
-            <w:pPr>
-              <w:spacing w:after="40" w:before="40"/>
-            </w:pPr>
-            <w:r>
-              <w:rPr>
-                <w:rFonts w:ascii="Calibri" w:hAnsi="Calibri"/>
-                <w:sz w:val="21"/>
-              </w:rPr>
-            </w:r>
-            <w:r>
-              <w:rPr>
-                <w:rFonts w:ascii="Calibri" w:hAnsi="Calibri"/>
-                <w:sz w:val="21"/>
-              </w:rPr>
-              <w:t>Ad revenue share</w:t>
-            </w:r>
-          </w:p>
-        </w:tc>
-      </w:tr>
-      <w:tr>
-        <w:tc>
-          <w:tcPr>
-            <w:tcW w:type="dxa" w:w="2016"/>
-            <w:tcW w:w="1512" w:type="dxa"/>
-          </w:tcPr>
-          <w:p>
-            <w:pPr>
-              <w:spacing w:after="40" w:before="40"/>
-            </w:pPr>
-            <w:r>
-              <w:rPr>
-                <w:rFonts w:ascii="Calibri" w:hAnsi="Calibri"/>
-                <w:sz w:val="21"/>
-              </w:rPr>
-            </w:r>
-            <w:r>
-              <w:rPr>
-                <w:rFonts w:ascii="Calibri" w:hAnsi="Calibri"/>
-                <w:sz w:val="21"/>
-              </w:rPr>
-              <w:t>Instagram</w:t>
-            </w:r>
-          </w:p>
-        </w:tc>
-        <w:tc>
-          <w:tcPr>
-            <w:tcW w:type="dxa" w:w="2016"/>
-            <w:tcW w:w="1728" w:type="dxa"/>
-          </w:tcPr>
-          <w:p>
-            <w:pPr>
-              <w:spacing w:after="40" w:before="40"/>
-            </w:pPr>
-            <w:r>
-              <w:rPr>
-                <w:rFonts w:ascii="Calibri" w:hAnsi="Calibri"/>
-                <w:sz w:val="21"/>
-              </w:rPr>
-            </w:r>
-            <w:r>
-              <w:rPr>
-                <w:rFonts w:ascii="Calibri" w:hAnsi="Calibri"/>
-                <w:sz w:val="21"/>
-              </w:rPr>
-              <w:t>Gifts / Subscriptions</w:t>
-            </w:r>
-          </w:p>
-        </w:tc>
-        <w:tc>
-          <w:tcPr>
-            <w:tcW w:type="dxa" w:w="2016"/>
-            <w:tcW w:w="3168" w:type="dxa"/>
-          </w:tcPr>
-          <w:p>
-            <w:pPr>
-              <w:spacing w:after="40" w:before="40"/>
-            </w:pPr>
-            <w:r>
-              <w:rPr>
-                <w:rFonts w:ascii="Calibri" w:hAnsi="Calibri"/>
-                <w:sz w:val="21"/>
-              </w:rPr>
-            </w:r>
-            <w:r>
-              <w:rPr>
-                <w:rFonts w:ascii="Calibri" w:hAnsi="Calibri"/>
-                <w:sz w:val="21"/>
-              </w:rPr>
-              <w:t>No fixed public threshold; direct-payout bonus programs are mostly invite-only</w:t>
-            </w:r>
-          </w:p>
-        </w:tc>
-        <w:tc>
-          <w:tcPr>
-            <w:tcW w:type="dxa" w:w="2016"/>
-            <w:tcW w:w="1655" w:type="dxa"/>
-          </w:tcPr>
-          <w:p>
-            <w:pPr>
-              <w:spacing w:after="40" w:before="40"/>
-            </w:pPr>
-            <w:r>
-              <w:rPr>
-                <w:rFonts w:ascii="Calibri" w:hAnsi="Calibri"/>
-                <w:sz w:val="21"/>
-              </w:rPr>
-            </w:r>
-            <w:r>
-              <w:rPr>
-                <w:rFonts w:ascii="Calibri" w:hAnsi="Calibri"/>
-                <w:sz w:val="21"/>
-              </w:rPr>
-              <w:t>Viewer tipping / subscriptions</w:t>
-            </w:r>
-          </w:p>
-        </w:tc>
-      </w:tr>
-      <w:tr>
-        <w:tc>
-          <w:tcPr>
-            <w:tcW w:type="dxa" w:w="2016"/>
-            <w:tcW w:w="1512" w:type="dxa"/>
-          </w:tcPr>
-          <w:p>
-            <w:pPr>
-              <w:spacing w:after="40" w:before="40"/>
-            </w:pPr>
-            <w:r>
-              <w:rPr>
-                <w:rFonts w:ascii="Calibri" w:hAnsi="Calibri"/>
-                <w:sz w:val="21"/>
-              </w:rPr>
-            </w:r>
-            <w:r>
-              <w:rPr>
-                <w:rFonts w:ascii="Calibri" w:hAnsi="Calibri"/>
-                <w:sz w:val="21"/>
-              </w:rPr>
-              <w:t>Vimeo</w:t>
-            </w:r>
-          </w:p>
-        </w:tc>
-        <w:tc>
-          <w:tcPr>
-            <w:tcW w:type="dxa" w:w="2016"/>
-            <w:tcW w:w="1728" w:type="dxa"/>
-          </w:tcPr>
-          <w:p>
-            <w:pPr>
-              <w:spacing w:after="40" w:before="40"/>
-            </w:pPr>
-            <w:r>
-              <w:rPr>
-                <w:rFonts w:ascii="Calibri" w:hAnsi="Calibri"/>
-                <w:sz w:val="21"/>
-              </w:rPr>
-            </w:r>
-            <w:r>
-              <w:rPr>
-                <w:rFonts w:ascii="Calibri" w:hAnsi="Calibri"/>
-                <w:sz w:val="21"/>
-              </w:rPr>
-              <w:t>—</w:t>
-            </w:r>
-          </w:p>
-        </w:tc>
-        <w:tc>
-          <w:tcPr>
-            <w:tcW w:type="dxa" w:w="2016"/>
-            <w:tcW w:w="3168" w:type="dxa"/>
-          </w:tcPr>
-          <w:p>
-            <w:pPr>
-              <w:spacing w:after="40" w:before="40"/>
-            </w:pPr>
-            <w:r>
-              <w:rPr>
-                <w:rFonts w:ascii="Calibri" w:hAnsi="Calibri"/>
-                <w:sz w:val="21"/>
-              </w:rPr>
-            </w:r>
-            <w:r>
-              <w:rPr>
-                <w:rFonts w:ascii="Calibri" w:hAnsi="Calibri"/>
-                <w:sz w:val="21"/>
-              </w:rPr>
-              <w:t>On Demand is being discontinued in 2026, not replaced with an equivalent</w:t>
-            </w:r>
-          </w:p>
-        </w:tc>
-        <w:tc>
-          <w:tcPr>
-            <w:tcW w:type="dxa" w:w="2016"/>
-            <w:tcW w:w="1655" w:type="dxa"/>
-          </w:tcPr>
-          <w:p>
-            <w:pPr>
-              <w:spacing w:after="40" w:before="40"/>
-            </w:pPr>
-            <w:r>
-              <w:rPr>
-                <w:rFonts w:ascii="Calibri" w:hAnsi="Calibri"/>
-                <w:sz w:val="21"/>
-              </w:rPr>
-            </w:r>
-            <w:r>
-              <w:rPr>
-                <w:rFonts w:ascii="Calibri" w:hAnsi="Calibri"/>
-                <w:sz w:val="21"/>
-              </w:rPr>
-              <w:t>Was pay-per-view; replaced by a paid-subscription tool, not a payout program</w:t>
-            </w:r>
-          </w:p>
-        </w:tc>
-      </w:tr>
-      <w:tr>
-        <w:tc>
-          <w:tcPr>
-            <w:tcW w:type="dxa" w:w="2016"/>
-            <w:tcW w:w="1512" w:type="dxa"/>
-          </w:tcPr>
-          <w:p>
-            <w:pPr>
-              <w:spacing w:after="40" w:before="40"/>
-            </w:pPr>
-            <w:r>
-              <w:rPr>
-                <w:rFonts w:ascii="Calibri" w:hAnsi="Calibri"/>
-                <w:sz w:val="21"/>
-              </w:rPr>
-            </w:r>
-            <w:hyperlink r:id="rId61">
-              <w:r>
-                <w:rPr>
-                  <w:rStyle w:val="Hyperlink"/>
-                  <w:sz w:val="22"/>
-                  <w:rFonts w:ascii="Calibri" w:hAnsi="Calibri"/>
-                </w:rPr>
-                <w:t xml:space="preserve">Tumblr</w:t>
-              </w:r>
-            </w:hyperlink>
-          </w:p>
-        </w:tc>
-        <w:tc>
-          <w:tcPr>
-            <w:tcW w:type="dxa" w:w="2016"/>
-            <w:tcW w:w="1728" w:type="dxa"/>
-          </w:tcPr>
-          <w:p>
-            <w:pPr>
-              <w:spacing w:after="40" w:before="40"/>
-            </w:pPr>
-            <w:r>
-              <w:rPr>
-                <w:rFonts w:ascii="Calibri" w:hAnsi="Calibri"/>
-                <w:sz w:val="21"/>
-              </w:rPr>
-            </w:r>
-            <w:r>
-              <w:rPr>
-                <w:rFonts w:ascii="Calibri" w:hAnsi="Calibri"/>
-                <w:sz w:val="21"/>
-              </w:rPr>
-              <w:t>—</w:t>
-            </w:r>
-          </w:p>
-        </w:tc>
-        <w:tc>
-          <w:tcPr>
-            <w:tcW w:type="dxa" w:w="2016"/>
-            <w:tcW w:w="3168" w:type="dxa"/>
-          </w:tcPr>
-          <w:p>
-            <w:pPr>
-              <w:spacing w:after="40" w:before="40"/>
-            </w:pPr>
-            <w:r>
-              <w:rPr>
-                <w:rFonts w:ascii="Calibri" w:hAnsi="Calibri"/>
-                <w:sz w:val="21"/>
-              </w:rPr>
-            </w:r>
-            <w:r>
-              <w:rPr>
-                <w:rFonts w:ascii="Calibri" w:hAnsi="Calibri"/>
-                <w:sz w:val="21"/>
-              </w:rPr>
-              <w:t>No dedicated video ad-monetization program</w:t>
-            </w:r>
-          </w:p>
-        </w:tc>
-        <w:tc>
-          <w:tcPr>
-            <w:tcW w:type="dxa" w:w="2016"/>
-            <w:tcW w:w="1655" w:type="dxa"/>
-          </w:tcPr>
-          <w:p>
-            <w:pPr>
-              <w:spacing w:after="40" w:before="40"/>
-            </w:pPr>
-            <w:r>
-              <w:rPr>
-                <w:rFonts w:ascii="Calibri" w:hAnsi="Calibri"/>
-                <w:sz w:val="21"/>
-              </w:rPr>
-            </w:r>
-            <w:r>
-              <w:rPr>
-                <w:rFonts w:ascii="Calibri" w:hAnsi="Calibri"/>
-                <w:sz w:val="21"/>
-              </w:rPr>
-              <w:t>Traffic and referral platform, not currently a payout source</w:t>
-            </w:r>
-          </w:p>
-        </w:tc>
-      </w:tr>
-    </w:tbl>
-    <w:p/>
-    <w:p>
-      <w:r>
-        <w:rPr>
-          <w:rFonts w:ascii="Calibri" w:hAnsi="Calibri"/>
-        </w:rPr>
-        <w:t>Two platforms in this table changed their entire monetization program within the same year this chapter was written. Facebook’s old In-Stream Ads program ended outright — for on-demand video in 2025, for Live video in mid-2026 — replaced by the unified Content Monetization Program above. X retired its original revenue-sharing program in September 2026, the same month this chapter was drafted, in favor of the Original Content Rewards Program shown here, which pays for qualified impressions on original content rather than for engagement on replies. Neither change was unusual; it is the normal pace at which a platform’s monetization terms move, and it is the reason every number in this table needs reconfirming before you rely on it.</w:t>
-      </w:r>
-    </w:p>
-    <w:p>
-      <w:r>
-        <w:rPr>
-          <w:rFonts w:ascii="Calibri" w:hAnsi="Calibri"/>
-        </w:rPr>
-        <w:t>Dailymotion’s own published requirements were inconsistent across sources at the time of writing — some describing a threshold that mirrors YouTube’s almost exactly, others describing a much lower bar. That inconsistency is itself useful information: check the platform’s own creator help center directly, here and for every platform in this table, rather than a secondhand guide.</w:t>
-      </w:r>
-    </w:p>
-    <w:p>
-      <w:r>
-        <w:rPr>
-          <w:rFonts w:ascii="Calibri" w:hAnsi="Calibri"/>
-        </w:rPr>
-        <w:t>Instagram and Tumblr are worth naming because creators ask about them, not because either is currently a strong ad-revenue-share platform for video the way YouTube or TikTok are. Instagram’s direct-payout bonus programs are largely invite-only; its dependable monetization tools are viewer-funded — Gifts and Subscriptions — which pay only if an audience is already willing to pay directly. Tumblr has no comparable video ad-monetization program at all; treat it as a place to post and link back to a monetized upload elsewhere, not as a payout source in its own right.</w:t>
+        <w:t>The highlighted YouTube bar is 1,000 subscribers, the ad-share gate from §I. The fan-funding gate is 500 subscribers and is deliberately not a second bar: this chart compares main ad programs, and a follower count alone still does not make a channel eligible. Figures checked September 2026. The list below is the fuller picture. Each line was opened on that platform’s own help. A program whose page would not yield one number is not on the list.</w:t>
+      </w:r>
+    </w:p>
+    <w:p>
+      <w:r>
+        <w:rPr>
+          <w:rFonts w:ascii="Calibri" w:hAnsi="Calibri"/>
+        </w:rPr>
+        <w:t>Checked September 2026. Open the link again before you plan a month around the number.</w:t>
+      </w:r>
+    </w:p>
+    <w:p>
+      <w:r>
+        <w:rPr>
+          <w:rFonts w:ascii="Calibri" w:hAnsi="Calibri"/>
+          <w:b/>
+        </w:rPr>
+        <w:t>YouTube — Partner Program.</w:t>
+      </w:r>
+      <w:r>
+        <w:rPr>
+          <w:rFonts w:ascii="Calibri" w:hAnsi="Calibri"/>
+        </w:rPr>
+        <w:t xml:space="preserve"> Ad revenue share. 1,000 subscribers and 4,000 long-form watch hours in 12 months, or 10 million Shorts views in 90 days. The page is the eligibility link in §I.</w:t>
+      </w:r>
+    </w:p>
+    <w:p>
+      <w:r>
+        <w:rPr>
+          <w:rFonts w:ascii="Calibri" w:hAnsi="Calibri"/>
+          <w:b/>
+        </w:rPr>
+        <w:t>[TikTok — Creator Rewards](https://www.tiktok.com/creator-academy/article/eligibility).</w:t>
+      </w:r>
+      <w:r>
+        <w:rPr>
+          <w:rFonts w:ascii="Calibri" w:hAnsi="Calibri"/>
+        </w:rPr>
+        <w:t xml:space="preserve"> Pay per qualified view. 10,000 followers and 100,000 views in 30 days. Age 18 or older. Videos 60 seconds or longer. Limited countries.</w:t>
+      </w:r>
+    </w:p>
+    <w:p>
+      <w:r>
+        <w:rPr>
+          <w:rFonts w:ascii="Calibri" w:hAnsi="Calibri"/>
+          <w:b/>
+        </w:rPr>
+        <w:t>[Facebook — Content Monetization](https://creators.facebook.com/tools/ad-breaks/v2/).</w:t>
+      </w:r>
+      <w:r>
+        <w:rPr>
+          <w:rFonts w:ascii="Calibri" w:hAnsi="Calibri"/>
+        </w:rPr>
+        <w:t xml:space="preserve"> Ad revenue share. 10,000 followers, 600,000 minutes watched in 60 days, and 5 videos on the Page.</w:t>
+      </w:r>
+    </w:p>
+    <w:p>
+      <w:r>
+        <w:rPr>
+          <w:rFonts w:ascii="Calibri" w:hAnsi="Calibri"/>
+          <w:b/>
+        </w:rPr>
+        <w:t>[Snapchat — Spotlight](https://help.snapchat.com/hc/en-us/articles/7012310905876).</w:t>
+      </w:r>
+      <w:r>
+        <w:rPr>
+          <w:rFonts w:ascii="Calibri" w:hAnsi="Calibri"/>
+        </w:rPr>
+        <w:t xml:space="preserve"> Ad revenue share. 50,000 followers, 25 posts a month, and 100 hours of Spotlight view time in 28 days.</w:t>
+      </w:r>
+    </w:p>
+    <w:p>
+      <w:r>
+        <w:rPr>
+          <w:rFonts w:ascii="Calibri" w:hAnsi="Calibri"/>
+          <w:b/>
+        </w:rPr>
+        <w:t>[X — Original Content Rewards](https://help.x.com/en/using-x/original-content-rewards).</w:t>
+      </w:r>
+      <w:r>
+        <w:rPr>
+          <w:rFonts w:ascii="Calibri" w:hAnsi="Calibri"/>
+        </w:rPr>
+        <w:t xml:space="preserve"> Pay per qualified impression. An active Premium subscription, 500 verified followers, and 500,000 impressions in 90 days.</w:t>
+      </w:r>
+    </w:p>
+    <w:p>
+      <w:r>
+        <w:rPr>
+          <w:rFonts w:ascii="Calibri" w:hAnsi="Calibri"/>
+          <w:b/>
+        </w:rPr>
+        <w:t>[Rumble — Partner Program](https://rumble.support/help/rumble-creator-program).</w:t>
+      </w:r>
+      <w:r>
+        <w:rPr>
+          <w:rFonts w:ascii="Calibri" w:hAnsi="Calibri"/>
+        </w:rPr>
+        <w:t xml:space="preserve"> Ad revenue share. No follower minimum. An account 30 days old and in good standing, and one original upload.</w:t>
+      </w:r>
+    </w:p>
+    <w:p>
+      <w:r>
+        <w:rPr>
+          <w:rFonts w:ascii="Calibri" w:hAnsi="Calibri"/>
+          <w:b/>
+        </w:rPr>
+        <w:t>[Tumblr](https://help.tumblr.com/knowledge-base/paid-feature-eligibility/).</w:t>
+      </w:r>
+      <w:r>
+        <w:rPr>
+          <w:rFonts w:ascii="Calibri" w:hAnsi="Calibri"/>
+        </w:rPr>
+        <w:t xml:space="preserve"> No video ad program on that page. A place to post and point back at the page where you actually charge.</w:t>
+      </w:r>
+    </w:p>
+    <w:p>
+      <w:r>
+        <w:rPr>
+          <w:rFonts w:ascii="Calibri" w:hAnsi="Calibri"/>
+        </w:rPr>
+        <w:t>Instagram, as of the same month, does not publish a fixed follower floor for gifts, and its bonus programs are described as invite-only. This list does not treat it as an ad-share plan. If you post there, the tap is the profile website and the Story sticker already named in §V. Dailymotion’s creator pages did not agree on one threshold in September 2026, so this chapter gives you no number for it. Vimeo On Demand was being discontinued, and this chapter has no replacement payout page it can send you to. If you still want one of those three, open that company’s own help and read the live page. Do not plan from this paragraph.</w:t>
+      </w:r>
+    </w:p>
+    <w:p>
+      <w:r>
+        <w:rPr>
+          <w:rFonts w:ascii="Calibri" w:hAnsi="Calibri"/>
+        </w:rPr>
+        <w:t>Two programs on the list replaced an older one in the year this chapter was written. Facebook’s In-Stream Ads ended for on-demand video in 2025 and for Live in mid-2026. The Content Monetization line above is the replacement. X retired its earlier revenue-sharing program in September 2026. Original Content Rewards is the replacement, and it pays for qualified impressions on original posts. That pace is why each line carries a month.</w:t>
       </w:r>
     </w:p>
     <w:p>
@@ -7047,7 +6457,7 @@
         <w:rPr>
           <w:rFonts w:ascii="Calibri" w:hAnsi="Calibri"/>
         </w:rPr>
-        <w:t>Disclose next to the link: “affiliate link” or “#ad.” The FTC pages in the sources apply on every site. Put that one link in the first two or three lines, the part a viewer sees before “more.” On a long video whose comments are clickable, a pinned comment can repeat it. Three to five links is a ceiling this book treats as creator consensus. Past that, the list is a menu. The first chapter already asked you to pick one product.</w:t>
+        <w:t>Disclose next to the link: “affiliate link” or “#ad.” The FTC pages in the sources are the US rule. Other countries have their own disclosure rules. Saying “affiliate” in the same sentence as the link is the minimum wherever you post. Put that one URL in the first two or three lines, the part a viewer sees before “more.” On a long video whose comments are clickable, the pinned comment repeats the same URL. The channel profile may repeat it once. YouTube’s sharing-links page allows up to 14 profile links. Use one. Leave the other thirteen empty. A second product in those slots is the menu chapter 1 already refused.</w:t>
       </w:r>
     </w:p>
     <w:p>
@@ -7065,7 +6475,7 @@
         </w:rPr>
         <w:t xml:space="preserve">A pasted address is not a link until YouTube will make it clickable. </w:t>
       </w:r>
-      <w:hyperlink r:id="rId62">
+      <w:hyperlink r:id="rId79">
         <w:r>
           <w:rPr>
             <w:rStyle w:val="Hyperlink"/>
@@ -7089,7 +6499,7 @@
         </w:rPr>
         <w:t xml:space="preserve">An </w:t>
       </w:r>
-      <w:hyperlink r:id="rId63">
+      <w:hyperlink r:id="rId80">
         <w:r>
           <w:rPr>
             <w:rStyle w:val="Hyperlink"/>
@@ -7105,7 +6515,7 @@
         </w:rPr>
         <w:t xml:space="preserve"> or an </w:t>
       </w:r>
-      <w:hyperlink r:id="rId64">
+      <w:hyperlink r:id="rId81">
         <w:r>
           <w:rPr>
             <w:rStyle w:val="Hyperlink"/>
@@ -7121,7 +6531,7 @@
         </w:rPr>
         <w:t xml:space="preserve"> that opens a site outside YouTube requires the </w:t>
       </w:r>
-      <w:hyperlink r:id="rId52">
+      <w:hyperlink r:id="rId76">
         <w:r>
           <w:rPr>
             <w:rStyle w:val="Hyperlink"/>
@@ -7135,7 +6545,7 @@
         <w:rPr>
           <w:rFonts w:ascii="Calibri" w:hAnsi="Calibri"/>
         </w:rPr>
-        <w:t>. An end screen can sit only in the last 5–20 seconds, and only on a video at least 25 seconds long. Those overlays are a later convenience. The first sale uses a long-form description, a pinned comment on that long video, and the links on the channel profile — YouTube’s sharing-links page allows up to 14 of those — once advanced features are on.</w:t>
+        <w:t>. An end screen can sit only in the last 5–20 seconds, and only on a video at least 25 seconds long. Those overlays are a later convenience. The first sale uses a long-form description and a pinned comment on that long video, once advanced features are on, plus the one profile link.</w:t>
       </w:r>
     </w:p>
     <w:p>
@@ -7153,7 +6563,7 @@
         <w:rPr>
           <w:rFonts w:ascii="Calibri" w:hAnsi="Calibri"/>
         </w:rPr>
-        <w:t>The table in §III is how a site might pay you for attention. This section is how a stranger pays you for the offer, on YouTube and on the other sites in that table.</w:t>
+        <w:t>The list in §III is how a site might pay you for attention. This section is how a stranger pays you for the offer, on YouTube and on the other sites in that list.</w:t>
       </w:r>
     </w:p>
     <w:p>
@@ -7234,7 +6644,7 @@
         </w:rPr>
         <w:t xml:space="preserve">Instagram’s help lists “Add a website to your Instagram profile” from its </w:t>
       </w:r>
-      <w:hyperlink r:id="rId65">
+      <w:hyperlink r:id="rId82">
         <w:r>
           <w:rPr>
             <w:rStyle w:val="Hyperlink"/>
@@ -7250,7 +6660,7 @@
         </w:rPr>
         <w:t xml:space="preserve"> page. Separately, </w:t>
       </w:r>
-      <w:hyperlink r:id="rId66">
+      <w:hyperlink r:id="rId83">
         <w:r>
           <w:rPr>
             <w:rStyle w:val="Hyperlink"/>
@@ -7277,7 +6687,7 @@
         </w:rPr>
         <w:t xml:space="preserve">TikTok’s help has a page for </w:t>
       </w:r>
-      <w:hyperlink r:id="rId67">
+      <w:hyperlink r:id="rId84">
         <w:r>
           <w:rPr>
             <w:rStyle w:val="Hyperlink"/>
@@ -7302,15 +6712,15 @@
         <w:rPr>
           <w:rFonts w:ascii="Calibri" w:hAnsi="Calibri"/>
         </w:rPr>
-        <w:t>Every other row in the table already links to that platform’s creator help. Use the profile, About, or description field that page names.</w:t>
-      </w:r>
-    </w:p>
-    <w:p>
-      <w:r>
-        <w:rPr>
-          <w:rFonts w:ascii="Calibri" w:hAnsi="Calibri"/>
-        </w:rPr>
-        <w:t>Then test the tap on your phone, the same way you test the payment page. If the caption is not clickable, the profile is the shelf. YouTube is the strict case already in §IV. A Short’s description and comments are not clickable. A long-form description waits until advanced features are on. The other sites are different. Confirm each one on your phone.</w:t>
+        <w:t>Every other name in the §III list already links to that platform’s creator help. Use the profile, About, or description field that page names.</w:t>
+      </w:r>
+    </w:p>
+    <w:p>
+      <w:r>
+        <w:rPr>
+          <w:rFonts w:ascii="Calibri" w:hAnsi="Calibri"/>
+        </w:rPr>
+        <w:t>Then test the tap on your phone, the same way you test the payment page. If the caption is not clickable, the profile is the shelf. YouTube’s strict case is already in §IV. The other sites are different. Confirm each one on your phone.</w:t>
       </w:r>
     </w:p>
     <w:p>
@@ -7329,7 +6739,7 @@
         <w:rPr>
           <w:rFonts w:ascii="Calibri" w:hAnsi="Calibri"/>
         </w:rPr>
-        <w:t>Its ad or rewards program, after you clear the row in the table. Write that money on the platform line of the money sheet, separate from offer money.</w:t>
+        <w:t>Its ad or rewards program, after you clear the line in §III. Write that money on the platform line of the money sheet, separate from offer money.</w:t>
       </w:r>
     </w:p>
     <w:p>
@@ -7467,7 +6877,7 @@
         <w:rPr>
           <w:rFonts w:ascii="Calibri" w:hAnsi="Calibri"/>
         </w:rPr>
-        <w:t>That more affiliate links are a better recommendation. Past three to five, the list is a menu. Chapter 1 already asked for one product.</w:t>
+        <w:t>That more links are a better recommendation. One URL. The description, the pinned comment, and one profile slot may each repeat it. A second product is a menu.</w:t>
       </w:r>
     </w:p>
     <w:p>
@@ -7550,7 +6960,7 @@
           <w:rFonts w:ascii="Calibri" w:hAnsi="Calibri"/>
           <w:i/>
         </w:rPr>
-        <w:t>Sources: YouTube Partner Program requirements verified against YouTube’s own creator-facing monetization guidance, current at the time of writing. Facebook, TikTok, Snapchat, X, Rumble, Instagram, Vimeo, and Tumblr monetization details are drawn from each platform’s own current creator or help pages, cross-checked against multiple independent sources; Dailymotion’s requirements could not be confirmed to the same standard and are flagged as such in the text. Subscriber-conversion tactics in §I and the three-to-five link ceiling in §IV are creator consensus drawn from the author’s own saved research on those topics, not published platform policy, and are labeled as such throughout. Which YouTube addresses are clickable, and which overlays can leave the site, are taken from YouTube’s own sharing-links, feature-eligibility, cards, and end-screen help, current at the time of writing. The second-channel rules in §II reflect YouTube’s own stated policy on multiple channels. The offer shapes in the first chapter, and the instruction in §V to use one offer on every site, are editorial. Instagram’s profile-website article is listed from its editing-your-profile help, and its link-sticker page says an organic Story sticker can send a tap to a website. TikTok’s help has a page for adding a website to a profile; this chapter does not add a follower minimum that page did not show in plain text. Where a link can be tapped on any other site, confirm that site’s own help, on your phone, before you rely on a caption.</w:t>
+        <w:t>Sources: YouTube Partner Program requirements verified against YouTube’s own creator-facing monetization guidance, checked September 2026. TikTok, Facebook, Snapchat, X, Rumble, and Tumblr figures in §III were taken from the linked page on each line, the same month. Instagram, Dailymotion, and Vimeo are named only to say this chapter has no number for them. Subscriber-conversion tactics in §I are creator consensus, labeled as tests, not published platform policy. One URL, repeated, is the rule in §IV. Which YouTube addresses are clickable, and which overlays can leave the site, are taken from YouTube’s own sharing-links, feature-eligibility, cards, and end-screen help. The second-channel rules in §II reflect YouTube’s own stated policy on multiple channels. The offer shapes in the first chapter, and the instruction in §V to use one offer on every site, are editorial. The FTC pages linked from the back of the book are US guidance. Other countries have their own disclosure rules. Instagram’s profile-website article is listed from its editing-your-profile help, and its link-sticker page says an organic Story sticker can send a tap to a website. TikTok’s help has a page for adding a website to a profile. Where a link can be tapped on any other site, confirm that site’s own help, on your phone, before you rely on a caption.</w:t>
       </w:r>
     </w:p>
     <w:p>
@@ -7563,6 +6973,19 @@
       </w:r>
     </w:p>
     <w:p>
+      <w:pPr>
+        <w:sectPr>
+          <w:headerReference w:type="default" r:id="rId74"/>
+          <w:footerReference w:type="default" r:id="rId75"/>
+          <w:pgSz w:w="10080" w:h="14400"/>
+          <w:pgMar w:top="1008" w:right="1008" w:bottom="1008" w:left="1008" w:header="504" w:footer="504" w:gutter="0"/>
+          <w:cols w:space="720"/>
+          <w:titlePg/>
+          <w:docGrid w:linePitch="360"/>
+        </w:sectPr>
+      </w:pPr>
+    </w:p>
+    <w:p>
       <w:bookmarkStart w:id="41" w:name="toc40"/>
       <w:pPr>
         <w:pStyle w:val="Heading1"/>
@@ -7612,7 +7035,15 @@
         <w:rPr>
           <w:rFonts w:ascii="Calibri" w:hAnsi="Calibri"/>
         </w:rPr>
-        <w:t>Write the buyer sentence, the unfit-viewer sentence, and the twenty-second offer. Choose one of the three offer types. Put a price on the page, or a booking link with the scope written in plain language. Read it aloud. If you stumble, the viewer will leave.</w:t>
+        <w:t>Write the buyer sentence, the unfit-viewer sentence, and the twenty-second offer. Pick one shape from the offer chapter and put that shape’s sentence on the page, with the price. Read it aloud. If you stumble, the viewer will leave.</w:t>
+      </w:r>
+    </w:p>
+    <w:p>
+      <w:r>
+        <w:rPr>
+          <w:rFonts w:ascii="Calibri" w:hAnsi="Calibri"/>
+        </w:rPr>
+        <w:t>The eight jobs in the videos chapter are the only set of videos this calendar films. The click chapter uses that same set. Week one does not add a second quota.</w:t>
       </w:r>
     </w:p>
     <w:p>
@@ -8016,6 +7447,19 @@
       </w:r>
     </w:p>
     <w:p>
+      <w:pPr>
+        <w:sectPr>
+          <w:headerReference w:type="default" r:id="rId85"/>
+          <w:footerReference w:type="default" r:id="rId86"/>
+          <w:pgSz w:w="10080" w:h="14400"/>
+          <w:pgMar w:top="1008" w:right="1008" w:bottom="1008" w:left="1008" w:header="504" w:footer="504" w:gutter="0"/>
+          <w:cols w:space="720"/>
+          <w:titlePg/>
+          <w:docGrid w:linePitch="360"/>
+        </w:sectPr>
+      </w:pPr>
+    </w:p>
+    <w:p>
       <w:bookmarkStart w:id="50" w:name="toc49"/>
       <w:pPr>
         <w:pStyle w:val="Heading1"/>
@@ -8427,6 +7871,19 @@
       </w:r>
     </w:p>
     <w:p>
+      <w:pPr>
+        <w:sectPr>
+          <w:headerReference w:type="default" r:id="rId87"/>
+          <w:footerReference w:type="default" r:id="rId88"/>
+          <w:pgSz w:w="10080" w:h="14400"/>
+          <w:pgMar w:top="1008" w:right="1008" w:bottom="1008" w:left="1008" w:header="504" w:footer="504" w:gutter="0"/>
+          <w:cols w:space="720"/>
+          <w:titlePg/>
+          <w:docGrid w:linePitch="360"/>
+        </w:sectPr>
+      </w:pPr>
+    </w:p>
+    <w:p>
       <w:bookmarkStart w:id="60" w:name="toc59"/>
       <w:pPr>
         <w:pStyle w:val="Heading1"/>
@@ -8567,6 +8024,14 @@
           <w:rFonts w:ascii="Calibri" w:hAnsi="Calibri"/>
         </w:rPr>
         <w:t>The page link:</w:t>
+      </w:r>
+    </w:p>
+    <w:p>
+      <w:r>
+        <w:rPr>
+          <w:rFonts w:ascii="Calibri" w:hAnsi="Calibri"/>
+        </w:rPr>
+        <w:t>The sentence for this shape, from the offer chapter:</w:t>
       </w:r>
     </w:p>
     <w:p>
@@ -9305,6 +8770,19 @@
       </w:r>
     </w:p>
     <w:p>
+      <w:pPr>
+        <w:sectPr>
+          <w:headerReference w:type="default" r:id="rId89"/>
+          <w:footerReference w:type="default" r:id="rId90"/>
+          <w:pgSz w:w="10080" w:h="14400"/>
+          <w:pgMar w:top="1008" w:right="1008" w:bottom="1008" w:left="1008" w:header="504" w:footer="504" w:gutter="0"/>
+          <w:cols w:space="720"/>
+          <w:titlePg/>
+          <w:docGrid w:linePitch="360"/>
+        </w:sectPr>
+      </w:pPr>
+    </w:p>
+    <w:p>
       <w:bookmarkStart w:id="69" w:name="toc68"/>
       <w:pPr>
         <w:pStyle w:val="Heading1"/>
@@ -9372,7 +8850,7 @@
         <w:rPr>
           <w:rFonts w:ascii="Calibri" w:hAnsi="Calibri"/>
         </w:rPr>
-        <w:t>The videos exist. The page exists. Viewers still do not arrive there. Look at the first two lines of the description, the pinned comment, and the words you say at the end. If the link is under a paragraph about your story, move it up. If you never say the name of the offer, say it. If you can read the address and cannot tap it, the price is hidden. That includes a YouTube Short, and any other site where you have not finished the phone test. If three test viewers cannot find the price without you pointing, the packaging failed and the niche did not.</w:t>
+        <w:t>The videos exist. The page exists. Viewers still do not arrive there. Look at the first two lines of the description, the pinned comment, and the words you say at the end. If the link is under a paragraph about your story, move it up. If you never say the name of the offer, say it. If you can read the address and cannot tap it, the price is hidden. A YouTube Short is the case the money chapter already states: the description and the comments do not tap. Any other site you have not tested on your phone is the same break. If three test viewers cannot find the price without you pointing, the packaging failed and the niche did not.</w:t>
       </w:r>
     </w:p>
     <w:p>
@@ -9636,6 +9114,19 @@
       </w:r>
     </w:p>
     <w:p>
+      <w:pPr>
+        <w:sectPr>
+          <w:headerReference w:type="default" r:id="rId91"/>
+          <w:footerReference w:type="default" r:id="rId92"/>
+          <w:pgSz w:w="10080" w:h="14400"/>
+          <w:pgMar w:top="1008" w:right="1008" w:bottom="1008" w:left="1008" w:header="504" w:footer="504" w:gutter="0"/>
+          <w:cols w:space="720"/>
+          <w:titlePg/>
+          <w:docGrid w:linePitch="360"/>
+        </w:sectPr>
+      </w:pPr>
+    </w:p>
+    <w:p>
       <w:bookmarkStart w:id="79" w:name="toc78"/>
       <w:pPr>
         <w:pStyle w:val="Heading1"/>
@@ -9659,6 +9150,81 @@
           <w:rFonts w:ascii="Calibri" w:hAnsi="Calibri"/>
           <w:b/>
         </w:rPr>
+        <w:t xml:space="preserve">Eight jobs. </w:t>
+      </w:r>
+      <w:r>
+        <w:rPr>
+          <w:rFonts w:ascii="Calibri" w:hAnsi="Calibri"/>
+        </w:rPr>
+        <w:t>The only set of videos this book asks you to finish: who it is for, the problem in their words, the method, proof, the comparison, one objection, the offer, and which video to watch next. The click chapter and the six-week calendar use this same set.</w:t>
+      </w:r>
+    </w:p>
+    <w:p>
+      <w:r>
+        <w:rPr>
+          <w:rFonts w:ascii="Calibri" w:hAnsi="Calibri"/>
+          <w:b/>
+        </w:rPr>
+        <w:t xml:space="preserve">Phone test. </w:t>
+      </w:r>
+      <w:r>
+        <w:rPr>
+          <w:rFonts w:ascii="Calibri" w:hAnsi="Calibri"/>
+        </w:rPr>
+        <w:t>On your phone, open the offer link the way a stranger will, from the description, and finish a payment or a booking. The step where you stall is the step a buyer will abandon. Refund the test if the tool allows it.</w:t>
+      </w:r>
+    </w:p>
+    <w:p>
+      <w:r>
+        <w:rPr>
+          <w:rFonts w:ascii="Calibri" w:hAnsi="Calibri"/>
+          <w:b/>
+        </w:rPr>
+        <w:t xml:space="preserve">Ticket. </w:t>
+      </w:r>
+      <w:r>
+        <w:rPr>
+          <w:rFonts w:ascii="Calibri" w:hAnsi="Calibri"/>
+        </w:rPr>
+        <w:t>One workshop on one date, with the date, the length, and the price on the page. After that date, sell the recording as the file, or stop. Do not leave both for sale.</w:t>
+      </w:r>
+    </w:p>
+    <w:p>
+      <w:r>
+        <w:rPr>
+          <w:rFonts w:ascii="Calibri" w:hAnsi="Calibri"/>
+          <w:b/>
+        </w:rPr>
+        <w:t xml:space="preserve">Monthly pass. </w:t>
+      </w:r>
+      <w:r>
+        <w:rPr>
+          <w:rFonts w:ascii="Calibri" w:hAnsi="Calibri"/>
+        </w:rPr>
+        <w:t>The next file or the next call, billed by you, on your page. The page says what arrives each month and when the next charge happens. A video site’s own membership button can wait until you have cleared that site’s gate.</w:t>
+      </w:r>
+    </w:p>
+    <w:p>
+      <w:r>
+        <w:rPr>
+          <w:rFonts w:ascii="Calibri" w:hAnsi="Calibri"/>
+          <w:b/>
+        </w:rPr>
+        <w:t xml:space="preserve">Sponsor. </w:t>
+      </w:r>
+      <w:r>
+        <w:rPr>
+          <w:rFonts w:ascii="Calibri" w:hAnsi="Calibri"/>
+        </w:rPr>
+        <w:t>One company pays you for one video. Say so in the video and next to the link. Do not also pitch your own file in that video.</w:t>
+      </w:r>
+    </w:p>
+    <w:p>
+      <w:r>
+        <w:rPr>
+          <w:rFonts w:ascii="Calibri" w:hAnsi="Calibri"/>
+          <w:b/>
+        </w:rPr>
         <w:t xml:space="preserve">Advanced features. </w:t>
       </w:r>
       <w:r>
@@ -9939,6 +9505,19 @@
       </w:r>
     </w:p>
     <w:p>
+      <w:pPr>
+        <w:sectPr>
+          <w:headerReference w:type="default" r:id="rId93"/>
+          <w:footerReference w:type="default" r:id="rId94"/>
+          <w:pgSz w:w="10080" w:h="14400"/>
+          <w:pgMar w:top="1008" w:right="1008" w:bottom="1008" w:left="1008" w:header="504" w:footer="504" w:gutter="0"/>
+          <w:cols w:space="720"/>
+          <w:titlePg/>
+          <w:docGrid w:linePitch="360"/>
+        </w:sectPr>
+      </w:pPr>
+    </w:p>
+    <w:p>
       <w:bookmarkStart w:id="80" w:name="toc79"/>
       <w:pPr>
         <w:pStyle w:val="Heading1"/>
@@ -9971,7 +9550,7 @@
           <w:rFonts w:ascii="Calibri" w:hAnsi="Calibri"/>
           <w:i/>
         </w:rPr>
-        <w:t>Chapter 2. Title, description, and tag limits, captions, thumbnails, the title-and-thumbnail test, audience retention, recommendation signals, the recommendation system, Shorts discovery, Shorts analytics, and series playlists are cited to YouTube’s own help pages in the chapter. The four-long-and-six-shorts month is a production load, not a YouTube quota. Advertiser-friendly guidelines are cited for the existence of a sensitive-content category. The exact words that trigger it are not published.</w:t>
+        <w:t>Chapter 2. Title, description, and tag limits, captions, thumbnails, the title-and-thumbnail test, audience retention, recommendation signals, the recommendation system, Shorts discovery, Shorts analytics, and series playlists are cited to YouTube’s own help pages in the chapter. The eight jobs are the only production load in this book. YouTube does not publish that set as a quota. Four of them have to be long videos, because a Short cannot carry the link. Advertiser-friendly guidelines are cited for the existence of a sensitive-content category. The exact words that trigger it are not published.</w:t>
       </w:r>
     </w:p>
     <w:p>
@@ -9989,7 +9568,7 @@
           <w:rFonts w:ascii="Calibri" w:hAnsi="Calibri"/>
           <w:i/>
         </w:rPr>
-        <w:t>Chapter 5. YouTube Partner Program requirements were checked against YouTube’s own monetization guidance. Other platforms were checked against their own creator or help pages. Dailymotion’s requirements could not be confirmed to the same standard and are flagged in the chapter. Affiliate-link placement is creator consensus plus a disclosure habit, not a promise of income. Using one offer on every site is editorial. Instagram’s link sticker and TikTok’s profile-website page are cited in the chapter. Confirm each tap on a phone.</w:t>
+        <w:t>Chapter 5. YouTube Partner Program requirements were checked against YouTube’s own monetization guidance. Other platforms on the list were checked against the linked help page in September 2026. Instagram, Dailymotion, and Vimeo have no number in the chapter. One URL, repeated, is the rule. The FTC pages are US guidance.</w:t>
       </w:r>
     </w:p>
     <w:p>
@@ -10009,7 +9588,7 @@
       </w:r>
     </w:p>
     <w:p>
-      <w:hyperlink r:id="rId51">
+      <w:hyperlink r:id="rId71">
         <w:r>
           <w:rPr>
             <w:rStyle w:val="Hyperlink"/>
@@ -10027,7 +9606,7 @@
       </w:r>
     </w:p>
     <w:p>
-      <w:hyperlink r:id="rId35">
+      <w:hyperlink r:id="rId49">
         <w:r>
           <w:rPr>
             <w:rStyle w:val="Hyperlink"/>
@@ -10045,7 +9624,7 @@
       </w:r>
     </w:p>
     <w:p>
-      <w:hyperlink r:id="rId52">
+      <w:hyperlink r:id="rId76">
         <w:r>
           <w:rPr>
             <w:rStyle w:val="Hyperlink"/>
@@ -10061,7 +9640,7 @@
         </w:rPr>
         <w:t xml:space="preserve">, </w:t>
       </w:r>
-      <w:hyperlink r:id="rId53">
+      <w:hyperlink r:id="rId77">
         <w:r>
           <w:rPr>
             <w:rStyle w:val="Hyperlink"/>
@@ -10077,7 +9656,7 @@
         </w:rPr>
         <w:t xml:space="preserve">, </w:t>
       </w:r>
-      <w:hyperlink r:id="rId62">
+      <w:hyperlink r:id="rId79">
         <w:r>
           <w:rPr>
             <w:rStyle w:val="Hyperlink"/>
@@ -10093,7 +9672,7 @@
         </w:rPr>
         <w:t xml:space="preserve">, </w:t>
       </w:r>
-      <w:hyperlink r:id="rId63">
+      <w:hyperlink r:id="rId80">
         <w:r>
           <w:rPr>
             <w:rStyle w:val="Hyperlink"/>
@@ -10109,7 +9688,7 @@
         </w:rPr>
         <w:t xml:space="preserve">, </w:t>
       </w:r>
-      <w:hyperlink r:id="rId64">
+      <w:hyperlink r:id="rId81">
         <w:r>
           <w:rPr>
             <w:rStyle w:val="Hyperlink"/>
@@ -10127,7 +9706,7 @@
       </w:r>
     </w:p>
     <w:p>
-      <w:hyperlink r:id="rId65">
+      <w:hyperlink r:id="rId82">
         <w:r>
           <w:rPr>
             <w:rStyle w:val="Hyperlink"/>
@@ -10143,7 +9722,7 @@
         </w:rPr>
         <w:t xml:space="preserve"> — lists adding a website to the profile. </w:t>
       </w:r>
-      <w:hyperlink r:id="rId66">
+      <w:hyperlink r:id="rId83">
         <w:r>
           <w:rPr>
             <w:rStyle w:val="Hyperlink"/>
@@ -10161,7 +9740,7 @@
       </w:r>
     </w:p>
     <w:p>
-      <w:hyperlink r:id="rId67">
+      <w:hyperlink r:id="rId84">
         <w:r>
           <w:rPr>
             <w:rStyle w:val="Hyperlink"/>
@@ -10179,7 +9758,7 @@
       </w:r>
     </w:p>
     <w:p>
-      <w:hyperlink r:id="rId68">
+      <w:hyperlink r:id="rId97">
         <w:r>
           <w:rPr>
             <w:rStyle w:val="Hyperlink"/>
@@ -10195,7 +9774,7 @@
         </w:rPr>
         <w:t xml:space="preserve"> and </w:t>
       </w:r>
-      <w:hyperlink r:id="rId69">
+      <w:hyperlink r:id="rId98">
         <w:r>
           <w:rPr>
             <w:rStyle w:val="Hyperlink"/>
@@ -10213,7 +9792,7 @@
       </w:r>
     </w:p>
     <w:p>
-      <w:hyperlink r:id="rId70">
+      <w:hyperlink r:id="rId99">
         <w:r>
           <w:rPr>
             <w:rStyle w:val="Hyperlink"/>
@@ -10229,7 +9808,7 @@
         </w:rPr>
         <w:t xml:space="preserve">. </w:t>
       </w:r>
-      <w:hyperlink r:id="rId71">
+      <w:hyperlink r:id="rId100">
         <w:r>
           <w:rPr>
             <w:rStyle w:val="Hyperlink"/>
@@ -10245,7 +9824,7 @@
         </w:rPr>
         <w:t xml:space="preserve">. </w:t>
       </w:r>
-      <w:hyperlink r:id="rId72">
+      <w:hyperlink r:id="rId101">
         <w:r>
           <w:rPr>
             <w:rStyle w:val="Hyperlink"/>
@@ -10261,7 +9840,7 @@
         </w:rPr>
         <w:t xml:space="preserve">. </w:t>
       </w:r>
-      <w:hyperlink r:id="rId73">
+      <w:hyperlink r:id="rId102">
         <w:r>
           <w:rPr>
             <w:rStyle w:val="Hyperlink"/>
@@ -10277,7 +9856,7 @@
         </w:rPr>
         <w:t xml:space="preserve">. </w:t>
       </w:r>
-      <w:hyperlink r:id="rId74">
+      <w:hyperlink r:id="rId103">
         <w:r>
           <w:rPr>
             <w:rStyle w:val="Hyperlink"/>
@@ -10295,13 +9874,640 @@
       </w:r>
     </w:p>
     <w:sectPr>
+      <w:headerReference w:type="default" r:id="rId95"/>
+      <w:footerReference w:type="default" r:id="rId96"/>
       <w:pgSz w:w="10080" w:h="14400"/>
-      <w:pgMar w:top="1008" w:right="1008" w:bottom="1008" w:left="1008" w:header="720" w:footer="720" w:gutter="0"/>
+      <w:pgMar w:top="1008" w:right="1008" w:bottom="1008" w:left="1008" w:header="504" w:footer="504" w:gutter="0"/>
       <w:cols w:space="720"/>
+      <w:titlePg/>
       <w:docGrid w:linePitch="360"/>
     </w:sectPr>
   </w:body>
 </w:document>
+</file>
+
+<file path=word/footer1.xml><?xml version="1.0" encoding="utf-8"?>
+<w:ftr xmlns:m="http://schemas.openxmlformats.org/officeDocument/2006/math" xmlns:mc="http://schemas.openxmlformats.org/markup-compatibility/2006" xmlns:mo="http://schemas.microsoft.com/office/mac/office/2008/main" xmlns:mv="urn:schemas-microsoft-com:mac:vml" xmlns:o="urn:schemas-microsoft-com:office:office" xmlns:r="http://schemas.openxmlformats.org/officeDocument/2006/relationships" xmlns:v="urn:schemas-microsoft-com:vml" xmlns:w10="urn:schemas-microsoft-com:office:word" xmlns:w14="http://schemas.microsoft.com/office/word/2010/wordml" xmlns:w="http://schemas.openxmlformats.org/wordprocessingml/2006/main" xmlns:wne="http://schemas.microsoft.com/office/word/2006/wordml" xmlns:wp14="http://schemas.microsoft.com/office/word/2010/wordprocessingDrawing" xmlns:wp="http://schemas.openxmlformats.org/drawingml/2006/wordprocessingDrawing" xmlns:wpc="http://schemas.microsoft.com/office/word/2010/wordprocessingCanvas" xmlns:wpg="http://schemas.microsoft.com/office/word/2010/wordprocessingGroup" xmlns:wpi="http://schemas.microsoft.com/office/word/2010/wordprocessingInk" xmlns:wps="http://schemas.microsoft.com/office/word/2010/wordprocessingShape" mc:Ignorable="w14 wp14">
+  <w:p>
+    <w:pPr>
+      <w:pStyle w:val="Footer"/>
+      <w:jc w:val="center"/>
+    </w:pPr>
+    <w:r>
+      <w:rPr>
+        <w:rFonts w:ascii="Calibri" w:hAnsi="Calibri"/>
+        <w:sz w:val="18"/>
+      </w:rPr>
+      <w:fldChar w:fldCharType="begin"/>
+    </w:r>
+    <w:r>
+      <w:rPr>
+        <w:rFonts w:ascii="Calibri" w:hAnsi="Calibri"/>
+        <w:sz w:val="18"/>
+      </w:rPr>
+      <w:instrText xml:space="preserve"> PAGE </w:instrText>
+    </w:r>
+    <w:r>
+      <w:rPr>
+        <w:rFonts w:ascii="Calibri" w:hAnsi="Calibri"/>
+        <w:sz w:val="18"/>
+      </w:rPr>
+      <w:fldChar w:fldCharType="end"/>
+    </w:r>
+  </w:p>
+</w:ftr>
+</file>
+
+<file path=word/footer10.xml><?xml version="1.0" encoding="utf-8"?>
+<w:ftr xmlns:m="http://schemas.openxmlformats.org/officeDocument/2006/math" xmlns:mc="http://schemas.openxmlformats.org/markup-compatibility/2006" xmlns:mo="http://schemas.microsoft.com/office/mac/office/2008/main" xmlns:mv="urn:schemas-microsoft-com:mac:vml" xmlns:o="urn:schemas-microsoft-com:office:office" xmlns:r="http://schemas.openxmlformats.org/officeDocument/2006/relationships" xmlns:v="urn:schemas-microsoft-com:vml" xmlns:w10="urn:schemas-microsoft-com:office:word" xmlns:w14="http://schemas.microsoft.com/office/word/2010/wordml" xmlns:w="http://schemas.openxmlformats.org/wordprocessingml/2006/main" xmlns:wne="http://schemas.microsoft.com/office/word/2006/wordml" xmlns:wp14="http://schemas.microsoft.com/office/word/2010/wordprocessingDrawing" xmlns:wp="http://schemas.openxmlformats.org/drawingml/2006/wordprocessingDrawing" xmlns:wpc="http://schemas.microsoft.com/office/word/2010/wordprocessingCanvas" xmlns:wpg="http://schemas.microsoft.com/office/word/2010/wordprocessingGroup" xmlns:wpi="http://schemas.microsoft.com/office/word/2010/wordprocessingInk" xmlns:wps="http://schemas.microsoft.com/office/word/2010/wordprocessingShape" mc:Ignorable="w14 wp14">
+  <w:p>
+    <w:pPr>
+      <w:pStyle w:val="Footer"/>
+      <w:jc w:val="center"/>
+    </w:pPr>
+    <w:r>
+      <w:rPr>
+        <w:rFonts w:ascii="Calibri" w:hAnsi="Calibri"/>
+        <w:sz w:val="18"/>
+      </w:rPr>
+      <w:fldChar w:fldCharType="begin"/>
+    </w:r>
+    <w:r>
+      <w:rPr>
+        <w:rFonts w:ascii="Calibri" w:hAnsi="Calibri"/>
+        <w:sz w:val="18"/>
+      </w:rPr>
+      <w:instrText xml:space="preserve"> PAGE </w:instrText>
+    </w:r>
+    <w:r>
+      <w:rPr>
+        <w:rFonts w:ascii="Calibri" w:hAnsi="Calibri"/>
+        <w:sz w:val="18"/>
+      </w:rPr>
+      <w:fldChar w:fldCharType="end"/>
+    </w:r>
+  </w:p>
+</w:ftr>
+</file>
+
+<file path=word/footer11.xml><?xml version="1.0" encoding="utf-8"?>
+<w:ftr xmlns:m="http://schemas.openxmlformats.org/officeDocument/2006/math" xmlns:mc="http://schemas.openxmlformats.org/markup-compatibility/2006" xmlns:mo="http://schemas.microsoft.com/office/mac/office/2008/main" xmlns:mv="urn:schemas-microsoft-com:mac:vml" xmlns:o="urn:schemas-microsoft-com:office:office" xmlns:r="http://schemas.openxmlformats.org/officeDocument/2006/relationships" xmlns:v="urn:schemas-microsoft-com:vml" xmlns:w10="urn:schemas-microsoft-com:office:word" xmlns:w14="http://schemas.microsoft.com/office/word/2010/wordml" xmlns:w="http://schemas.openxmlformats.org/wordprocessingml/2006/main" xmlns:wne="http://schemas.microsoft.com/office/word/2006/wordml" xmlns:wp14="http://schemas.microsoft.com/office/word/2010/wordprocessingDrawing" xmlns:wp="http://schemas.openxmlformats.org/drawingml/2006/wordprocessingDrawing" xmlns:wpc="http://schemas.microsoft.com/office/word/2010/wordprocessingCanvas" xmlns:wpg="http://schemas.microsoft.com/office/word/2010/wordprocessingGroup" xmlns:wpi="http://schemas.microsoft.com/office/word/2010/wordprocessingInk" xmlns:wps="http://schemas.microsoft.com/office/word/2010/wordprocessingShape" mc:Ignorable="w14 wp14">
+  <w:p>
+    <w:pPr>
+      <w:pStyle w:val="Footer"/>
+      <w:jc w:val="center"/>
+    </w:pPr>
+    <w:r>
+      <w:rPr>
+        <w:rFonts w:ascii="Calibri" w:hAnsi="Calibri"/>
+        <w:sz w:val="18"/>
+      </w:rPr>
+      <w:fldChar w:fldCharType="begin"/>
+    </w:r>
+    <w:r>
+      <w:rPr>
+        <w:rFonts w:ascii="Calibri" w:hAnsi="Calibri"/>
+        <w:sz w:val="18"/>
+      </w:rPr>
+      <w:instrText xml:space="preserve"> PAGE </w:instrText>
+    </w:r>
+    <w:r>
+      <w:rPr>
+        <w:rFonts w:ascii="Calibri" w:hAnsi="Calibri"/>
+        <w:sz w:val="18"/>
+      </w:rPr>
+      <w:fldChar w:fldCharType="end"/>
+    </w:r>
+  </w:p>
+</w:ftr>
+</file>
+
+<file path=word/footer12.xml><?xml version="1.0" encoding="utf-8"?>
+<w:ftr xmlns:m="http://schemas.openxmlformats.org/officeDocument/2006/math" xmlns:mc="http://schemas.openxmlformats.org/markup-compatibility/2006" xmlns:mo="http://schemas.microsoft.com/office/mac/office/2008/main" xmlns:mv="urn:schemas-microsoft-com:mac:vml" xmlns:o="urn:schemas-microsoft-com:office:office" xmlns:r="http://schemas.openxmlformats.org/officeDocument/2006/relationships" xmlns:v="urn:schemas-microsoft-com:vml" xmlns:w10="urn:schemas-microsoft-com:office:word" xmlns:w14="http://schemas.microsoft.com/office/word/2010/wordml" xmlns:w="http://schemas.openxmlformats.org/wordprocessingml/2006/main" xmlns:wne="http://schemas.microsoft.com/office/word/2006/wordml" xmlns:wp14="http://schemas.microsoft.com/office/word/2010/wordprocessingDrawing" xmlns:wp="http://schemas.openxmlformats.org/drawingml/2006/wordprocessingDrawing" xmlns:wpc="http://schemas.microsoft.com/office/word/2010/wordprocessingCanvas" xmlns:wpg="http://schemas.microsoft.com/office/word/2010/wordprocessingGroup" xmlns:wpi="http://schemas.microsoft.com/office/word/2010/wordprocessingInk" xmlns:wps="http://schemas.microsoft.com/office/word/2010/wordprocessingShape" mc:Ignorable="w14 wp14">
+  <w:p>
+    <w:pPr>
+      <w:pStyle w:val="Footer"/>
+      <w:jc w:val="center"/>
+    </w:pPr>
+    <w:r>
+      <w:rPr>
+        <w:rFonts w:ascii="Calibri" w:hAnsi="Calibri"/>
+        <w:sz w:val="18"/>
+      </w:rPr>
+      <w:fldChar w:fldCharType="begin"/>
+    </w:r>
+    <w:r>
+      <w:rPr>
+        <w:rFonts w:ascii="Calibri" w:hAnsi="Calibri"/>
+        <w:sz w:val="18"/>
+      </w:rPr>
+      <w:instrText xml:space="preserve"> PAGE </w:instrText>
+    </w:r>
+    <w:r>
+      <w:rPr>
+        <w:rFonts w:ascii="Calibri" w:hAnsi="Calibri"/>
+        <w:sz w:val="18"/>
+      </w:rPr>
+      <w:fldChar w:fldCharType="end"/>
+    </w:r>
+  </w:p>
+</w:ftr>
+</file>
+
+<file path=word/footer2.xml><?xml version="1.0" encoding="utf-8"?>
+<w:ftr xmlns:m="http://schemas.openxmlformats.org/officeDocument/2006/math" xmlns:mc="http://schemas.openxmlformats.org/markup-compatibility/2006" xmlns:mo="http://schemas.microsoft.com/office/mac/office/2008/main" xmlns:mv="urn:schemas-microsoft-com:mac:vml" xmlns:o="urn:schemas-microsoft-com:office:office" xmlns:r="http://schemas.openxmlformats.org/officeDocument/2006/relationships" xmlns:v="urn:schemas-microsoft-com:vml" xmlns:w10="urn:schemas-microsoft-com:office:word" xmlns:w14="http://schemas.microsoft.com/office/word/2010/wordml" xmlns:w="http://schemas.openxmlformats.org/wordprocessingml/2006/main" xmlns:wne="http://schemas.microsoft.com/office/word/2006/wordml" xmlns:wp14="http://schemas.microsoft.com/office/word/2010/wordprocessingDrawing" xmlns:wp="http://schemas.openxmlformats.org/drawingml/2006/wordprocessingDrawing" xmlns:wpc="http://schemas.microsoft.com/office/word/2010/wordprocessingCanvas" xmlns:wpg="http://schemas.microsoft.com/office/word/2010/wordprocessingGroup" xmlns:wpi="http://schemas.microsoft.com/office/word/2010/wordprocessingInk" xmlns:wps="http://schemas.microsoft.com/office/word/2010/wordprocessingShape" mc:Ignorable="w14 wp14">
+  <w:p>
+    <w:pPr>
+      <w:pStyle w:val="Footer"/>
+      <w:jc w:val="center"/>
+    </w:pPr>
+    <w:r>
+      <w:rPr>
+        <w:rFonts w:ascii="Calibri" w:hAnsi="Calibri"/>
+        <w:sz w:val="18"/>
+      </w:rPr>
+      <w:fldChar w:fldCharType="begin"/>
+    </w:r>
+    <w:r>
+      <w:rPr>
+        <w:rFonts w:ascii="Calibri" w:hAnsi="Calibri"/>
+        <w:sz w:val="18"/>
+      </w:rPr>
+      <w:instrText xml:space="preserve"> PAGE </w:instrText>
+    </w:r>
+    <w:r>
+      <w:rPr>
+        <w:rFonts w:ascii="Calibri" w:hAnsi="Calibri"/>
+        <w:sz w:val="18"/>
+      </w:rPr>
+      <w:fldChar w:fldCharType="end"/>
+    </w:r>
+  </w:p>
+</w:ftr>
+</file>
+
+<file path=word/footer3.xml><?xml version="1.0" encoding="utf-8"?>
+<w:ftr xmlns:m="http://schemas.openxmlformats.org/officeDocument/2006/math" xmlns:mc="http://schemas.openxmlformats.org/markup-compatibility/2006" xmlns:mo="http://schemas.microsoft.com/office/mac/office/2008/main" xmlns:mv="urn:schemas-microsoft-com:mac:vml" xmlns:o="urn:schemas-microsoft-com:office:office" xmlns:r="http://schemas.openxmlformats.org/officeDocument/2006/relationships" xmlns:v="urn:schemas-microsoft-com:vml" xmlns:w10="urn:schemas-microsoft-com:office:word" xmlns:w14="http://schemas.microsoft.com/office/word/2010/wordml" xmlns:w="http://schemas.openxmlformats.org/wordprocessingml/2006/main" xmlns:wne="http://schemas.microsoft.com/office/word/2006/wordml" xmlns:wp14="http://schemas.microsoft.com/office/word/2010/wordprocessingDrawing" xmlns:wp="http://schemas.openxmlformats.org/drawingml/2006/wordprocessingDrawing" xmlns:wpc="http://schemas.microsoft.com/office/word/2010/wordprocessingCanvas" xmlns:wpg="http://schemas.microsoft.com/office/word/2010/wordprocessingGroup" xmlns:wpi="http://schemas.microsoft.com/office/word/2010/wordprocessingInk" xmlns:wps="http://schemas.microsoft.com/office/word/2010/wordprocessingShape" mc:Ignorable="w14 wp14">
+  <w:p>
+    <w:pPr>
+      <w:pStyle w:val="Footer"/>
+      <w:jc w:val="center"/>
+    </w:pPr>
+    <w:r>
+      <w:rPr>
+        <w:rFonts w:ascii="Calibri" w:hAnsi="Calibri"/>
+        <w:sz w:val="18"/>
+      </w:rPr>
+      <w:fldChar w:fldCharType="begin"/>
+    </w:r>
+    <w:r>
+      <w:rPr>
+        <w:rFonts w:ascii="Calibri" w:hAnsi="Calibri"/>
+        <w:sz w:val="18"/>
+      </w:rPr>
+      <w:instrText xml:space="preserve"> PAGE </w:instrText>
+    </w:r>
+    <w:r>
+      <w:rPr>
+        <w:rFonts w:ascii="Calibri" w:hAnsi="Calibri"/>
+        <w:sz w:val="18"/>
+      </w:rPr>
+      <w:fldChar w:fldCharType="end"/>
+    </w:r>
+  </w:p>
+</w:ftr>
+</file>
+
+<file path=word/footer4.xml><?xml version="1.0" encoding="utf-8"?>
+<w:ftr xmlns:m="http://schemas.openxmlformats.org/officeDocument/2006/math" xmlns:mc="http://schemas.openxmlformats.org/markup-compatibility/2006" xmlns:mo="http://schemas.microsoft.com/office/mac/office/2008/main" xmlns:mv="urn:schemas-microsoft-com:mac:vml" xmlns:o="urn:schemas-microsoft-com:office:office" xmlns:r="http://schemas.openxmlformats.org/officeDocument/2006/relationships" xmlns:v="urn:schemas-microsoft-com:vml" xmlns:w10="urn:schemas-microsoft-com:office:word" xmlns:w14="http://schemas.microsoft.com/office/word/2010/wordml" xmlns:w="http://schemas.openxmlformats.org/wordprocessingml/2006/main" xmlns:wne="http://schemas.microsoft.com/office/word/2006/wordml" xmlns:wp14="http://schemas.microsoft.com/office/word/2010/wordprocessingDrawing" xmlns:wp="http://schemas.openxmlformats.org/drawingml/2006/wordprocessingDrawing" xmlns:wpc="http://schemas.microsoft.com/office/word/2010/wordprocessingCanvas" xmlns:wpg="http://schemas.microsoft.com/office/word/2010/wordprocessingGroup" xmlns:wpi="http://schemas.microsoft.com/office/word/2010/wordprocessingInk" xmlns:wps="http://schemas.microsoft.com/office/word/2010/wordprocessingShape" mc:Ignorable="w14 wp14">
+  <w:p>
+    <w:pPr>
+      <w:pStyle w:val="Footer"/>
+      <w:jc w:val="center"/>
+    </w:pPr>
+    <w:r>
+      <w:rPr>
+        <w:rFonts w:ascii="Calibri" w:hAnsi="Calibri"/>
+        <w:sz w:val="18"/>
+      </w:rPr>
+      <w:fldChar w:fldCharType="begin"/>
+    </w:r>
+    <w:r>
+      <w:rPr>
+        <w:rFonts w:ascii="Calibri" w:hAnsi="Calibri"/>
+        <w:sz w:val="18"/>
+      </w:rPr>
+      <w:instrText xml:space="preserve"> PAGE </w:instrText>
+    </w:r>
+    <w:r>
+      <w:rPr>
+        <w:rFonts w:ascii="Calibri" w:hAnsi="Calibri"/>
+        <w:sz w:val="18"/>
+      </w:rPr>
+      <w:fldChar w:fldCharType="end"/>
+    </w:r>
+  </w:p>
+</w:ftr>
+</file>
+
+<file path=word/footer5.xml><?xml version="1.0" encoding="utf-8"?>
+<w:ftr xmlns:m="http://schemas.openxmlformats.org/officeDocument/2006/math" xmlns:mc="http://schemas.openxmlformats.org/markup-compatibility/2006" xmlns:mo="http://schemas.microsoft.com/office/mac/office/2008/main" xmlns:mv="urn:schemas-microsoft-com:mac:vml" xmlns:o="urn:schemas-microsoft-com:office:office" xmlns:r="http://schemas.openxmlformats.org/officeDocument/2006/relationships" xmlns:v="urn:schemas-microsoft-com:vml" xmlns:w10="urn:schemas-microsoft-com:office:word" xmlns:w14="http://schemas.microsoft.com/office/word/2010/wordml" xmlns:w="http://schemas.openxmlformats.org/wordprocessingml/2006/main" xmlns:wne="http://schemas.microsoft.com/office/word/2006/wordml" xmlns:wp14="http://schemas.microsoft.com/office/word/2010/wordprocessingDrawing" xmlns:wp="http://schemas.openxmlformats.org/drawingml/2006/wordprocessingDrawing" xmlns:wpc="http://schemas.microsoft.com/office/word/2010/wordprocessingCanvas" xmlns:wpg="http://schemas.microsoft.com/office/word/2010/wordprocessingGroup" xmlns:wpi="http://schemas.microsoft.com/office/word/2010/wordprocessingInk" xmlns:wps="http://schemas.microsoft.com/office/word/2010/wordprocessingShape" mc:Ignorable="w14 wp14">
+  <w:p>
+    <w:pPr>
+      <w:pStyle w:val="Footer"/>
+      <w:jc w:val="center"/>
+    </w:pPr>
+    <w:r>
+      <w:rPr>
+        <w:rFonts w:ascii="Calibri" w:hAnsi="Calibri"/>
+        <w:sz w:val="18"/>
+      </w:rPr>
+      <w:fldChar w:fldCharType="begin"/>
+    </w:r>
+    <w:r>
+      <w:rPr>
+        <w:rFonts w:ascii="Calibri" w:hAnsi="Calibri"/>
+        <w:sz w:val="18"/>
+      </w:rPr>
+      <w:instrText xml:space="preserve"> PAGE </w:instrText>
+    </w:r>
+    <w:r>
+      <w:rPr>
+        <w:rFonts w:ascii="Calibri" w:hAnsi="Calibri"/>
+        <w:sz w:val="18"/>
+      </w:rPr>
+      <w:fldChar w:fldCharType="end"/>
+    </w:r>
+  </w:p>
+</w:ftr>
+</file>
+
+<file path=word/footer6.xml><?xml version="1.0" encoding="utf-8"?>
+<w:ftr xmlns:m="http://schemas.openxmlformats.org/officeDocument/2006/math" xmlns:mc="http://schemas.openxmlformats.org/markup-compatibility/2006" xmlns:mo="http://schemas.microsoft.com/office/mac/office/2008/main" xmlns:mv="urn:schemas-microsoft-com:mac:vml" xmlns:o="urn:schemas-microsoft-com:office:office" xmlns:r="http://schemas.openxmlformats.org/officeDocument/2006/relationships" xmlns:v="urn:schemas-microsoft-com:vml" xmlns:w10="urn:schemas-microsoft-com:office:word" xmlns:w14="http://schemas.microsoft.com/office/word/2010/wordml" xmlns:w="http://schemas.openxmlformats.org/wordprocessingml/2006/main" xmlns:wne="http://schemas.microsoft.com/office/word/2006/wordml" xmlns:wp14="http://schemas.microsoft.com/office/word/2010/wordprocessingDrawing" xmlns:wp="http://schemas.openxmlformats.org/drawingml/2006/wordprocessingDrawing" xmlns:wpc="http://schemas.microsoft.com/office/word/2010/wordprocessingCanvas" xmlns:wpg="http://schemas.microsoft.com/office/word/2010/wordprocessingGroup" xmlns:wpi="http://schemas.microsoft.com/office/word/2010/wordprocessingInk" xmlns:wps="http://schemas.microsoft.com/office/word/2010/wordprocessingShape" mc:Ignorable="w14 wp14">
+  <w:p>
+    <w:pPr>
+      <w:pStyle w:val="Footer"/>
+      <w:jc w:val="center"/>
+    </w:pPr>
+    <w:r>
+      <w:rPr>
+        <w:rFonts w:ascii="Calibri" w:hAnsi="Calibri"/>
+        <w:sz w:val="18"/>
+      </w:rPr>
+      <w:fldChar w:fldCharType="begin"/>
+    </w:r>
+    <w:r>
+      <w:rPr>
+        <w:rFonts w:ascii="Calibri" w:hAnsi="Calibri"/>
+        <w:sz w:val="18"/>
+      </w:rPr>
+      <w:instrText xml:space="preserve"> PAGE </w:instrText>
+    </w:r>
+    <w:r>
+      <w:rPr>
+        <w:rFonts w:ascii="Calibri" w:hAnsi="Calibri"/>
+        <w:sz w:val="18"/>
+      </w:rPr>
+      <w:fldChar w:fldCharType="end"/>
+    </w:r>
+  </w:p>
+</w:ftr>
+</file>
+
+<file path=word/footer7.xml><?xml version="1.0" encoding="utf-8"?>
+<w:ftr xmlns:m="http://schemas.openxmlformats.org/officeDocument/2006/math" xmlns:mc="http://schemas.openxmlformats.org/markup-compatibility/2006" xmlns:mo="http://schemas.microsoft.com/office/mac/office/2008/main" xmlns:mv="urn:schemas-microsoft-com:mac:vml" xmlns:o="urn:schemas-microsoft-com:office:office" xmlns:r="http://schemas.openxmlformats.org/officeDocument/2006/relationships" xmlns:v="urn:schemas-microsoft-com:vml" xmlns:w10="urn:schemas-microsoft-com:office:word" xmlns:w14="http://schemas.microsoft.com/office/word/2010/wordml" xmlns:w="http://schemas.openxmlformats.org/wordprocessingml/2006/main" xmlns:wne="http://schemas.microsoft.com/office/word/2006/wordml" xmlns:wp14="http://schemas.microsoft.com/office/word/2010/wordprocessingDrawing" xmlns:wp="http://schemas.openxmlformats.org/drawingml/2006/wordprocessingDrawing" xmlns:wpc="http://schemas.microsoft.com/office/word/2010/wordprocessingCanvas" xmlns:wpg="http://schemas.microsoft.com/office/word/2010/wordprocessingGroup" xmlns:wpi="http://schemas.microsoft.com/office/word/2010/wordprocessingInk" xmlns:wps="http://schemas.microsoft.com/office/word/2010/wordprocessingShape" mc:Ignorable="w14 wp14">
+  <w:p>
+    <w:pPr>
+      <w:pStyle w:val="Footer"/>
+      <w:jc w:val="center"/>
+    </w:pPr>
+    <w:r>
+      <w:rPr>
+        <w:rFonts w:ascii="Calibri" w:hAnsi="Calibri"/>
+        <w:sz w:val="18"/>
+      </w:rPr>
+      <w:fldChar w:fldCharType="begin"/>
+    </w:r>
+    <w:r>
+      <w:rPr>
+        <w:rFonts w:ascii="Calibri" w:hAnsi="Calibri"/>
+        <w:sz w:val="18"/>
+      </w:rPr>
+      <w:instrText xml:space="preserve"> PAGE </w:instrText>
+    </w:r>
+    <w:r>
+      <w:rPr>
+        <w:rFonts w:ascii="Calibri" w:hAnsi="Calibri"/>
+        <w:sz w:val="18"/>
+      </w:rPr>
+      <w:fldChar w:fldCharType="end"/>
+    </w:r>
+  </w:p>
+</w:ftr>
+</file>
+
+<file path=word/footer8.xml><?xml version="1.0" encoding="utf-8"?>
+<w:ftr xmlns:m="http://schemas.openxmlformats.org/officeDocument/2006/math" xmlns:mc="http://schemas.openxmlformats.org/markup-compatibility/2006" xmlns:mo="http://schemas.microsoft.com/office/mac/office/2008/main" xmlns:mv="urn:schemas-microsoft-com:mac:vml" xmlns:o="urn:schemas-microsoft-com:office:office" xmlns:r="http://schemas.openxmlformats.org/officeDocument/2006/relationships" xmlns:v="urn:schemas-microsoft-com:vml" xmlns:w10="urn:schemas-microsoft-com:office:word" xmlns:w14="http://schemas.microsoft.com/office/word/2010/wordml" xmlns:w="http://schemas.openxmlformats.org/wordprocessingml/2006/main" xmlns:wne="http://schemas.microsoft.com/office/word/2006/wordml" xmlns:wp14="http://schemas.microsoft.com/office/word/2010/wordprocessingDrawing" xmlns:wp="http://schemas.openxmlformats.org/drawingml/2006/wordprocessingDrawing" xmlns:wpc="http://schemas.microsoft.com/office/word/2010/wordprocessingCanvas" xmlns:wpg="http://schemas.microsoft.com/office/word/2010/wordprocessingGroup" xmlns:wpi="http://schemas.microsoft.com/office/word/2010/wordprocessingInk" xmlns:wps="http://schemas.microsoft.com/office/word/2010/wordprocessingShape" mc:Ignorable="w14 wp14">
+  <w:p>
+    <w:pPr>
+      <w:pStyle w:val="Footer"/>
+      <w:jc w:val="center"/>
+    </w:pPr>
+    <w:r>
+      <w:rPr>
+        <w:rFonts w:ascii="Calibri" w:hAnsi="Calibri"/>
+        <w:sz w:val="18"/>
+      </w:rPr>
+      <w:fldChar w:fldCharType="begin"/>
+    </w:r>
+    <w:r>
+      <w:rPr>
+        <w:rFonts w:ascii="Calibri" w:hAnsi="Calibri"/>
+        <w:sz w:val="18"/>
+      </w:rPr>
+      <w:instrText xml:space="preserve"> PAGE </w:instrText>
+    </w:r>
+    <w:r>
+      <w:rPr>
+        <w:rFonts w:ascii="Calibri" w:hAnsi="Calibri"/>
+        <w:sz w:val="18"/>
+      </w:rPr>
+      <w:fldChar w:fldCharType="end"/>
+    </w:r>
+  </w:p>
+</w:ftr>
+</file>
+
+<file path=word/footer9.xml><?xml version="1.0" encoding="utf-8"?>
+<w:ftr xmlns:m="http://schemas.openxmlformats.org/officeDocument/2006/math" xmlns:mc="http://schemas.openxmlformats.org/markup-compatibility/2006" xmlns:mo="http://schemas.microsoft.com/office/mac/office/2008/main" xmlns:mv="urn:schemas-microsoft-com:mac:vml" xmlns:o="urn:schemas-microsoft-com:office:office" xmlns:r="http://schemas.openxmlformats.org/officeDocument/2006/relationships" xmlns:v="urn:schemas-microsoft-com:vml" xmlns:w10="urn:schemas-microsoft-com:office:word" xmlns:w14="http://schemas.microsoft.com/office/word/2010/wordml" xmlns:w="http://schemas.openxmlformats.org/wordprocessingml/2006/main" xmlns:wne="http://schemas.microsoft.com/office/word/2006/wordml" xmlns:wp14="http://schemas.microsoft.com/office/word/2010/wordprocessingDrawing" xmlns:wp="http://schemas.openxmlformats.org/drawingml/2006/wordprocessingDrawing" xmlns:wpc="http://schemas.microsoft.com/office/word/2010/wordprocessingCanvas" xmlns:wpg="http://schemas.microsoft.com/office/word/2010/wordprocessingGroup" xmlns:wpi="http://schemas.microsoft.com/office/word/2010/wordprocessingInk" xmlns:wps="http://schemas.microsoft.com/office/word/2010/wordprocessingShape" mc:Ignorable="w14 wp14">
+  <w:p>
+    <w:pPr>
+      <w:pStyle w:val="Footer"/>
+      <w:jc w:val="center"/>
+    </w:pPr>
+    <w:r>
+      <w:rPr>
+        <w:rFonts w:ascii="Calibri" w:hAnsi="Calibri"/>
+        <w:sz w:val="18"/>
+      </w:rPr>
+      <w:fldChar w:fldCharType="begin"/>
+    </w:r>
+    <w:r>
+      <w:rPr>
+        <w:rFonts w:ascii="Calibri" w:hAnsi="Calibri"/>
+        <w:sz w:val="18"/>
+      </w:rPr>
+      <w:instrText xml:space="preserve"> PAGE </w:instrText>
+    </w:r>
+    <w:r>
+      <w:rPr>
+        <w:rFonts w:ascii="Calibri" w:hAnsi="Calibri"/>
+        <w:sz w:val="18"/>
+      </w:rPr>
+      <w:fldChar w:fldCharType="end"/>
+    </w:r>
+  </w:p>
+</w:ftr>
+</file>
+
+<file path=word/header1.xml><?xml version="1.0" encoding="utf-8"?>
+<w:hdr xmlns:m="http://schemas.openxmlformats.org/officeDocument/2006/math" xmlns:mc="http://schemas.openxmlformats.org/markup-compatibility/2006" xmlns:mo="http://schemas.microsoft.com/office/mac/office/2008/main" xmlns:mv="urn:schemas-microsoft-com:mac:vml" xmlns:o="urn:schemas-microsoft-com:office:office" xmlns:r="http://schemas.openxmlformats.org/officeDocument/2006/relationships" xmlns:v="urn:schemas-microsoft-com:vml" xmlns:w10="urn:schemas-microsoft-com:office:word" xmlns:w14="http://schemas.microsoft.com/office/word/2010/wordml" xmlns:w="http://schemas.openxmlformats.org/wordprocessingml/2006/main" xmlns:wne="http://schemas.microsoft.com/office/word/2006/wordml" xmlns:wp14="http://schemas.microsoft.com/office/word/2010/wordprocessingDrawing" xmlns:wp="http://schemas.openxmlformats.org/drawingml/2006/wordprocessingDrawing" xmlns:wpc="http://schemas.microsoft.com/office/word/2010/wordprocessingCanvas" xmlns:wpg="http://schemas.microsoft.com/office/word/2010/wordprocessingGroup" xmlns:wpi="http://schemas.microsoft.com/office/word/2010/wordprocessingInk" xmlns:wps="http://schemas.microsoft.com/office/word/2010/wordprocessingShape" mc:Ignorable="w14 wp14">
+  <w:p>
+    <w:pPr>
+      <w:pStyle w:val="Header"/>
+      <w:jc w:val="right"/>
+    </w:pPr>
+    <w:r>
+      <w:rPr>
+        <w:rFonts w:ascii="Calibri" w:hAnsi="Calibri"/>
+        <w:i/>
+        <w:color w:val="444444"/>
+        <w:sz w:val="18"/>
+      </w:rPr>
+      <w:t>Start here</w:t>
+    </w:r>
+  </w:p>
+</w:hdr>
+</file>
+
+<file path=word/header10.xml><?xml version="1.0" encoding="utf-8"?>
+<w:hdr xmlns:m="http://schemas.openxmlformats.org/officeDocument/2006/math" xmlns:mc="http://schemas.openxmlformats.org/markup-compatibility/2006" xmlns:mo="http://schemas.microsoft.com/office/mac/office/2008/main" xmlns:mv="urn:schemas-microsoft-com:mac:vml" xmlns:o="urn:schemas-microsoft-com:office:office" xmlns:r="http://schemas.openxmlformats.org/officeDocument/2006/relationships" xmlns:v="urn:schemas-microsoft-com:vml" xmlns:w10="urn:schemas-microsoft-com:office:word" xmlns:w14="http://schemas.microsoft.com/office/word/2010/wordml" xmlns:w="http://schemas.openxmlformats.org/wordprocessingml/2006/main" xmlns:wne="http://schemas.microsoft.com/office/word/2006/wordml" xmlns:wp14="http://schemas.microsoft.com/office/word/2010/wordprocessingDrawing" xmlns:wp="http://schemas.openxmlformats.org/drawingml/2006/wordprocessingDrawing" xmlns:wpc="http://schemas.microsoft.com/office/word/2010/wordprocessingCanvas" xmlns:wpg="http://schemas.microsoft.com/office/word/2010/wordprocessingGroup" xmlns:wpi="http://schemas.microsoft.com/office/word/2010/wordprocessingInk" xmlns:wps="http://schemas.microsoft.com/office/word/2010/wordprocessingShape" mc:Ignorable="w14 wp14">
+  <w:p>
+    <w:pPr>
+      <w:pStyle w:val="Header"/>
+      <w:jc w:val="right"/>
+    </w:pPr>
+    <w:r>
+      <w:rPr>
+        <w:rFonts w:ascii="Calibri" w:hAnsi="Calibri"/>
+        <w:i/>
+        <w:color w:val="444444"/>
+        <w:sz w:val="18"/>
+      </w:rPr>
+      <w:t>9  When Nothing Sells</w:t>
+    </w:r>
+  </w:p>
+</w:hdr>
+</file>
+
+<file path=word/header11.xml><?xml version="1.0" encoding="utf-8"?>
+<w:hdr xmlns:m="http://schemas.openxmlformats.org/officeDocument/2006/math" xmlns:mc="http://schemas.openxmlformats.org/markup-compatibility/2006" xmlns:mo="http://schemas.microsoft.com/office/mac/office/2008/main" xmlns:mv="urn:schemas-microsoft-com:mac:vml" xmlns:o="urn:schemas-microsoft-com:office:office" xmlns:r="http://schemas.openxmlformats.org/officeDocument/2006/relationships" xmlns:v="urn:schemas-microsoft-com:vml" xmlns:w10="urn:schemas-microsoft-com:office:word" xmlns:w14="http://schemas.microsoft.com/office/word/2010/wordml" xmlns:w="http://schemas.openxmlformats.org/wordprocessingml/2006/main" xmlns:wne="http://schemas.microsoft.com/office/word/2006/wordml" xmlns:wp14="http://schemas.microsoft.com/office/word/2010/wordprocessingDrawing" xmlns:wp="http://schemas.openxmlformats.org/drawingml/2006/wordprocessingDrawing" xmlns:wpc="http://schemas.microsoft.com/office/word/2010/wordprocessingCanvas" xmlns:wpg="http://schemas.microsoft.com/office/word/2010/wordprocessingGroup" xmlns:wpi="http://schemas.microsoft.com/office/word/2010/wordprocessingInk" xmlns:wps="http://schemas.microsoft.com/office/word/2010/wordprocessingShape" mc:Ignorable="w14 wp14">
+  <w:p>
+    <w:pPr>
+      <w:pStyle w:val="Header"/>
+      <w:jc w:val="right"/>
+    </w:pPr>
+    <w:r>
+      <w:rPr>
+        <w:rFonts w:ascii="Calibri" w:hAnsi="Calibri"/>
+        <w:i/>
+        <w:color w:val="444444"/>
+        <w:sz w:val="18"/>
+      </w:rPr>
+      <w:t>Glossary</w:t>
+    </w:r>
+  </w:p>
+</w:hdr>
+</file>
+
+<file path=word/header12.xml><?xml version="1.0" encoding="utf-8"?>
+<w:hdr xmlns:m="http://schemas.openxmlformats.org/officeDocument/2006/math" xmlns:mc="http://schemas.openxmlformats.org/markup-compatibility/2006" xmlns:mo="http://schemas.microsoft.com/office/mac/office/2008/main" xmlns:mv="urn:schemas-microsoft-com:mac:vml" xmlns:o="urn:schemas-microsoft-com:office:office" xmlns:r="http://schemas.openxmlformats.org/officeDocument/2006/relationships" xmlns:v="urn:schemas-microsoft-com:vml" xmlns:w10="urn:schemas-microsoft-com:office:word" xmlns:w14="http://schemas.microsoft.com/office/word/2010/wordml" xmlns:w="http://schemas.openxmlformats.org/wordprocessingml/2006/main" xmlns:wne="http://schemas.microsoft.com/office/word/2006/wordml" xmlns:wp14="http://schemas.microsoft.com/office/word/2010/wordprocessingDrawing" xmlns:wp="http://schemas.openxmlformats.org/drawingml/2006/wordprocessingDrawing" xmlns:wpc="http://schemas.microsoft.com/office/word/2010/wordprocessingCanvas" xmlns:wpg="http://schemas.microsoft.com/office/word/2010/wordprocessingGroup" xmlns:wpi="http://schemas.microsoft.com/office/word/2010/wordprocessingInk" xmlns:wps="http://schemas.microsoft.com/office/word/2010/wordprocessingShape" mc:Ignorable="w14 wp14">
+  <w:p>
+    <w:pPr>
+      <w:pStyle w:val="Header"/>
+      <w:jc w:val="right"/>
+    </w:pPr>
+    <w:r>
+      <w:rPr>
+        <w:rFonts w:ascii="Calibri" w:hAnsi="Calibri"/>
+        <w:i/>
+        <w:color w:val="444444"/>
+        <w:sz w:val="18"/>
+      </w:rPr>
+      <w:t>Sources</w:t>
+    </w:r>
+  </w:p>
+</w:hdr>
+</file>
+
+<file path=word/header2.xml><?xml version="1.0" encoding="utf-8"?>
+<w:hdr xmlns:m="http://schemas.openxmlformats.org/officeDocument/2006/math" xmlns:mc="http://schemas.openxmlformats.org/markup-compatibility/2006" xmlns:mo="http://schemas.microsoft.com/office/mac/office/2008/main" xmlns:mv="urn:schemas-microsoft-com:mac:vml" xmlns:o="urn:schemas-microsoft-com:office:office" xmlns:r="http://schemas.openxmlformats.org/officeDocument/2006/relationships" xmlns:v="urn:schemas-microsoft-com:vml" xmlns:w10="urn:schemas-microsoft-com:office:word" xmlns:w14="http://schemas.microsoft.com/office/word/2010/wordml" xmlns:w="http://schemas.openxmlformats.org/wordprocessingml/2006/main" xmlns:wne="http://schemas.microsoft.com/office/word/2006/wordml" xmlns:wp14="http://schemas.microsoft.com/office/word/2010/wordprocessingDrawing" xmlns:wp="http://schemas.openxmlformats.org/drawingml/2006/wordprocessingDrawing" xmlns:wpc="http://schemas.microsoft.com/office/word/2010/wordprocessingCanvas" xmlns:wpg="http://schemas.microsoft.com/office/word/2010/wordprocessingGroup" xmlns:wpi="http://schemas.microsoft.com/office/word/2010/wordprocessingInk" xmlns:wps="http://schemas.microsoft.com/office/word/2010/wordprocessingShape" mc:Ignorable="w14 wp14">
+  <w:p>
+    <w:pPr>
+      <w:pStyle w:val="Header"/>
+      <w:jc w:val="right"/>
+    </w:pPr>
+    <w:r>
+      <w:rPr>
+        <w:rFonts w:ascii="Calibri" w:hAnsi="Calibri"/>
+        <w:i/>
+        <w:color w:val="444444"/>
+        <w:sz w:val="18"/>
+      </w:rPr>
+      <w:t>1  Sell One Thing</w:t>
+    </w:r>
+  </w:p>
+</w:hdr>
+</file>
+
+<file path=word/header3.xml><?xml version="1.0" encoding="utf-8"?>
+<w:hdr xmlns:m="http://schemas.openxmlformats.org/officeDocument/2006/math" xmlns:mc="http://schemas.openxmlformats.org/markup-compatibility/2006" xmlns:mo="http://schemas.microsoft.com/office/mac/office/2008/main" xmlns:mv="urn:schemas-microsoft-com:mac:vml" xmlns:o="urn:schemas-microsoft-com:office:office" xmlns:r="http://schemas.openxmlformats.org/officeDocument/2006/relationships" xmlns:v="urn:schemas-microsoft-com:vml" xmlns:w10="urn:schemas-microsoft-com:office:word" xmlns:w14="http://schemas.microsoft.com/office/word/2010/wordml" xmlns:w="http://schemas.openxmlformats.org/wordprocessingml/2006/main" xmlns:wne="http://schemas.microsoft.com/office/word/2006/wordml" xmlns:wp14="http://schemas.microsoft.com/office/word/2010/wordprocessingDrawing" xmlns:wp="http://schemas.openxmlformats.org/drawingml/2006/wordprocessingDrawing" xmlns:wpc="http://schemas.microsoft.com/office/word/2010/wordprocessingCanvas" xmlns:wpg="http://schemas.microsoft.com/office/word/2010/wordprocessingGroup" xmlns:wpi="http://schemas.microsoft.com/office/word/2010/wordprocessingInk" xmlns:wps="http://schemas.microsoft.com/office/word/2010/wordprocessingShape" mc:Ignorable="w14 wp14">
+  <w:p>
+    <w:pPr>
+      <w:pStyle w:val="Header"/>
+      <w:jc w:val="right"/>
+    </w:pPr>
+    <w:r>
+      <w:rPr>
+        <w:rFonts w:ascii="Calibri" w:hAnsi="Calibri"/>
+        <w:i/>
+        <w:color w:val="444444"/>
+        <w:sz w:val="18"/>
+      </w:rPr>
+      <w:t>2  The Click Is the Whole Business</w:t>
+    </w:r>
+  </w:p>
+</w:hdr>
+</file>
+
+<file path=word/header4.xml><?xml version="1.0" encoding="utf-8"?>
+<w:hdr xmlns:m="http://schemas.openxmlformats.org/officeDocument/2006/math" xmlns:mc="http://schemas.openxmlformats.org/markup-compatibility/2006" xmlns:mo="http://schemas.microsoft.com/office/mac/office/2008/main" xmlns:mv="urn:schemas-microsoft-com:mac:vml" xmlns:o="urn:schemas-microsoft-com:office:office" xmlns:r="http://schemas.openxmlformats.org/officeDocument/2006/relationships" xmlns:v="urn:schemas-microsoft-com:vml" xmlns:w10="urn:schemas-microsoft-com:office:word" xmlns:w14="http://schemas.microsoft.com/office/word/2010/wordml" xmlns:w="http://schemas.openxmlformats.org/wordprocessingml/2006/main" xmlns:wne="http://schemas.microsoft.com/office/word/2006/wordml" xmlns:wp14="http://schemas.microsoft.com/office/word/2010/wordprocessingDrawing" xmlns:wp="http://schemas.openxmlformats.org/drawingml/2006/wordprocessingDrawing" xmlns:wpc="http://schemas.microsoft.com/office/word/2010/wordprocessingCanvas" xmlns:wpg="http://schemas.microsoft.com/office/word/2010/wordprocessingGroup" xmlns:wpi="http://schemas.microsoft.com/office/word/2010/wordprocessingInk" xmlns:wps="http://schemas.microsoft.com/office/word/2010/wordprocessingShape" mc:Ignorable="w14 wp14">
+  <w:p>
+    <w:pPr>
+      <w:pStyle w:val="Header"/>
+      <w:jc w:val="right"/>
+    </w:pPr>
+    <w:r>
+      <w:rPr>
+        <w:rFonts w:ascii="Calibri" w:hAnsi="Calibri"/>
+        <w:i/>
+        <w:color w:val="444444"/>
+        <w:sz w:val="18"/>
+      </w:rPr>
+      <w:t>3  Nobody Can Tell What It Cost</w:t>
+    </w:r>
+  </w:p>
+</w:hdr>
+</file>
+
+<file path=word/header5.xml><?xml version="1.0" encoding="utf-8"?>
+<w:hdr xmlns:m="http://schemas.openxmlformats.org/officeDocument/2006/math" xmlns:mc="http://schemas.openxmlformats.org/markup-compatibility/2006" xmlns:mo="http://schemas.microsoft.com/office/mac/office/2008/main" xmlns:mv="urn:schemas-microsoft-com:mac:vml" xmlns:o="urn:schemas-microsoft-com:office:office" xmlns:r="http://schemas.openxmlformats.org/officeDocument/2006/relationships" xmlns:v="urn:schemas-microsoft-com:vml" xmlns:w10="urn:schemas-microsoft-com:office:word" xmlns:w14="http://schemas.microsoft.com/office/word/2010/wordml" xmlns:w="http://schemas.openxmlformats.org/wordprocessingml/2006/main" xmlns:wne="http://schemas.microsoft.com/office/word/2006/wordml" xmlns:wp14="http://schemas.microsoft.com/office/word/2010/wordprocessingDrawing" xmlns:wp="http://schemas.openxmlformats.org/drawingml/2006/wordprocessingDrawing" xmlns:wpc="http://schemas.microsoft.com/office/word/2010/wordprocessingCanvas" xmlns:wpg="http://schemas.microsoft.com/office/word/2010/wordprocessingGroup" xmlns:wpi="http://schemas.microsoft.com/office/word/2010/wordprocessingInk" xmlns:wps="http://schemas.microsoft.com/office/word/2010/wordprocessingShape" mc:Ignorable="w14 wp14">
+  <w:p>
+    <w:pPr>
+      <w:pStyle w:val="Header"/>
+      <w:jc w:val="right"/>
+    </w:pPr>
+    <w:r>
+      <w:rPr>
+        <w:rFonts w:ascii="Calibri" w:hAnsi="Calibri"/>
+        <w:i/>
+        <w:color w:val="444444"/>
+        <w:sz w:val="18"/>
+      </w:rPr>
+      <w:t>4  The Videos That Do the Selling</w:t>
+    </w:r>
+  </w:p>
+</w:hdr>
+</file>
+
+<file path=word/header6.xml><?xml version="1.0" encoding="utf-8"?>
+<w:hdr xmlns:m="http://schemas.openxmlformats.org/officeDocument/2006/math" xmlns:mc="http://schemas.openxmlformats.org/markup-compatibility/2006" xmlns:mo="http://schemas.microsoft.com/office/mac/office/2008/main" xmlns:mv="urn:schemas-microsoft-com:mac:vml" xmlns:o="urn:schemas-microsoft-com:office:office" xmlns:r="http://schemas.openxmlformats.org/officeDocument/2006/relationships" xmlns:v="urn:schemas-microsoft-com:vml" xmlns:w10="urn:schemas-microsoft-com:office:word" xmlns:w14="http://schemas.microsoft.com/office/word/2010/wordml" xmlns:w="http://schemas.openxmlformats.org/wordprocessingml/2006/main" xmlns:wne="http://schemas.microsoft.com/office/word/2006/wordml" xmlns:wp14="http://schemas.microsoft.com/office/word/2010/wordprocessingDrawing" xmlns:wp="http://schemas.openxmlformats.org/drawingml/2006/wordprocessingDrawing" xmlns:wpc="http://schemas.microsoft.com/office/word/2010/wordprocessingCanvas" xmlns:wpg="http://schemas.microsoft.com/office/word/2010/wordprocessingGroup" xmlns:wpi="http://schemas.microsoft.com/office/word/2010/wordprocessingInk" xmlns:wps="http://schemas.microsoft.com/office/word/2010/wordprocessingShape" mc:Ignorable="w14 wp14">
+  <w:p>
+    <w:pPr>
+      <w:pStyle w:val="Header"/>
+      <w:jc w:val="right"/>
+    </w:pPr>
+    <w:r>
+      <w:rPr>
+        <w:rFonts w:ascii="Calibri" w:hAnsi="Calibri"/>
+        <w:i/>
+        <w:color w:val="444444"/>
+        <w:sz w:val="18"/>
+      </w:rPr>
+      <w:t>5  Where the Money Actually Comes From</w:t>
+    </w:r>
+  </w:p>
+</w:hdr>
+</file>
+
+<file path=word/header7.xml><?xml version="1.0" encoding="utf-8"?>
+<w:hdr xmlns:m="http://schemas.openxmlformats.org/officeDocument/2006/math" xmlns:mc="http://schemas.openxmlformats.org/markup-compatibility/2006" xmlns:mo="http://schemas.microsoft.com/office/mac/office/2008/main" xmlns:mv="urn:schemas-microsoft-com:mac:vml" xmlns:o="urn:schemas-microsoft-com:office:office" xmlns:r="http://schemas.openxmlformats.org/officeDocument/2006/relationships" xmlns:v="urn:schemas-microsoft-com:vml" xmlns:w10="urn:schemas-microsoft-com:office:word" xmlns:w14="http://schemas.microsoft.com/office/word/2010/wordml" xmlns:w="http://schemas.openxmlformats.org/wordprocessingml/2006/main" xmlns:wne="http://schemas.microsoft.com/office/word/2006/wordml" xmlns:wp14="http://schemas.microsoft.com/office/word/2010/wordprocessingDrawing" xmlns:wp="http://schemas.openxmlformats.org/drawingml/2006/wordprocessingDrawing" xmlns:wpc="http://schemas.microsoft.com/office/word/2010/wordprocessingCanvas" xmlns:wpg="http://schemas.microsoft.com/office/word/2010/wordprocessingGroup" xmlns:wpi="http://schemas.microsoft.com/office/word/2010/wordprocessingInk" xmlns:wps="http://schemas.microsoft.com/office/word/2010/wordprocessingShape" mc:Ignorable="w14 wp14">
+  <w:p>
+    <w:pPr>
+      <w:pStyle w:val="Header"/>
+      <w:jc w:val="right"/>
+    </w:pPr>
+    <w:r>
+      <w:rPr>
+        <w:rFonts w:ascii="Calibri" w:hAnsi="Calibri"/>
+        <w:i/>
+        <w:color w:val="444444"/>
+        <w:sz w:val="18"/>
+      </w:rPr>
+      <w:t>6  Six Weeks to a Live Offer</w:t>
+    </w:r>
+  </w:p>
+</w:hdr>
+</file>
+
+<file path=word/header8.xml><?xml version="1.0" encoding="utf-8"?>
+<w:hdr xmlns:m="http://schemas.openxmlformats.org/officeDocument/2006/math" xmlns:mc="http://schemas.openxmlformats.org/markup-compatibility/2006" xmlns:mo="http://schemas.microsoft.com/office/mac/office/2008/main" xmlns:mv="urn:schemas-microsoft-com:mac:vml" xmlns:o="urn:schemas-microsoft-com:office:office" xmlns:r="http://schemas.openxmlformats.org/officeDocument/2006/relationships" xmlns:v="urn:schemas-microsoft-com:vml" xmlns:w10="urn:schemas-microsoft-com:office:word" xmlns:w14="http://schemas.microsoft.com/office/word/2010/wordml" xmlns:w="http://schemas.openxmlformats.org/wordprocessingml/2006/main" xmlns:wne="http://schemas.microsoft.com/office/word/2006/wordml" xmlns:wp14="http://schemas.microsoft.com/office/word/2010/wordprocessingDrawing" xmlns:wp="http://schemas.openxmlformats.org/drawingml/2006/wordprocessingDrawing" xmlns:wpc="http://schemas.microsoft.com/office/word/2010/wordprocessingCanvas" xmlns:wpg="http://schemas.microsoft.com/office/word/2010/wordprocessingGroup" xmlns:wpi="http://schemas.microsoft.com/office/word/2010/wordprocessingInk" xmlns:wps="http://schemas.microsoft.com/office/word/2010/wordprocessingShape" mc:Ignorable="w14 wp14">
+  <w:p>
+    <w:pPr>
+      <w:pStyle w:val="Header"/>
+      <w:jc w:val="right"/>
+    </w:pPr>
+    <w:r>
+      <w:rPr>
+        <w:rFonts w:ascii="Calibri" w:hAnsi="Calibri"/>
+        <w:i/>
+        <w:color w:val="444444"/>
+        <w:sz w:val="18"/>
+      </w:rPr>
+      <w:t>7  Say This</w:t>
+    </w:r>
+  </w:p>
+</w:hdr>
+</file>
+
+<file path=word/header9.xml><?xml version="1.0" encoding="utf-8"?>
+<w:hdr xmlns:m="http://schemas.openxmlformats.org/officeDocument/2006/math" xmlns:mc="http://schemas.openxmlformats.org/markup-compatibility/2006" xmlns:mo="http://schemas.microsoft.com/office/mac/office/2008/main" xmlns:mv="urn:schemas-microsoft-com:mac:vml" xmlns:o="urn:schemas-microsoft-com:office:office" xmlns:r="http://schemas.openxmlformats.org/officeDocument/2006/relationships" xmlns:v="urn:schemas-microsoft-com:vml" xmlns:w10="urn:schemas-microsoft-com:office:word" xmlns:w14="http://schemas.microsoft.com/office/word/2010/wordml" xmlns:w="http://schemas.openxmlformats.org/wordprocessingml/2006/main" xmlns:wne="http://schemas.microsoft.com/office/word/2006/wordml" xmlns:wp14="http://schemas.microsoft.com/office/word/2010/wordprocessingDrawing" xmlns:wp="http://schemas.openxmlformats.org/drawingml/2006/wordprocessingDrawing" xmlns:wpc="http://schemas.microsoft.com/office/word/2010/wordprocessingCanvas" xmlns:wpg="http://schemas.microsoft.com/office/word/2010/wordprocessingGroup" xmlns:wpi="http://schemas.microsoft.com/office/word/2010/wordprocessingInk" xmlns:wps="http://schemas.microsoft.com/office/word/2010/wordprocessingShape" mc:Ignorable="w14 wp14">
+  <w:p>
+    <w:pPr>
+      <w:pStyle w:val="Header"/>
+      <w:jc w:val="right"/>
+    </w:pPr>
+    <w:r>
+      <w:rPr>
+        <w:rFonts w:ascii="Calibri" w:hAnsi="Calibri"/>
+        <w:i/>
+        <w:color w:val="444444"/>
+        <w:sz w:val="18"/>
+      </w:rPr>
+      <w:t>8  The Channel Workbook</w:t>
+    </w:r>
+  </w:p>
+</w:hdr>
 </file>
 
 <file path=word/numbering.xml><?xml version="1.0" encoding="utf-8"?>
@@ -10755,7 +10961,7 @@
     <w:pPr>
       <w:keepNext/>
       <w:keepLines/>
-      <w:pageBreakBefore/>
+      <w:pageBreakBefore w:val="0"/>
       <w:spacing w:before="480" w:after="0"/>
       <w:outlineLvl w:val="0"/>
     </w:pPr>
@@ -10780,7 +10986,7 @@
     <w:pPr>
       <w:keepNext/>
       <w:keepLines/>
-      <w:spacing w:before="240" w:after="120"/>
+      <w:spacing w:before="320" w:after="160"/>
       <w:outlineLvl w:val="1"/>
     </w:pPr>
     <w:rPr>
@@ -10788,7 +10994,7 @@
       <w:b/>
       <w:bCs/>
       <w:color w:val="000000"/>
-      <w:sz w:val="28"/>
+      <w:sz w:val="32"/>
       <w:szCs w:val="26"/>
     </w:rPr>
   </w:style>

</xml_diff>

<commit_message>
Save the remaining local manuscript edits so GitHub has this computer's copies.
Co-authored-by: Cursor <cursoragent@cursor.com>
</commit_message>
<xml_diff>
--- a/Your First YouTube Channel That Sells/Your First YouTube Channel That Sells.docx
+++ b/Your First YouTube Channel That Sells/Your First YouTube Channel That Sells.docx
@@ -520,7 +520,7 @@
             <w:color w:val="1F4E79"/>
             <w:u w:val="single"/>
           </w:rPr>
-          <w:t>V. Four people, and the move you can copy</w:t>
+          <w:t>V. Four people, and which move is yours</w:t>
         </w:r>
       </w:hyperlink>
     </w:p>
@@ -1377,6 +1377,19 @@
       </w:r>
     </w:p>
     <w:p>
+      <w:pPr>
+        <w:sectPr>
+          <w:headerReference w:type="default" r:id="rId9"/>
+          <w:footerReference w:type="default" r:id="rId10"/>
+          <w:pgSz w:w="10080" w:h="14400"/>
+          <w:pgMar w:top="1008" w:right="1008" w:bottom="1008" w:left="1008" w:header="504" w:footer="504" w:gutter="0"/>
+          <w:cols w:space="720"/>
+          <w:titlePg/>
+          <w:docGrid w:linePitch="360"/>
+        </w:sectPr>
+      </w:pPr>
+    </w:p>
+    <w:p>
       <w:bookmarkStart w:id="2" w:name="toc1"/>
       <w:pPr>
         <w:pStyle w:val="Heading1"/>
@@ -1674,6 +1687,158 @@
         <w:rPr>
           <w:rFonts w:ascii="Calibri" w:hAnsi="Calibri"/>
         </w:rPr>
+        <w:t>Week one of the calendar builds the page for the shape you picked, and you say that shape’s sentence. One page. One sentence. One shape for ninety days.</w:t>
+      </w:r>
+    </w:p>
+    <w:p>
+      <w:pPr>
+        <w:pStyle w:val="ListBullet"/>
+      </w:pPr>
+      <w:r>
+        <w:rPr>
+          <w:rFonts w:ascii="Calibri" w:hAnsi="Calibri"/>
+          <w:b/>
+        </w:rPr>
+        <w:t>File.</w:t>
+      </w:r>
+      <w:r>
+        <w:rPr>
+          <w:rFonts w:ascii="Calibri" w:hAnsi="Calibri"/>
+        </w:rPr>
+        <w:t xml:space="preserve"> The page names the file, the price, and what is in it. Say: “I made [name]. It costs [price]. Here is the link.”</w:t>
+      </w:r>
+    </w:p>
+    <w:p>
+      <w:pPr>
+        <w:pStyle w:val="ListBullet"/>
+      </w:pPr>
+      <w:r>
+        <w:rPr>
+          <w:rFonts w:ascii="Calibri" w:hAnsi="Calibri"/>
+          <w:b/>
+        </w:rPr>
+        <w:t>Ticket.</w:t>
+      </w:r>
+      <w:r>
+        <w:rPr>
+          <w:rFonts w:ascii="Calibri" w:hAnsi="Calibri"/>
+        </w:rPr>
+        <w:t xml:space="preserve"> The page names the date, the length, and the price. Say: “On [date] I teach [result]. It costs [price]. Here is the link.” After that date, sell the recording as the file, or stop. Do not leave both on the page.</w:t>
+      </w:r>
+    </w:p>
+    <w:p>
+      <w:pPr>
+        <w:pStyle w:val="ListBullet"/>
+      </w:pPr>
+      <w:r>
+        <w:rPr>
+          <w:rFonts w:ascii="Calibri" w:hAnsi="Calibri"/>
+          <w:b/>
+        </w:rPr>
+        <w:t>A thing you ship.</w:t>
+      </w:r>
+      <w:r>
+        <w:rPr>
+          <w:rFonts w:ascii="Calibri" w:hAnsi="Calibri"/>
+        </w:rPr>
+        <w:t xml:space="preserve"> The page names what arrives, how long it takes, and the price, including whether shipping is inside the number. Say: “I will send you [thing]. It costs [price]. Here is the link.”</w:t>
+      </w:r>
+    </w:p>
+    <w:p>
+      <w:pPr>
+        <w:pStyle w:val="ListBullet"/>
+      </w:pPr>
+      <w:r>
+        <w:rPr>
+          <w:rFonts w:ascii="Calibri" w:hAnsi="Calibri"/>
+          <w:b/>
+        </w:rPr>
+        <w:t>License.</w:t>
+      </w:r>
+      <w:r>
+        <w:rPr>
+          <w:rFonts w:ascii="Calibri" w:hAnsi="Calibri"/>
+        </w:rPr>
+        <w:t xml:space="preserve"> The page says what the buyer may do with the clip or the template, and what they may not. Say: “You can use [thing] for [the use you wrote down]. It costs [price]. Here is the link.”</w:t>
+      </w:r>
+    </w:p>
+    <w:p>
+      <w:pPr>
+        <w:pStyle w:val="ListBullet"/>
+      </w:pPr>
+      <w:r>
+        <w:rPr>
+          <w:rFonts w:ascii="Calibri" w:hAnsi="Calibri"/>
+          <w:b/>
+        </w:rPr>
+        <w:t>Call.</w:t>
+      </w:r>
+      <w:r>
+        <w:rPr>
+          <w:rFonts w:ascii="Calibri" w:hAnsi="Calibri"/>
+        </w:rPr>
+        <w:t xml:space="preserve"> The page names the length, the result, and the price. Say: “I will [result] with you for [length]. It costs [price]. Here is the link.”</w:t>
+      </w:r>
+    </w:p>
+    <w:p>
+      <w:pPr>
+        <w:pStyle w:val="ListBullet"/>
+      </w:pPr>
+      <w:r>
+        <w:rPr>
+          <w:rFonts w:ascii="Calibri" w:hAnsi="Calibri"/>
+          <w:b/>
+        </w:rPr>
+        <w:t>One affiliate product.</w:t>
+      </w:r>
+      <w:r>
+        <w:rPr>
+          <w:rFonts w:ascii="Calibri" w:hAnsi="Calibri"/>
+        </w:rPr>
+        <w:t xml:space="preserve"> The page the stranger pays on is the merchant’s. Your sentence carries the disclosure. Say: “I use [product]. This is an affiliate link. The price on their page is [price].”</w:t>
+      </w:r>
+    </w:p>
+    <w:p>
+      <w:pPr>
+        <w:pStyle w:val="ListBullet"/>
+      </w:pPr>
+      <w:r>
+        <w:rPr>
+          <w:rFonts w:ascii="Calibri" w:hAnsi="Calibri"/>
+          <w:b/>
+        </w:rPr>
+        <w:t>Monthly pass.</w:t>
+      </w:r>
+      <w:r>
+        <w:rPr>
+          <w:rFonts w:ascii="Calibri" w:hAnsi="Calibri"/>
+        </w:rPr>
+        <w:t xml:space="preserve"> The page says what arrives each month and when the next charge happens. Say: “Each month you get [thing]. It costs [price] a month. Here is the link. You can cancel before the next charge.”</w:t>
+      </w:r>
+    </w:p>
+    <w:p>
+      <w:pPr>
+        <w:pStyle w:val="ListBullet"/>
+      </w:pPr>
+      <w:r>
+        <w:rPr>
+          <w:rFonts w:ascii="Calibri" w:hAnsi="Calibri"/>
+          <w:b/>
+        </w:rPr>
+        <w:t>One sponsor.</w:t>
+      </w:r>
+      <w:r>
+        <w:rPr>
+          <w:rFonts w:ascii="Calibri" w:hAnsi="Calibri"/>
+        </w:rPr>
+        <w:t xml:space="preserve"> If the sponsor pays you directly, the sentence is the disclosure. Say: “[Sponsor] paid for this video. The link is theirs.” Do not also name your file.</w:t>
+      </w:r>
+    </w:p>
+    <w:p>
+      <w:r>
+        <w:rPr>
+          <w:rFonts w:ascii="Calibri" w:hAnsi="Calibri"/>
+        </w:rPr>
         <w:t>Ad revenue from a platform partner program is not this offer. It can become extra income after the thresholds in the money chapter. It is a slow, uncertain side effect of attention. Do not build the channel as if the badge is the product. A channel with no offer can be popular and still sell nothing you control.</w:t>
       </w:r>
     </w:p>
@@ -1762,6 +1927,14 @@
       </w:r>
     </w:p>
     <w:p>
+      <w:r>
+        <w:rPr>
+          <w:rFonts w:ascii="Calibri" w:hAnsi="Calibri"/>
+        </w:rPr>
+        <w:t>Price the hours as well. Suppose the offer video takes eight hours, and you need those hours to be worth $25 each. The video costs $200 of your time before a sale. At $30 a sale you need seven sales, about 350 views of that video at the 2-in-100 guess, before the time is covered. The $150 call covers those same hours on the second sale. Write your own hours and your own rate on the money sheet. If the file cannot cover the hours, sell the call, or make a shorter video. The 2-in-100 figure stays a placeholder until your own count replaces it.</w:t>
+      </w:r>
+    </w:p>
+    <w:p>
       <w:bookmarkStart w:id="7" w:name="toc6"/>
       <w:pPr>
         <w:pStyle w:val="Heading2"/>
@@ -1808,7 +1981,15 @@
         <w:rPr>
           <w:rFonts w:ascii="Calibri" w:hAnsi="Calibri"/>
         </w:rPr>
-        <w:t>Then buy it yourself. On your phone, open the link the way a stranger will, from the description, not from a bookmark you already trust. Finish the payment or the booking. If the tool allows a refund of that test, refund it. The step where you stalled is the step a buyer will abandon. Do this before the first video.</w:t>
+        <w:t>Then buy it yourself. On your phone, open the link the way a stranger will, from the description, not from a bookmark you already trust.</w:t>
+      </w:r>
+    </w:p>
+    <w:p>
+      <w:r>
+        <w:rPr>
+          <w:rFonts w:ascii="Calibri" w:hAnsi="Calibri"/>
+        </w:rPr>
+        <w:t>Here is the test when it fails. The page says “request a quote.” Or the pay button loads and the form will not take the card. You stop. That stall is the buyer’s stall. Fix the page before you film. If a payment did go through and the tool allows a refund, refund it. The step where you stalled is the step a buyer will abandon. Do this before the first video.</w:t>
       </w:r>
     </w:p>
     <w:p>
@@ -1826,7 +2007,7 @@
         </w:rPr>
         <w:t xml:space="preserve">YouTube also lets a channel publish posts. </w:t>
       </w:r>
-      <w:hyperlink r:id="rId9">
+      <w:hyperlink r:id="rId13">
         <w:r>
           <w:rPr>
             <w:rStyle w:val="Hyperlink"/>
@@ -2023,6 +2204,19 @@
       </w:r>
     </w:p>
     <w:p>
+      <w:pPr>
+        <w:sectPr>
+          <w:headerReference w:type="default" r:id="rId11"/>
+          <w:footerReference w:type="default" r:id="rId12"/>
+          <w:pgSz w:w="10080" w:h="14400"/>
+          <w:pgMar w:top="1008" w:right="1008" w:bottom="1008" w:left="1008" w:header="504" w:footer="504" w:gutter="0"/>
+          <w:cols w:space="720"/>
+          <w:titlePg/>
+          <w:docGrid w:linePitch="360"/>
+        </w:sectPr>
+      </w:pPr>
+    </w:p>
+    <w:p>
       <w:bookmarkStart w:id="10" w:name="toc9"/>
       <w:pPr>
         <w:pStyle w:val="Heading1"/>
@@ -2172,7 +2366,7 @@
         </w:rPr>
         <w:t xml:space="preserve">A title that leads with the hook and buries the keyword reads well and ranks poorly; search does not give credit for personality it cannot parse. Put the keyword first when the two goals conflict. </w:t>
       </w:r>
-      <w:hyperlink r:id="rId10">
+      <w:hyperlink r:id="rId16">
         <w:r>
           <w:rPr>
             <w:rStyle w:val="Hyperlink"/>
@@ -2204,7 +2398,7 @@
         </w:rPr>
         <w:t xml:space="preserve">The thumbnail does not repeat the title. The title carries the keyword. The picture shows the result or the problem. Neither may promise a result the video does not deliver. Where Studio offers a title-and-thumbnail test, </w:t>
       </w:r>
-      <w:hyperlink r:id="rId11">
+      <w:hyperlink r:id="rId17">
         <w:r>
           <w:rPr>
             <w:rStyle w:val="Hyperlink"/>
@@ -2568,7 +2762,7 @@
       </w:r>
     </w:p>
     <w:p>
-      <w:hyperlink r:id="rId12">
+      <w:hyperlink r:id="rId18">
         <w:r>
           <w:rPr>
             <w:rStyle w:val="Hyperlink"/>
@@ -2594,7 +2788,7 @@
       </w:r>
     </w:p>
     <w:p>
-      <w:hyperlink r:id="rId13">
+      <w:hyperlink r:id="rId19">
         <w:r>
           <w:rPr>
             <w:rStyle w:val="Hyperlink"/>
@@ -2820,7 +3014,7 @@
         </w:rPr>
         <w:t xml:space="preserve">YouTube does publish one retention measurement, and it is not a ranking formula. In Studio, open that video’s Analytics and the audience-retention report. The report usually takes one to two days to appear. The intro line is the percentage of viewers still watching after the first 30 seconds. </w:t>
       </w:r>
-      <w:hyperlink r:id="rId14">
+      <w:hyperlink r:id="rId20">
         <w:r>
           <w:rPr>
             <w:rStyle w:val="Hyperlink"/>
@@ -2838,7 +3032,7 @@
       </w:r>
     </w:p>
     <w:p>
-      <w:hyperlink r:id="rId13">
+      <w:hyperlink r:id="rId19">
         <w:r>
           <w:rPr>
             <w:rStyle w:val="Hyperlink"/>
@@ -2856,7 +3050,7 @@
       </w:r>
     </w:p>
     <w:p>
-      <w:hyperlink r:id="rId15">
+      <w:hyperlink r:id="rId21">
         <w:r>
           <w:rPr>
             <w:rStyle w:val="Hyperlink"/>
@@ -2904,7 +3098,7 @@
         <w:rPr>
           <w:rFonts w:ascii="Calibri" w:hAnsi="Calibri"/>
         </w:rPr>
-        <w:t>Connect them in three places. Name the long video as the Short’s related video. Say the destination out loud inside the Short, and show it. A pinned comment on the Short is not a buy link. YouTube’s sharing-links page says a Short’s comments are not clickable. The spoken pointer still matters. Do all three. One of them does not replace the others.</w:t>
+        <w:t>Connect them in three places. Name the long video as the Short’s related video. Say the destination out loud inside the Short, and show it. A pinned comment on the Short is not a buy link. The money chapter has the rule, from YouTube’s own page: a Short’s description and comments are not clickable. The spoken pointer still matters.</w:t>
       </w:r>
     </w:p>
     <w:p>
@@ -2914,7 +3108,7 @@
         </w:rPr>
         <w:t xml:space="preserve">A Short is ranked for a person, not for a format. </w:t>
       </w:r>
-      <w:hyperlink r:id="rId16">
+      <w:hyperlink r:id="rId22">
         <w:r>
           <w:rPr>
             <w:rStyle w:val="Hyperlink"/>
@@ -2938,7 +3132,7 @@
         </w:rPr>
         <w:t xml:space="preserve">In Analytics, open the Content tab and the Shorts chip. </w:t>
       </w:r>
-      <w:hyperlink r:id="rId17">
+      <w:hyperlink r:id="rId23">
         <w:r>
           <w:rPr>
             <w:rStyle w:val="Hyperlink"/>
@@ -2962,7 +3156,7 @@
         </w:rPr>
         <w:t xml:space="preserve">If several videos answer the same buyer’s next question, mark them as a </w:t>
       </w:r>
-      <w:hyperlink r:id="rId18">
+      <w:hyperlink r:id="rId24">
         <w:r>
           <w:rPr>
             <w:rStyle w:val="Hyperlink"/>
@@ -2984,7 +3178,15 @@
         <w:rPr>
           <w:rFonts w:ascii="Calibri" w:hAnsi="Calibri"/>
         </w:rPr>
-        <w:t>Four long videos and six shorts in a month is a load a person can finish. YouTube does not publish it as a quota. One of the four is the offer video. The other three are that buyer’s next questions, not a new subject every Sunday. Posting every week for six months beats a daily plan you drop in week three.</w:t>
+        <w:t>The load you can finish is the eight jobs in the videos chapter. The six-week calendar films those eight. YouTube does not publish that set as a quota. There is not a second month of four long videos and six Shorts sitting on top of them.</w:t>
+      </w:r>
+    </w:p>
+    <w:p>
+      <w:r>
+        <w:rPr>
+          <w:rFonts w:ascii="Calibri" w:hAnsi="Calibri"/>
+        </w:rPr>
+        <w:t>Four of the eight have to be long videos, because a Short cannot carry the link: who it is for, the problem in their words, the method, and the offer. Proof, the comparison, the objection, and the video that names which one to watch next can be long videos too. If the month is short, those four can be Shorts that point at the long video which already did that job. The offer itself is never only a Short. It has to be long enough for a clickable description. Posting a week you can finish beats a daily plan you drop in week three.</w:t>
       </w:r>
     </w:p>
     <w:tbl>
@@ -3156,7 +3358,7 @@
           <w:rFonts w:ascii="Calibri" w:hAnsi="Calibri"/>
           <w:i/>
         </w:rPr>
-        <w:t>Sources: YouTube Studio’s own upload interface (title, description, and tag character limits, and the captions workflow). YouTube’s thumbnail and title tips, its description tips, its title-and-thumbnail test, its audience-retention report, its pages on recommendation signals and on the recommendation system, its Shorts discovery page, its Shorts analytics tips, and its series-playlist settings, each cited in the section where it is used. YouTube’s advertiser-friendly content guidelines for the existence of a sensitive-content category. The “four long videos and six shorts” month is a production load, not a figure YouTube publishes. Confirm the live help pages before you rely on a number.</w:t>
+        <w:t>Sources: YouTube Studio’s own upload interface (title, description, and tag character limits, and the captions workflow). YouTube’s thumbnail and title tips, its description tips, its title-and-thumbnail test, its audience-retention report, its pages on recommendation signals and on the recommendation system, its Shorts discovery page, its Shorts analytics tips, and its series-playlist settings, each cited in the section where it is used. YouTube’s advertiser-friendly content guidelines for the existence of a sensitive-content category. The eight jobs are the production load, spelled out again in the videos chapter and on the six-week calendar. YouTube does not publish that set as a quota. Confirm the live help pages before you rely on a number.</w:t>
       </w:r>
     </w:p>
     <w:p>
@@ -3169,6 +3371,19 @@
       </w:r>
     </w:p>
     <w:p>
+      <w:pPr>
+        <w:sectPr>
+          <w:headerReference w:type="default" r:id="rId14"/>
+          <w:footerReference w:type="default" r:id="rId15"/>
+          <w:pgSz w:w="10080" w:h="14400"/>
+          <w:pgMar w:top="1008" w:right="1008" w:bottom="1008" w:left="1008" w:header="504" w:footer="504" w:gutter="0"/>
+          <w:cols w:space="720"/>
+          <w:titlePg/>
+          <w:docGrid w:linePitch="360"/>
+        </w:sectPr>
+      </w:pPr>
+    </w:p>
+    <w:p>
       <w:bookmarkStart w:id="18" w:name="toc17"/>
       <w:pPr>
         <w:pStyle w:val="Heading1"/>
@@ -3216,7 +3431,31 @@
         <w:rPr>
           <w:rFonts w:ascii="Calibri" w:hAnsi="Calibri"/>
         </w:rPr>
-        <w:t>You are here because the videos in the next chapter have to be cheap enough to finish. The tools are how you make those videos. They are not a second hobby of collecting apps. Make the one video in front of you, with the free tool that does that one job, and read its license before you publish.</w:t>
+        <w:t>You are here because the videos in the next chapter have to be cheap enough to finish. Make the one video in front of you. The tools are how. They are not a second hobby of collecting apps.</w:t>
+      </w:r>
+    </w:p>
+    <w:p>
+      <w:r>
+        <w:rPr>
+          <w:rFonts w:ascii="Calibri" w:hAnsi="Calibri"/>
+        </w:rPr>
+        <w:t xml:space="preserve">The default stack is four things. Your voice, or a text-to-speech voice that is not a clone of someone else. One track from YouTube’s Audio Library. One editor that will export the whole video: </w:t>
+      </w:r>
+      <w:hyperlink r:id="rId27">
+        <w:r>
+          <w:rPr>
+            <w:rStyle w:val="Hyperlink"/>
+            <w:sz w:val="22"/>
+            <w:rFonts w:ascii="Calibri" w:hAnsi="Calibri"/>
+          </w:rPr>
+          <w:t xml:space="preserve">CapCut</w:t>
+        </w:r>
+      </w:hyperlink>
+      <w:r>
+        <w:rPr>
+          <w:rFonts w:ascii="Calibri" w:hAnsi="Calibri"/>
+        </w:rPr>
+        <w:t xml:space="preserve"> is enough. Footage you filmed, drew, or photographed, or one stock clip after you have read that clip’s license. Finish with that stack. The rest of this chapter is what to open when the stack cannot make the shot. Read the license before you publish.</w:t>
       </w:r>
     </w:p>
     <w:p>
@@ -3239,7 +3478,7 @@
                     <pic:cNvPicPr/>
                   </pic:nvPicPr>
                   <pic:blipFill>
-                    <a:blip r:embed="rId19"/>
+                    <a:blip r:embed="rId28"/>
                     <a:stretch>
                       <a:fillRect/>
                     </a:stretch>
@@ -3282,14 +3521,14 @@
         <w:rPr>
           <w:rFonts w:ascii="Calibri" w:hAnsi="Calibri"/>
         </w:rPr>
-        <w:t>Describe a shot. A text-to-video tool gives you a few seconds that did not exist an hour ago. Use one tool for the shot in front of you.</w:t>
+        <w:t>Describe a shot. A text-to-video tool gives you a few seconds that did not exist an hour ago. Use one tool for the shot the default stack cannot film, then stop.</w:t>
       </w:r>
     </w:p>
     <w:p>
       <w:pPr>
         <w:pStyle w:val="ListBullet"/>
       </w:pPr>
-      <w:hyperlink r:id="rId20">
+      <w:hyperlink r:id="rId29">
         <w:r>
           <w:rPr>
             <w:rStyle w:val="Hyperlink"/>
@@ -3310,29 +3549,76 @@
       <w:pPr>
         <w:pStyle w:val="ListBullet"/>
       </w:pPr>
-      <w:r>
-        <w:rPr>
-          <w:rFonts w:ascii="Calibri" w:hAnsi="Calibri"/>
-        </w:rPr>
-        <w:t>InVideo, Media.io, VEED, and Magic Hour do that job in a browser. Magic Hour also offers face swap, a talking head from one photo, lip sync, and restyling. A face you did not film is someone else’s face. Section VI is the check.</w:t>
+      <w:hyperlink r:id="rId30">
+        <w:r>
+          <w:rPr>
+            <w:rStyle w:val="Hyperlink"/>
+            <w:sz w:val="22"/>
+            <w:rFonts w:ascii="Calibri" w:hAnsi="Calibri"/>
+          </w:rPr>
+          <w:t xml:space="preserve">InVideo</w:t>
+        </w:r>
+      </w:hyperlink>
+      <w:r>
+        <w:rPr>
+          <w:rFonts w:ascii="Calibri" w:hAnsi="Calibri"/>
+        </w:rPr>
+        <w:t xml:space="preserve">, </w:t>
+      </w:r>
+      <w:hyperlink r:id="rId31">
+        <w:r>
+          <w:rPr>
+            <w:rStyle w:val="Hyperlink"/>
+            <w:sz w:val="22"/>
+            <w:rFonts w:ascii="Calibri" w:hAnsi="Calibri"/>
+          </w:rPr>
+          <w:t xml:space="preserve">Media.io</w:t>
+        </w:r>
+      </w:hyperlink>
+      <w:r>
+        <w:rPr>
+          <w:rFonts w:ascii="Calibri" w:hAnsi="Calibri"/>
+        </w:rPr>
+        <w:t xml:space="preserve">, </w:t>
+      </w:r>
+      <w:hyperlink r:id="rId32">
+        <w:r>
+          <w:rPr>
+            <w:rStyle w:val="Hyperlink"/>
+            <w:sz w:val="22"/>
+            <w:rFonts w:ascii="Calibri" w:hAnsi="Calibri"/>
+          </w:rPr>
+          <w:t xml:space="preserve">VEED</w:t>
+        </w:r>
+      </w:hyperlink>
+      <w:r>
+        <w:rPr>
+          <w:rFonts w:ascii="Calibri" w:hAnsi="Calibri"/>
+        </w:rPr>
+        <w:t xml:space="preserve">, and </w:t>
+      </w:r>
+      <w:hyperlink r:id="rId33">
+        <w:r>
+          <w:rPr>
+            <w:rStyle w:val="Hyperlink"/>
+            <w:sz w:val="22"/>
+            <w:rFonts w:ascii="Calibri" w:hAnsi="Calibri"/>
+          </w:rPr>
+          <w:t xml:space="preserve">Magic Hour</w:t>
+        </w:r>
+      </w:hyperlink>
+      <w:r>
+        <w:rPr>
+          <w:rFonts w:ascii="Calibri" w:hAnsi="Calibri"/>
+        </w:rPr>
+        <w:t xml:space="preserve"> do that job in a browser.</w:t>
       </w:r>
     </w:p>
     <w:p>
       <w:pPr>
         <w:pStyle w:val="ListBullet"/>
       </w:pPr>
-      <w:r>
-        <w:rPr>
-          <w:rFonts w:ascii="Calibri" w:hAnsi="Calibri"/>
-        </w:rPr>
-        <w:t>Remaker and Deepswap are built around face swap. Same check.</w:t>
-      </w:r>
-    </w:p>
-    <w:p>
-      <w:pPr>
-        <w:pStyle w:val="ListBullet"/>
-      </w:pPr>
-      <w:hyperlink r:id="rId21">
+      <w:hyperlink r:id="rId34">
         <w:r>
           <w:rPr>
             <w:rStyle w:val="Hyperlink"/>
@@ -3346,7 +3632,23 @@
         <w:rPr>
           <w:rFonts w:ascii="Calibri" w:hAnsi="Calibri"/>
         </w:rPr>
-        <w:t xml:space="preserve"> and Synthesys put a generated presenter on screen from a script. Use one when the video needs a person at a desk and you are not filming yourself.</w:t>
+        <w:t xml:space="preserve"> and </w:t>
+      </w:r>
+      <w:hyperlink r:id="rId35">
+        <w:r>
+          <w:rPr>
+            <w:rStyle w:val="Hyperlink"/>
+            <w:sz w:val="22"/>
+            <w:rFonts w:ascii="Calibri" w:hAnsi="Calibri"/>
+          </w:rPr>
+          <w:t xml:space="preserve">Synthesys</w:t>
+        </w:r>
+      </w:hyperlink>
+      <w:r>
+        <w:rPr>
+          <w:rFonts w:ascii="Calibri" w:hAnsi="Calibri"/>
+        </w:rPr>
+        <w:t xml:space="preserve"> put a generated presenter on screen from a script, when the video needs a person at a desk and you are not filming yourself.</w:t>
       </w:r>
     </w:p>
     <w:p>
@@ -3511,7 +3813,7 @@
                 <w:sz w:val="21"/>
               </w:rPr>
             </w:r>
-            <w:hyperlink r:id="rId22">
+            <w:hyperlink r:id="rId36">
               <w:r>
                 <w:rPr>
                   <w:rStyle w:val="Hyperlink"/>
@@ -3588,7 +3890,7 @@
                 <w:sz w:val="21"/>
               </w:rPr>
             </w:r>
-            <w:hyperlink r:id="rId23">
+            <w:hyperlink r:id="rId37">
               <w:r>
                 <w:rPr>
                   <w:rStyle w:val="Hyperlink"/>
@@ -3665,7 +3967,7 @@
                 <w:sz w:val="21"/>
               </w:rPr>
             </w:r>
-            <w:hyperlink r:id="rId24">
+            <w:hyperlink r:id="rId38">
               <w:r>
                 <w:rPr>
                   <w:rStyle w:val="Hyperlink"/>
@@ -3742,7 +4044,7 @@
                 <w:sz w:val="21"/>
               </w:rPr>
             </w:r>
-            <w:hyperlink r:id="rId25">
+            <w:hyperlink r:id="rId39">
               <w:r>
                 <w:rPr>
                   <w:rStyle w:val="Hyperlink"/>
@@ -3819,7 +4121,7 @@
                 <w:sz w:val="21"/>
               </w:rPr>
             </w:r>
-            <w:hyperlink r:id="rId26">
+            <w:hyperlink r:id="rId40">
               <w:r>
                 <w:rPr>
                   <w:rStyle w:val="Hyperlink"/>
@@ -3896,7 +4198,7 @@
                 <w:sz w:val="21"/>
               </w:rPr>
             </w:r>
-            <w:hyperlink r:id="rId27">
+            <w:hyperlink r:id="rId41">
               <w:r>
                 <w:rPr>
                   <w:rStyle w:val="Hyperlink"/>
@@ -3973,7 +4275,7 @@
                 <w:sz w:val="21"/>
               </w:rPr>
             </w:r>
-            <w:hyperlink r:id="rId28">
+            <w:hyperlink r:id="rId42">
               <w:r>
                 <w:rPr>
                   <w:rStyle w:val="Hyperlink"/>
@@ -4050,7 +4352,7 @@
                 <w:sz w:val="21"/>
               </w:rPr>
             </w:r>
-            <w:hyperlink r:id="rId29">
+            <w:hyperlink r:id="rId43">
               <w:r>
                 <w:rPr>
                   <w:rStyle w:val="Hyperlink"/>
@@ -4127,7 +4429,7 @@
                 <w:sz w:val="21"/>
               </w:rPr>
             </w:r>
-            <w:hyperlink r:id="rId30">
+            <w:hyperlink r:id="rId44">
               <w:r>
                 <w:rPr>
                   <w:rStyle w:val="Hyperlink"/>
@@ -4204,7 +4506,7 @@
                 <w:sz w:val="21"/>
               </w:rPr>
             </w:r>
-            <w:hyperlink r:id="rId31">
+            <w:hyperlink r:id="rId45">
               <w:r>
                 <w:rPr>
                   <w:rStyle w:val="Hyperlink"/>
@@ -4281,7 +4583,7 @@
                 <w:sz w:val="21"/>
               </w:rPr>
             </w:r>
-            <w:hyperlink r:id="rId32">
+            <w:hyperlink r:id="rId46">
               <w:r>
                 <w:rPr>
                   <w:rStyle w:val="Hyperlink"/>
@@ -4298,7 +4600,7 @@
               </w:rPr>
               <w:t xml:space="preserve"> / </w:t>
             </w:r>
-            <w:hyperlink r:id="rId33">
+            <w:hyperlink r:id="rId47">
               <w:r>
                 <w:rPr>
                   <w:rStyle w:val="Hyperlink"/>
@@ -4362,7 +4664,7 @@
     </w:tbl>
     <w:p/>
     <w:p>
-      <w:hyperlink r:id="rId34">
+      <w:hyperlink r:id="rId48">
         <w:r>
           <w:rPr>
             <w:rStyle w:val="Hyperlink"/>
@@ -4417,7 +4719,7 @@
         </w:rPr>
         <w:t xml:space="preserve">. </w:t>
       </w:r>
-      <w:hyperlink r:id="rId35">
+      <w:hyperlink r:id="rId49">
         <w:r>
           <w:rPr>
             <w:rStyle w:val="Hyperlink"/>
@@ -4433,7 +4735,7 @@
         </w:rPr>
         <w:t xml:space="preserve"> says it lives in YouTube Studio, on the left menu as Audio library, and also at </w:t>
       </w:r>
-      <w:hyperlink r:id="rId36">
+      <w:hyperlink r:id="rId50">
         <w:r>
           <w:rPr>
             <w:rStyle w:val="Hyperlink"/>
@@ -4457,7 +4759,7 @@
         </w:rPr>
         <w:t xml:space="preserve">Beyond it: </w:t>
       </w:r>
-      <w:hyperlink r:id="rId37">
+      <w:hyperlink r:id="rId51">
         <w:r>
           <w:rPr>
             <w:rStyle w:val="Hyperlink"/>
@@ -4473,7 +4775,7 @@
         </w:rPr>
         <w:t xml:space="preserve"> and </w:t>
       </w:r>
-      <w:hyperlink r:id="rId38">
+      <w:hyperlink r:id="rId52">
         <w:r>
           <w:rPr>
             <w:rStyle w:val="Hyperlink"/>
@@ -4489,7 +4791,7 @@
         </w:rPr>
         <w:t xml:space="preserve"> are free with no attribution required, the latter because its tracks are public domain outright. Sites built around a specific composer’s catalog, like Incompetech, or a named creator’s free tier, like Bensound, commonly require crediting that person by name in the video description even when the track itself costs nothing — read the attribution wording on the specific track, not just its price. For a sound effect that is not in that tab, </w:t>
       </w:r>
-      <w:hyperlink r:id="rId39">
+      <w:hyperlink r:id="rId53">
         <w:r>
           <w:rPr>
             <w:rStyle w:val="Hyperlink"/>
@@ -4505,7 +4807,7 @@
         </w:rPr>
         <w:t xml:space="preserve"> is one library of effects; read its license the same way you read a stock clip’s. </w:t>
       </w:r>
-      <w:hyperlink r:id="rId40">
+      <w:hyperlink r:id="rId54">
         <w:r>
           <w:rPr>
             <w:rStyle w:val="Hyperlink"/>
@@ -4523,7 +4825,7 @@
       </w:r>
     </w:p>
     <w:p>
-      <w:hyperlink r:id="rId41">
+      <w:hyperlink r:id="rId55">
         <w:r>
           <w:rPr>
             <w:rStyle w:val="Hyperlink"/>
@@ -4539,7 +4841,7 @@
         </w:rPr>
         <w:t xml:space="preserve"> clears its free tracks for monetized use if you keep a one-line credit, unless you pay to drop the credit. </w:t>
       </w:r>
-      <w:hyperlink r:id="rId42">
+      <w:hyperlink r:id="rId56">
         <w:r>
           <w:rPr>
             <w:rStyle w:val="Hyperlink"/>
@@ -4555,7 +4857,7 @@
         </w:rPr>
         <w:t xml:space="preserve"> hosts independent artists. Filter for the Creative Commons tracks. The rest of that library is not yours to use. </w:t>
       </w:r>
-      <w:hyperlink r:id="rId43">
+      <w:hyperlink r:id="rId57">
         <w:r>
           <w:rPr>
             <w:rStyle w:val="Hyperlink"/>
@@ -4587,7 +4889,7 @@
         </w:rPr>
         <w:t xml:space="preserve">A full song with vocals is a different job. </w:t>
       </w:r>
-      <w:hyperlink r:id="rId44">
+      <w:hyperlink r:id="rId58">
         <w:r>
           <w:rPr>
             <w:rStyle w:val="Hyperlink"/>
@@ -4603,7 +4905,7 @@
         </w:rPr>
         <w:t xml:space="preserve"> and </w:t>
       </w:r>
-      <w:hyperlink r:id="rId45">
+      <w:hyperlink r:id="rId59">
         <w:r>
           <w:rPr>
             <w:rStyle w:val="Hyperlink"/>
@@ -4647,7 +4949,7 @@
       <w:bookmarkEnd w:id="22"/>
     </w:p>
     <w:p>
-      <w:hyperlink r:id="rId46">
+      <w:hyperlink r:id="rId60">
         <w:r>
           <w:rPr>
             <w:rStyle w:val="Hyperlink"/>
@@ -4663,7 +4965,7 @@
         </w:rPr>
         <w:t xml:space="preserve"> and </w:t>
       </w:r>
-      <w:hyperlink r:id="rId47">
+      <w:hyperlink r:id="rId61">
         <w:r>
           <w:rPr>
             <w:rStyle w:val="Hyperlink"/>
@@ -4685,7 +4987,55 @@
         <w:rPr>
           <w:rFonts w:ascii="Calibri" w:hAnsi="Calibri"/>
         </w:rPr>
-        <w:t>ElevenLabs is the name creators most often call the most natural, as of this writing. Its free tier covers several short scripts a month. That reputation is creator talk. Listen to a sample on its own page before you pick it. NaturalReader and Speechify do the same job more simply. The voice sounds less natural. If your editor already speaks a script from the timeline, try that first. It skips a second export.</w:t>
+        <w:t xml:space="preserve">ElevenLabs is the name creators most often call the most natural, as of this writing. Its free tier covers several short scripts a month. That reputation is creator talk. Listen to a sample on </w:t>
+      </w:r>
+      <w:hyperlink r:id="rId62">
+        <w:r>
+          <w:rPr>
+            <w:rStyle w:val="Hyperlink"/>
+            <w:sz w:val="22"/>
+            <w:rFonts w:ascii="Calibri" w:hAnsi="Calibri"/>
+          </w:rPr>
+          <w:t xml:space="preserve">its own page</w:t>
+        </w:r>
+      </w:hyperlink>
+      <w:r>
+        <w:rPr>
+          <w:rFonts w:ascii="Calibri" w:hAnsi="Calibri"/>
+        </w:rPr>
+        <w:t xml:space="preserve"> before you pick it. </w:t>
+      </w:r>
+      <w:hyperlink r:id="rId63">
+        <w:r>
+          <w:rPr>
+            <w:rStyle w:val="Hyperlink"/>
+            <w:sz w:val="22"/>
+            <w:rFonts w:ascii="Calibri" w:hAnsi="Calibri"/>
+          </w:rPr>
+          <w:t xml:space="preserve">NaturalReader</w:t>
+        </w:r>
+      </w:hyperlink>
+      <w:r>
+        <w:rPr>
+          <w:rFonts w:ascii="Calibri" w:hAnsi="Calibri"/>
+        </w:rPr>
+        <w:t xml:space="preserve"> and </w:t>
+      </w:r>
+      <w:hyperlink r:id="rId64">
+        <w:r>
+          <w:rPr>
+            <w:rStyle w:val="Hyperlink"/>
+            <w:sz w:val="22"/>
+            <w:rFonts w:ascii="Calibri" w:hAnsi="Calibri"/>
+          </w:rPr>
+          <w:t xml:space="preserve">Speechify</w:t>
+        </w:r>
+      </w:hyperlink>
+      <w:r>
+        <w:rPr>
+          <w:rFonts w:ascii="Calibri" w:hAnsi="Calibri"/>
+        </w:rPr>
+        <w:t xml:space="preserve"> do the same job more simply. The voice sounds less natural. If your editor already speaks a script from the timeline, try that first. It skips a second export.</w:t>
       </w:r>
     </w:p>
     <w:p>
@@ -4727,9 +5077,9 @@
         <w:rPr>
           <w:rFonts w:ascii="Calibri" w:hAnsi="Calibri"/>
         </w:rPr>
-        <w:t xml:space="preserve">Trimming, a vertical frame, a join, a burned-in caption, and a format YouTube will take: a browser editor can do those at no cost. 123apps, EZGIF, Clideo, and </w:t>
-      </w:r>
-      <w:hyperlink r:id="rId48">
+        <w:t xml:space="preserve">Trimming, a vertical frame, a join, a burned-in caption, and a format YouTube will take: one browser editor can do those at no cost. </w:t>
+      </w:r>
+      <w:hyperlink r:id="rId27">
         <w:r>
           <w:rPr>
             <w:rStyle w:val="Hyperlink"/>
@@ -4743,9 +5093,57 @@
         <w:rPr>
           <w:rFonts w:ascii="Calibri" w:hAnsi="Calibri"/>
         </w:rPr>
-        <w:t xml:space="preserve"> each bundle most of them. </w:t>
-      </w:r>
-      <w:hyperlink r:id="rId49">
+        <w:t xml:space="preserve"> is the default. </w:t>
+      </w:r>
+      <w:hyperlink r:id="rId65">
+        <w:r>
+          <w:rPr>
+            <w:rStyle w:val="Hyperlink"/>
+            <w:sz w:val="22"/>
+            <w:rFonts w:ascii="Calibri" w:hAnsi="Calibri"/>
+          </w:rPr>
+          <w:t xml:space="preserve">123apps</w:t>
+        </w:r>
+      </w:hyperlink>
+      <w:r>
+        <w:rPr>
+          <w:rFonts w:ascii="Calibri" w:hAnsi="Calibri"/>
+        </w:rPr>
+        <w:t xml:space="preserve">, </w:t>
+      </w:r>
+      <w:hyperlink r:id="rId66">
+        <w:r>
+          <w:rPr>
+            <w:rStyle w:val="Hyperlink"/>
+            <w:sz w:val="22"/>
+            <w:rFonts w:ascii="Calibri" w:hAnsi="Calibri"/>
+          </w:rPr>
+          <w:t xml:space="preserve">EZGIF</w:t>
+        </w:r>
+      </w:hyperlink>
+      <w:r>
+        <w:rPr>
+          <w:rFonts w:ascii="Calibri" w:hAnsi="Calibri"/>
+        </w:rPr>
+        <w:t xml:space="preserve">, and </w:t>
+      </w:r>
+      <w:hyperlink r:id="rId67">
+        <w:r>
+          <w:rPr>
+            <w:rStyle w:val="Hyperlink"/>
+            <w:sz w:val="22"/>
+            <w:rFonts w:ascii="Calibri" w:hAnsi="Calibri"/>
+          </w:rPr>
+          <w:t xml:space="preserve">Clideo</w:t>
+        </w:r>
+      </w:hyperlink>
+      <w:r>
+        <w:rPr>
+          <w:rFonts w:ascii="Calibri" w:hAnsi="Calibri"/>
+        </w:rPr>
+        <w:t xml:space="preserve"> cover a single job when CapCut will not. </w:t>
+      </w:r>
+      <w:hyperlink r:id="rId68">
         <w:r>
           <w:rPr>
             <w:rStyle w:val="Hyperlink"/>
@@ -4759,7 +5157,23 @@
         <w:rPr>
           <w:rFonts w:ascii="Calibri" w:hAnsi="Calibri"/>
         </w:rPr>
-        <w:t xml:space="preserve"> is enough when all you need is a trim. cloudconvert.com turns one file format into another when the editor’s export list does not include the one you need.</w:t>
+        <w:t xml:space="preserve"> is enough when all you need is a trim. </w:t>
+      </w:r>
+      <w:hyperlink r:id="rId69">
+        <w:r>
+          <w:rPr>
+            <w:rStyle w:val="Hyperlink"/>
+            <w:sz w:val="22"/>
+            <w:rFonts w:ascii="Calibri" w:hAnsi="Calibri"/>
+          </w:rPr>
+          <w:t xml:space="preserve">CloudConvert</w:t>
+        </w:r>
+      </w:hyperlink>
+      <w:r>
+        <w:rPr>
+          <w:rFonts w:ascii="Calibri" w:hAnsi="Calibri"/>
+        </w:rPr>
+        <w:t xml:space="preserve"> turns one file format into another when the editor’s export list does not include the one you need.</w:t>
       </w:r>
     </w:p>
     <w:p>
@@ -4777,7 +5191,7 @@
         </w:rPr>
         <w:t xml:space="preserve">Underneath nearly all of these, doing the actual video processing, is </w:t>
       </w:r>
-      <w:hyperlink r:id="rId50">
+      <w:hyperlink r:id="rId70">
         <w:r>
           <w:rPr>
             <w:rStyle w:val="Hyperlink"/>
@@ -4814,7 +5228,7 @@
         </w:rPr>
         <w:t xml:space="preserve">Whatever tool does the final export, match </w:t>
       </w:r>
-      <w:hyperlink r:id="rId51">
+      <w:hyperlink r:id="rId71">
         <w:r>
           <w:rPr>
             <w:rStyle w:val="Hyperlink"/>
@@ -4871,6 +5285,14 @@
           <w:rFonts w:ascii="Calibri" w:hAnsi="Calibri"/>
         </w:rPr>
         <w:t>Before you post the same file on another site, read the license for that site. A grant that names YouTube does not automatically name every other logo. If the license is silent, do not post the file there.</w:t>
+      </w:r>
+    </w:p>
+    <w:p>
+      <w:r>
+        <w:rPr>
+          <w:rFonts w:ascii="Calibri" w:hAnsi="Calibri"/>
+        </w:rPr>
+        <w:t>A face swap, or a voice cloned from someone else, fails this check unless that person has agreed in writing. The tool’s terms do not supply that agreement. Do not build the video around either one.</w:t>
       </w:r>
     </w:p>
     <w:tbl>
@@ -5033,6 +5455,19 @@
       </w:r>
     </w:p>
     <w:p>
+      <w:pPr>
+        <w:sectPr>
+          <w:headerReference w:type="default" r:id="rId25"/>
+          <w:footerReference w:type="default" r:id="rId26"/>
+          <w:pgSz w:w="10080" w:h="14400"/>
+          <w:pgMar w:top="1008" w:right="1008" w:bottom="1008" w:left="1008" w:header="504" w:footer="504" w:gutter="0"/>
+          <w:cols w:space="720"/>
+          <w:titlePg/>
+          <w:docGrid w:linePitch="360"/>
+        </w:sectPr>
+      </w:pPr>
+    </w:p>
+    <w:p>
       <w:bookmarkStart w:id="26" w:name="toc25"/>
       <w:pPr>
         <w:pStyle w:val="Heading1"/>
@@ -5090,7 +5525,15 @@
         <w:rPr>
           <w:rFonts w:ascii="Calibri" w:hAnsi="Calibri"/>
         </w:rPr>
-        <w:t>Jobs that sell, used in this order:</w:t>
+        <w:t>The order is the buyer’s order. They have to recognize themselves before a method is worth hearing. They have to see the method before proof means anything. They have to see proof before a comparison is a choice. They have to hear the comparison and the one objection before the price is a decision. The last video names the path, so the set is not a feed.</w:t>
+      </w:r>
+    </w:p>
+    <w:p>
+      <w:r>
+        <w:rPr>
+          <w:rFonts w:ascii="Calibri" w:hAnsi="Calibri"/>
+        </w:rPr>
+        <w:t>Jobs that sell, in that order:</w:t>
       </w:r>
     </w:p>
     <w:p>
@@ -5244,7 +5687,7 @@
         <w:rPr>
           <w:rFonts w:ascii="Calibri" w:hAnsi="Calibri"/>
         </w:rPr>
-        <w:t xml:space="preserve"> The twenty-second version from the offer chapter, filmed as its own short video and also spoken once at the end of the others.</w:t>
+        <w:t xml:space="preserve"> The twenty-second version from the offer chapter, filmed as a brief video, long enough for a clickable description, and also spoken once at the end of the others. A YouTube Short cannot be this video. Its description is not a checkout.</w:t>
       </w:r>
     </w:p>
     <w:p>
@@ -5274,7 +5717,7 @@
         <w:rPr>
           <w:rFonts w:ascii="Calibri" w:hAnsi="Calibri"/>
         </w:rPr>
-        <w:t>That is the first eight. You may post shorts that point at these. You do not need a ninth idea until these eight exist and the offer link has been clicked by someone who is not you.</w:t>
+        <w:t>That is the first eight, and it is the only production load in this book. The click chapter uses the same eight. So does the six-week calendar. A Short may point at one of them. It does not add a second quota. You do not need a ninth idea until these eight exist and the offer link has been clicked by someone who is not you.</w:t>
       </w:r>
     </w:p>
     <w:p>
@@ -5344,7 +5787,7 @@
         <w:rPr>
           <w:rFonts w:ascii="Calibri" w:hAnsi="Calibri"/>
         </w:rPr>
-        <w:t>Eight finished videos aimed at one offer beat forty videos aimed at “the algorithm.” The posting rhythm in the click chapter is a floor for staying visible, not an order to invent topics. If you can publish one of the eight a week, publish one of the eight a week. If a week is too fast to keep the teaching accurate, slow down. A wrong video that contradicts the offer does more damage than a quiet week.</w:t>
+        <w:t>Eight finished videos aimed at one offer beat forty videos aimed at a posting streak. If you can publish one of the eight a week, do that. If a week is too fast to keep the teaching accurate, slow down. A wrong video that contradicts the offer does more damage than a quiet week.</w:t>
       </w:r>
     </w:p>
     <w:p>
@@ -5361,7 +5804,7 @@
         <w:pStyle w:val="Heading2"/>
       </w:pPr>
       <w:r>
-        <w:t>V. Four people, and the move you can copy</w:t>
+        <w:t>V. Four people, and which move is yours</w:t>
       </w:r>
       <w:bookmarkEnd w:id="31"/>
     </w:p>
@@ -5370,47 +5813,23 @@
         <w:rPr>
           <w:rFonts w:ascii="Calibri" w:hAnsi="Calibri"/>
         </w:rPr>
-        <w:t>These are not income promises. They are the early repeat, in the person’s own interviews. Copy the repeat. The later studio is not the lesson.</w:t>
-      </w:r>
-    </w:p>
-    <w:p>
-      <w:r>
-        <w:rPr>
-          <w:rFonts w:ascii="Calibri" w:hAnsi="Calibri"/>
-        </w:rPr>
-        <w:t>Marques Brownlee told The Verge he bought a laptop after watching reviews, found details those reviews had skipped, and turned on a webcam so the next buyer would not miss them. The video he counts as the start was about one accessory that came in the box. On Recode he described posting about Safari for Windows the day it was available, and waking up to on the order of 6,000 views when his other videos were not doing that. In the same interview he told people who ask which camera to buy to start with the gear they already have. A better camera did not make the first video. A buyer’s missing detail did.</w:t>
-      </w:r>
-    </w:p>
-    <w:p>
-      <w:r>
-        <w:rPr>
-          <w:rFonts w:ascii="Calibri" w:hAnsi="Calibri"/>
-        </w:rPr>
-        <w:t>Andrew Rea told Mashed the first Binging with Babish video was a one-off: a burger from a Parks and Recreation episode, filmed because he wanted to know what it tasted like. He had not planned a series. He kept going because he wanted to edit the next one the same night. He later added Basics with Babish, which taught ordinary technique instead of only the stunt recipe, and he published a cookbook of food from the videos. The free videos were the method. The book was the thing a stranger could buy.</w:t>
-      </w:r>
-    </w:p>
-    <w:p>
-      <w:r>
-        <w:rPr>
-          <w:rFonts w:ascii="Calibri" w:hAnsi="Calibri"/>
-        </w:rPr>
-        <w:t>Ali Abdaal told Mixergy he made a short course on editing, on someone else’s platform, in about a day, and it kept selling after he stopped promoting it. He then made his own course, because leaving the income on a platform he did not control felt fragile. The YouTube video stayed the piece he wanted to make. The other posts were cut from it.</w:t>
-      </w:r>
-    </w:p>
-    <w:p>
-      <w:r>
-        <w:rPr>
-          <w:rFonts w:ascii="Calibri" w:hAnsi="Calibri"/>
-        </w:rPr>
-        <w:t>Hannah Hart told The Verge the first year of her channel was a webcam, with the laptop on a stack of books. She recorded in Photo Booth and cut the video in iMovie. She said the first episode reached about 80,000 views, and that she was still filming without a crew years later. The Verge’s introduction notes that she later published a cookbook and, by that interview, a memoir. The early move is one video with the gear already on the desk. The books are the thing a stranger could buy. The later audience is not the lesson.</w:t>
-      </w:r>
-    </w:p>
-    <w:p>
-      <w:r>
-        <w:rPr>
-          <w:rFonts w:ascii="Calibri" w:hAnsi="Calibri"/>
-        </w:rPr>
-        <w:t>What you can copy is the early move, and only that. Brownlee filmed one missing detail a buyer would have wanted, on a webcam. Rea filmed one recipe he wanted to taste, and a cookbook came later. Abdaal sold a short course, then moved that sale onto something he controlled. Hart’s first year was a laptop on a stack of books, and the books a stranger could buy came after. None of that is this chapter’s eight-video set. The set is the method here. Their later studios, audiences, and income are not evidence the set works, and they are not a reason to wait for a studio before the offer exists.</w:t>
+        <w:t>These interviews are not income promises. They are not proof that the eight jobs work. Three of them are the path this book declines.</w:t>
+      </w:r>
+    </w:p>
+    <w:p>
+      <w:r>
+        <w:rPr>
+          <w:rFonts w:ascii="Calibri" w:hAnsi="Calibri"/>
+        </w:rPr>
+        <w:t>Marques Brownlee told The Verge he turned on a webcam so the next laptop buyer would not miss a detail the reviews had skipped. On Recode he told people who ask which camera to buy to start with the gear they already have, and he recalled a Safari-for-Windows video reaching on the order of 6,000 views. Andrew Rea told Mashed the first video was one burger he wanted to taste. A cookbook of the recipes came later. Hannah Hart told The Verge the first year was a webcam, the laptop on a stack of books, recorded in Photo Booth and cut in iMovie. She said the first episode reached about 80,000 views, and that she was still filming without a crew years later. The Verge’s introduction notes a cookbook and, by that interview, a memoir. Those products came after the audience. Film first, price later, is the order this book refuses. The page and the price come before the second video.</w:t>
+      </w:r>
+    </w:p>
+    <w:p>
+      <w:r>
+        <w:rPr>
+          <w:rFonts w:ascii="Calibri" w:hAnsi="Calibri"/>
+        </w:rPr>
+        <w:t>Ali Abdaal told Mixergy he made a short editing course, on someone else’s platform, in about a day, and it kept selling after he stopped promoting it. He then moved that sale onto a course he controlled, because leaving the income on a platform he did not own felt fragile. That is the move this book keeps: a price, on a page you control, while the videos are still small. His later audience is not the lesson. The eight jobs are the method. A studio is not a reason to wait for one.</w:t>
       </w:r>
     </w:p>
     <w:p>
@@ -5550,7 +5969,7 @@
         <w:rPr>
           <w:rFonts w:ascii="Calibri" w:hAnsi="Calibri"/>
         </w:rPr>
-        <w:t>That you need the studio those channels have now. Brownlee started on a webcam. Hart’s first year was a laptop on a stack of books. Rea started with one recipe he wanted to taste. The gear came after the repeat.</w:t>
+        <w:t>That you need the studio those channels have now. Brownlee, Rea, and Hart filmed with what was on the desk, and the product came after the audience. This book keeps Abdaal’s move instead: a price on a page you control, before the second video. The gear can be the gear you have. The missing price cannot.</w:t>
       </w:r>
     </w:p>
     <w:p>
@@ -5571,6 +5990,19 @@
       </w:r>
     </w:p>
     <w:p>
+      <w:pPr>
+        <w:sectPr>
+          <w:headerReference w:type="default" r:id="rId72"/>
+          <w:footerReference w:type="default" r:id="rId73"/>
+          <w:pgSz w:w="10080" w:h="14400"/>
+          <w:pgMar w:top="1008" w:right="1008" w:bottom="1008" w:left="1008" w:header="504" w:footer="504" w:gutter="0"/>
+          <w:cols w:space="720"/>
+          <w:titlePg/>
+          <w:docGrid w:linePitch="360"/>
+        </w:sectPr>
+      </w:pPr>
+    </w:p>
+    <w:p>
       <w:bookmarkStart w:id="34" w:name="toc33"/>
       <w:pPr>
         <w:pStyle w:val="Heading1"/>
@@ -5622,7 +6054,7 @@
         </w:rPr>
         <w:t xml:space="preserve">YouTube pays through two gates, and neither one is the first money. The offer in chapter 1 can pay on a sale before either gate opens. YouTube’s own ads on your videos, before you are accepted, are not your revenue. </w:t>
       </w:r>
-      <w:hyperlink r:id="rId52">
+      <w:hyperlink r:id="rId76">
         <w:r>
           <w:rPr>
             <w:rStyle w:val="Hyperlink"/>
@@ -5646,7 +6078,7 @@
         </w:rPr>
         <w:t xml:space="preserve">In countries where YouTube has opened the expanded program, the first gate is fan funding and Shopping: channel memberships, Super Chat, Super Stickers, Super Thanks, and product tags. </w:t>
       </w:r>
-      <w:hyperlink r:id="rId53">
+      <w:hyperlink r:id="rId77">
         <w:r>
           <w:rPr>
             <w:rStyle w:val="Hyperlink"/>
@@ -5845,7 +6277,7 @@
                     <pic:cNvPicPr/>
                   </pic:nvPicPr>
                   <pic:blipFill>
-                    <a:blip r:embed="rId54"/>
+                    <a:blip r:embed="rId78"/>
                     <a:stretch>
                       <a:fillRect/>
                     </a:stretch>
@@ -5870,1158 +6302,136 @@
           <w:rFonts w:ascii="Calibri" w:hAnsi="Calibri"/>
           <w:i/>
         </w:rPr>
-        <w:t>The highlighted YouTube bar is 1,000 subscribers, the ad-share gate from §I. The fan-funding gate is 500 subscribers and is deliberately not a second bar: this chart compares main ad programs, and a follower count alone still does not make a channel eligible. Figures as of the time of writing. The table below is the fuller picture.</w:t>
-      </w:r>
-    </w:p>
-    <w:tbl>
-      <w:tblPr>
-        <w:tblStyle w:val="TableGrid"/>
-        <w:tblW w:type="auto" w:w="0"/>
-        <w:tblLayout w:type="fixed"/>
-        <w:tblLook w:firstColumn="1" w:firstRow="1" w:lastColumn="0" w:lastRow="0" w:noHBand="0" w:noVBand="1" w:val="04A0"/>
-        <w:tblW w:w="8063" w:type="dxa"/>
-      </w:tblPr>
-      <w:tblGrid>
-        <w:gridCol w:w="2016"/>
-        <w:gridCol w:w="2016"/>
-        <w:gridCol w:w="2016"/>
-        <w:gridCol w:w="2016"/>
-      </w:tblGrid>
-      <w:tr>
-        <w:tc>
-          <w:tcPr>
-            <w:tcW w:type="dxa" w:w="2016"/>
-            <w:tcW w:w="1512" w:type="dxa"/>
-            <w:shd w:val="clear" w:color="auto" w:fill="F3F1EA"/>
-          </w:tcPr>
-          <w:p>
-            <w:pPr>
-              <w:spacing w:after="40" w:before="40"/>
-            </w:pPr>
-            <w:r>
-              <w:rPr>
-                <w:rFonts w:ascii="Calibri" w:hAnsi="Calibri"/>
-                <w:b/>
-                <w:sz w:val="21"/>
-              </w:rPr>
-            </w:r>
-            <w:r>
-              <w:rPr>
-                <w:rFonts w:ascii="Calibri" w:hAnsi="Calibri"/>
-                <w:b/>
-                <w:sz w:val="21"/>
-              </w:rPr>
-              <w:t>Platform</w:t>
-            </w:r>
-          </w:p>
-        </w:tc>
-        <w:tc>
-          <w:tcPr>
-            <w:tcW w:type="dxa" w:w="2016"/>
-            <w:tcW w:w="1728" w:type="dxa"/>
-            <w:shd w:val="clear" w:color="auto" w:fill="F3F1EA"/>
-          </w:tcPr>
-          <w:p>
-            <w:pPr>
-              <w:spacing w:after="40" w:before="40"/>
-            </w:pPr>
-            <w:r>
-              <w:rPr>
-                <w:rFonts w:ascii="Calibri" w:hAnsi="Calibri"/>
-                <w:b/>
-                <w:sz w:val="21"/>
-              </w:rPr>
-            </w:r>
-            <w:r>
-              <w:rPr>
-                <w:rFonts w:ascii="Calibri" w:hAnsi="Calibri"/>
-                <w:b/>
-                <w:sz w:val="21"/>
-              </w:rPr>
-              <w:t>Program</w:t>
-            </w:r>
-          </w:p>
-        </w:tc>
-        <w:tc>
-          <w:tcPr>
-            <w:tcW w:type="dxa" w:w="2016"/>
-            <w:tcW w:w="3168" w:type="dxa"/>
-            <w:shd w:val="clear" w:color="auto" w:fill="F3F1EA"/>
-          </w:tcPr>
-          <w:p>
-            <w:pPr>
-              <w:spacing w:after="40" w:before="40"/>
-            </w:pPr>
-            <w:r>
-              <w:rPr>
-                <w:rFonts w:ascii="Calibri" w:hAnsi="Calibri"/>
-                <w:b/>
-                <w:sz w:val="21"/>
-              </w:rPr>
-            </w:r>
-            <w:r>
-              <w:rPr>
-                <w:rFonts w:ascii="Calibri" w:hAnsi="Calibri"/>
-                <w:b/>
-                <w:sz w:val="21"/>
-              </w:rPr>
-              <w:t>Threshold (at time of writing)</w:t>
-            </w:r>
-          </w:p>
-        </w:tc>
-        <w:tc>
-          <w:tcPr>
-            <w:tcW w:type="dxa" w:w="2016"/>
-            <w:tcW w:w="1655" w:type="dxa"/>
-            <w:shd w:val="clear" w:color="auto" w:fill="F3F1EA"/>
-          </w:tcPr>
-          <w:p>
-            <w:pPr>
-              <w:spacing w:after="40" w:before="40"/>
-            </w:pPr>
-            <w:r>
-              <w:rPr>
-                <w:rFonts w:ascii="Calibri" w:hAnsi="Calibri"/>
-                <w:b/>
-                <w:sz w:val="21"/>
-              </w:rPr>
-            </w:r>
-            <w:r>
-              <w:rPr>
-                <w:rFonts w:ascii="Calibri" w:hAnsi="Calibri"/>
-                <w:b/>
-                <w:sz w:val="21"/>
-              </w:rPr>
-              <w:t>Model</w:t>
-            </w:r>
-          </w:p>
-        </w:tc>
-      </w:tr>
-      <w:tr>
-        <w:tc>
-          <w:tcPr>
-            <w:tcW w:type="dxa" w:w="2016"/>
-            <w:tcW w:w="1512" w:type="dxa"/>
-          </w:tcPr>
-          <w:p>
-            <w:pPr>
-              <w:spacing w:after="40" w:before="40"/>
-            </w:pPr>
-            <w:r>
-              <w:rPr>
-                <w:rFonts w:ascii="Calibri" w:hAnsi="Calibri"/>
-                <w:sz w:val="21"/>
-              </w:rPr>
-            </w:r>
-            <w:r>
-              <w:rPr>
-                <w:rFonts w:ascii="Calibri" w:hAnsi="Calibri"/>
-                <w:sz w:val="21"/>
-              </w:rPr>
-              <w:t>YouTube</w:t>
-            </w:r>
-          </w:p>
-        </w:tc>
-        <w:tc>
-          <w:tcPr>
-            <w:tcW w:type="dxa" w:w="2016"/>
-            <w:tcW w:w="1728" w:type="dxa"/>
-          </w:tcPr>
-          <w:p>
-            <w:pPr>
-              <w:spacing w:after="40" w:before="40"/>
-            </w:pPr>
-            <w:r>
-              <w:rPr>
-                <w:rFonts w:ascii="Calibri" w:hAnsi="Calibri"/>
-                <w:sz w:val="21"/>
-              </w:rPr>
-            </w:r>
-            <w:r>
-              <w:rPr>
-                <w:rFonts w:ascii="Calibri" w:hAnsi="Calibri"/>
-                <w:sz w:val="21"/>
-              </w:rPr>
-              <w:t>Partner Program</w:t>
-            </w:r>
-          </w:p>
-        </w:tc>
-        <w:tc>
-          <w:tcPr>
-            <w:tcW w:type="dxa" w:w="2016"/>
-            <w:tcW w:w="3168" w:type="dxa"/>
-          </w:tcPr>
-          <w:p>
-            <w:pPr>
-              <w:spacing w:after="40" w:before="40"/>
-            </w:pPr>
-            <w:r>
-              <w:rPr>
-                <w:rFonts w:ascii="Calibri" w:hAnsi="Calibri"/>
-                <w:sz w:val="21"/>
-              </w:rPr>
-            </w:r>
-            <w:r>
-              <w:rPr>
-                <w:rFonts w:ascii="Calibri" w:hAnsi="Calibri"/>
-                <w:sz w:val="21"/>
-              </w:rPr>
-              <w:t>1,000 subscribers + 4,000 watch hours/12 months, or 10M Shorts views/90 days</w:t>
-            </w:r>
-          </w:p>
-        </w:tc>
-        <w:tc>
-          <w:tcPr>
-            <w:tcW w:type="dxa" w:w="2016"/>
-            <w:tcW w:w="1655" w:type="dxa"/>
-          </w:tcPr>
-          <w:p>
-            <w:pPr>
-              <w:spacing w:after="40" w:before="40"/>
-            </w:pPr>
-            <w:r>
-              <w:rPr>
-                <w:rFonts w:ascii="Calibri" w:hAnsi="Calibri"/>
-                <w:sz w:val="21"/>
-              </w:rPr>
-            </w:r>
-            <w:r>
-              <w:rPr>
-                <w:rFonts w:ascii="Calibri" w:hAnsi="Calibri"/>
-                <w:sz w:val="21"/>
-              </w:rPr>
-              <w:t>Ad revenue share</w:t>
-            </w:r>
-          </w:p>
-        </w:tc>
-      </w:tr>
-      <w:tr>
-        <w:tc>
-          <w:tcPr>
-            <w:tcW w:type="dxa" w:w="2016"/>
-            <w:tcW w:w="1512" w:type="dxa"/>
-          </w:tcPr>
-          <w:p>
-            <w:pPr>
-              <w:spacing w:after="40" w:before="40"/>
-            </w:pPr>
-            <w:r>
-              <w:rPr>
-                <w:rFonts w:ascii="Calibri" w:hAnsi="Calibri"/>
-                <w:sz w:val="21"/>
-              </w:rPr>
-            </w:r>
-            <w:hyperlink r:id="rId55">
-              <w:r>
-                <w:rPr>
-                  <w:rStyle w:val="Hyperlink"/>
-                  <w:sz w:val="22"/>
-                  <w:rFonts w:ascii="Calibri" w:hAnsi="Calibri"/>
-                </w:rPr>
-                <w:t xml:space="preserve">TikTok</w:t>
-              </w:r>
-            </w:hyperlink>
-          </w:p>
-        </w:tc>
-        <w:tc>
-          <w:tcPr>
-            <w:tcW w:type="dxa" w:w="2016"/>
-            <w:tcW w:w="1728" w:type="dxa"/>
-          </w:tcPr>
-          <w:p>
-            <w:pPr>
-              <w:spacing w:after="40" w:before="40"/>
-            </w:pPr>
-            <w:r>
-              <w:rPr>
-                <w:rFonts w:ascii="Calibri" w:hAnsi="Calibri"/>
-                <w:sz w:val="21"/>
-              </w:rPr>
-            </w:r>
-            <w:r>
-              <w:rPr>
-                <w:rFonts w:ascii="Calibri" w:hAnsi="Calibri"/>
-                <w:sz w:val="21"/>
-              </w:rPr>
-              <w:t>Creator Rewards</w:t>
-            </w:r>
-          </w:p>
-        </w:tc>
-        <w:tc>
-          <w:tcPr>
-            <w:tcW w:type="dxa" w:w="2016"/>
-            <w:tcW w:w="3168" w:type="dxa"/>
-          </w:tcPr>
-          <w:p>
-            <w:pPr>
-              <w:spacing w:after="40" w:before="40"/>
-            </w:pPr>
-            <w:r>
-              <w:rPr>
-                <w:rFonts w:ascii="Calibri" w:hAnsi="Calibri"/>
-                <w:sz w:val="21"/>
-              </w:rPr>
-            </w:r>
-            <w:r>
-              <w:rPr>
-                <w:rFonts w:ascii="Calibri" w:hAnsi="Calibri"/>
-                <w:sz w:val="21"/>
-              </w:rPr>
-              <w:t>10,000 followers + 100,000 views/30 days; 18+; videos 60s or longer; limited countries</w:t>
-            </w:r>
-          </w:p>
-        </w:tc>
-        <w:tc>
-          <w:tcPr>
-            <w:tcW w:type="dxa" w:w="2016"/>
-            <w:tcW w:w="1655" w:type="dxa"/>
-          </w:tcPr>
-          <w:p>
-            <w:pPr>
-              <w:spacing w:after="40" w:before="40"/>
-            </w:pPr>
-            <w:r>
-              <w:rPr>
-                <w:rFonts w:ascii="Calibri" w:hAnsi="Calibri"/>
-                <w:sz w:val="21"/>
-              </w:rPr>
-            </w:r>
-            <w:r>
-              <w:rPr>
-                <w:rFonts w:ascii="Calibri" w:hAnsi="Calibri"/>
-                <w:sz w:val="21"/>
-              </w:rPr>
-              <w:t>Pay per qualified view</w:t>
-            </w:r>
-          </w:p>
-        </w:tc>
-      </w:tr>
-      <w:tr>
-        <w:tc>
-          <w:tcPr>
-            <w:tcW w:type="dxa" w:w="2016"/>
-            <w:tcW w:w="1512" w:type="dxa"/>
-          </w:tcPr>
-          <w:p>
-            <w:pPr>
-              <w:spacing w:after="40" w:before="40"/>
-            </w:pPr>
-            <w:r>
-              <w:rPr>
-                <w:rFonts w:ascii="Calibri" w:hAnsi="Calibri"/>
-                <w:sz w:val="21"/>
-              </w:rPr>
-            </w:r>
-            <w:hyperlink r:id="rId56">
-              <w:r>
-                <w:rPr>
-                  <w:rStyle w:val="Hyperlink"/>
-                  <w:sz w:val="22"/>
-                  <w:rFonts w:ascii="Calibri" w:hAnsi="Calibri"/>
-                </w:rPr>
-                <w:t xml:space="preserve">Facebook</w:t>
-              </w:r>
-            </w:hyperlink>
-          </w:p>
-        </w:tc>
-        <w:tc>
-          <w:tcPr>
-            <w:tcW w:type="dxa" w:w="2016"/>
-            <w:tcW w:w="1728" w:type="dxa"/>
-          </w:tcPr>
-          <w:p>
-            <w:pPr>
-              <w:spacing w:after="40" w:before="40"/>
-            </w:pPr>
-            <w:r>
-              <w:rPr>
-                <w:rFonts w:ascii="Calibri" w:hAnsi="Calibri"/>
-                <w:sz w:val="21"/>
-              </w:rPr>
-            </w:r>
-            <w:r>
-              <w:rPr>
-                <w:rFonts w:ascii="Calibri" w:hAnsi="Calibri"/>
-                <w:sz w:val="21"/>
-              </w:rPr>
-              <w:t>Content Monetization</w:t>
-            </w:r>
-          </w:p>
-        </w:tc>
-        <w:tc>
-          <w:tcPr>
-            <w:tcW w:type="dxa" w:w="2016"/>
-            <w:tcW w:w="3168" w:type="dxa"/>
-          </w:tcPr>
-          <w:p>
-            <w:pPr>
-              <w:spacing w:after="40" w:before="40"/>
-            </w:pPr>
-            <w:r>
-              <w:rPr>
-                <w:rFonts w:ascii="Calibri" w:hAnsi="Calibri"/>
-                <w:sz w:val="21"/>
-              </w:rPr>
-            </w:r>
-            <w:r>
-              <w:rPr>
-                <w:rFonts w:ascii="Calibri" w:hAnsi="Calibri"/>
-                <w:sz w:val="21"/>
-              </w:rPr>
-              <w:t>10,000 followers + 600,000 minutes watched/60 days + 5 videos on the Page</w:t>
-            </w:r>
-          </w:p>
-        </w:tc>
-        <w:tc>
-          <w:tcPr>
-            <w:tcW w:type="dxa" w:w="2016"/>
-            <w:tcW w:w="1655" w:type="dxa"/>
-          </w:tcPr>
-          <w:p>
-            <w:pPr>
-              <w:spacing w:after="40" w:before="40"/>
-            </w:pPr>
-            <w:r>
-              <w:rPr>
-                <w:rFonts w:ascii="Calibri" w:hAnsi="Calibri"/>
-                <w:sz w:val="21"/>
-              </w:rPr>
-            </w:r>
-            <w:r>
-              <w:rPr>
-                <w:rFonts w:ascii="Calibri" w:hAnsi="Calibri"/>
-                <w:sz w:val="21"/>
-              </w:rPr>
-              <w:t>Ad revenue share</w:t>
-            </w:r>
-          </w:p>
-        </w:tc>
-      </w:tr>
-      <w:tr>
-        <w:tc>
-          <w:tcPr>
-            <w:tcW w:type="dxa" w:w="2016"/>
-            <w:tcW w:w="1512" w:type="dxa"/>
-          </w:tcPr>
-          <w:p>
-            <w:pPr>
-              <w:spacing w:after="40" w:before="40"/>
-            </w:pPr>
-            <w:r>
-              <w:rPr>
-                <w:rFonts w:ascii="Calibri" w:hAnsi="Calibri"/>
-                <w:sz w:val="21"/>
-              </w:rPr>
-            </w:r>
-            <w:hyperlink r:id="rId57">
-              <w:r>
-                <w:rPr>
-                  <w:rStyle w:val="Hyperlink"/>
-                  <w:sz w:val="22"/>
-                  <w:rFonts w:ascii="Calibri" w:hAnsi="Calibri"/>
-                </w:rPr>
-                <w:t xml:space="preserve">Snapchat</w:t>
-              </w:r>
-            </w:hyperlink>
-          </w:p>
-        </w:tc>
-        <w:tc>
-          <w:tcPr>
-            <w:tcW w:type="dxa" w:w="2016"/>
-            <w:tcW w:w="1728" w:type="dxa"/>
-          </w:tcPr>
-          <w:p>
-            <w:pPr>
-              <w:spacing w:after="40" w:before="40"/>
-            </w:pPr>
-            <w:r>
-              <w:rPr>
-                <w:rFonts w:ascii="Calibri" w:hAnsi="Calibri"/>
-                <w:sz w:val="21"/>
-              </w:rPr>
-            </w:r>
-            <w:r>
-              <w:rPr>
-                <w:rFonts w:ascii="Calibri" w:hAnsi="Calibri"/>
-                <w:sz w:val="21"/>
-              </w:rPr>
-              <w:t>Spotlight monetization</w:t>
-            </w:r>
-          </w:p>
-        </w:tc>
-        <w:tc>
-          <w:tcPr>
-            <w:tcW w:type="dxa" w:w="2016"/>
-            <w:tcW w:w="3168" w:type="dxa"/>
-          </w:tcPr>
-          <w:p>
-            <w:pPr>
-              <w:spacing w:after="40" w:before="40"/>
-            </w:pPr>
-            <w:r>
-              <w:rPr>
-                <w:rFonts w:ascii="Calibri" w:hAnsi="Calibri"/>
-                <w:sz w:val="21"/>
-              </w:rPr>
-            </w:r>
-            <w:r>
-              <w:rPr>
-                <w:rFonts w:ascii="Calibri" w:hAnsi="Calibri"/>
-                <w:sz w:val="21"/>
-              </w:rPr>
-              <w:t>50,000 followers + 25 posts/month + 100 hours of Spotlight view time/28 days</w:t>
-            </w:r>
-          </w:p>
-        </w:tc>
-        <w:tc>
-          <w:tcPr>
-            <w:tcW w:type="dxa" w:w="2016"/>
-            <w:tcW w:w="1655" w:type="dxa"/>
-          </w:tcPr>
-          <w:p>
-            <w:pPr>
-              <w:spacing w:after="40" w:before="40"/>
-            </w:pPr>
-            <w:r>
-              <w:rPr>
-                <w:rFonts w:ascii="Calibri" w:hAnsi="Calibri"/>
-                <w:sz w:val="21"/>
-              </w:rPr>
-            </w:r>
-            <w:r>
-              <w:rPr>
-                <w:rFonts w:ascii="Calibri" w:hAnsi="Calibri"/>
-                <w:sz w:val="21"/>
-              </w:rPr>
-              <w:t>Ad revenue share</w:t>
-            </w:r>
-          </w:p>
-        </w:tc>
-      </w:tr>
-      <w:tr>
-        <w:tc>
-          <w:tcPr>
-            <w:tcW w:type="dxa" w:w="2016"/>
-            <w:tcW w:w="1512" w:type="dxa"/>
-          </w:tcPr>
-          <w:p>
-            <w:pPr>
-              <w:spacing w:after="40" w:before="40"/>
-            </w:pPr>
-            <w:r>
-              <w:rPr>
-                <w:rFonts w:ascii="Calibri" w:hAnsi="Calibri"/>
-                <w:sz w:val="21"/>
-              </w:rPr>
-            </w:r>
-            <w:hyperlink r:id="rId58">
-              <w:r>
-                <w:rPr>
-                  <w:rStyle w:val="Hyperlink"/>
-                  <w:sz w:val="22"/>
-                  <w:rFonts w:ascii="Calibri" w:hAnsi="Calibri"/>
-                </w:rPr>
-                <w:t xml:space="preserve">X</w:t>
-              </w:r>
-            </w:hyperlink>
-          </w:p>
-        </w:tc>
-        <w:tc>
-          <w:tcPr>
-            <w:tcW w:type="dxa" w:w="2016"/>
-            <w:tcW w:w="1728" w:type="dxa"/>
-          </w:tcPr>
-          <w:p>
-            <w:pPr>
-              <w:spacing w:after="40" w:before="40"/>
-            </w:pPr>
-            <w:r>
-              <w:rPr>
-                <w:rFonts w:ascii="Calibri" w:hAnsi="Calibri"/>
-                <w:sz w:val="21"/>
-              </w:rPr>
-            </w:r>
-            <w:r>
-              <w:rPr>
-                <w:rFonts w:ascii="Calibri" w:hAnsi="Calibri"/>
-                <w:sz w:val="21"/>
-              </w:rPr>
-              <w:t>Original Content Rewards</w:t>
-            </w:r>
-          </w:p>
-        </w:tc>
-        <w:tc>
-          <w:tcPr>
-            <w:tcW w:type="dxa" w:w="2016"/>
-            <w:tcW w:w="3168" w:type="dxa"/>
-          </w:tcPr>
-          <w:p>
-            <w:pPr>
-              <w:spacing w:after="40" w:before="40"/>
-            </w:pPr>
-            <w:r>
-              <w:rPr>
-                <w:rFonts w:ascii="Calibri" w:hAnsi="Calibri"/>
-                <w:sz w:val="21"/>
-              </w:rPr>
-            </w:r>
-            <w:r>
-              <w:rPr>
-                <w:rFonts w:ascii="Calibri" w:hAnsi="Calibri"/>
-                <w:sz w:val="21"/>
-              </w:rPr>
-              <w:t>Active Premium subscription + 500 verified followers + 500,000 impressions/90 days</w:t>
-            </w:r>
-          </w:p>
-        </w:tc>
-        <w:tc>
-          <w:tcPr>
-            <w:tcW w:type="dxa" w:w="2016"/>
-            <w:tcW w:w="1655" w:type="dxa"/>
-          </w:tcPr>
-          <w:p>
-            <w:pPr>
-              <w:spacing w:after="40" w:before="40"/>
-            </w:pPr>
-            <w:r>
-              <w:rPr>
-                <w:rFonts w:ascii="Calibri" w:hAnsi="Calibri"/>
-                <w:sz w:val="21"/>
-              </w:rPr>
-            </w:r>
-            <w:r>
-              <w:rPr>
-                <w:rFonts w:ascii="Calibri" w:hAnsi="Calibri"/>
-                <w:sz w:val="21"/>
-              </w:rPr>
-              <w:t>Pay per qualified impression</w:t>
-            </w:r>
-          </w:p>
-        </w:tc>
-      </w:tr>
-      <w:tr>
-        <w:tc>
-          <w:tcPr>
-            <w:tcW w:type="dxa" w:w="2016"/>
-            <w:tcW w:w="1512" w:type="dxa"/>
-          </w:tcPr>
-          <w:p>
-            <w:pPr>
-              <w:spacing w:after="40" w:before="40"/>
-            </w:pPr>
-            <w:r>
-              <w:rPr>
-                <w:rFonts w:ascii="Calibri" w:hAnsi="Calibri"/>
-                <w:sz w:val="21"/>
-              </w:rPr>
-            </w:r>
-            <w:hyperlink r:id="rId59">
-              <w:r>
-                <w:rPr>
-                  <w:rStyle w:val="Hyperlink"/>
-                  <w:sz w:val="22"/>
-                  <w:rFonts w:ascii="Calibri" w:hAnsi="Calibri"/>
-                </w:rPr>
-                <w:t xml:space="preserve">Rumble</w:t>
-              </w:r>
-            </w:hyperlink>
-          </w:p>
-        </w:tc>
-        <w:tc>
-          <w:tcPr>
-            <w:tcW w:type="dxa" w:w="2016"/>
-            <w:tcW w:w="1728" w:type="dxa"/>
-          </w:tcPr>
-          <w:p>
-            <w:pPr>
-              <w:spacing w:after="40" w:before="40"/>
-            </w:pPr>
-            <w:r>
-              <w:rPr>
-                <w:rFonts w:ascii="Calibri" w:hAnsi="Calibri"/>
-                <w:sz w:val="21"/>
-              </w:rPr>
-            </w:r>
-            <w:r>
-              <w:rPr>
-                <w:rFonts w:ascii="Calibri" w:hAnsi="Calibri"/>
-                <w:sz w:val="21"/>
-              </w:rPr>
-              <w:t>Partner Program</w:t>
-            </w:r>
-          </w:p>
-        </w:tc>
-        <w:tc>
-          <w:tcPr>
-            <w:tcW w:type="dxa" w:w="2016"/>
-            <w:tcW w:w="3168" w:type="dxa"/>
-          </w:tcPr>
-          <w:p>
-            <w:pPr>
-              <w:spacing w:after="40" w:before="40"/>
-            </w:pPr>
-            <w:r>
-              <w:rPr>
-                <w:rFonts w:ascii="Calibri" w:hAnsi="Calibri"/>
-                <w:sz w:val="21"/>
-              </w:rPr>
-            </w:r>
-            <w:r>
-              <w:rPr>
-                <w:rFonts w:ascii="Calibri" w:hAnsi="Calibri"/>
-                <w:sz w:val="21"/>
-              </w:rPr>
-              <w:t>No follower minimum; 30-day-old account in good standing, one original upload</w:t>
-            </w:r>
-          </w:p>
-        </w:tc>
-        <w:tc>
-          <w:tcPr>
-            <w:tcW w:type="dxa" w:w="2016"/>
-            <w:tcW w:w="1655" w:type="dxa"/>
-          </w:tcPr>
-          <w:p>
-            <w:pPr>
-              <w:spacing w:after="40" w:before="40"/>
-            </w:pPr>
-            <w:r>
-              <w:rPr>
-                <w:rFonts w:ascii="Calibri" w:hAnsi="Calibri"/>
-                <w:sz w:val="21"/>
-              </w:rPr>
-            </w:r>
-            <w:r>
-              <w:rPr>
-                <w:rFonts w:ascii="Calibri" w:hAnsi="Calibri"/>
-                <w:sz w:val="21"/>
-              </w:rPr>
-              <w:t>Ad revenue share</w:t>
-            </w:r>
-          </w:p>
-        </w:tc>
-      </w:tr>
-      <w:tr>
-        <w:tc>
-          <w:tcPr>
-            <w:tcW w:type="dxa" w:w="2016"/>
-            <w:tcW w:w="1512" w:type="dxa"/>
-          </w:tcPr>
-          <w:p>
-            <w:pPr>
-              <w:spacing w:after="40" w:before="40"/>
-            </w:pPr>
-            <w:r>
-              <w:rPr>
-                <w:rFonts w:ascii="Calibri" w:hAnsi="Calibri"/>
-                <w:sz w:val="21"/>
-              </w:rPr>
-            </w:r>
-            <w:hyperlink r:id="rId60">
-              <w:r>
-                <w:rPr>
-                  <w:rStyle w:val="Hyperlink"/>
-                  <w:sz w:val="22"/>
-                  <w:rFonts w:ascii="Calibri" w:hAnsi="Calibri"/>
-                </w:rPr>
-                <w:t xml:space="preserve">Dailymotion</w:t>
-              </w:r>
-            </w:hyperlink>
-          </w:p>
-        </w:tc>
-        <w:tc>
-          <w:tcPr>
-            <w:tcW w:type="dxa" w:w="2016"/>
-            <w:tcW w:w="1728" w:type="dxa"/>
-          </w:tcPr>
-          <w:p>
-            <w:pPr>
-              <w:spacing w:after="40" w:before="40"/>
-            </w:pPr>
-            <w:r>
-              <w:rPr>
-                <w:rFonts w:ascii="Calibri" w:hAnsi="Calibri"/>
-                <w:sz w:val="21"/>
-              </w:rPr>
-            </w:r>
-            <w:r>
-              <w:rPr>
-                <w:rFonts w:ascii="Calibri" w:hAnsi="Calibri"/>
-                <w:sz w:val="21"/>
-              </w:rPr>
-              <w:t>Partner Program</w:t>
-            </w:r>
-          </w:p>
-        </w:tc>
-        <w:tc>
-          <w:tcPr>
-            <w:tcW w:type="dxa" w:w="2016"/>
-            <w:tcW w:w="3168" w:type="dxa"/>
-          </w:tcPr>
-          <w:p>
-            <w:pPr>
-              <w:spacing w:after="40" w:before="40"/>
-            </w:pPr>
-            <w:r>
-              <w:rPr>
-                <w:rFonts w:ascii="Calibri" w:hAnsi="Calibri"/>
-                <w:sz w:val="21"/>
-              </w:rPr>
-            </w:r>
-            <w:r>
-              <w:rPr>
-                <w:rFonts w:ascii="Calibri" w:hAnsi="Calibri"/>
-                <w:sz w:val="21"/>
-              </w:rPr>
-              <w:t>Sources disagree — confirm directly with Dailymotion</w:t>
-            </w:r>
-          </w:p>
-        </w:tc>
-        <w:tc>
-          <w:tcPr>
-            <w:tcW w:type="dxa" w:w="2016"/>
-            <w:tcW w:w="1655" w:type="dxa"/>
-          </w:tcPr>
-          <w:p>
-            <w:pPr>
-              <w:spacing w:after="40" w:before="40"/>
-            </w:pPr>
-            <w:r>
-              <w:rPr>
-                <w:rFonts w:ascii="Calibri" w:hAnsi="Calibri"/>
-                <w:sz w:val="21"/>
-              </w:rPr>
-            </w:r>
-            <w:r>
-              <w:rPr>
-                <w:rFonts w:ascii="Calibri" w:hAnsi="Calibri"/>
-                <w:sz w:val="21"/>
-              </w:rPr>
-              <w:t>Ad revenue share</w:t>
-            </w:r>
-          </w:p>
-        </w:tc>
-      </w:tr>
-      <w:tr>
-        <w:tc>
-          <w:tcPr>
-            <w:tcW w:type="dxa" w:w="2016"/>
-            <w:tcW w:w="1512" w:type="dxa"/>
-          </w:tcPr>
-          <w:p>
-            <w:pPr>
-              <w:spacing w:after="40" w:before="40"/>
-            </w:pPr>
-            <w:r>
-              <w:rPr>
-                <w:rFonts w:ascii="Calibri" w:hAnsi="Calibri"/>
-                <w:sz w:val="21"/>
-              </w:rPr>
-            </w:r>
-            <w:r>
-              <w:rPr>
-                <w:rFonts w:ascii="Calibri" w:hAnsi="Calibri"/>
-                <w:sz w:val="21"/>
-              </w:rPr>
-              <w:t>Instagram</w:t>
-            </w:r>
-          </w:p>
-        </w:tc>
-        <w:tc>
-          <w:tcPr>
-            <w:tcW w:type="dxa" w:w="2016"/>
-            <w:tcW w:w="1728" w:type="dxa"/>
-          </w:tcPr>
-          <w:p>
-            <w:pPr>
-              <w:spacing w:after="40" w:before="40"/>
-            </w:pPr>
-            <w:r>
-              <w:rPr>
-                <w:rFonts w:ascii="Calibri" w:hAnsi="Calibri"/>
-                <w:sz w:val="21"/>
-              </w:rPr>
-            </w:r>
-            <w:r>
-              <w:rPr>
-                <w:rFonts w:ascii="Calibri" w:hAnsi="Calibri"/>
-                <w:sz w:val="21"/>
-              </w:rPr>
-              <w:t>Gifts / Subscriptions</w:t>
-            </w:r>
-          </w:p>
-        </w:tc>
-        <w:tc>
-          <w:tcPr>
-            <w:tcW w:type="dxa" w:w="2016"/>
-            <w:tcW w:w="3168" w:type="dxa"/>
-          </w:tcPr>
-          <w:p>
-            <w:pPr>
-              <w:spacing w:after="40" w:before="40"/>
-            </w:pPr>
-            <w:r>
-              <w:rPr>
-                <w:rFonts w:ascii="Calibri" w:hAnsi="Calibri"/>
-                <w:sz w:val="21"/>
-              </w:rPr>
-            </w:r>
-            <w:r>
-              <w:rPr>
-                <w:rFonts w:ascii="Calibri" w:hAnsi="Calibri"/>
-                <w:sz w:val="21"/>
-              </w:rPr>
-              <w:t>No fixed public threshold; direct-payout bonus programs are mostly invite-only</w:t>
-            </w:r>
-          </w:p>
-        </w:tc>
-        <w:tc>
-          <w:tcPr>
-            <w:tcW w:type="dxa" w:w="2016"/>
-            <w:tcW w:w="1655" w:type="dxa"/>
-          </w:tcPr>
-          <w:p>
-            <w:pPr>
-              <w:spacing w:after="40" w:before="40"/>
-            </w:pPr>
-            <w:r>
-              <w:rPr>
-                <w:rFonts w:ascii="Calibri" w:hAnsi="Calibri"/>
-                <w:sz w:val="21"/>
-              </w:rPr>
-            </w:r>
-            <w:r>
-              <w:rPr>
-                <w:rFonts w:ascii="Calibri" w:hAnsi="Calibri"/>
-                <w:sz w:val="21"/>
-              </w:rPr>
-              <w:t>Viewer tipping / subscriptions</w:t>
-            </w:r>
-          </w:p>
-        </w:tc>
-      </w:tr>
-      <w:tr>
-        <w:tc>
-          <w:tcPr>
-            <w:tcW w:type="dxa" w:w="2016"/>
-            <w:tcW w:w="1512" w:type="dxa"/>
-          </w:tcPr>
-          <w:p>
-            <w:pPr>
-              <w:spacing w:after="40" w:before="40"/>
-            </w:pPr>
-            <w:r>
-              <w:rPr>
-                <w:rFonts w:ascii="Calibri" w:hAnsi="Calibri"/>
-                <w:sz w:val="21"/>
-              </w:rPr>
-            </w:r>
-            <w:r>
-              <w:rPr>
-                <w:rFonts w:ascii="Calibri" w:hAnsi="Calibri"/>
-                <w:sz w:val="21"/>
-              </w:rPr>
-              <w:t>Vimeo</w:t>
-            </w:r>
-          </w:p>
-        </w:tc>
-        <w:tc>
-          <w:tcPr>
-            <w:tcW w:type="dxa" w:w="2016"/>
-            <w:tcW w:w="1728" w:type="dxa"/>
-          </w:tcPr>
-          <w:p>
-            <w:pPr>
-              <w:spacing w:after="40" w:before="40"/>
-            </w:pPr>
-            <w:r>
-              <w:rPr>
-                <w:rFonts w:ascii="Calibri" w:hAnsi="Calibri"/>
-                <w:sz w:val="21"/>
-              </w:rPr>
-            </w:r>
-            <w:r>
-              <w:rPr>
-                <w:rFonts w:ascii="Calibri" w:hAnsi="Calibri"/>
-                <w:sz w:val="21"/>
-              </w:rPr>
-              <w:t>—</w:t>
-            </w:r>
-          </w:p>
-        </w:tc>
-        <w:tc>
-          <w:tcPr>
-            <w:tcW w:type="dxa" w:w="2016"/>
-            <w:tcW w:w="3168" w:type="dxa"/>
-          </w:tcPr>
-          <w:p>
-            <w:pPr>
-              <w:spacing w:after="40" w:before="40"/>
-            </w:pPr>
-            <w:r>
-              <w:rPr>
-                <w:rFonts w:ascii="Calibri" w:hAnsi="Calibri"/>
-                <w:sz w:val="21"/>
-              </w:rPr>
-            </w:r>
-            <w:r>
-              <w:rPr>
-                <w:rFonts w:ascii="Calibri" w:hAnsi="Calibri"/>
-                <w:sz w:val="21"/>
-              </w:rPr>
-              <w:t>On Demand is being discontinued in 2026, not replaced with an equivalent</w:t>
-            </w:r>
-          </w:p>
-        </w:tc>
-        <w:tc>
-          <w:tcPr>
-            <w:tcW w:type="dxa" w:w="2016"/>
-            <w:tcW w:w="1655" w:type="dxa"/>
-          </w:tcPr>
-          <w:p>
-            <w:pPr>
-              <w:spacing w:after="40" w:before="40"/>
-            </w:pPr>
-            <w:r>
-              <w:rPr>
-                <w:rFonts w:ascii="Calibri" w:hAnsi="Calibri"/>
-                <w:sz w:val="21"/>
-              </w:rPr>
-            </w:r>
-            <w:r>
-              <w:rPr>
-                <w:rFonts w:ascii="Calibri" w:hAnsi="Calibri"/>
-                <w:sz w:val="21"/>
-              </w:rPr>
-              <w:t>Was pay-per-view; replaced by a paid-subscription tool, not a payout program</w:t>
-            </w:r>
-          </w:p>
-        </w:tc>
-      </w:tr>
-      <w:tr>
-        <w:tc>
-          <w:tcPr>
-            <w:tcW w:type="dxa" w:w="2016"/>
-            <w:tcW w:w="1512" w:type="dxa"/>
-          </w:tcPr>
-          <w:p>
-            <w:pPr>
-              <w:spacing w:after="40" w:before="40"/>
-            </w:pPr>
-            <w:r>
-              <w:rPr>
-                <w:rFonts w:ascii="Calibri" w:hAnsi="Calibri"/>
-                <w:sz w:val="21"/>
-              </w:rPr>
-            </w:r>
-            <w:hyperlink r:id="rId61">
-              <w:r>
-                <w:rPr>
-                  <w:rStyle w:val="Hyperlink"/>
-                  <w:sz w:val="22"/>
-                  <w:rFonts w:ascii="Calibri" w:hAnsi="Calibri"/>
-                </w:rPr>
-                <w:t xml:space="preserve">Tumblr</w:t>
-              </w:r>
-            </w:hyperlink>
-          </w:p>
-        </w:tc>
-        <w:tc>
-          <w:tcPr>
-            <w:tcW w:type="dxa" w:w="2016"/>
-            <w:tcW w:w="1728" w:type="dxa"/>
-          </w:tcPr>
-          <w:p>
-            <w:pPr>
-              <w:spacing w:after="40" w:before="40"/>
-            </w:pPr>
-            <w:r>
-              <w:rPr>
-                <w:rFonts w:ascii="Calibri" w:hAnsi="Calibri"/>
-                <w:sz w:val="21"/>
-              </w:rPr>
-            </w:r>
-            <w:r>
-              <w:rPr>
-                <w:rFonts w:ascii="Calibri" w:hAnsi="Calibri"/>
-                <w:sz w:val="21"/>
-              </w:rPr>
-              <w:t>—</w:t>
-            </w:r>
-          </w:p>
-        </w:tc>
-        <w:tc>
-          <w:tcPr>
-            <w:tcW w:type="dxa" w:w="2016"/>
-            <w:tcW w:w="3168" w:type="dxa"/>
-          </w:tcPr>
-          <w:p>
-            <w:pPr>
-              <w:spacing w:after="40" w:before="40"/>
-            </w:pPr>
-            <w:r>
-              <w:rPr>
-                <w:rFonts w:ascii="Calibri" w:hAnsi="Calibri"/>
-                <w:sz w:val="21"/>
-              </w:rPr>
-            </w:r>
-            <w:r>
-              <w:rPr>
-                <w:rFonts w:ascii="Calibri" w:hAnsi="Calibri"/>
-                <w:sz w:val="21"/>
-              </w:rPr>
-              <w:t>No dedicated video ad-monetization program</w:t>
-            </w:r>
-          </w:p>
-        </w:tc>
-        <w:tc>
-          <w:tcPr>
-            <w:tcW w:type="dxa" w:w="2016"/>
-            <w:tcW w:w="1655" w:type="dxa"/>
-          </w:tcPr>
-          <w:p>
-            <w:pPr>
-              <w:spacing w:after="40" w:before="40"/>
-            </w:pPr>
-            <w:r>
-              <w:rPr>
-                <w:rFonts w:ascii="Calibri" w:hAnsi="Calibri"/>
-                <w:sz w:val="21"/>
-              </w:rPr>
-            </w:r>
-            <w:r>
-              <w:rPr>
-                <w:rFonts w:ascii="Calibri" w:hAnsi="Calibri"/>
-                <w:sz w:val="21"/>
-              </w:rPr>
-              <w:t>Traffic and referral platform, not currently a payout source</w:t>
-            </w:r>
-          </w:p>
-        </w:tc>
-      </w:tr>
-    </w:tbl>
-    <w:p/>
-    <w:p>
-      <w:r>
-        <w:rPr>
-          <w:rFonts w:ascii="Calibri" w:hAnsi="Calibri"/>
-        </w:rPr>
-        <w:t>Two platforms in this table changed their entire monetization program within the same year this chapter was written. Facebook’s old In-Stream Ads program ended outright — for on-demand video in 2025, for Live video in mid-2026 — replaced by the unified Content Monetization Program above. X retired its original revenue-sharing program in September 2026, the same month this chapter was drafted, in favor of the Original Content Rewards Program shown here, which pays for qualified impressions on original content rather than for engagement on replies. Neither change was unusual; it is the normal pace at which a platform’s monetization terms move, and it is the reason every number in this table needs reconfirming before you rely on it.</w:t>
-      </w:r>
-    </w:p>
-    <w:p>
-      <w:r>
-        <w:rPr>
-          <w:rFonts w:ascii="Calibri" w:hAnsi="Calibri"/>
-        </w:rPr>
-        <w:t>Dailymotion’s own published requirements were inconsistent across sources at the time of writing — some describing a threshold that mirrors YouTube’s almost exactly, others describing a much lower bar. That inconsistency is itself useful information: check the platform’s own creator help center directly, here and for every platform in this table, rather than a secondhand guide.</w:t>
-      </w:r>
-    </w:p>
-    <w:p>
-      <w:r>
-        <w:rPr>
-          <w:rFonts w:ascii="Calibri" w:hAnsi="Calibri"/>
-        </w:rPr>
-        <w:t>Instagram and Tumblr are worth naming because creators ask about them, not because either is currently a strong ad-revenue-share platform for video the way YouTube or TikTok are. Instagram’s direct-payout bonus programs are largely invite-only; its dependable monetization tools are viewer-funded — Gifts and Subscriptions — which pay only if an audience is already willing to pay directly. Tumblr has no comparable video ad-monetization program at all; treat it as a place to post and link back to a monetized upload elsewhere, not as a payout source in its own right.</w:t>
+        <w:t>The highlighted YouTube bar is 1,000 subscribers, the ad-share gate from §I. The fan-funding gate is 500 subscribers and is deliberately not a second bar: this chart compares main ad programs, and a follower count alone still does not make a channel eligible. Figures checked September 2026. The list below is the fuller picture. Each line was opened on that platform’s own help. A program whose page would not yield one number is not on the list.</w:t>
+      </w:r>
+    </w:p>
+    <w:p>
+      <w:r>
+        <w:rPr>
+          <w:rFonts w:ascii="Calibri" w:hAnsi="Calibri"/>
+        </w:rPr>
+        <w:t>Checked September 2026. Open the link again before you plan a month around the number.</w:t>
+      </w:r>
+    </w:p>
+    <w:p>
+      <w:r>
+        <w:rPr>
+          <w:rFonts w:ascii="Calibri" w:hAnsi="Calibri"/>
+          <w:b/>
+        </w:rPr>
+        <w:t>YouTube — Partner Program.</w:t>
+      </w:r>
+      <w:r>
+        <w:rPr>
+          <w:rFonts w:ascii="Calibri" w:hAnsi="Calibri"/>
+        </w:rPr>
+        <w:t xml:space="preserve"> Ad revenue share. 1,000 subscribers and 4,000 long-form watch hours in 12 months, or 10 million Shorts views in 90 days. The page is the eligibility link in §I.</w:t>
+      </w:r>
+    </w:p>
+    <w:p>
+      <w:r>
+        <w:rPr>
+          <w:rFonts w:ascii="Calibri" w:hAnsi="Calibri"/>
+          <w:b/>
+        </w:rPr>
+        <w:t>[TikTok — Creator Rewards](https://www.tiktok.com/creator-academy/article/eligibility).</w:t>
+      </w:r>
+      <w:r>
+        <w:rPr>
+          <w:rFonts w:ascii="Calibri" w:hAnsi="Calibri"/>
+        </w:rPr>
+        <w:t xml:space="preserve"> Pay per qualified view. 10,000 followers and 100,000 views in 30 days. Age 18 or older. Videos 60 seconds or longer. Limited countries.</w:t>
+      </w:r>
+    </w:p>
+    <w:p>
+      <w:r>
+        <w:rPr>
+          <w:rFonts w:ascii="Calibri" w:hAnsi="Calibri"/>
+          <w:b/>
+        </w:rPr>
+        <w:t>[Facebook — Content Monetization](https://creators.facebook.com/tools/ad-breaks/v2/).</w:t>
+      </w:r>
+      <w:r>
+        <w:rPr>
+          <w:rFonts w:ascii="Calibri" w:hAnsi="Calibri"/>
+        </w:rPr>
+        <w:t xml:space="preserve"> Ad revenue share. 10,000 followers, 600,000 minutes watched in 60 days, and 5 videos on the Page.</w:t>
+      </w:r>
+    </w:p>
+    <w:p>
+      <w:r>
+        <w:rPr>
+          <w:rFonts w:ascii="Calibri" w:hAnsi="Calibri"/>
+          <w:b/>
+        </w:rPr>
+        <w:t>[Snapchat — Spotlight](https://help.snapchat.com/hc/en-us/articles/7012310905876).</w:t>
+      </w:r>
+      <w:r>
+        <w:rPr>
+          <w:rFonts w:ascii="Calibri" w:hAnsi="Calibri"/>
+        </w:rPr>
+        <w:t xml:space="preserve"> Ad revenue share. 50,000 followers, 25 posts a month, and 100 hours of Spotlight view time in 28 days.</w:t>
+      </w:r>
+    </w:p>
+    <w:p>
+      <w:r>
+        <w:rPr>
+          <w:rFonts w:ascii="Calibri" w:hAnsi="Calibri"/>
+          <w:b/>
+        </w:rPr>
+        <w:t>[X — Original Content Rewards](https://help.x.com/en/using-x/original-content-rewards).</w:t>
+      </w:r>
+      <w:r>
+        <w:rPr>
+          <w:rFonts w:ascii="Calibri" w:hAnsi="Calibri"/>
+        </w:rPr>
+        <w:t xml:space="preserve"> Pay per qualified impression. An active Premium subscription, 500 verified followers, and 500,000 impressions in 90 days.</w:t>
+      </w:r>
+    </w:p>
+    <w:p>
+      <w:r>
+        <w:rPr>
+          <w:rFonts w:ascii="Calibri" w:hAnsi="Calibri"/>
+          <w:b/>
+        </w:rPr>
+        <w:t>[Rumble — Partner Program](https://rumble.support/help/rumble-creator-program).</w:t>
+      </w:r>
+      <w:r>
+        <w:rPr>
+          <w:rFonts w:ascii="Calibri" w:hAnsi="Calibri"/>
+        </w:rPr>
+        <w:t xml:space="preserve"> Ad revenue share. No follower minimum. An account 30 days old and in good standing, and one original upload.</w:t>
+      </w:r>
+    </w:p>
+    <w:p>
+      <w:r>
+        <w:rPr>
+          <w:rFonts w:ascii="Calibri" w:hAnsi="Calibri"/>
+          <w:b/>
+        </w:rPr>
+        <w:t>[Tumblr](https://help.tumblr.com/knowledge-base/paid-feature-eligibility/).</w:t>
+      </w:r>
+      <w:r>
+        <w:rPr>
+          <w:rFonts w:ascii="Calibri" w:hAnsi="Calibri"/>
+        </w:rPr>
+        <w:t xml:space="preserve"> No video ad program on that page. A place to post and point back at the page where you actually charge.</w:t>
+      </w:r>
+    </w:p>
+    <w:p>
+      <w:r>
+        <w:rPr>
+          <w:rFonts w:ascii="Calibri" w:hAnsi="Calibri"/>
+        </w:rPr>
+        <w:t>Instagram, as of the same month, does not publish a fixed follower floor for gifts, and its bonus programs are described as invite-only. This list does not treat it as an ad-share plan. If you post there, the tap is the profile website and the Story sticker already named in §V. Dailymotion’s creator pages did not agree on one threshold in September 2026, so this chapter gives you no number for it. Vimeo On Demand was being discontinued, and this chapter has no replacement payout page it can send you to. If you still want one of those three, open that company’s own help and read the live page. Do not plan from this paragraph.</w:t>
+      </w:r>
+    </w:p>
+    <w:p>
+      <w:r>
+        <w:rPr>
+          <w:rFonts w:ascii="Calibri" w:hAnsi="Calibri"/>
+        </w:rPr>
+        <w:t>Two programs on the list replaced an older one in the year this chapter was written. Facebook’s In-Stream Ads ended for on-demand video in 2025 and for Live in mid-2026. The Content Monetization line above is the replacement. X retired its earlier revenue-sharing program in September 2026. Original Content Rewards is the replacement, and it pays for qualified impressions on original posts. That pace is why each line carries a month.</w:t>
       </w:r>
     </w:p>
     <w:p>
@@ -7047,7 +6457,7 @@
         <w:rPr>
           <w:rFonts w:ascii="Calibri" w:hAnsi="Calibri"/>
         </w:rPr>
-        <w:t>Disclose next to the link: “affiliate link” or “#ad.” The FTC pages in the sources apply on every site. Put that one link in the first two or three lines, the part a viewer sees before “more.” On a long video whose comments are clickable, a pinned comment can repeat it. Three to five links is a ceiling this book treats as creator consensus. Past that, the list is a menu. The first chapter already asked you to pick one product.</w:t>
+        <w:t>Disclose next to the link: “affiliate link” or “#ad.” The FTC pages in the sources are the US rule. Other countries have their own disclosure rules. Saying “affiliate” in the same sentence as the link is the minimum wherever you post. Put that one URL in the first two or three lines, the part a viewer sees before “more.” On a long video whose comments are clickable, the pinned comment repeats the same URL. The channel profile may repeat it once. YouTube’s sharing-links page allows up to 14 profile links. Use one. Leave the other thirteen empty. A second product in those slots is the menu chapter 1 already refused.</w:t>
       </w:r>
     </w:p>
     <w:p>
@@ -7065,7 +6475,7 @@
         </w:rPr>
         <w:t xml:space="preserve">A pasted address is not a link until YouTube will make it clickable. </w:t>
       </w:r>
-      <w:hyperlink r:id="rId62">
+      <w:hyperlink r:id="rId79">
         <w:r>
           <w:rPr>
             <w:rStyle w:val="Hyperlink"/>
@@ -7089,7 +6499,7 @@
         </w:rPr>
         <w:t xml:space="preserve">An </w:t>
       </w:r>
-      <w:hyperlink r:id="rId63">
+      <w:hyperlink r:id="rId80">
         <w:r>
           <w:rPr>
             <w:rStyle w:val="Hyperlink"/>
@@ -7105,7 +6515,7 @@
         </w:rPr>
         <w:t xml:space="preserve"> or an </w:t>
       </w:r>
-      <w:hyperlink r:id="rId64">
+      <w:hyperlink r:id="rId81">
         <w:r>
           <w:rPr>
             <w:rStyle w:val="Hyperlink"/>
@@ -7121,7 +6531,7 @@
         </w:rPr>
         <w:t xml:space="preserve"> that opens a site outside YouTube requires the </w:t>
       </w:r>
-      <w:hyperlink r:id="rId52">
+      <w:hyperlink r:id="rId76">
         <w:r>
           <w:rPr>
             <w:rStyle w:val="Hyperlink"/>
@@ -7135,7 +6545,7 @@
         <w:rPr>
           <w:rFonts w:ascii="Calibri" w:hAnsi="Calibri"/>
         </w:rPr>
-        <w:t>. An end screen can sit only in the last 5–20 seconds, and only on a video at least 25 seconds long. Those overlays are a later convenience. The first sale uses a long-form description, a pinned comment on that long video, and the links on the channel profile — YouTube’s sharing-links page allows up to 14 of those — once advanced features are on.</w:t>
+        <w:t>. An end screen can sit only in the last 5–20 seconds, and only on a video at least 25 seconds long. Those overlays are a later convenience. The first sale uses a long-form description and a pinned comment on that long video, once advanced features are on, plus the one profile link.</w:t>
       </w:r>
     </w:p>
     <w:p>
@@ -7153,7 +6563,7 @@
         <w:rPr>
           <w:rFonts w:ascii="Calibri" w:hAnsi="Calibri"/>
         </w:rPr>
-        <w:t>The table in §III is how a site might pay you for attention. This section is how a stranger pays you for the offer, on YouTube and on the other sites in that table.</w:t>
+        <w:t>The list in §III is how a site might pay you for attention. This section is how a stranger pays you for the offer, on YouTube and on the other sites in that list.</w:t>
       </w:r>
     </w:p>
     <w:p>
@@ -7234,7 +6644,7 @@
         </w:rPr>
         <w:t xml:space="preserve">Instagram’s help lists “Add a website to your Instagram profile” from its </w:t>
       </w:r>
-      <w:hyperlink r:id="rId65">
+      <w:hyperlink r:id="rId82">
         <w:r>
           <w:rPr>
             <w:rStyle w:val="Hyperlink"/>
@@ -7250,7 +6660,7 @@
         </w:rPr>
         <w:t xml:space="preserve"> page. Separately, </w:t>
       </w:r>
-      <w:hyperlink r:id="rId66">
+      <w:hyperlink r:id="rId83">
         <w:r>
           <w:rPr>
             <w:rStyle w:val="Hyperlink"/>
@@ -7277,7 +6687,7 @@
         </w:rPr>
         <w:t xml:space="preserve">TikTok’s help has a page for </w:t>
       </w:r>
-      <w:hyperlink r:id="rId67">
+      <w:hyperlink r:id="rId84">
         <w:r>
           <w:rPr>
             <w:rStyle w:val="Hyperlink"/>
@@ -7302,15 +6712,15 @@
         <w:rPr>
           <w:rFonts w:ascii="Calibri" w:hAnsi="Calibri"/>
         </w:rPr>
-        <w:t>Every other row in the table already links to that platform’s creator help. Use the profile, About, or description field that page names.</w:t>
-      </w:r>
-    </w:p>
-    <w:p>
-      <w:r>
-        <w:rPr>
-          <w:rFonts w:ascii="Calibri" w:hAnsi="Calibri"/>
-        </w:rPr>
-        <w:t>Then test the tap on your phone, the same way you test the payment page. If the caption is not clickable, the profile is the shelf. YouTube is the strict case already in §IV. A Short’s description and comments are not clickable. A long-form description waits until advanced features are on. The other sites are different. Confirm each one on your phone.</w:t>
+        <w:t>Every other name in the §III list already links to that platform’s creator help. Use the profile, About, or description field that page names.</w:t>
+      </w:r>
+    </w:p>
+    <w:p>
+      <w:r>
+        <w:rPr>
+          <w:rFonts w:ascii="Calibri" w:hAnsi="Calibri"/>
+        </w:rPr>
+        <w:t>Then test the tap on your phone, the same way you test the payment page. If the caption is not clickable, the profile is the shelf. YouTube’s strict case is already in §IV. The other sites are different. Confirm each one on your phone.</w:t>
       </w:r>
     </w:p>
     <w:p>
@@ -7329,7 +6739,7 @@
         <w:rPr>
           <w:rFonts w:ascii="Calibri" w:hAnsi="Calibri"/>
         </w:rPr>
-        <w:t>Its ad or rewards program, after you clear the row in the table. Write that money on the platform line of the money sheet, separate from offer money.</w:t>
+        <w:t>Its ad or rewards program, after you clear the line in §III. Write that money on the platform line of the money sheet, separate from offer money.</w:t>
       </w:r>
     </w:p>
     <w:p>
@@ -7467,7 +6877,7 @@
         <w:rPr>
           <w:rFonts w:ascii="Calibri" w:hAnsi="Calibri"/>
         </w:rPr>
-        <w:t>That more affiliate links are a better recommendation. Past three to five, the list is a menu. Chapter 1 already asked for one product.</w:t>
+        <w:t>That more links are a better recommendation. One URL. The description, the pinned comment, and one profile slot may each repeat it. A second product is a menu.</w:t>
       </w:r>
     </w:p>
     <w:p>
@@ -7550,7 +6960,7 @@
           <w:rFonts w:ascii="Calibri" w:hAnsi="Calibri"/>
           <w:i/>
         </w:rPr>
-        <w:t>Sources: YouTube Partner Program requirements verified against YouTube’s own creator-facing monetization guidance, current at the time of writing. Facebook, TikTok, Snapchat, X, Rumble, Instagram, Vimeo, and Tumblr monetization details are drawn from each platform’s own current creator or help pages, cross-checked against multiple independent sources; Dailymotion’s requirements could not be confirmed to the same standard and are flagged as such in the text. Subscriber-conversion tactics in §I and the three-to-five link ceiling in §IV are creator consensus drawn from the author’s own saved research on those topics, not published platform policy, and are labeled as such throughout. Which YouTube addresses are clickable, and which overlays can leave the site, are taken from YouTube’s own sharing-links, feature-eligibility, cards, and end-screen help, current at the time of writing. The second-channel rules in §II reflect YouTube’s own stated policy on multiple channels. The offer shapes in the first chapter, and the instruction in §V to use one offer on every site, are editorial. Instagram’s profile-website article is listed from its editing-your-profile help, and its link-sticker page says an organic Story sticker can send a tap to a website. TikTok’s help has a page for adding a website to a profile; this chapter does not add a follower minimum that page did not show in plain text. Where a link can be tapped on any other site, confirm that site’s own help, on your phone, before you rely on a caption.</w:t>
+        <w:t>Sources: YouTube Partner Program requirements verified against YouTube’s own creator-facing monetization guidance, checked September 2026. TikTok, Facebook, Snapchat, X, Rumble, and Tumblr figures in §III were taken from the linked page on each line, the same month. Instagram, Dailymotion, and Vimeo are named only to say this chapter has no number for them. Subscriber-conversion tactics in §I are creator consensus, labeled as tests, not published platform policy. One URL, repeated, is the rule in §IV. Which YouTube addresses are clickable, and which overlays can leave the site, are taken from YouTube’s own sharing-links, feature-eligibility, cards, and end-screen help. The second-channel rules in §II reflect YouTube’s own stated policy on multiple channels. The offer shapes in the first chapter, and the instruction in §V to use one offer on every site, are editorial. The FTC pages linked from the back of the book are US guidance. Other countries have their own disclosure rules. Instagram’s profile-website article is listed from its editing-your-profile help, and its link-sticker page says an organic Story sticker can send a tap to a website. TikTok’s help has a page for adding a website to a profile. Where a link can be tapped on any other site, confirm that site’s own help, on your phone, before you rely on a caption.</w:t>
       </w:r>
     </w:p>
     <w:p>
@@ -7563,6 +6973,19 @@
       </w:r>
     </w:p>
     <w:p>
+      <w:pPr>
+        <w:sectPr>
+          <w:headerReference w:type="default" r:id="rId74"/>
+          <w:footerReference w:type="default" r:id="rId75"/>
+          <w:pgSz w:w="10080" w:h="14400"/>
+          <w:pgMar w:top="1008" w:right="1008" w:bottom="1008" w:left="1008" w:header="504" w:footer="504" w:gutter="0"/>
+          <w:cols w:space="720"/>
+          <w:titlePg/>
+          <w:docGrid w:linePitch="360"/>
+        </w:sectPr>
+      </w:pPr>
+    </w:p>
+    <w:p>
       <w:bookmarkStart w:id="41" w:name="toc40"/>
       <w:pPr>
         <w:pStyle w:val="Heading1"/>
@@ -7612,7 +7035,15 @@
         <w:rPr>
           <w:rFonts w:ascii="Calibri" w:hAnsi="Calibri"/>
         </w:rPr>
-        <w:t>Write the buyer sentence, the unfit-viewer sentence, and the twenty-second offer. Choose one of the three offer types. Put a price on the page, or a booking link with the scope written in plain language. Read it aloud. If you stumble, the viewer will leave.</w:t>
+        <w:t>Write the buyer sentence, the unfit-viewer sentence, and the twenty-second offer. Pick one shape from the offer chapter and put that shape’s sentence on the page, with the price. Read it aloud. If you stumble, the viewer will leave.</w:t>
+      </w:r>
+    </w:p>
+    <w:p>
+      <w:r>
+        <w:rPr>
+          <w:rFonts w:ascii="Calibri" w:hAnsi="Calibri"/>
+        </w:rPr>
+        <w:t>The eight jobs in the videos chapter are the only set of videos this calendar films. The click chapter uses that same set. Week one does not add a second quota.</w:t>
       </w:r>
     </w:p>
     <w:p>
@@ -8016,6 +7447,19 @@
       </w:r>
     </w:p>
     <w:p>
+      <w:pPr>
+        <w:sectPr>
+          <w:headerReference w:type="default" r:id="rId85"/>
+          <w:footerReference w:type="default" r:id="rId86"/>
+          <w:pgSz w:w="10080" w:h="14400"/>
+          <w:pgMar w:top="1008" w:right="1008" w:bottom="1008" w:left="1008" w:header="504" w:footer="504" w:gutter="0"/>
+          <w:cols w:space="720"/>
+          <w:titlePg/>
+          <w:docGrid w:linePitch="360"/>
+        </w:sectPr>
+      </w:pPr>
+    </w:p>
+    <w:p>
       <w:bookmarkStart w:id="50" w:name="toc49"/>
       <w:pPr>
         <w:pStyle w:val="Heading1"/>
@@ -8427,6 +7871,19 @@
       </w:r>
     </w:p>
     <w:p>
+      <w:pPr>
+        <w:sectPr>
+          <w:headerReference w:type="default" r:id="rId87"/>
+          <w:footerReference w:type="default" r:id="rId88"/>
+          <w:pgSz w:w="10080" w:h="14400"/>
+          <w:pgMar w:top="1008" w:right="1008" w:bottom="1008" w:left="1008" w:header="504" w:footer="504" w:gutter="0"/>
+          <w:cols w:space="720"/>
+          <w:titlePg/>
+          <w:docGrid w:linePitch="360"/>
+        </w:sectPr>
+      </w:pPr>
+    </w:p>
+    <w:p>
       <w:bookmarkStart w:id="60" w:name="toc59"/>
       <w:pPr>
         <w:pStyle w:val="Heading1"/>
@@ -8567,6 +8024,14 @@
           <w:rFonts w:ascii="Calibri" w:hAnsi="Calibri"/>
         </w:rPr>
         <w:t>The page link:</w:t>
+      </w:r>
+    </w:p>
+    <w:p>
+      <w:r>
+        <w:rPr>
+          <w:rFonts w:ascii="Calibri" w:hAnsi="Calibri"/>
+        </w:rPr>
+        <w:t>The sentence for this shape, from the offer chapter:</w:t>
       </w:r>
     </w:p>
     <w:p>
@@ -9305,6 +8770,19 @@
       </w:r>
     </w:p>
     <w:p>
+      <w:pPr>
+        <w:sectPr>
+          <w:headerReference w:type="default" r:id="rId89"/>
+          <w:footerReference w:type="default" r:id="rId90"/>
+          <w:pgSz w:w="10080" w:h="14400"/>
+          <w:pgMar w:top="1008" w:right="1008" w:bottom="1008" w:left="1008" w:header="504" w:footer="504" w:gutter="0"/>
+          <w:cols w:space="720"/>
+          <w:titlePg/>
+          <w:docGrid w:linePitch="360"/>
+        </w:sectPr>
+      </w:pPr>
+    </w:p>
+    <w:p>
       <w:bookmarkStart w:id="69" w:name="toc68"/>
       <w:pPr>
         <w:pStyle w:val="Heading1"/>
@@ -9372,7 +8850,7 @@
         <w:rPr>
           <w:rFonts w:ascii="Calibri" w:hAnsi="Calibri"/>
         </w:rPr>
-        <w:t>The videos exist. The page exists. Viewers still do not arrive there. Look at the first two lines of the description, the pinned comment, and the words you say at the end. If the link is under a paragraph about your story, move it up. If you never say the name of the offer, say it. If you can read the address and cannot tap it, the price is hidden. That includes a YouTube Short, and any other site where you have not finished the phone test. If three test viewers cannot find the price without you pointing, the packaging failed and the niche did not.</w:t>
+        <w:t>The videos exist. The page exists. Viewers still do not arrive there. Look at the first two lines of the description, the pinned comment, and the words you say at the end. If the link is under a paragraph about your story, move it up. If you never say the name of the offer, say it. If you can read the address and cannot tap it, the price is hidden. A YouTube Short is the case the money chapter already states: the description and the comments do not tap. Any other site you have not tested on your phone is the same break. If three test viewers cannot find the price without you pointing, the packaging failed and the niche did not.</w:t>
       </w:r>
     </w:p>
     <w:p>
@@ -9636,6 +9114,19 @@
       </w:r>
     </w:p>
     <w:p>
+      <w:pPr>
+        <w:sectPr>
+          <w:headerReference w:type="default" r:id="rId91"/>
+          <w:footerReference w:type="default" r:id="rId92"/>
+          <w:pgSz w:w="10080" w:h="14400"/>
+          <w:pgMar w:top="1008" w:right="1008" w:bottom="1008" w:left="1008" w:header="504" w:footer="504" w:gutter="0"/>
+          <w:cols w:space="720"/>
+          <w:titlePg/>
+          <w:docGrid w:linePitch="360"/>
+        </w:sectPr>
+      </w:pPr>
+    </w:p>
+    <w:p>
       <w:bookmarkStart w:id="79" w:name="toc78"/>
       <w:pPr>
         <w:pStyle w:val="Heading1"/>
@@ -9659,6 +9150,81 @@
           <w:rFonts w:ascii="Calibri" w:hAnsi="Calibri"/>
           <w:b/>
         </w:rPr>
+        <w:t xml:space="preserve">Eight jobs. </w:t>
+      </w:r>
+      <w:r>
+        <w:rPr>
+          <w:rFonts w:ascii="Calibri" w:hAnsi="Calibri"/>
+        </w:rPr>
+        <w:t>The only set of videos this book asks you to finish: who it is for, the problem in their words, the method, proof, the comparison, one objection, the offer, and which video to watch next. The click chapter and the six-week calendar use this same set.</w:t>
+      </w:r>
+    </w:p>
+    <w:p>
+      <w:r>
+        <w:rPr>
+          <w:rFonts w:ascii="Calibri" w:hAnsi="Calibri"/>
+          <w:b/>
+        </w:rPr>
+        <w:t xml:space="preserve">Phone test. </w:t>
+      </w:r>
+      <w:r>
+        <w:rPr>
+          <w:rFonts w:ascii="Calibri" w:hAnsi="Calibri"/>
+        </w:rPr>
+        <w:t>On your phone, open the offer link the way a stranger will, from the description, and finish a payment or a booking. The step where you stall is the step a buyer will abandon. Refund the test if the tool allows it.</w:t>
+      </w:r>
+    </w:p>
+    <w:p>
+      <w:r>
+        <w:rPr>
+          <w:rFonts w:ascii="Calibri" w:hAnsi="Calibri"/>
+          <w:b/>
+        </w:rPr>
+        <w:t xml:space="preserve">Ticket. </w:t>
+      </w:r>
+      <w:r>
+        <w:rPr>
+          <w:rFonts w:ascii="Calibri" w:hAnsi="Calibri"/>
+        </w:rPr>
+        <w:t>One workshop on one date, with the date, the length, and the price on the page. After that date, sell the recording as the file, or stop. Do not leave both for sale.</w:t>
+      </w:r>
+    </w:p>
+    <w:p>
+      <w:r>
+        <w:rPr>
+          <w:rFonts w:ascii="Calibri" w:hAnsi="Calibri"/>
+          <w:b/>
+        </w:rPr>
+        <w:t xml:space="preserve">Monthly pass. </w:t>
+      </w:r>
+      <w:r>
+        <w:rPr>
+          <w:rFonts w:ascii="Calibri" w:hAnsi="Calibri"/>
+        </w:rPr>
+        <w:t>The next file or the next call, billed by you, on your page. The page says what arrives each month and when the next charge happens. A video site’s own membership button can wait until you have cleared that site’s gate.</w:t>
+      </w:r>
+    </w:p>
+    <w:p>
+      <w:r>
+        <w:rPr>
+          <w:rFonts w:ascii="Calibri" w:hAnsi="Calibri"/>
+          <w:b/>
+        </w:rPr>
+        <w:t xml:space="preserve">Sponsor. </w:t>
+      </w:r>
+      <w:r>
+        <w:rPr>
+          <w:rFonts w:ascii="Calibri" w:hAnsi="Calibri"/>
+        </w:rPr>
+        <w:t>One company pays you for one video. Say so in the video and next to the link. Do not also pitch your own file in that video.</w:t>
+      </w:r>
+    </w:p>
+    <w:p>
+      <w:r>
+        <w:rPr>
+          <w:rFonts w:ascii="Calibri" w:hAnsi="Calibri"/>
+          <w:b/>
+        </w:rPr>
         <w:t xml:space="preserve">Advanced features. </w:t>
       </w:r>
       <w:r>
@@ -9939,6 +9505,19 @@
       </w:r>
     </w:p>
     <w:p>
+      <w:pPr>
+        <w:sectPr>
+          <w:headerReference w:type="default" r:id="rId93"/>
+          <w:footerReference w:type="default" r:id="rId94"/>
+          <w:pgSz w:w="10080" w:h="14400"/>
+          <w:pgMar w:top="1008" w:right="1008" w:bottom="1008" w:left="1008" w:header="504" w:footer="504" w:gutter="0"/>
+          <w:cols w:space="720"/>
+          <w:titlePg/>
+          <w:docGrid w:linePitch="360"/>
+        </w:sectPr>
+      </w:pPr>
+    </w:p>
+    <w:p>
       <w:bookmarkStart w:id="80" w:name="toc79"/>
       <w:pPr>
         <w:pStyle w:val="Heading1"/>
@@ -9971,7 +9550,7 @@
           <w:rFonts w:ascii="Calibri" w:hAnsi="Calibri"/>
           <w:i/>
         </w:rPr>
-        <w:t>Chapter 2. Title, description, and tag limits, captions, thumbnails, the title-and-thumbnail test, audience retention, recommendation signals, the recommendation system, Shorts discovery, Shorts analytics, and series playlists are cited to YouTube’s own help pages in the chapter. The four-long-and-six-shorts month is a production load, not a YouTube quota. Advertiser-friendly guidelines are cited for the existence of a sensitive-content category. The exact words that trigger it are not published.</w:t>
+        <w:t>Chapter 2. Title, description, and tag limits, captions, thumbnails, the title-and-thumbnail test, audience retention, recommendation signals, the recommendation system, Shorts discovery, Shorts analytics, and series playlists are cited to YouTube’s own help pages in the chapter. The eight jobs are the only production load in this book. YouTube does not publish that set as a quota. Four of them have to be long videos, because a Short cannot carry the link. Advertiser-friendly guidelines are cited for the existence of a sensitive-content category. The exact words that trigger it are not published.</w:t>
       </w:r>
     </w:p>
     <w:p>
@@ -9989,7 +9568,7 @@
           <w:rFonts w:ascii="Calibri" w:hAnsi="Calibri"/>
           <w:i/>
         </w:rPr>
-        <w:t>Chapter 5. YouTube Partner Program requirements were checked against YouTube’s own monetization guidance. Other platforms were checked against their own creator or help pages. Dailymotion’s requirements could not be confirmed to the same standard and are flagged in the chapter. Affiliate-link placement is creator consensus plus a disclosure habit, not a promise of income. Using one offer on every site is editorial. Instagram’s link sticker and TikTok’s profile-website page are cited in the chapter. Confirm each tap on a phone.</w:t>
+        <w:t>Chapter 5. YouTube Partner Program requirements were checked against YouTube’s own monetization guidance. Other platforms on the list were checked against the linked help page in September 2026. Instagram, Dailymotion, and Vimeo have no number in the chapter. One URL, repeated, is the rule. The FTC pages are US guidance.</w:t>
       </w:r>
     </w:p>
     <w:p>
@@ -10009,7 +9588,7 @@
       </w:r>
     </w:p>
     <w:p>
-      <w:hyperlink r:id="rId51">
+      <w:hyperlink r:id="rId71">
         <w:r>
           <w:rPr>
             <w:rStyle w:val="Hyperlink"/>
@@ -10027,7 +9606,7 @@
       </w:r>
     </w:p>
     <w:p>
-      <w:hyperlink r:id="rId35">
+      <w:hyperlink r:id="rId49">
         <w:r>
           <w:rPr>
             <w:rStyle w:val="Hyperlink"/>
@@ -10045,7 +9624,7 @@
       </w:r>
     </w:p>
     <w:p>
-      <w:hyperlink r:id="rId52">
+      <w:hyperlink r:id="rId76">
         <w:r>
           <w:rPr>
             <w:rStyle w:val="Hyperlink"/>
@@ -10061,7 +9640,7 @@
         </w:rPr>
         <w:t xml:space="preserve">, </w:t>
       </w:r>
-      <w:hyperlink r:id="rId53">
+      <w:hyperlink r:id="rId77">
         <w:r>
           <w:rPr>
             <w:rStyle w:val="Hyperlink"/>
@@ -10077,7 +9656,7 @@
         </w:rPr>
         <w:t xml:space="preserve">, </w:t>
       </w:r>
-      <w:hyperlink r:id="rId62">
+      <w:hyperlink r:id="rId79">
         <w:r>
           <w:rPr>
             <w:rStyle w:val="Hyperlink"/>
@@ -10093,7 +9672,7 @@
         </w:rPr>
         <w:t xml:space="preserve">, </w:t>
       </w:r>
-      <w:hyperlink r:id="rId63">
+      <w:hyperlink r:id="rId80">
         <w:r>
           <w:rPr>
             <w:rStyle w:val="Hyperlink"/>
@@ -10109,7 +9688,7 @@
         </w:rPr>
         <w:t xml:space="preserve">, </w:t>
       </w:r>
-      <w:hyperlink r:id="rId64">
+      <w:hyperlink r:id="rId81">
         <w:r>
           <w:rPr>
             <w:rStyle w:val="Hyperlink"/>
@@ -10127,7 +9706,7 @@
       </w:r>
     </w:p>
     <w:p>
-      <w:hyperlink r:id="rId65">
+      <w:hyperlink r:id="rId82">
         <w:r>
           <w:rPr>
             <w:rStyle w:val="Hyperlink"/>
@@ -10143,7 +9722,7 @@
         </w:rPr>
         <w:t xml:space="preserve"> — lists adding a website to the profile. </w:t>
       </w:r>
-      <w:hyperlink r:id="rId66">
+      <w:hyperlink r:id="rId83">
         <w:r>
           <w:rPr>
             <w:rStyle w:val="Hyperlink"/>
@@ -10161,7 +9740,7 @@
       </w:r>
     </w:p>
     <w:p>
-      <w:hyperlink r:id="rId67">
+      <w:hyperlink r:id="rId84">
         <w:r>
           <w:rPr>
             <w:rStyle w:val="Hyperlink"/>
@@ -10179,7 +9758,7 @@
       </w:r>
     </w:p>
     <w:p>
-      <w:hyperlink r:id="rId68">
+      <w:hyperlink r:id="rId97">
         <w:r>
           <w:rPr>
             <w:rStyle w:val="Hyperlink"/>
@@ -10195,7 +9774,7 @@
         </w:rPr>
         <w:t xml:space="preserve"> and </w:t>
       </w:r>
-      <w:hyperlink r:id="rId69">
+      <w:hyperlink r:id="rId98">
         <w:r>
           <w:rPr>
             <w:rStyle w:val="Hyperlink"/>
@@ -10213,7 +9792,7 @@
       </w:r>
     </w:p>
     <w:p>
-      <w:hyperlink r:id="rId70">
+      <w:hyperlink r:id="rId99">
         <w:r>
           <w:rPr>
             <w:rStyle w:val="Hyperlink"/>
@@ -10229,7 +9808,7 @@
         </w:rPr>
         <w:t xml:space="preserve">. </w:t>
       </w:r>
-      <w:hyperlink r:id="rId71">
+      <w:hyperlink r:id="rId100">
         <w:r>
           <w:rPr>
             <w:rStyle w:val="Hyperlink"/>
@@ -10245,7 +9824,7 @@
         </w:rPr>
         <w:t xml:space="preserve">. </w:t>
       </w:r>
-      <w:hyperlink r:id="rId72">
+      <w:hyperlink r:id="rId101">
         <w:r>
           <w:rPr>
             <w:rStyle w:val="Hyperlink"/>
@@ -10261,7 +9840,7 @@
         </w:rPr>
         <w:t xml:space="preserve">. </w:t>
       </w:r>
-      <w:hyperlink r:id="rId73">
+      <w:hyperlink r:id="rId102">
         <w:r>
           <w:rPr>
             <w:rStyle w:val="Hyperlink"/>
@@ -10277,7 +9856,7 @@
         </w:rPr>
         <w:t xml:space="preserve">. </w:t>
       </w:r>
-      <w:hyperlink r:id="rId74">
+      <w:hyperlink r:id="rId103">
         <w:r>
           <w:rPr>
             <w:rStyle w:val="Hyperlink"/>
@@ -10295,13 +9874,640 @@
       </w:r>
     </w:p>
     <w:sectPr>
+      <w:headerReference w:type="default" r:id="rId95"/>
+      <w:footerReference w:type="default" r:id="rId96"/>
       <w:pgSz w:w="10080" w:h="14400"/>
-      <w:pgMar w:top="1008" w:right="1008" w:bottom="1008" w:left="1008" w:header="720" w:footer="720" w:gutter="0"/>
+      <w:pgMar w:top="1008" w:right="1008" w:bottom="1008" w:left="1008" w:header="504" w:footer="504" w:gutter="0"/>
       <w:cols w:space="720"/>
+      <w:titlePg/>
       <w:docGrid w:linePitch="360"/>
     </w:sectPr>
   </w:body>
 </w:document>
+</file>
+
+<file path=word/footer1.xml><?xml version="1.0" encoding="utf-8"?>
+<w:ftr xmlns:m="http://schemas.openxmlformats.org/officeDocument/2006/math" xmlns:mc="http://schemas.openxmlformats.org/markup-compatibility/2006" xmlns:mo="http://schemas.microsoft.com/office/mac/office/2008/main" xmlns:mv="urn:schemas-microsoft-com:mac:vml" xmlns:o="urn:schemas-microsoft-com:office:office" xmlns:r="http://schemas.openxmlformats.org/officeDocument/2006/relationships" xmlns:v="urn:schemas-microsoft-com:vml" xmlns:w10="urn:schemas-microsoft-com:office:word" xmlns:w14="http://schemas.microsoft.com/office/word/2010/wordml" xmlns:w="http://schemas.openxmlformats.org/wordprocessingml/2006/main" xmlns:wne="http://schemas.microsoft.com/office/word/2006/wordml" xmlns:wp14="http://schemas.microsoft.com/office/word/2010/wordprocessingDrawing" xmlns:wp="http://schemas.openxmlformats.org/drawingml/2006/wordprocessingDrawing" xmlns:wpc="http://schemas.microsoft.com/office/word/2010/wordprocessingCanvas" xmlns:wpg="http://schemas.microsoft.com/office/word/2010/wordprocessingGroup" xmlns:wpi="http://schemas.microsoft.com/office/word/2010/wordprocessingInk" xmlns:wps="http://schemas.microsoft.com/office/word/2010/wordprocessingShape" mc:Ignorable="w14 wp14">
+  <w:p>
+    <w:pPr>
+      <w:pStyle w:val="Footer"/>
+      <w:jc w:val="center"/>
+    </w:pPr>
+    <w:r>
+      <w:rPr>
+        <w:rFonts w:ascii="Calibri" w:hAnsi="Calibri"/>
+        <w:sz w:val="18"/>
+      </w:rPr>
+      <w:fldChar w:fldCharType="begin"/>
+    </w:r>
+    <w:r>
+      <w:rPr>
+        <w:rFonts w:ascii="Calibri" w:hAnsi="Calibri"/>
+        <w:sz w:val="18"/>
+      </w:rPr>
+      <w:instrText xml:space="preserve"> PAGE </w:instrText>
+    </w:r>
+    <w:r>
+      <w:rPr>
+        <w:rFonts w:ascii="Calibri" w:hAnsi="Calibri"/>
+        <w:sz w:val="18"/>
+      </w:rPr>
+      <w:fldChar w:fldCharType="end"/>
+    </w:r>
+  </w:p>
+</w:ftr>
+</file>
+
+<file path=word/footer10.xml><?xml version="1.0" encoding="utf-8"?>
+<w:ftr xmlns:m="http://schemas.openxmlformats.org/officeDocument/2006/math" xmlns:mc="http://schemas.openxmlformats.org/markup-compatibility/2006" xmlns:mo="http://schemas.microsoft.com/office/mac/office/2008/main" xmlns:mv="urn:schemas-microsoft-com:mac:vml" xmlns:o="urn:schemas-microsoft-com:office:office" xmlns:r="http://schemas.openxmlformats.org/officeDocument/2006/relationships" xmlns:v="urn:schemas-microsoft-com:vml" xmlns:w10="urn:schemas-microsoft-com:office:word" xmlns:w14="http://schemas.microsoft.com/office/word/2010/wordml" xmlns:w="http://schemas.openxmlformats.org/wordprocessingml/2006/main" xmlns:wne="http://schemas.microsoft.com/office/word/2006/wordml" xmlns:wp14="http://schemas.microsoft.com/office/word/2010/wordprocessingDrawing" xmlns:wp="http://schemas.openxmlformats.org/drawingml/2006/wordprocessingDrawing" xmlns:wpc="http://schemas.microsoft.com/office/word/2010/wordprocessingCanvas" xmlns:wpg="http://schemas.microsoft.com/office/word/2010/wordprocessingGroup" xmlns:wpi="http://schemas.microsoft.com/office/word/2010/wordprocessingInk" xmlns:wps="http://schemas.microsoft.com/office/word/2010/wordprocessingShape" mc:Ignorable="w14 wp14">
+  <w:p>
+    <w:pPr>
+      <w:pStyle w:val="Footer"/>
+      <w:jc w:val="center"/>
+    </w:pPr>
+    <w:r>
+      <w:rPr>
+        <w:rFonts w:ascii="Calibri" w:hAnsi="Calibri"/>
+        <w:sz w:val="18"/>
+      </w:rPr>
+      <w:fldChar w:fldCharType="begin"/>
+    </w:r>
+    <w:r>
+      <w:rPr>
+        <w:rFonts w:ascii="Calibri" w:hAnsi="Calibri"/>
+        <w:sz w:val="18"/>
+      </w:rPr>
+      <w:instrText xml:space="preserve"> PAGE </w:instrText>
+    </w:r>
+    <w:r>
+      <w:rPr>
+        <w:rFonts w:ascii="Calibri" w:hAnsi="Calibri"/>
+        <w:sz w:val="18"/>
+      </w:rPr>
+      <w:fldChar w:fldCharType="end"/>
+    </w:r>
+  </w:p>
+</w:ftr>
+</file>
+
+<file path=word/footer11.xml><?xml version="1.0" encoding="utf-8"?>
+<w:ftr xmlns:m="http://schemas.openxmlformats.org/officeDocument/2006/math" xmlns:mc="http://schemas.openxmlformats.org/markup-compatibility/2006" xmlns:mo="http://schemas.microsoft.com/office/mac/office/2008/main" xmlns:mv="urn:schemas-microsoft-com:mac:vml" xmlns:o="urn:schemas-microsoft-com:office:office" xmlns:r="http://schemas.openxmlformats.org/officeDocument/2006/relationships" xmlns:v="urn:schemas-microsoft-com:vml" xmlns:w10="urn:schemas-microsoft-com:office:word" xmlns:w14="http://schemas.microsoft.com/office/word/2010/wordml" xmlns:w="http://schemas.openxmlformats.org/wordprocessingml/2006/main" xmlns:wne="http://schemas.microsoft.com/office/word/2006/wordml" xmlns:wp14="http://schemas.microsoft.com/office/word/2010/wordprocessingDrawing" xmlns:wp="http://schemas.openxmlformats.org/drawingml/2006/wordprocessingDrawing" xmlns:wpc="http://schemas.microsoft.com/office/word/2010/wordprocessingCanvas" xmlns:wpg="http://schemas.microsoft.com/office/word/2010/wordprocessingGroup" xmlns:wpi="http://schemas.microsoft.com/office/word/2010/wordprocessingInk" xmlns:wps="http://schemas.microsoft.com/office/word/2010/wordprocessingShape" mc:Ignorable="w14 wp14">
+  <w:p>
+    <w:pPr>
+      <w:pStyle w:val="Footer"/>
+      <w:jc w:val="center"/>
+    </w:pPr>
+    <w:r>
+      <w:rPr>
+        <w:rFonts w:ascii="Calibri" w:hAnsi="Calibri"/>
+        <w:sz w:val="18"/>
+      </w:rPr>
+      <w:fldChar w:fldCharType="begin"/>
+    </w:r>
+    <w:r>
+      <w:rPr>
+        <w:rFonts w:ascii="Calibri" w:hAnsi="Calibri"/>
+        <w:sz w:val="18"/>
+      </w:rPr>
+      <w:instrText xml:space="preserve"> PAGE </w:instrText>
+    </w:r>
+    <w:r>
+      <w:rPr>
+        <w:rFonts w:ascii="Calibri" w:hAnsi="Calibri"/>
+        <w:sz w:val="18"/>
+      </w:rPr>
+      <w:fldChar w:fldCharType="end"/>
+    </w:r>
+  </w:p>
+</w:ftr>
+</file>
+
+<file path=word/footer12.xml><?xml version="1.0" encoding="utf-8"?>
+<w:ftr xmlns:m="http://schemas.openxmlformats.org/officeDocument/2006/math" xmlns:mc="http://schemas.openxmlformats.org/markup-compatibility/2006" xmlns:mo="http://schemas.microsoft.com/office/mac/office/2008/main" xmlns:mv="urn:schemas-microsoft-com:mac:vml" xmlns:o="urn:schemas-microsoft-com:office:office" xmlns:r="http://schemas.openxmlformats.org/officeDocument/2006/relationships" xmlns:v="urn:schemas-microsoft-com:vml" xmlns:w10="urn:schemas-microsoft-com:office:word" xmlns:w14="http://schemas.microsoft.com/office/word/2010/wordml" xmlns:w="http://schemas.openxmlformats.org/wordprocessingml/2006/main" xmlns:wne="http://schemas.microsoft.com/office/word/2006/wordml" xmlns:wp14="http://schemas.microsoft.com/office/word/2010/wordprocessingDrawing" xmlns:wp="http://schemas.openxmlformats.org/drawingml/2006/wordprocessingDrawing" xmlns:wpc="http://schemas.microsoft.com/office/word/2010/wordprocessingCanvas" xmlns:wpg="http://schemas.microsoft.com/office/word/2010/wordprocessingGroup" xmlns:wpi="http://schemas.microsoft.com/office/word/2010/wordprocessingInk" xmlns:wps="http://schemas.microsoft.com/office/word/2010/wordprocessingShape" mc:Ignorable="w14 wp14">
+  <w:p>
+    <w:pPr>
+      <w:pStyle w:val="Footer"/>
+      <w:jc w:val="center"/>
+    </w:pPr>
+    <w:r>
+      <w:rPr>
+        <w:rFonts w:ascii="Calibri" w:hAnsi="Calibri"/>
+        <w:sz w:val="18"/>
+      </w:rPr>
+      <w:fldChar w:fldCharType="begin"/>
+    </w:r>
+    <w:r>
+      <w:rPr>
+        <w:rFonts w:ascii="Calibri" w:hAnsi="Calibri"/>
+        <w:sz w:val="18"/>
+      </w:rPr>
+      <w:instrText xml:space="preserve"> PAGE </w:instrText>
+    </w:r>
+    <w:r>
+      <w:rPr>
+        <w:rFonts w:ascii="Calibri" w:hAnsi="Calibri"/>
+        <w:sz w:val="18"/>
+      </w:rPr>
+      <w:fldChar w:fldCharType="end"/>
+    </w:r>
+  </w:p>
+</w:ftr>
+</file>
+
+<file path=word/footer2.xml><?xml version="1.0" encoding="utf-8"?>
+<w:ftr xmlns:m="http://schemas.openxmlformats.org/officeDocument/2006/math" xmlns:mc="http://schemas.openxmlformats.org/markup-compatibility/2006" xmlns:mo="http://schemas.microsoft.com/office/mac/office/2008/main" xmlns:mv="urn:schemas-microsoft-com:mac:vml" xmlns:o="urn:schemas-microsoft-com:office:office" xmlns:r="http://schemas.openxmlformats.org/officeDocument/2006/relationships" xmlns:v="urn:schemas-microsoft-com:vml" xmlns:w10="urn:schemas-microsoft-com:office:word" xmlns:w14="http://schemas.microsoft.com/office/word/2010/wordml" xmlns:w="http://schemas.openxmlformats.org/wordprocessingml/2006/main" xmlns:wne="http://schemas.microsoft.com/office/word/2006/wordml" xmlns:wp14="http://schemas.microsoft.com/office/word/2010/wordprocessingDrawing" xmlns:wp="http://schemas.openxmlformats.org/drawingml/2006/wordprocessingDrawing" xmlns:wpc="http://schemas.microsoft.com/office/word/2010/wordprocessingCanvas" xmlns:wpg="http://schemas.microsoft.com/office/word/2010/wordprocessingGroup" xmlns:wpi="http://schemas.microsoft.com/office/word/2010/wordprocessingInk" xmlns:wps="http://schemas.microsoft.com/office/word/2010/wordprocessingShape" mc:Ignorable="w14 wp14">
+  <w:p>
+    <w:pPr>
+      <w:pStyle w:val="Footer"/>
+      <w:jc w:val="center"/>
+    </w:pPr>
+    <w:r>
+      <w:rPr>
+        <w:rFonts w:ascii="Calibri" w:hAnsi="Calibri"/>
+        <w:sz w:val="18"/>
+      </w:rPr>
+      <w:fldChar w:fldCharType="begin"/>
+    </w:r>
+    <w:r>
+      <w:rPr>
+        <w:rFonts w:ascii="Calibri" w:hAnsi="Calibri"/>
+        <w:sz w:val="18"/>
+      </w:rPr>
+      <w:instrText xml:space="preserve"> PAGE </w:instrText>
+    </w:r>
+    <w:r>
+      <w:rPr>
+        <w:rFonts w:ascii="Calibri" w:hAnsi="Calibri"/>
+        <w:sz w:val="18"/>
+      </w:rPr>
+      <w:fldChar w:fldCharType="end"/>
+    </w:r>
+  </w:p>
+</w:ftr>
+</file>
+
+<file path=word/footer3.xml><?xml version="1.0" encoding="utf-8"?>
+<w:ftr xmlns:m="http://schemas.openxmlformats.org/officeDocument/2006/math" xmlns:mc="http://schemas.openxmlformats.org/markup-compatibility/2006" xmlns:mo="http://schemas.microsoft.com/office/mac/office/2008/main" xmlns:mv="urn:schemas-microsoft-com:mac:vml" xmlns:o="urn:schemas-microsoft-com:office:office" xmlns:r="http://schemas.openxmlformats.org/officeDocument/2006/relationships" xmlns:v="urn:schemas-microsoft-com:vml" xmlns:w10="urn:schemas-microsoft-com:office:word" xmlns:w14="http://schemas.microsoft.com/office/word/2010/wordml" xmlns:w="http://schemas.openxmlformats.org/wordprocessingml/2006/main" xmlns:wne="http://schemas.microsoft.com/office/word/2006/wordml" xmlns:wp14="http://schemas.microsoft.com/office/word/2010/wordprocessingDrawing" xmlns:wp="http://schemas.openxmlformats.org/drawingml/2006/wordprocessingDrawing" xmlns:wpc="http://schemas.microsoft.com/office/word/2010/wordprocessingCanvas" xmlns:wpg="http://schemas.microsoft.com/office/word/2010/wordprocessingGroup" xmlns:wpi="http://schemas.microsoft.com/office/word/2010/wordprocessingInk" xmlns:wps="http://schemas.microsoft.com/office/word/2010/wordprocessingShape" mc:Ignorable="w14 wp14">
+  <w:p>
+    <w:pPr>
+      <w:pStyle w:val="Footer"/>
+      <w:jc w:val="center"/>
+    </w:pPr>
+    <w:r>
+      <w:rPr>
+        <w:rFonts w:ascii="Calibri" w:hAnsi="Calibri"/>
+        <w:sz w:val="18"/>
+      </w:rPr>
+      <w:fldChar w:fldCharType="begin"/>
+    </w:r>
+    <w:r>
+      <w:rPr>
+        <w:rFonts w:ascii="Calibri" w:hAnsi="Calibri"/>
+        <w:sz w:val="18"/>
+      </w:rPr>
+      <w:instrText xml:space="preserve"> PAGE </w:instrText>
+    </w:r>
+    <w:r>
+      <w:rPr>
+        <w:rFonts w:ascii="Calibri" w:hAnsi="Calibri"/>
+        <w:sz w:val="18"/>
+      </w:rPr>
+      <w:fldChar w:fldCharType="end"/>
+    </w:r>
+  </w:p>
+</w:ftr>
+</file>
+
+<file path=word/footer4.xml><?xml version="1.0" encoding="utf-8"?>
+<w:ftr xmlns:m="http://schemas.openxmlformats.org/officeDocument/2006/math" xmlns:mc="http://schemas.openxmlformats.org/markup-compatibility/2006" xmlns:mo="http://schemas.microsoft.com/office/mac/office/2008/main" xmlns:mv="urn:schemas-microsoft-com:mac:vml" xmlns:o="urn:schemas-microsoft-com:office:office" xmlns:r="http://schemas.openxmlformats.org/officeDocument/2006/relationships" xmlns:v="urn:schemas-microsoft-com:vml" xmlns:w10="urn:schemas-microsoft-com:office:word" xmlns:w14="http://schemas.microsoft.com/office/word/2010/wordml" xmlns:w="http://schemas.openxmlformats.org/wordprocessingml/2006/main" xmlns:wne="http://schemas.microsoft.com/office/word/2006/wordml" xmlns:wp14="http://schemas.microsoft.com/office/word/2010/wordprocessingDrawing" xmlns:wp="http://schemas.openxmlformats.org/drawingml/2006/wordprocessingDrawing" xmlns:wpc="http://schemas.microsoft.com/office/word/2010/wordprocessingCanvas" xmlns:wpg="http://schemas.microsoft.com/office/word/2010/wordprocessingGroup" xmlns:wpi="http://schemas.microsoft.com/office/word/2010/wordprocessingInk" xmlns:wps="http://schemas.microsoft.com/office/word/2010/wordprocessingShape" mc:Ignorable="w14 wp14">
+  <w:p>
+    <w:pPr>
+      <w:pStyle w:val="Footer"/>
+      <w:jc w:val="center"/>
+    </w:pPr>
+    <w:r>
+      <w:rPr>
+        <w:rFonts w:ascii="Calibri" w:hAnsi="Calibri"/>
+        <w:sz w:val="18"/>
+      </w:rPr>
+      <w:fldChar w:fldCharType="begin"/>
+    </w:r>
+    <w:r>
+      <w:rPr>
+        <w:rFonts w:ascii="Calibri" w:hAnsi="Calibri"/>
+        <w:sz w:val="18"/>
+      </w:rPr>
+      <w:instrText xml:space="preserve"> PAGE </w:instrText>
+    </w:r>
+    <w:r>
+      <w:rPr>
+        <w:rFonts w:ascii="Calibri" w:hAnsi="Calibri"/>
+        <w:sz w:val="18"/>
+      </w:rPr>
+      <w:fldChar w:fldCharType="end"/>
+    </w:r>
+  </w:p>
+</w:ftr>
+</file>
+
+<file path=word/footer5.xml><?xml version="1.0" encoding="utf-8"?>
+<w:ftr xmlns:m="http://schemas.openxmlformats.org/officeDocument/2006/math" xmlns:mc="http://schemas.openxmlformats.org/markup-compatibility/2006" xmlns:mo="http://schemas.microsoft.com/office/mac/office/2008/main" xmlns:mv="urn:schemas-microsoft-com:mac:vml" xmlns:o="urn:schemas-microsoft-com:office:office" xmlns:r="http://schemas.openxmlformats.org/officeDocument/2006/relationships" xmlns:v="urn:schemas-microsoft-com:vml" xmlns:w10="urn:schemas-microsoft-com:office:word" xmlns:w14="http://schemas.microsoft.com/office/word/2010/wordml" xmlns:w="http://schemas.openxmlformats.org/wordprocessingml/2006/main" xmlns:wne="http://schemas.microsoft.com/office/word/2006/wordml" xmlns:wp14="http://schemas.microsoft.com/office/word/2010/wordprocessingDrawing" xmlns:wp="http://schemas.openxmlformats.org/drawingml/2006/wordprocessingDrawing" xmlns:wpc="http://schemas.microsoft.com/office/word/2010/wordprocessingCanvas" xmlns:wpg="http://schemas.microsoft.com/office/word/2010/wordprocessingGroup" xmlns:wpi="http://schemas.microsoft.com/office/word/2010/wordprocessingInk" xmlns:wps="http://schemas.microsoft.com/office/word/2010/wordprocessingShape" mc:Ignorable="w14 wp14">
+  <w:p>
+    <w:pPr>
+      <w:pStyle w:val="Footer"/>
+      <w:jc w:val="center"/>
+    </w:pPr>
+    <w:r>
+      <w:rPr>
+        <w:rFonts w:ascii="Calibri" w:hAnsi="Calibri"/>
+        <w:sz w:val="18"/>
+      </w:rPr>
+      <w:fldChar w:fldCharType="begin"/>
+    </w:r>
+    <w:r>
+      <w:rPr>
+        <w:rFonts w:ascii="Calibri" w:hAnsi="Calibri"/>
+        <w:sz w:val="18"/>
+      </w:rPr>
+      <w:instrText xml:space="preserve"> PAGE </w:instrText>
+    </w:r>
+    <w:r>
+      <w:rPr>
+        <w:rFonts w:ascii="Calibri" w:hAnsi="Calibri"/>
+        <w:sz w:val="18"/>
+      </w:rPr>
+      <w:fldChar w:fldCharType="end"/>
+    </w:r>
+  </w:p>
+</w:ftr>
+</file>
+
+<file path=word/footer6.xml><?xml version="1.0" encoding="utf-8"?>
+<w:ftr xmlns:m="http://schemas.openxmlformats.org/officeDocument/2006/math" xmlns:mc="http://schemas.openxmlformats.org/markup-compatibility/2006" xmlns:mo="http://schemas.microsoft.com/office/mac/office/2008/main" xmlns:mv="urn:schemas-microsoft-com:mac:vml" xmlns:o="urn:schemas-microsoft-com:office:office" xmlns:r="http://schemas.openxmlformats.org/officeDocument/2006/relationships" xmlns:v="urn:schemas-microsoft-com:vml" xmlns:w10="urn:schemas-microsoft-com:office:word" xmlns:w14="http://schemas.microsoft.com/office/word/2010/wordml" xmlns:w="http://schemas.openxmlformats.org/wordprocessingml/2006/main" xmlns:wne="http://schemas.microsoft.com/office/word/2006/wordml" xmlns:wp14="http://schemas.microsoft.com/office/word/2010/wordprocessingDrawing" xmlns:wp="http://schemas.openxmlformats.org/drawingml/2006/wordprocessingDrawing" xmlns:wpc="http://schemas.microsoft.com/office/word/2010/wordprocessingCanvas" xmlns:wpg="http://schemas.microsoft.com/office/word/2010/wordprocessingGroup" xmlns:wpi="http://schemas.microsoft.com/office/word/2010/wordprocessingInk" xmlns:wps="http://schemas.microsoft.com/office/word/2010/wordprocessingShape" mc:Ignorable="w14 wp14">
+  <w:p>
+    <w:pPr>
+      <w:pStyle w:val="Footer"/>
+      <w:jc w:val="center"/>
+    </w:pPr>
+    <w:r>
+      <w:rPr>
+        <w:rFonts w:ascii="Calibri" w:hAnsi="Calibri"/>
+        <w:sz w:val="18"/>
+      </w:rPr>
+      <w:fldChar w:fldCharType="begin"/>
+    </w:r>
+    <w:r>
+      <w:rPr>
+        <w:rFonts w:ascii="Calibri" w:hAnsi="Calibri"/>
+        <w:sz w:val="18"/>
+      </w:rPr>
+      <w:instrText xml:space="preserve"> PAGE </w:instrText>
+    </w:r>
+    <w:r>
+      <w:rPr>
+        <w:rFonts w:ascii="Calibri" w:hAnsi="Calibri"/>
+        <w:sz w:val="18"/>
+      </w:rPr>
+      <w:fldChar w:fldCharType="end"/>
+    </w:r>
+  </w:p>
+</w:ftr>
+</file>
+
+<file path=word/footer7.xml><?xml version="1.0" encoding="utf-8"?>
+<w:ftr xmlns:m="http://schemas.openxmlformats.org/officeDocument/2006/math" xmlns:mc="http://schemas.openxmlformats.org/markup-compatibility/2006" xmlns:mo="http://schemas.microsoft.com/office/mac/office/2008/main" xmlns:mv="urn:schemas-microsoft-com:mac:vml" xmlns:o="urn:schemas-microsoft-com:office:office" xmlns:r="http://schemas.openxmlformats.org/officeDocument/2006/relationships" xmlns:v="urn:schemas-microsoft-com:vml" xmlns:w10="urn:schemas-microsoft-com:office:word" xmlns:w14="http://schemas.microsoft.com/office/word/2010/wordml" xmlns:w="http://schemas.openxmlformats.org/wordprocessingml/2006/main" xmlns:wne="http://schemas.microsoft.com/office/word/2006/wordml" xmlns:wp14="http://schemas.microsoft.com/office/word/2010/wordprocessingDrawing" xmlns:wp="http://schemas.openxmlformats.org/drawingml/2006/wordprocessingDrawing" xmlns:wpc="http://schemas.microsoft.com/office/word/2010/wordprocessingCanvas" xmlns:wpg="http://schemas.microsoft.com/office/word/2010/wordprocessingGroup" xmlns:wpi="http://schemas.microsoft.com/office/word/2010/wordprocessingInk" xmlns:wps="http://schemas.microsoft.com/office/word/2010/wordprocessingShape" mc:Ignorable="w14 wp14">
+  <w:p>
+    <w:pPr>
+      <w:pStyle w:val="Footer"/>
+      <w:jc w:val="center"/>
+    </w:pPr>
+    <w:r>
+      <w:rPr>
+        <w:rFonts w:ascii="Calibri" w:hAnsi="Calibri"/>
+        <w:sz w:val="18"/>
+      </w:rPr>
+      <w:fldChar w:fldCharType="begin"/>
+    </w:r>
+    <w:r>
+      <w:rPr>
+        <w:rFonts w:ascii="Calibri" w:hAnsi="Calibri"/>
+        <w:sz w:val="18"/>
+      </w:rPr>
+      <w:instrText xml:space="preserve"> PAGE </w:instrText>
+    </w:r>
+    <w:r>
+      <w:rPr>
+        <w:rFonts w:ascii="Calibri" w:hAnsi="Calibri"/>
+        <w:sz w:val="18"/>
+      </w:rPr>
+      <w:fldChar w:fldCharType="end"/>
+    </w:r>
+  </w:p>
+</w:ftr>
+</file>
+
+<file path=word/footer8.xml><?xml version="1.0" encoding="utf-8"?>
+<w:ftr xmlns:m="http://schemas.openxmlformats.org/officeDocument/2006/math" xmlns:mc="http://schemas.openxmlformats.org/markup-compatibility/2006" xmlns:mo="http://schemas.microsoft.com/office/mac/office/2008/main" xmlns:mv="urn:schemas-microsoft-com:mac:vml" xmlns:o="urn:schemas-microsoft-com:office:office" xmlns:r="http://schemas.openxmlformats.org/officeDocument/2006/relationships" xmlns:v="urn:schemas-microsoft-com:vml" xmlns:w10="urn:schemas-microsoft-com:office:word" xmlns:w14="http://schemas.microsoft.com/office/word/2010/wordml" xmlns:w="http://schemas.openxmlformats.org/wordprocessingml/2006/main" xmlns:wne="http://schemas.microsoft.com/office/word/2006/wordml" xmlns:wp14="http://schemas.microsoft.com/office/word/2010/wordprocessingDrawing" xmlns:wp="http://schemas.openxmlformats.org/drawingml/2006/wordprocessingDrawing" xmlns:wpc="http://schemas.microsoft.com/office/word/2010/wordprocessingCanvas" xmlns:wpg="http://schemas.microsoft.com/office/word/2010/wordprocessingGroup" xmlns:wpi="http://schemas.microsoft.com/office/word/2010/wordprocessingInk" xmlns:wps="http://schemas.microsoft.com/office/word/2010/wordprocessingShape" mc:Ignorable="w14 wp14">
+  <w:p>
+    <w:pPr>
+      <w:pStyle w:val="Footer"/>
+      <w:jc w:val="center"/>
+    </w:pPr>
+    <w:r>
+      <w:rPr>
+        <w:rFonts w:ascii="Calibri" w:hAnsi="Calibri"/>
+        <w:sz w:val="18"/>
+      </w:rPr>
+      <w:fldChar w:fldCharType="begin"/>
+    </w:r>
+    <w:r>
+      <w:rPr>
+        <w:rFonts w:ascii="Calibri" w:hAnsi="Calibri"/>
+        <w:sz w:val="18"/>
+      </w:rPr>
+      <w:instrText xml:space="preserve"> PAGE </w:instrText>
+    </w:r>
+    <w:r>
+      <w:rPr>
+        <w:rFonts w:ascii="Calibri" w:hAnsi="Calibri"/>
+        <w:sz w:val="18"/>
+      </w:rPr>
+      <w:fldChar w:fldCharType="end"/>
+    </w:r>
+  </w:p>
+</w:ftr>
+</file>
+
+<file path=word/footer9.xml><?xml version="1.0" encoding="utf-8"?>
+<w:ftr xmlns:m="http://schemas.openxmlformats.org/officeDocument/2006/math" xmlns:mc="http://schemas.openxmlformats.org/markup-compatibility/2006" xmlns:mo="http://schemas.microsoft.com/office/mac/office/2008/main" xmlns:mv="urn:schemas-microsoft-com:mac:vml" xmlns:o="urn:schemas-microsoft-com:office:office" xmlns:r="http://schemas.openxmlformats.org/officeDocument/2006/relationships" xmlns:v="urn:schemas-microsoft-com:vml" xmlns:w10="urn:schemas-microsoft-com:office:word" xmlns:w14="http://schemas.microsoft.com/office/word/2010/wordml" xmlns:w="http://schemas.openxmlformats.org/wordprocessingml/2006/main" xmlns:wne="http://schemas.microsoft.com/office/word/2006/wordml" xmlns:wp14="http://schemas.microsoft.com/office/word/2010/wordprocessingDrawing" xmlns:wp="http://schemas.openxmlformats.org/drawingml/2006/wordprocessingDrawing" xmlns:wpc="http://schemas.microsoft.com/office/word/2010/wordprocessingCanvas" xmlns:wpg="http://schemas.microsoft.com/office/word/2010/wordprocessingGroup" xmlns:wpi="http://schemas.microsoft.com/office/word/2010/wordprocessingInk" xmlns:wps="http://schemas.microsoft.com/office/word/2010/wordprocessingShape" mc:Ignorable="w14 wp14">
+  <w:p>
+    <w:pPr>
+      <w:pStyle w:val="Footer"/>
+      <w:jc w:val="center"/>
+    </w:pPr>
+    <w:r>
+      <w:rPr>
+        <w:rFonts w:ascii="Calibri" w:hAnsi="Calibri"/>
+        <w:sz w:val="18"/>
+      </w:rPr>
+      <w:fldChar w:fldCharType="begin"/>
+    </w:r>
+    <w:r>
+      <w:rPr>
+        <w:rFonts w:ascii="Calibri" w:hAnsi="Calibri"/>
+        <w:sz w:val="18"/>
+      </w:rPr>
+      <w:instrText xml:space="preserve"> PAGE </w:instrText>
+    </w:r>
+    <w:r>
+      <w:rPr>
+        <w:rFonts w:ascii="Calibri" w:hAnsi="Calibri"/>
+        <w:sz w:val="18"/>
+      </w:rPr>
+      <w:fldChar w:fldCharType="end"/>
+    </w:r>
+  </w:p>
+</w:ftr>
+</file>
+
+<file path=word/header1.xml><?xml version="1.0" encoding="utf-8"?>
+<w:hdr xmlns:m="http://schemas.openxmlformats.org/officeDocument/2006/math" xmlns:mc="http://schemas.openxmlformats.org/markup-compatibility/2006" xmlns:mo="http://schemas.microsoft.com/office/mac/office/2008/main" xmlns:mv="urn:schemas-microsoft-com:mac:vml" xmlns:o="urn:schemas-microsoft-com:office:office" xmlns:r="http://schemas.openxmlformats.org/officeDocument/2006/relationships" xmlns:v="urn:schemas-microsoft-com:vml" xmlns:w10="urn:schemas-microsoft-com:office:word" xmlns:w14="http://schemas.microsoft.com/office/word/2010/wordml" xmlns:w="http://schemas.openxmlformats.org/wordprocessingml/2006/main" xmlns:wne="http://schemas.microsoft.com/office/word/2006/wordml" xmlns:wp14="http://schemas.microsoft.com/office/word/2010/wordprocessingDrawing" xmlns:wp="http://schemas.openxmlformats.org/drawingml/2006/wordprocessingDrawing" xmlns:wpc="http://schemas.microsoft.com/office/word/2010/wordprocessingCanvas" xmlns:wpg="http://schemas.microsoft.com/office/word/2010/wordprocessingGroup" xmlns:wpi="http://schemas.microsoft.com/office/word/2010/wordprocessingInk" xmlns:wps="http://schemas.microsoft.com/office/word/2010/wordprocessingShape" mc:Ignorable="w14 wp14">
+  <w:p>
+    <w:pPr>
+      <w:pStyle w:val="Header"/>
+      <w:jc w:val="right"/>
+    </w:pPr>
+    <w:r>
+      <w:rPr>
+        <w:rFonts w:ascii="Calibri" w:hAnsi="Calibri"/>
+        <w:i/>
+        <w:color w:val="444444"/>
+        <w:sz w:val="18"/>
+      </w:rPr>
+      <w:t>Start here</w:t>
+    </w:r>
+  </w:p>
+</w:hdr>
+</file>
+
+<file path=word/header10.xml><?xml version="1.0" encoding="utf-8"?>
+<w:hdr xmlns:m="http://schemas.openxmlformats.org/officeDocument/2006/math" xmlns:mc="http://schemas.openxmlformats.org/markup-compatibility/2006" xmlns:mo="http://schemas.microsoft.com/office/mac/office/2008/main" xmlns:mv="urn:schemas-microsoft-com:mac:vml" xmlns:o="urn:schemas-microsoft-com:office:office" xmlns:r="http://schemas.openxmlformats.org/officeDocument/2006/relationships" xmlns:v="urn:schemas-microsoft-com:vml" xmlns:w10="urn:schemas-microsoft-com:office:word" xmlns:w14="http://schemas.microsoft.com/office/word/2010/wordml" xmlns:w="http://schemas.openxmlformats.org/wordprocessingml/2006/main" xmlns:wne="http://schemas.microsoft.com/office/word/2006/wordml" xmlns:wp14="http://schemas.microsoft.com/office/word/2010/wordprocessingDrawing" xmlns:wp="http://schemas.openxmlformats.org/drawingml/2006/wordprocessingDrawing" xmlns:wpc="http://schemas.microsoft.com/office/word/2010/wordprocessingCanvas" xmlns:wpg="http://schemas.microsoft.com/office/word/2010/wordprocessingGroup" xmlns:wpi="http://schemas.microsoft.com/office/word/2010/wordprocessingInk" xmlns:wps="http://schemas.microsoft.com/office/word/2010/wordprocessingShape" mc:Ignorable="w14 wp14">
+  <w:p>
+    <w:pPr>
+      <w:pStyle w:val="Header"/>
+      <w:jc w:val="right"/>
+    </w:pPr>
+    <w:r>
+      <w:rPr>
+        <w:rFonts w:ascii="Calibri" w:hAnsi="Calibri"/>
+        <w:i/>
+        <w:color w:val="444444"/>
+        <w:sz w:val="18"/>
+      </w:rPr>
+      <w:t>9  When Nothing Sells</w:t>
+    </w:r>
+  </w:p>
+</w:hdr>
+</file>
+
+<file path=word/header11.xml><?xml version="1.0" encoding="utf-8"?>
+<w:hdr xmlns:m="http://schemas.openxmlformats.org/officeDocument/2006/math" xmlns:mc="http://schemas.openxmlformats.org/markup-compatibility/2006" xmlns:mo="http://schemas.microsoft.com/office/mac/office/2008/main" xmlns:mv="urn:schemas-microsoft-com:mac:vml" xmlns:o="urn:schemas-microsoft-com:office:office" xmlns:r="http://schemas.openxmlformats.org/officeDocument/2006/relationships" xmlns:v="urn:schemas-microsoft-com:vml" xmlns:w10="urn:schemas-microsoft-com:office:word" xmlns:w14="http://schemas.microsoft.com/office/word/2010/wordml" xmlns:w="http://schemas.openxmlformats.org/wordprocessingml/2006/main" xmlns:wne="http://schemas.microsoft.com/office/word/2006/wordml" xmlns:wp14="http://schemas.microsoft.com/office/word/2010/wordprocessingDrawing" xmlns:wp="http://schemas.openxmlformats.org/drawingml/2006/wordprocessingDrawing" xmlns:wpc="http://schemas.microsoft.com/office/word/2010/wordprocessingCanvas" xmlns:wpg="http://schemas.microsoft.com/office/word/2010/wordprocessingGroup" xmlns:wpi="http://schemas.microsoft.com/office/word/2010/wordprocessingInk" xmlns:wps="http://schemas.microsoft.com/office/word/2010/wordprocessingShape" mc:Ignorable="w14 wp14">
+  <w:p>
+    <w:pPr>
+      <w:pStyle w:val="Header"/>
+      <w:jc w:val="right"/>
+    </w:pPr>
+    <w:r>
+      <w:rPr>
+        <w:rFonts w:ascii="Calibri" w:hAnsi="Calibri"/>
+        <w:i/>
+        <w:color w:val="444444"/>
+        <w:sz w:val="18"/>
+      </w:rPr>
+      <w:t>Glossary</w:t>
+    </w:r>
+  </w:p>
+</w:hdr>
+</file>
+
+<file path=word/header12.xml><?xml version="1.0" encoding="utf-8"?>
+<w:hdr xmlns:m="http://schemas.openxmlformats.org/officeDocument/2006/math" xmlns:mc="http://schemas.openxmlformats.org/markup-compatibility/2006" xmlns:mo="http://schemas.microsoft.com/office/mac/office/2008/main" xmlns:mv="urn:schemas-microsoft-com:mac:vml" xmlns:o="urn:schemas-microsoft-com:office:office" xmlns:r="http://schemas.openxmlformats.org/officeDocument/2006/relationships" xmlns:v="urn:schemas-microsoft-com:vml" xmlns:w10="urn:schemas-microsoft-com:office:word" xmlns:w14="http://schemas.microsoft.com/office/word/2010/wordml" xmlns:w="http://schemas.openxmlformats.org/wordprocessingml/2006/main" xmlns:wne="http://schemas.microsoft.com/office/word/2006/wordml" xmlns:wp14="http://schemas.microsoft.com/office/word/2010/wordprocessingDrawing" xmlns:wp="http://schemas.openxmlformats.org/drawingml/2006/wordprocessingDrawing" xmlns:wpc="http://schemas.microsoft.com/office/word/2010/wordprocessingCanvas" xmlns:wpg="http://schemas.microsoft.com/office/word/2010/wordprocessingGroup" xmlns:wpi="http://schemas.microsoft.com/office/word/2010/wordprocessingInk" xmlns:wps="http://schemas.microsoft.com/office/word/2010/wordprocessingShape" mc:Ignorable="w14 wp14">
+  <w:p>
+    <w:pPr>
+      <w:pStyle w:val="Header"/>
+      <w:jc w:val="right"/>
+    </w:pPr>
+    <w:r>
+      <w:rPr>
+        <w:rFonts w:ascii="Calibri" w:hAnsi="Calibri"/>
+        <w:i/>
+        <w:color w:val="444444"/>
+        <w:sz w:val="18"/>
+      </w:rPr>
+      <w:t>Sources</w:t>
+    </w:r>
+  </w:p>
+</w:hdr>
+</file>
+
+<file path=word/header2.xml><?xml version="1.0" encoding="utf-8"?>
+<w:hdr xmlns:m="http://schemas.openxmlformats.org/officeDocument/2006/math" xmlns:mc="http://schemas.openxmlformats.org/markup-compatibility/2006" xmlns:mo="http://schemas.microsoft.com/office/mac/office/2008/main" xmlns:mv="urn:schemas-microsoft-com:mac:vml" xmlns:o="urn:schemas-microsoft-com:office:office" xmlns:r="http://schemas.openxmlformats.org/officeDocument/2006/relationships" xmlns:v="urn:schemas-microsoft-com:vml" xmlns:w10="urn:schemas-microsoft-com:office:word" xmlns:w14="http://schemas.microsoft.com/office/word/2010/wordml" xmlns:w="http://schemas.openxmlformats.org/wordprocessingml/2006/main" xmlns:wne="http://schemas.microsoft.com/office/word/2006/wordml" xmlns:wp14="http://schemas.microsoft.com/office/word/2010/wordprocessingDrawing" xmlns:wp="http://schemas.openxmlformats.org/drawingml/2006/wordprocessingDrawing" xmlns:wpc="http://schemas.microsoft.com/office/word/2010/wordprocessingCanvas" xmlns:wpg="http://schemas.microsoft.com/office/word/2010/wordprocessingGroup" xmlns:wpi="http://schemas.microsoft.com/office/word/2010/wordprocessingInk" xmlns:wps="http://schemas.microsoft.com/office/word/2010/wordprocessingShape" mc:Ignorable="w14 wp14">
+  <w:p>
+    <w:pPr>
+      <w:pStyle w:val="Header"/>
+      <w:jc w:val="right"/>
+    </w:pPr>
+    <w:r>
+      <w:rPr>
+        <w:rFonts w:ascii="Calibri" w:hAnsi="Calibri"/>
+        <w:i/>
+        <w:color w:val="444444"/>
+        <w:sz w:val="18"/>
+      </w:rPr>
+      <w:t>1  Sell One Thing</w:t>
+    </w:r>
+  </w:p>
+</w:hdr>
+</file>
+
+<file path=word/header3.xml><?xml version="1.0" encoding="utf-8"?>
+<w:hdr xmlns:m="http://schemas.openxmlformats.org/officeDocument/2006/math" xmlns:mc="http://schemas.openxmlformats.org/markup-compatibility/2006" xmlns:mo="http://schemas.microsoft.com/office/mac/office/2008/main" xmlns:mv="urn:schemas-microsoft-com:mac:vml" xmlns:o="urn:schemas-microsoft-com:office:office" xmlns:r="http://schemas.openxmlformats.org/officeDocument/2006/relationships" xmlns:v="urn:schemas-microsoft-com:vml" xmlns:w10="urn:schemas-microsoft-com:office:word" xmlns:w14="http://schemas.microsoft.com/office/word/2010/wordml" xmlns:w="http://schemas.openxmlformats.org/wordprocessingml/2006/main" xmlns:wne="http://schemas.microsoft.com/office/word/2006/wordml" xmlns:wp14="http://schemas.microsoft.com/office/word/2010/wordprocessingDrawing" xmlns:wp="http://schemas.openxmlformats.org/drawingml/2006/wordprocessingDrawing" xmlns:wpc="http://schemas.microsoft.com/office/word/2010/wordprocessingCanvas" xmlns:wpg="http://schemas.microsoft.com/office/word/2010/wordprocessingGroup" xmlns:wpi="http://schemas.microsoft.com/office/word/2010/wordprocessingInk" xmlns:wps="http://schemas.microsoft.com/office/word/2010/wordprocessingShape" mc:Ignorable="w14 wp14">
+  <w:p>
+    <w:pPr>
+      <w:pStyle w:val="Header"/>
+      <w:jc w:val="right"/>
+    </w:pPr>
+    <w:r>
+      <w:rPr>
+        <w:rFonts w:ascii="Calibri" w:hAnsi="Calibri"/>
+        <w:i/>
+        <w:color w:val="444444"/>
+        <w:sz w:val="18"/>
+      </w:rPr>
+      <w:t>2  The Click Is the Whole Business</w:t>
+    </w:r>
+  </w:p>
+</w:hdr>
+</file>
+
+<file path=word/header4.xml><?xml version="1.0" encoding="utf-8"?>
+<w:hdr xmlns:m="http://schemas.openxmlformats.org/officeDocument/2006/math" xmlns:mc="http://schemas.openxmlformats.org/markup-compatibility/2006" xmlns:mo="http://schemas.microsoft.com/office/mac/office/2008/main" xmlns:mv="urn:schemas-microsoft-com:mac:vml" xmlns:o="urn:schemas-microsoft-com:office:office" xmlns:r="http://schemas.openxmlformats.org/officeDocument/2006/relationships" xmlns:v="urn:schemas-microsoft-com:vml" xmlns:w10="urn:schemas-microsoft-com:office:word" xmlns:w14="http://schemas.microsoft.com/office/word/2010/wordml" xmlns:w="http://schemas.openxmlformats.org/wordprocessingml/2006/main" xmlns:wne="http://schemas.microsoft.com/office/word/2006/wordml" xmlns:wp14="http://schemas.microsoft.com/office/word/2010/wordprocessingDrawing" xmlns:wp="http://schemas.openxmlformats.org/drawingml/2006/wordprocessingDrawing" xmlns:wpc="http://schemas.microsoft.com/office/word/2010/wordprocessingCanvas" xmlns:wpg="http://schemas.microsoft.com/office/word/2010/wordprocessingGroup" xmlns:wpi="http://schemas.microsoft.com/office/word/2010/wordprocessingInk" xmlns:wps="http://schemas.microsoft.com/office/word/2010/wordprocessingShape" mc:Ignorable="w14 wp14">
+  <w:p>
+    <w:pPr>
+      <w:pStyle w:val="Header"/>
+      <w:jc w:val="right"/>
+    </w:pPr>
+    <w:r>
+      <w:rPr>
+        <w:rFonts w:ascii="Calibri" w:hAnsi="Calibri"/>
+        <w:i/>
+        <w:color w:val="444444"/>
+        <w:sz w:val="18"/>
+      </w:rPr>
+      <w:t>3  Nobody Can Tell What It Cost</w:t>
+    </w:r>
+  </w:p>
+</w:hdr>
+</file>
+
+<file path=word/header5.xml><?xml version="1.0" encoding="utf-8"?>
+<w:hdr xmlns:m="http://schemas.openxmlformats.org/officeDocument/2006/math" xmlns:mc="http://schemas.openxmlformats.org/markup-compatibility/2006" xmlns:mo="http://schemas.microsoft.com/office/mac/office/2008/main" xmlns:mv="urn:schemas-microsoft-com:mac:vml" xmlns:o="urn:schemas-microsoft-com:office:office" xmlns:r="http://schemas.openxmlformats.org/officeDocument/2006/relationships" xmlns:v="urn:schemas-microsoft-com:vml" xmlns:w10="urn:schemas-microsoft-com:office:word" xmlns:w14="http://schemas.microsoft.com/office/word/2010/wordml" xmlns:w="http://schemas.openxmlformats.org/wordprocessingml/2006/main" xmlns:wne="http://schemas.microsoft.com/office/word/2006/wordml" xmlns:wp14="http://schemas.microsoft.com/office/word/2010/wordprocessingDrawing" xmlns:wp="http://schemas.openxmlformats.org/drawingml/2006/wordprocessingDrawing" xmlns:wpc="http://schemas.microsoft.com/office/word/2010/wordprocessingCanvas" xmlns:wpg="http://schemas.microsoft.com/office/word/2010/wordprocessingGroup" xmlns:wpi="http://schemas.microsoft.com/office/word/2010/wordprocessingInk" xmlns:wps="http://schemas.microsoft.com/office/word/2010/wordprocessingShape" mc:Ignorable="w14 wp14">
+  <w:p>
+    <w:pPr>
+      <w:pStyle w:val="Header"/>
+      <w:jc w:val="right"/>
+    </w:pPr>
+    <w:r>
+      <w:rPr>
+        <w:rFonts w:ascii="Calibri" w:hAnsi="Calibri"/>
+        <w:i/>
+        <w:color w:val="444444"/>
+        <w:sz w:val="18"/>
+      </w:rPr>
+      <w:t>4  The Videos That Do the Selling</w:t>
+    </w:r>
+  </w:p>
+</w:hdr>
+</file>
+
+<file path=word/header6.xml><?xml version="1.0" encoding="utf-8"?>
+<w:hdr xmlns:m="http://schemas.openxmlformats.org/officeDocument/2006/math" xmlns:mc="http://schemas.openxmlformats.org/markup-compatibility/2006" xmlns:mo="http://schemas.microsoft.com/office/mac/office/2008/main" xmlns:mv="urn:schemas-microsoft-com:mac:vml" xmlns:o="urn:schemas-microsoft-com:office:office" xmlns:r="http://schemas.openxmlformats.org/officeDocument/2006/relationships" xmlns:v="urn:schemas-microsoft-com:vml" xmlns:w10="urn:schemas-microsoft-com:office:word" xmlns:w14="http://schemas.microsoft.com/office/word/2010/wordml" xmlns:w="http://schemas.openxmlformats.org/wordprocessingml/2006/main" xmlns:wne="http://schemas.microsoft.com/office/word/2006/wordml" xmlns:wp14="http://schemas.microsoft.com/office/word/2010/wordprocessingDrawing" xmlns:wp="http://schemas.openxmlformats.org/drawingml/2006/wordprocessingDrawing" xmlns:wpc="http://schemas.microsoft.com/office/word/2010/wordprocessingCanvas" xmlns:wpg="http://schemas.microsoft.com/office/word/2010/wordprocessingGroup" xmlns:wpi="http://schemas.microsoft.com/office/word/2010/wordprocessingInk" xmlns:wps="http://schemas.microsoft.com/office/word/2010/wordprocessingShape" mc:Ignorable="w14 wp14">
+  <w:p>
+    <w:pPr>
+      <w:pStyle w:val="Header"/>
+      <w:jc w:val="right"/>
+    </w:pPr>
+    <w:r>
+      <w:rPr>
+        <w:rFonts w:ascii="Calibri" w:hAnsi="Calibri"/>
+        <w:i/>
+        <w:color w:val="444444"/>
+        <w:sz w:val="18"/>
+      </w:rPr>
+      <w:t>5  Where the Money Actually Comes From</w:t>
+    </w:r>
+  </w:p>
+</w:hdr>
+</file>
+
+<file path=word/header7.xml><?xml version="1.0" encoding="utf-8"?>
+<w:hdr xmlns:m="http://schemas.openxmlformats.org/officeDocument/2006/math" xmlns:mc="http://schemas.openxmlformats.org/markup-compatibility/2006" xmlns:mo="http://schemas.microsoft.com/office/mac/office/2008/main" xmlns:mv="urn:schemas-microsoft-com:mac:vml" xmlns:o="urn:schemas-microsoft-com:office:office" xmlns:r="http://schemas.openxmlformats.org/officeDocument/2006/relationships" xmlns:v="urn:schemas-microsoft-com:vml" xmlns:w10="urn:schemas-microsoft-com:office:word" xmlns:w14="http://schemas.microsoft.com/office/word/2010/wordml" xmlns:w="http://schemas.openxmlformats.org/wordprocessingml/2006/main" xmlns:wne="http://schemas.microsoft.com/office/word/2006/wordml" xmlns:wp14="http://schemas.microsoft.com/office/word/2010/wordprocessingDrawing" xmlns:wp="http://schemas.openxmlformats.org/drawingml/2006/wordprocessingDrawing" xmlns:wpc="http://schemas.microsoft.com/office/word/2010/wordprocessingCanvas" xmlns:wpg="http://schemas.microsoft.com/office/word/2010/wordprocessingGroup" xmlns:wpi="http://schemas.microsoft.com/office/word/2010/wordprocessingInk" xmlns:wps="http://schemas.microsoft.com/office/word/2010/wordprocessingShape" mc:Ignorable="w14 wp14">
+  <w:p>
+    <w:pPr>
+      <w:pStyle w:val="Header"/>
+      <w:jc w:val="right"/>
+    </w:pPr>
+    <w:r>
+      <w:rPr>
+        <w:rFonts w:ascii="Calibri" w:hAnsi="Calibri"/>
+        <w:i/>
+        <w:color w:val="444444"/>
+        <w:sz w:val="18"/>
+      </w:rPr>
+      <w:t>6  Six Weeks to a Live Offer</w:t>
+    </w:r>
+  </w:p>
+</w:hdr>
+</file>
+
+<file path=word/header8.xml><?xml version="1.0" encoding="utf-8"?>
+<w:hdr xmlns:m="http://schemas.openxmlformats.org/officeDocument/2006/math" xmlns:mc="http://schemas.openxmlformats.org/markup-compatibility/2006" xmlns:mo="http://schemas.microsoft.com/office/mac/office/2008/main" xmlns:mv="urn:schemas-microsoft-com:mac:vml" xmlns:o="urn:schemas-microsoft-com:office:office" xmlns:r="http://schemas.openxmlformats.org/officeDocument/2006/relationships" xmlns:v="urn:schemas-microsoft-com:vml" xmlns:w10="urn:schemas-microsoft-com:office:word" xmlns:w14="http://schemas.microsoft.com/office/word/2010/wordml" xmlns:w="http://schemas.openxmlformats.org/wordprocessingml/2006/main" xmlns:wne="http://schemas.microsoft.com/office/word/2006/wordml" xmlns:wp14="http://schemas.microsoft.com/office/word/2010/wordprocessingDrawing" xmlns:wp="http://schemas.openxmlformats.org/drawingml/2006/wordprocessingDrawing" xmlns:wpc="http://schemas.microsoft.com/office/word/2010/wordprocessingCanvas" xmlns:wpg="http://schemas.microsoft.com/office/word/2010/wordprocessingGroup" xmlns:wpi="http://schemas.microsoft.com/office/word/2010/wordprocessingInk" xmlns:wps="http://schemas.microsoft.com/office/word/2010/wordprocessingShape" mc:Ignorable="w14 wp14">
+  <w:p>
+    <w:pPr>
+      <w:pStyle w:val="Header"/>
+      <w:jc w:val="right"/>
+    </w:pPr>
+    <w:r>
+      <w:rPr>
+        <w:rFonts w:ascii="Calibri" w:hAnsi="Calibri"/>
+        <w:i/>
+        <w:color w:val="444444"/>
+        <w:sz w:val="18"/>
+      </w:rPr>
+      <w:t>7  Say This</w:t>
+    </w:r>
+  </w:p>
+</w:hdr>
+</file>
+
+<file path=word/header9.xml><?xml version="1.0" encoding="utf-8"?>
+<w:hdr xmlns:m="http://schemas.openxmlformats.org/officeDocument/2006/math" xmlns:mc="http://schemas.openxmlformats.org/markup-compatibility/2006" xmlns:mo="http://schemas.microsoft.com/office/mac/office/2008/main" xmlns:mv="urn:schemas-microsoft-com:mac:vml" xmlns:o="urn:schemas-microsoft-com:office:office" xmlns:r="http://schemas.openxmlformats.org/officeDocument/2006/relationships" xmlns:v="urn:schemas-microsoft-com:vml" xmlns:w10="urn:schemas-microsoft-com:office:word" xmlns:w14="http://schemas.microsoft.com/office/word/2010/wordml" xmlns:w="http://schemas.openxmlformats.org/wordprocessingml/2006/main" xmlns:wne="http://schemas.microsoft.com/office/word/2006/wordml" xmlns:wp14="http://schemas.microsoft.com/office/word/2010/wordprocessingDrawing" xmlns:wp="http://schemas.openxmlformats.org/drawingml/2006/wordprocessingDrawing" xmlns:wpc="http://schemas.microsoft.com/office/word/2010/wordprocessingCanvas" xmlns:wpg="http://schemas.microsoft.com/office/word/2010/wordprocessingGroup" xmlns:wpi="http://schemas.microsoft.com/office/word/2010/wordprocessingInk" xmlns:wps="http://schemas.microsoft.com/office/word/2010/wordprocessingShape" mc:Ignorable="w14 wp14">
+  <w:p>
+    <w:pPr>
+      <w:pStyle w:val="Header"/>
+      <w:jc w:val="right"/>
+    </w:pPr>
+    <w:r>
+      <w:rPr>
+        <w:rFonts w:ascii="Calibri" w:hAnsi="Calibri"/>
+        <w:i/>
+        <w:color w:val="444444"/>
+        <w:sz w:val="18"/>
+      </w:rPr>
+      <w:t>8  The Channel Workbook</w:t>
+    </w:r>
+  </w:p>
+</w:hdr>
 </file>
 
 <file path=word/numbering.xml><?xml version="1.0" encoding="utf-8"?>
@@ -10755,7 +10961,7 @@
     <w:pPr>
       <w:keepNext/>
       <w:keepLines/>
-      <w:pageBreakBefore/>
+      <w:pageBreakBefore w:val="0"/>
       <w:spacing w:before="480" w:after="0"/>
       <w:outlineLvl w:val="0"/>
     </w:pPr>
@@ -10780,7 +10986,7 @@
     <w:pPr>
       <w:keepNext/>
       <w:keepLines/>
-      <w:spacing w:before="240" w:after="120"/>
+      <w:spacing w:before="320" w:after="160"/>
       <w:outlineLvl w:val="1"/>
     </w:pPr>
     <w:rPr>
@@ -10788,7 +10994,7 @@
       <w:b/>
       <w:bCs/>
       <w:color w:val="000000"/>
-      <w:sz w:val="28"/>
+      <w:sz w:val="32"/>
       <w:szCs w:val="26"/>
     </w:rPr>
   </w:style>

</xml_diff>

<commit_message>
Your First YouTube Channel That Sells: author Lothar J. Musiol (title page, copyright line, docx properties, KDP listing, notes); 2026/2027 YPP rules rechecked 1 Oct 2026 (chapter 5 already current); docx rebuilt; old docx in bak/
</commit_message>
<xml_diff>
--- a/Your First YouTube Channel That Sells/Your First YouTube Channel That Sells.docx
+++ b/Your First YouTube Channel That Sells/Your First YouTube Channel That Sells.docx
@@ -27,7 +27,20 @@
     </w:p>
     <w:p>
       <w:r>
+        <w:rPr>
+          <w:b/>
+        </w:rPr>
+        <w:t>Lothar J. Musiol</w:t>
+      </w:r>
+    </w:p>
+    <w:p>
+      <w:r>
         <w:t>Updated October 2026</w:t>
+      </w:r>
+    </w:p>
+    <w:p>
+      <w:r>
+        <w:t>Copyright © 2026 Lothar J. Musiol. All rights reserved.</w:t>
       </w:r>
     </w:p>
     <w:p>

</xml_diff>